<commit_message>
Return null on GitHub fetch failure to avoid dev server noise.
When api.github.com is unreachable, fall back silently instead of throwing through the route handler, and refresh the generated portfolio DOCX.

Co-authored-by: Cursor <cursoragent@cursor.com>
</commit_message>
<xml_diff>
--- a/public/RUYANGE-Arnold-Portfolio.docx
+++ b/public/RUYANGE-Arnold-Portfolio.docx
@@ -125,7 +125,7 @@
             <w:pPr>
               <w:spacing w:after="80"/>
             </w:pPr>
-            <w:hyperlink w:history="1" r:id="rIdobd1m3rpmsf-xwlb45y-y">
+            <w:hyperlink w:history="1" r:id="rIdoxlfi8yyv5bzn-5a2c8cj">
               <w:r>
                 <w:rPr>
                   <w:rFonts w:ascii="Calibri" w:cs="Calibri" w:eastAsia="Calibri" w:hAnsi="Calibri"/>
@@ -163,7 +163,7 @@
             <w:pPr>
               <w:spacing w:after="80"/>
             </w:pPr>
-            <w:hyperlink w:history="1" r:id="rIdey7jwchvwlxnegls0qrlf">
+            <w:hyperlink w:history="1" r:id="rId9fnfdjjakdkx9upv6-gfc">
               <w:r>
                 <w:rPr>
                   <w:rFonts w:ascii="Calibri" w:cs="Calibri" w:eastAsia="Calibri" w:hAnsi="Calibri"/>
@@ -183,7 +183,7 @@
             <w:pPr>
               <w:spacing w:after="80"/>
             </w:pPr>
-            <w:hyperlink w:history="1" r:id="rIdvui3xxcnicgwo3_flktk2">
+            <w:hyperlink w:history="1" r:id="rIdai9_2oyo-8zjoemib6p2-">
               <w:r>
                 <w:rPr>
                   <w:rFonts w:ascii="Calibri" w:cs="Calibri" w:eastAsia="Calibri" w:hAnsi="Calibri"/>
@@ -1883,7 +1883,7 @@
       <w:pPr>
         <w:spacing w:after="80"/>
       </w:pPr>
-      <w:hyperlink w:history="1" r:id="rIdpug-gkisfk0zl8-u0jk0x">
+      <w:hyperlink w:history="1" r:id="rIdp1-n89t27hxptkqtcja6a">
         <w:r>
           <w:rPr>
             <w:rFonts w:ascii="Calibri" w:cs="Calibri" w:eastAsia="Calibri" w:hAnsi="Calibri"/>
@@ -2267,7 +2267,7 @@
       <w:pPr>
         <w:spacing w:after="80"/>
       </w:pPr>
-      <w:hyperlink w:history="1" r:id="rId3n8yxb_g7611a0umzkszd">
+      <w:hyperlink w:history="1" r:id="rIdcqxeirveffaiouxoszlst">
         <w:r>
           <w:rPr>
             <w:rFonts w:ascii="Calibri" w:cs="Calibri" w:eastAsia="Calibri" w:hAnsi="Calibri"/>
@@ -2541,7 +2541,7 @@
       <w:pPr>
         <w:spacing w:after="80"/>
       </w:pPr>
-      <w:hyperlink w:history="1" r:id="rIdhgtlxwjs8tjggl1ycdneg">
+      <w:hyperlink w:history="1" r:id="rIdy2ekelwgghagt9aut1ipz">
         <w:r>
           <w:rPr>
             <w:rFonts w:ascii="Calibri" w:cs="Calibri" w:eastAsia="Calibri" w:hAnsi="Calibri"/>
@@ -2863,7 +2863,7 @@
       <w:pPr>
         <w:spacing w:after="80"/>
       </w:pPr>
-      <w:hyperlink w:history="1" r:id="rIdhwg-p2zj9_q_8bmrtfqq5">
+      <w:hyperlink w:history="1" r:id="rIdd_oqpuaxxuqtvl-ftbv3i">
         <w:r>
           <w:rPr>
             <w:rFonts w:ascii="Calibri" w:cs="Calibri" w:eastAsia="Calibri" w:hAnsi="Calibri"/>
@@ -3137,7 +3137,7 @@
       <w:pPr>
         <w:spacing w:after="80"/>
       </w:pPr>
-      <w:hyperlink w:history="1" r:id="rIdalg6tvvkii6zdkmddcxnc">
+      <w:hyperlink w:history="1" r:id="rIdcxywxvspswxpbqwkomejf">
         <w:r>
           <w:rPr>
             <w:rFonts w:ascii="Calibri" w:cs="Calibri" w:eastAsia="Calibri" w:hAnsi="Calibri"/>
@@ -3390,7 +3390,7 @@
       <w:pPr>
         <w:spacing w:after="80"/>
       </w:pPr>
-      <w:hyperlink w:history="1" r:id="rIdmxpele4um4nli5ebom58a">
+      <w:hyperlink w:history="1" r:id="rIdhc_39n_5um3c_5gyhufis">
         <w:r>
           <w:rPr>
             <w:rFonts w:ascii="Calibri" w:cs="Calibri" w:eastAsia="Calibri" w:hAnsi="Calibri"/>
@@ -3799,7 +3799,7 @@
       <w:pPr>
         <w:spacing w:after="80"/>
       </w:pPr>
-      <w:hyperlink w:history="1" r:id="rIdvcdyhpayacyfwrbgibjk2">
+      <w:hyperlink w:history="1" r:id="rIdptfnbmtyrnzkowppk2r1f">
         <w:r>
           <w:rPr>
             <w:rFonts w:ascii="Calibri" w:cs="Calibri" w:eastAsia="Calibri" w:hAnsi="Calibri"/>

</xml_diff>

<commit_message>
Prioritize strongest GitHub projects on site and resume.
Add Ingoboka, ArcFace, WASAC billing, BestBuy, ANPR, AviaServe, and other recent repos; sort by priority and regenerate portfolio PDF/DOCX.

Co-authored-by: Cursor <cursoragent@cursor.com>
</commit_message>
<xml_diff>
--- a/public/RUYANGE-Arnold-Portfolio.docx
+++ b/public/RUYANGE-Arnold-Portfolio.docx
@@ -125,7 +125,7 @@
             <w:pPr>
               <w:spacing w:after="80"/>
             </w:pPr>
-            <w:hyperlink w:history="1" r:id="rIdoxlfi8yyv5bzn-5a2c8cj">
+            <w:hyperlink w:history="1" r:id="rId5ioutsnmexnn1papfdaf2">
               <w:r>
                 <w:rPr>
                   <w:rFonts w:ascii="Calibri" w:cs="Calibri" w:eastAsia="Calibri" w:hAnsi="Calibri"/>
@@ -163,7 +163,7 @@
             <w:pPr>
               <w:spacing w:after="80"/>
             </w:pPr>
-            <w:hyperlink w:history="1" r:id="rId9fnfdjjakdkx9upv6-gfc">
+            <w:hyperlink w:history="1" r:id="rId1qv5hpsndefejc87dijvz">
               <w:r>
                 <w:rPr>
                   <w:rFonts w:ascii="Calibri" w:cs="Calibri" w:eastAsia="Calibri" w:hAnsi="Calibri"/>
@@ -175,7 +175,7 @@
                   <w:sz w:val="19"/>
                   <w:szCs w:val="19"/>
                 </w:rPr>
-                <w:t xml:space="preserve">arnold.dev</w:t>
+                <w:t xml:space="preserve">arnold-rho.vercel.app</w:t>
               </w:r>
             </w:hyperlink>
           </w:p>
@@ -183,7 +183,7 @@
             <w:pPr>
               <w:spacing w:after="80"/>
             </w:pPr>
-            <w:hyperlink w:history="1" r:id="rIdai9_2oyo-8zjoemib6p2-">
+            <w:hyperlink w:history="1" r:id="rIddxgdbupehp3l6sxquawn5">
               <w:r>
                 <w:rPr>
                   <w:rFonts w:ascii="Calibri" w:cs="Calibri" w:eastAsia="Calibri" w:hAnsi="Calibri"/>
@@ -1791,7 +1791,7 @@
           <w:sz w:val="26"/>
           <w:szCs w:val="26"/>
         </w:rPr>
-        <w:t xml:space="preserve">arnshop</w:t>
+        <w:t xml:space="preserve">Ingoboka Platform</w:t>
       </w:r>
       <w:r>
         <w:rPr>
@@ -1804,7 +1804,7 @@
           <w:sz w:val="20"/>
           <w:szCs w:val="20"/>
         </w:rPr>
-        <w:t xml:space="preserve"> — E-Commerce Platform</w:t>
+        <w:t xml:space="preserve"> — Digital Microinsurance PWA</w:t>
       </w:r>
     </w:p>
     <w:p>
@@ -1822,7 +1822,7 @@
           <w:sz w:val="19"/>
           <w:szCs w:val="19"/>
         </w:rPr>
-        <w:t xml:space="preserve">Problem: Needed a complete desktop e-commerce system for selling electronics with inventory and checkout — without relying on third-party storefronts.</w:t>
+        <w:t xml:space="preserve">Problem: Microinsurance products need a mobile-first, accessible frontend for citizens to browse coverage and complete flows without heavy native apps.</w:t>
       </w:r>
     </w:p>
     <w:p>
@@ -1840,7 +1840,7 @@
           <w:sz w:val="19"/>
           <w:szCs w:val="19"/>
         </w:rPr>
-        <w:t xml:space="preserve">Built: A Java Swing application with MySQL backend: product catalog, shopping cart, order management, and admin inventory controls.</w:t>
+        <w:t xml:space="preserve">Built: Next.js 14 App Router PWA with TypeScript, responsive layouts, and API-driven insurance workflows designed for real-world deployment.</w:t>
       </w:r>
     </w:p>
     <w:p>
@@ -1858,7 +1858,7 @@
           <w:sz w:val="19"/>
           <w:szCs w:val="19"/>
         </w:rPr>
-        <w:t xml:space="preserve">Outcome: Fully functional e-commerce workflow with clean Java architecture and a production-ready desktop UI.</w:t>
+        <w:t xml:space="preserve">Outcome: Production-grade PWA frontend ready to integrate with insurance backend services.</w:t>
       </w:r>
     </w:p>
     <w:p>
@@ -1876,14 +1876,14 @@
           <w:sz w:val="19"/>
           <w:szCs w:val="19"/>
         </w:rPr>
-        <w:t xml:space="preserve">Tech: Java, Swing, MySQL, E-Commerce</w:t>
+        <w:t xml:space="preserve">Tech: Next.js, TypeScript, PWA, React, Tailwind CSS</w:t>
       </w:r>
     </w:p>
     <w:p>
       <w:pPr>
         <w:spacing w:after="80"/>
       </w:pPr>
-      <w:hyperlink w:history="1" r:id="rIdp1-n89t27hxptkqtcja6a">
+      <w:hyperlink w:history="1" r:id="rIduhczfnxt8rzzzqrzp9mbr">
         <w:r>
           <w:rPr>
             <w:rFonts w:ascii="Calibri" w:cs="Calibri" w:eastAsia="Calibri" w:hAnsi="Calibri"/>
@@ -1895,7 +1895,7 @@
             <w:sz w:val="19"/>
             <w:szCs w:val="19"/>
           </w:rPr>
-          <w:t xml:space="preserve">GitHub: https://github.com/Arn-The-Wolf/arnshop</w:t>
+          <w:t xml:space="preserve">GitHub: https://github.com/Arn-The-Wolf/ingoboka-platform</w:t>
         </w:r>
       </w:hyperlink>
     </w:p>
@@ -1937,53 +1937,53 @@
           <w:sz w:val="19"/>
           <w:szCs w:val="19"/>
         </w:rPr>
-        <w:t xml:space="preserve">Full e-commerce functionality</w:t>
-      </w:r>
-    </w:p>
-    <w:p>
-      <w:pPr>
-        <w:pStyle w:val="ListParagraph"/>
-        <w:numPr>
-          <w:ilvl w:val="0"/>
-          <w:numId w:val="2"/>
-        </w:numPr>
-        <w:spacing w:after="60"/>
-      </w:pPr>
-      <w:r>
-        <w:rPr>
-          <w:rFonts w:ascii="Calibri" w:cs="Calibri" w:eastAsia="Calibri" w:hAnsi="Calibri"/>
-          <w:b w:val="false"/>
-          <w:bCs w:val="false"/>
-          <w:i w:val="false"/>
-          <w:iCs w:val="false"/>
-          <w:color w:val="333333"/>
-          <w:sz w:val="19"/>
-          <w:szCs w:val="19"/>
-        </w:rPr>
-        <w:t xml:space="preserve">Clean Java architecture</w:t>
-      </w:r>
-    </w:p>
-    <w:p>
-      <w:pPr>
-        <w:pStyle w:val="ListParagraph"/>
-        <w:numPr>
-          <w:ilvl w:val="0"/>
-          <w:numId w:val="2"/>
-        </w:numPr>
-        <w:spacing w:after="60"/>
-      </w:pPr>
-      <w:r>
-        <w:rPr>
-          <w:rFonts w:ascii="Calibri" w:cs="Calibri" w:eastAsia="Calibri" w:hAnsi="Calibri"/>
-          <w:b w:val="false"/>
-          <w:bCs w:val="false"/>
-          <w:i w:val="false"/>
-          <w:iCs w:val="false"/>
-          <w:color w:val="333333"/>
-          <w:sz w:val="19"/>
-          <w:szCs w:val="19"/>
-        </w:rPr>
-        <w:t xml:space="preserve">Production-ready UI</w:t>
+        <w:t xml:space="preserve">Next.js 14 PWA</w:t>
+      </w:r>
+    </w:p>
+    <w:p>
+      <w:pPr>
+        <w:pStyle w:val="ListParagraph"/>
+        <w:numPr>
+          <w:ilvl w:val="0"/>
+          <w:numId w:val="2"/>
+        </w:numPr>
+        <w:spacing w:after="60"/>
+      </w:pPr>
+      <w:r>
+        <w:rPr>
+          <w:rFonts w:ascii="Calibri" w:cs="Calibri" w:eastAsia="Calibri" w:hAnsi="Calibri"/>
+          <w:b w:val="false"/>
+          <w:bCs w:val="false"/>
+          <w:i w:val="false"/>
+          <w:iCs w:val="false"/>
+          <w:color w:val="333333"/>
+          <w:sz w:val="19"/>
+          <w:szCs w:val="19"/>
+        </w:rPr>
+        <w:t xml:space="preserve">Citizen-facing insurance UI</w:t>
+      </w:r>
+    </w:p>
+    <w:p>
+      <w:pPr>
+        <w:pStyle w:val="ListParagraph"/>
+        <w:numPr>
+          <w:ilvl w:val="0"/>
+          <w:numId w:val="2"/>
+        </w:numPr>
+        <w:spacing w:after="60"/>
+      </w:pPr>
+      <w:r>
+        <w:rPr>
+          <w:rFonts w:ascii="Calibri" w:cs="Calibri" w:eastAsia="Calibri" w:hAnsi="Calibri"/>
+          <w:b w:val="false"/>
+          <w:bCs w:val="false"/>
+          <w:i w:val="false"/>
+          <w:iCs w:val="false"/>
+          <w:color w:val="333333"/>
+          <w:sz w:val="19"/>
+          <w:szCs w:val="19"/>
+        </w:rPr>
+        <w:t xml:space="preserve">Production-ready frontend</w:t>
       </w:r>
     </w:p>
     <w:p>
@@ -2024,140 +2024,53 @@
           <w:sz w:val="19"/>
           <w:szCs w:val="19"/>
         </w:rPr>
-        <w:t xml:space="preserve">Building intuitive GUI</w:t>
-      </w:r>
-    </w:p>
-    <w:p>
-      <w:pPr>
-        <w:pStyle w:val="ListParagraph"/>
-        <w:numPr>
-          <w:ilvl w:val="0"/>
-          <w:numId w:val="2"/>
-        </w:numPr>
-        <w:spacing w:after="60"/>
-      </w:pPr>
-      <w:r>
-        <w:rPr>
-          <w:rFonts w:ascii="Calibri" w:cs="Calibri" w:eastAsia="Calibri" w:hAnsi="Calibri"/>
-          <w:b w:val="false"/>
-          <w:bCs w:val="false"/>
-          <w:i w:val="false"/>
-          <w:iCs w:val="false"/>
-          <w:color w:val="333333"/>
-          <w:sz w:val="19"/>
-          <w:szCs w:val="19"/>
-        </w:rPr>
-        <w:t xml:space="preserve">Inventory management</w:t>
-      </w:r>
-    </w:p>
-    <w:p>
-      <w:pPr>
-        <w:pStyle w:val="ListParagraph"/>
-        <w:numPr>
-          <w:ilvl w:val="0"/>
-          <w:numId w:val="2"/>
-        </w:numPr>
-        <w:spacing w:after="60"/>
-      </w:pPr>
-      <w:r>
-        <w:rPr>
-          <w:rFonts w:ascii="Calibri" w:cs="Calibri" w:eastAsia="Calibri" w:hAnsi="Calibri"/>
-          <w:b w:val="false"/>
-          <w:bCs w:val="false"/>
-          <w:i w:val="false"/>
-          <w:iCs w:val="false"/>
-          <w:color w:val="333333"/>
-          <w:sz w:val="19"/>
-          <w:szCs w:val="19"/>
-        </w:rPr>
-        <w:t xml:space="preserve">Payment flow integration</w:t>
-      </w:r>
-    </w:p>
-    <w:p>
-      <w:pPr>
-        <w:spacing w:after="40" w:before="80"/>
-      </w:pPr>
-      <w:r>
-        <w:rPr>
-          <w:rFonts w:ascii="Calibri" w:cs="Calibri" w:eastAsia="Calibri" w:hAnsi="Calibri"/>
-          <w:b/>
-          <w:bCs/>
-          <w:i w:val="false"/>
-          <w:iCs w:val="false"/>
-          <w:color w:val="333333"/>
-          <w:sz w:val="19"/>
-          <w:szCs w:val="19"/>
-        </w:rPr>
-        <w:t xml:space="preserve">Impact metrics</w:t>
-      </w:r>
-    </w:p>
-    <w:p>
-      <w:pPr>
-        <w:pStyle w:val="ListParagraph"/>
-        <w:numPr>
-          <w:ilvl w:val="0"/>
-          <w:numId w:val="2"/>
-        </w:numPr>
-        <w:spacing w:after="60"/>
-      </w:pPr>
-      <w:r>
-        <w:rPr>
-          <w:rFonts w:ascii="Calibri" w:cs="Calibri" w:eastAsia="Calibri" w:hAnsi="Calibri"/>
-          <w:b w:val="false"/>
-          <w:bCs w:val="false"/>
-          <w:i w:val="false"/>
-          <w:iCs w:val="false"/>
-          <w:color w:val="333333"/>
-          <w:sz w:val="19"/>
-          <w:szCs w:val="19"/>
-        </w:rPr>
-        <w:t xml:space="preserve">Features: 0 → Full cart + checkout (100%)</w:t>
-      </w:r>
-    </w:p>
-    <w:p>
-      <w:pPr>
-        <w:pStyle w:val="ListParagraph"/>
-        <w:numPr>
-          <w:ilvl w:val="0"/>
-          <w:numId w:val="2"/>
-        </w:numPr>
-        <w:spacing w:after="60"/>
-      </w:pPr>
-      <w:r>
-        <w:rPr>
-          <w:rFonts w:ascii="Calibri" w:cs="Calibri" w:eastAsia="Calibri" w:hAnsi="Calibri"/>
-          <w:b w:val="false"/>
-          <w:bCs w:val="false"/>
-          <w:i w:val="false"/>
-          <w:iCs w:val="false"/>
-          <w:color w:val="333333"/>
-          <w:sz w:val="19"/>
-          <w:szCs w:val="19"/>
-        </w:rPr>
-        <w:t xml:space="preserve">GUI Screens: N/A → Multi-panel UI (Complete)</w:t>
-      </w:r>
-    </w:p>
-    <w:p>
-      <w:pPr>
-        <w:pStyle w:val="ListParagraph"/>
-        <w:numPr>
-          <w:ilvl w:val="0"/>
-          <w:numId w:val="2"/>
-        </w:numPr>
-        <w:spacing w:after="60"/>
-      </w:pPr>
-      <w:r>
-        <w:rPr>
-          <w:rFonts w:ascii="Calibri" w:cs="Calibri" w:eastAsia="Calibri" w:hAnsi="Calibri"/>
-          <w:b w:val="false"/>
-          <w:bCs w:val="false"/>
-          <w:i w:val="false"/>
-          <w:iCs w:val="false"/>
-          <w:color w:val="333333"/>
-          <w:sz w:val="19"/>
-          <w:szCs w:val="19"/>
-        </w:rPr>
-        <w:t xml:space="preserve">Data Layer: None → MySQL integrated (Production-ready)</w:t>
+        <w:t xml:space="preserve">PWA offline behavior</w:t>
+      </w:r>
+    </w:p>
+    <w:p>
+      <w:pPr>
+        <w:pStyle w:val="ListParagraph"/>
+        <w:numPr>
+          <w:ilvl w:val="0"/>
+          <w:numId w:val="2"/>
+        </w:numPr>
+        <w:spacing w:after="60"/>
+      </w:pPr>
+      <w:r>
+        <w:rPr>
+          <w:rFonts w:ascii="Calibri" w:cs="Calibri" w:eastAsia="Calibri" w:hAnsi="Calibri"/>
+          <w:b w:val="false"/>
+          <w:bCs w:val="false"/>
+          <w:i w:val="false"/>
+          <w:iCs w:val="false"/>
+          <w:color w:val="333333"/>
+          <w:sz w:val="19"/>
+          <w:szCs w:val="19"/>
+        </w:rPr>
+        <w:t xml:space="preserve">Complex form flows</w:t>
+      </w:r>
+    </w:p>
+    <w:p>
+      <w:pPr>
+        <w:pStyle w:val="ListParagraph"/>
+        <w:numPr>
+          <w:ilvl w:val="0"/>
+          <w:numId w:val="2"/>
+        </w:numPr>
+        <w:spacing w:after="60"/>
+      </w:pPr>
+      <w:r>
+        <w:rPr>
+          <w:rFonts w:ascii="Calibri" w:cs="Calibri" w:eastAsia="Calibri" w:hAnsi="Calibri"/>
+          <w:b w:val="false"/>
+          <w:bCs w:val="false"/>
+          <w:i w:val="false"/>
+          <w:iCs w:val="false"/>
+          <w:color w:val="333333"/>
+          <w:sz w:val="19"/>
+          <w:szCs w:val="19"/>
+        </w:rPr>
+        <w:t xml:space="preserve">Mobile-first UX</w:t>
       </w:r>
     </w:p>
     <w:p>
@@ -2175,7 +2088,7 @@
           <w:sz w:val="26"/>
           <w:szCs w:val="26"/>
         </w:rPr>
-        <w:t xml:space="preserve">arnlibrary</w:t>
+        <w:t xml:space="preserve">BestBuy Electronics</w:t>
       </w:r>
       <w:r>
         <w:rPr>
@@ -2188,6 +2101,984 @@
           <w:sz w:val="20"/>
           <w:szCs w:val="20"/>
         </w:rPr>
+        <w:t xml:space="preserve"> — Full-Stack E-Commerce</w:t>
+      </w:r>
+    </w:p>
+    <w:p>
+      <w:pPr>
+        <w:spacing w:after="120"/>
+      </w:pPr>
+      <w:r>
+        <w:rPr>
+          <w:rFonts w:ascii="Calibri" w:cs="Calibri" w:eastAsia="Calibri" w:hAnsi="Calibri"/>
+          <w:b w:val="false"/>
+          <w:bCs w:val="false"/>
+          <w:i w:val="false"/>
+          <w:iCs w:val="false"/>
+          <w:color w:val="333333"/>
+          <w:sz w:val="19"/>
+          <w:szCs w:val="19"/>
+        </w:rPr>
+        <w:t xml:space="preserve">Problem: Electronics retail needed a modern storefront with a scalable backend for products, orders, and customer data.</w:t>
+      </w:r>
+    </w:p>
+    <w:p>
+      <w:pPr>
+        <w:spacing w:after="120"/>
+      </w:pPr>
+      <w:r>
+        <w:rPr>
+          <w:rFonts w:ascii="Calibri" w:cs="Calibri" w:eastAsia="Calibri" w:hAnsi="Calibri"/>
+          <w:b w:val="false"/>
+          <w:bCs w:val="false"/>
+          <w:i w:val="false"/>
+          <w:iCs w:val="false"/>
+          <w:color w:val="333333"/>
+          <w:sz w:val="19"/>
+          <w:szCs w:val="19"/>
+        </w:rPr>
+        <w:t xml:space="preserve">Built: Split repos: responsive React storefront with product catalog &amp; checkout; Next.js API backend with Supabase for auth, inventory, and orders.</w:t>
+      </w:r>
+    </w:p>
+    <w:p>
+      <w:pPr>
+        <w:spacing w:after="120"/>
+      </w:pPr>
+      <w:r>
+        <w:rPr>
+          <w:rFonts w:ascii="Calibri" w:cs="Calibri" w:eastAsia="Calibri" w:hAnsi="Calibri"/>
+          <w:b w:val="false"/>
+          <w:bCs w:val="false"/>
+          <w:i w:val="false"/>
+          <w:iCs w:val="false"/>
+          <w:color w:val="333333"/>
+          <w:sz w:val="19"/>
+          <w:szCs w:val="19"/>
+        </w:rPr>
+        <w:t xml:space="preserve">Outcome: End-to-end online store with separated frontend/backend deployment.</w:t>
+      </w:r>
+    </w:p>
+    <w:p>
+      <w:pPr>
+        <w:spacing w:after="80"/>
+      </w:pPr>
+      <w:r>
+        <w:rPr>
+          <w:rFonts w:ascii="Calibri" w:cs="Calibri" w:eastAsia="Calibri" w:hAnsi="Calibri"/>
+          <w:b/>
+          <w:bCs/>
+          <w:i w:val="false"/>
+          <w:iCs w:val="false"/>
+          <w:color w:val="333333"/>
+          <w:sz w:val="19"/>
+          <w:szCs w:val="19"/>
+        </w:rPr>
+        <w:t xml:space="preserve">Tech: TypeScript, React, Next.js, Supabase, E-Commerce</w:t>
+      </w:r>
+    </w:p>
+    <w:p>
+      <w:pPr>
+        <w:spacing w:after="80"/>
+      </w:pPr>
+      <w:hyperlink w:history="1" r:id="rIdwo7hdzvxhy9vqco7motdl">
+        <w:r>
+          <w:rPr>
+            <w:rFonts w:ascii="Calibri" w:cs="Calibri" w:eastAsia="Calibri" w:hAnsi="Calibri"/>
+            <w:b w:val="false"/>
+            <w:bCs w:val="false"/>
+            <w:i w:val="false"/>
+            <w:iCs w:val="false"/>
+            <w:color w:val="0563C1"/>
+            <w:sz w:val="19"/>
+            <w:szCs w:val="19"/>
+          </w:rPr>
+          <w:t xml:space="preserve">GitHub: https://github.com/Arn-The-Wolf/bestbuyelectronics_frontend</w:t>
+        </w:r>
+      </w:hyperlink>
+    </w:p>
+    <w:p>
+      <w:pPr>
+        <w:spacing w:after="40" w:before="60"/>
+      </w:pPr>
+      <w:r>
+        <w:rPr>
+          <w:rFonts w:ascii="Calibri" w:cs="Calibri" w:eastAsia="Calibri" w:hAnsi="Calibri"/>
+          <w:b/>
+          <w:bCs/>
+          <w:i w:val="false"/>
+          <w:iCs w:val="false"/>
+          <w:color w:val="333333"/>
+          <w:sz w:val="19"/>
+          <w:szCs w:val="19"/>
+        </w:rPr>
+        <w:t xml:space="preserve">Key results</w:t>
+      </w:r>
+    </w:p>
+    <w:p>
+      <w:pPr>
+        <w:pStyle w:val="ListParagraph"/>
+        <w:numPr>
+          <w:ilvl w:val="0"/>
+          <w:numId w:val="2"/>
+        </w:numPr>
+        <w:spacing w:after="60"/>
+      </w:pPr>
+      <w:r>
+        <w:rPr>
+          <w:rFonts w:ascii="Calibri" w:cs="Calibri" w:eastAsia="Calibri" w:hAnsi="Calibri"/>
+          <w:b w:val="false"/>
+          <w:bCs w:val="false"/>
+          <w:i w:val="false"/>
+          <w:iCs w:val="false"/>
+          <w:color w:val="333333"/>
+          <w:sz w:val="19"/>
+          <w:szCs w:val="19"/>
+        </w:rPr>
+        <w:t xml:space="preserve">React e-commerce UI</w:t>
+      </w:r>
+    </w:p>
+    <w:p>
+      <w:pPr>
+        <w:pStyle w:val="ListParagraph"/>
+        <w:numPr>
+          <w:ilvl w:val="0"/>
+          <w:numId w:val="2"/>
+        </w:numPr>
+        <w:spacing w:after="60"/>
+      </w:pPr>
+      <w:r>
+        <w:rPr>
+          <w:rFonts w:ascii="Calibri" w:cs="Calibri" w:eastAsia="Calibri" w:hAnsi="Calibri"/>
+          <w:b w:val="false"/>
+          <w:bCs w:val="false"/>
+          <w:i w:val="false"/>
+          <w:iCs w:val="false"/>
+          <w:color w:val="333333"/>
+          <w:sz w:val="19"/>
+          <w:szCs w:val="19"/>
+        </w:rPr>
+        <w:t xml:space="preserve">Next.js + Supabase API</w:t>
+      </w:r>
+    </w:p>
+    <w:p>
+      <w:pPr>
+        <w:pStyle w:val="ListParagraph"/>
+        <w:numPr>
+          <w:ilvl w:val="0"/>
+          <w:numId w:val="2"/>
+        </w:numPr>
+        <w:spacing w:after="60"/>
+      </w:pPr>
+      <w:r>
+        <w:rPr>
+          <w:rFonts w:ascii="Calibri" w:cs="Calibri" w:eastAsia="Calibri" w:hAnsi="Calibri"/>
+          <w:b w:val="false"/>
+          <w:bCs w:val="false"/>
+          <w:i w:val="false"/>
+          <w:iCs w:val="false"/>
+          <w:color w:val="333333"/>
+          <w:sz w:val="19"/>
+          <w:szCs w:val="19"/>
+        </w:rPr>
+        <w:t xml:space="preserve">Product &amp; order management</w:t>
+      </w:r>
+    </w:p>
+    <w:p>
+      <w:pPr>
+        <w:spacing w:after="40" w:before="80"/>
+      </w:pPr>
+      <w:r>
+        <w:rPr>
+          <w:rFonts w:ascii="Calibri" w:cs="Calibri" w:eastAsia="Calibri" w:hAnsi="Calibri"/>
+          <w:b/>
+          <w:bCs/>
+          <w:i w:val="false"/>
+          <w:iCs w:val="false"/>
+          <w:color w:val="333333"/>
+          <w:sz w:val="19"/>
+          <w:szCs w:val="19"/>
+        </w:rPr>
+        <w:t xml:space="preserve">Challenges solved</w:t>
+      </w:r>
+    </w:p>
+    <w:p>
+      <w:pPr>
+        <w:pStyle w:val="ListParagraph"/>
+        <w:numPr>
+          <w:ilvl w:val="0"/>
+          <w:numId w:val="2"/>
+        </w:numPr>
+        <w:spacing w:after="60"/>
+      </w:pPr>
+      <w:r>
+        <w:rPr>
+          <w:rFonts w:ascii="Calibri" w:cs="Calibri" w:eastAsia="Calibri" w:hAnsi="Calibri"/>
+          <w:b w:val="false"/>
+          <w:bCs w:val="false"/>
+          <w:i w:val="false"/>
+          <w:iCs w:val="false"/>
+          <w:color w:val="333333"/>
+          <w:sz w:val="19"/>
+          <w:szCs w:val="19"/>
+        </w:rPr>
+        <w:t xml:space="preserve">Supabase schema design</w:t>
+      </w:r>
+    </w:p>
+    <w:p>
+      <w:pPr>
+        <w:pStyle w:val="ListParagraph"/>
+        <w:numPr>
+          <w:ilvl w:val="0"/>
+          <w:numId w:val="2"/>
+        </w:numPr>
+        <w:spacing w:after="60"/>
+      </w:pPr>
+      <w:r>
+        <w:rPr>
+          <w:rFonts w:ascii="Calibri" w:cs="Calibri" w:eastAsia="Calibri" w:hAnsi="Calibri"/>
+          <w:b w:val="false"/>
+          <w:bCs w:val="false"/>
+          <w:i w:val="false"/>
+          <w:iCs w:val="false"/>
+          <w:color w:val="333333"/>
+          <w:sz w:val="19"/>
+          <w:szCs w:val="19"/>
+        </w:rPr>
+        <w:t xml:space="preserve">Cart &amp; checkout flow</w:t>
+      </w:r>
+    </w:p>
+    <w:p>
+      <w:pPr>
+        <w:pStyle w:val="ListParagraph"/>
+        <w:numPr>
+          <w:ilvl w:val="0"/>
+          <w:numId w:val="2"/>
+        </w:numPr>
+        <w:spacing w:after="60"/>
+      </w:pPr>
+      <w:r>
+        <w:rPr>
+          <w:rFonts w:ascii="Calibri" w:cs="Calibri" w:eastAsia="Calibri" w:hAnsi="Calibri"/>
+          <w:b w:val="false"/>
+          <w:bCs w:val="false"/>
+          <w:i w:val="false"/>
+          <w:iCs w:val="false"/>
+          <w:color w:val="333333"/>
+          <w:sz w:val="19"/>
+          <w:szCs w:val="19"/>
+        </w:rPr>
+        <w:t xml:space="preserve">Responsive storefront</w:t>
+      </w:r>
+    </w:p>
+    <w:p>
+      <w:pPr>
+        <w:spacing w:after="40" w:before="180"/>
+      </w:pPr>
+      <w:r>
+        <w:rPr>
+          <w:rFonts w:ascii="Calibri" w:cs="Calibri" w:eastAsia="Calibri" w:hAnsi="Calibri"/>
+          <w:b/>
+          <w:bCs/>
+          <w:i w:val="false"/>
+          <w:iCs w:val="false"/>
+          <w:color w:val="2C3E50"/>
+          <w:sz w:val="26"/>
+          <w:szCs w:val="26"/>
+        </w:rPr>
+        <w:t xml:space="preserve">AviaServe</w:t>
+      </w:r>
+      <w:r>
+        <w:rPr>
+          <w:rFonts w:ascii="Calibri" w:cs="Calibri" w:eastAsia="Calibri" w:hAnsi="Calibri"/>
+          <w:b w:val="false"/>
+          <w:bCs w:val="false"/>
+          <w:i w:val="false"/>
+          <w:iCs w:val="false"/>
+          <w:color w:val="666666"/>
+          <w:sz w:val="20"/>
+          <w:szCs w:val="20"/>
+        </w:rPr>
+        <w:t xml:space="preserve"> — Airline Reservation System</w:t>
+      </w:r>
+    </w:p>
+    <w:p>
+      <w:pPr>
+        <w:spacing w:after="120"/>
+      </w:pPr>
+      <w:r>
+        <w:rPr>
+          <w:rFonts w:ascii="Calibri" w:cs="Calibri" w:eastAsia="Calibri" w:hAnsi="Calibri"/>
+          <w:b w:val="false"/>
+          <w:bCs w:val="false"/>
+          <w:i w:val="false"/>
+          <w:iCs w:val="false"/>
+          <w:color w:val="333333"/>
+          <w:sz w:val="19"/>
+          <w:szCs w:val="19"/>
+        </w:rPr>
+        <w:t xml:space="preserve">Problem: Airline booking flows need reliable search, seat selection, and reservation management across routes.</w:t>
+      </w:r>
+    </w:p>
+    <w:p>
+      <w:pPr>
+        <w:spacing w:after="120"/>
+      </w:pPr>
+      <w:r>
+        <w:rPr>
+          <w:rFonts w:ascii="Calibri" w:cs="Calibri" w:eastAsia="Calibri" w:hAnsi="Calibri"/>
+          <w:b w:val="false"/>
+          <w:bCs w:val="false"/>
+          <w:i w:val="false"/>
+          <w:iCs w:val="false"/>
+          <w:color w:val="333333"/>
+          <w:sz w:val="19"/>
+          <w:szCs w:val="19"/>
+        </w:rPr>
+        <w:t xml:space="preserve">Built: Full-stack TypeScript application with route search, booking logic, and reservation management.</w:t>
+      </w:r>
+    </w:p>
+    <w:p>
+      <w:pPr>
+        <w:spacing w:after="120"/>
+      </w:pPr>
+      <w:r>
+        <w:rPr>
+          <w:rFonts w:ascii="Calibri" w:cs="Calibri" w:eastAsia="Calibri" w:hAnsi="Calibri"/>
+          <w:b w:val="false"/>
+          <w:bCs w:val="false"/>
+          <w:i w:val="false"/>
+          <w:iCs w:val="false"/>
+          <w:color w:val="333333"/>
+          <w:sz w:val="19"/>
+          <w:szCs w:val="19"/>
+        </w:rPr>
+        <w:t xml:space="preserve">Outcome: Complete reservation workflow for multi-route airline scenarios.</w:t>
+      </w:r>
+    </w:p>
+    <w:p>
+      <w:pPr>
+        <w:spacing w:after="80"/>
+      </w:pPr>
+      <w:r>
+        <w:rPr>
+          <w:rFonts w:ascii="Calibri" w:cs="Calibri" w:eastAsia="Calibri" w:hAnsi="Calibri"/>
+          <w:b/>
+          <w:bCs/>
+          <w:i w:val="false"/>
+          <w:iCs w:val="false"/>
+          <w:color w:val="333333"/>
+          <w:sz w:val="19"/>
+          <w:szCs w:val="19"/>
+        </w:rPr>
+        <w:t xml:space="preserve">Tech: TypeScript, Node.js, React, REST API, PostgreSQL</w:t>
+      </w:r>
+    </w:p>
+    <w:p>
+      <w:pPr>
+        <w:spacing w:after="80"/>
+      </w:pPr>
+      <w:hyperlink w:history="1" r:id="rIdjfduemdbfbzzkylgspzrb">
+        <w:r>
+          <w:rPr>
+            <w:rFonts w:ascii="Calibri" w:cs="Calibri" w:eastAsia="Calibri" w:hAnsi="Calibri"/>
+            <w:b w:val="false"/>
+            <w:bCs w:val="false"/>
+            <w:i w:val="false"/>
+            <w:iCs w:val="false"/>
+            <w:color w:val="0563C1"/>
+            <w:sz w:val="19"/>
+            <w:szCs w:val="19"/>
+          </w:rPr>
+          <w:t xml:space="preserve">GitHub: https://github.com/Arn-The-Wolf/aviaserve</w:t>
+        </w:r>
+      </w:hyperlink>
+    </w:p>
+    <w:p>
+      <w:pPr>
+        <w:spacing w:after="40" w:before="60"/>
+      </w:pPr>
+      <w:r>
+        <w:rPr>
+          <w:rFonts w:ascii="Calibri" w:cs="Calibri" w:eastAsia="Calibri" w:hAnsi="Calibri"/>
+          <w:b/>
+          <w:bCs/>
+          <w:i w:val="false"/>
+          <w:iCs w:val="false"/>
+          <w:color w:val="333333"/>
+          <w:sz w:val="19"/>
+          <w:szCs w:val="19"/>
+        </w:rPr>
+        <w:t xml:space="preserve">Key results</w:t>
+      </w:r>
+    </w:p>
+    <w:p>
+      <w:pPr>
+        <w:pStyle w:val="ListParagraph"/>
+        <w:numPr>
+          <w:ilvl w:val="0"/>
+          <w:numId w:val="2"/>
+        </w:numPr>
+        <w:spacing w:after="60"/>
+      </w:pPr>
+      <w:r>
+        <w:rPr>
+          <w:rFonts w:ascii="Calibri" w:cs="Calibri" w:eastAsia="Calibri" w:hAnsi="Calibri"/>
+          <w:b w:val="false"/>
+          <w:bCs w:val="false"/>
+          <w:i w:val="false"/>
+          <w:iCs w:val="false"/>
+          <w:color w:val="333333"/>
+          <w:sz w:val="19"/>
+          <w:szCs w:val="19"/>
+        </w:rPr>
+        <w:t xml:space="preserve">Multi-route reservations</w:t>
+      </w:r>
+    </w:p>
+    <w:p>
+      <w:pPr>
+        <w:pStyle w:val="ListParagraph"/>
+        <w:numPr>
+          <w:ilvl w:val="0"/>
+          <w:numId w:val="2"/>
+        </w:numPr>
+        <w:spacing w:after="60"/>
+      </w:pPr>
+      <w:r>
+        <w:rPr>
+          <w:rFonts w:ascii="Calibri" w:cs="Calibri" w:eastAsia="Calibri" w:hAnsi="Calibri"/>
+          <w:b w:val="false"/>
+          <w:bCs w:val="false"/>
+          <w:i w:val="false"/>
+          <w:iCs w:val="false"/>
+          <w:color w:val="333333"/>
+          <w:sz w:val="19"/>
+          <w:szCs w:val="19"/>
+        </w:rPr>
+        <w:t xml:space="preserve">TypeScript full stack</w:t>
+      </w:r>
+    </w:p>
+    <w:p>
+      <w:pPr>
+        <w:pStyle w:val="ListParagraph"/>
+        <w:numPr>
+          <w:ilvl w:val="0"/>
+          <w:numId w:val="2"/>
+        </w:numPr>
+        <w:spacing w:after="60"/>
+      </w:pPr>
+      <w:r>
+        <w:rPr>
+          <w:rFonts w:ascii="Calibri" w:cs="Calibri" w:eastAsia="Calibri" w:hAnsi="Calibri"/>
+          <w:b w:val="false"/>
+          <w:bCs w:val="false"/>
+          <w:i w:val="false"/>
+          <w:iCs w:val="false"/>
+          <w:color w:val="333333"/>
+          <w:sz w:val="19"/>
+          <w:szCs w:val="19"/>
+        </w:rPr>
+        <w:t xml:space="preserve">Booking management UI</w:t>
+      </w:r>
+    </w:p>
+    <w:p>
+      <w:pPr>
+        <w:spacing w:after="40" w:before="80"/>
+      </w:pPr>
+      <w:r>
+        <w:rPr>
+          <w:rFonts w:ascii="Calibri" w:cs="Calibri" w:eastAsia="Calibri" w:hAnsi="Calibri"/>
+          <w:b/>
+          <w:bCs/>
+          <w:i w:val="false"/>
+          <w:iCs w:val="false"/>
+          <w:color w:val="333333"/>
+          <w:sz w:val="19"/>
+          <w:szCs w:val="19"/>
+        </w:rPr>
+        <w:t xml:space="preserve">Challenges solved</w:t>
+      </w:r>
+    </w:p>
+    <w:p>
+      <w:pPr>
+        <w:pStyle w:val="ListParagraph"/>
+        <w:numPr>
+          <w:ilvl w:val="0"/>
+          <w:numId w:val="2"/>
+        </w:numPr>
+        <w:spacing w:after="60"/>
+      </w:pPr>
+      <w:r>
+        <w:rPr>
+          <w:rFonts w:ascii="Calibri" w:cs="Calibri" w:eastAsia="Calibri" w:hAnsi="Calibri"/>
+          <w:b w:val="false"/>
+          <w:bCs w:val="false"/>
+          <w:i w:val="false"/>
+          <w:iCs w:val="false"/>
+          <w:color w:val="333333"/>
+          <w:sz w:val="19"/>
+          <w:szCs w:val="19"/>
+        </w:rPr>
+        <w:t xml:space="preserve">Route &amp; schedule modeling</w:t>
+      </w:r>
+    </w:p>
+    <w:p>
+      <w:pPr>
+        <w:pStyle w:val="ListParagraph"/>
+        <w:numPr>
+          <w:ilvl w:val="0"/>
+          <w:numId w:val="2"/>
+        </w:numPr>
+        <w:spacing w:after="60"/>
+      </w:pPr>
+      <w:r>
+        <w:rPr>
+          <w:rFonts w:ascii="Calibri" w:cs="Calibri" w:eastAsia="Calibri" w:hAnsi="Calibri"/>
+          <w:b w:val="false"/>
+          <w:bCs w:val="false"/>
+          <w:i w:val="false"/>
+          <w:iCs w:val="false"/>
+          <w:color w:val="333333"/>
+          <w:sz w:val="19"/>
+          <w:szCs w:val="19"/>
+        </w:rPr>
+        <w:t xml:space="preserve">Booking concurrency</w:t>
+      </w:r>
+    </w:p>
+    <w:p>
+      <w:pPr>
+        <w:pStyle w:val="ListParagraph"/>
+        <w:numPr>
+          <w:ilvl w:val="0"/>
+          <w:numId w:val="2"/>
+        </w:numPr>
+        <w:spacing w:after="60"/>
+      </w:pPr>
+      <w:r>
+        <w:rPr>
+          <w:rFonts w:ascii="Calibri" w:cs="Calibri" w:eastAsia="Calibri" w:hAnsi="Calibri"/>
+          <w:b w:val="false"/>
+          <w:bCs w:val="false"/>
+          <w:i w:val="false"/>
+          <w:iCs w:val="false"/>
+          <w:color w:val="333333"/>
+          <w:sz w:val="19"/>
+          <w:szCs w:val="19"/>
+        </w:rPr>
+        <w:t xml:space="preserve">Search performance</w:t>
+      </w:r>
+    </w:p>
+    <w:p>
+      <w:pPr>
+        <w:spacing w:after="40" w:before="180"/>
+      </w:pPr>
+      <w:r>
+        <w:rPr>
+          <w:rFonts w:ascii="Calibri" w:cs="Calibri" w:eastAsia="Calibri" w:hAnsi="Calibri"/>
+          <w:b/>
+          <w:bCs/>
+          <w:i w:val="false"/>
+          <w:iCs w:val="false"/>
+          <w:color w:val="2C3E50"/>
+          <w:sz w:val="26"/>
+          <w:szCs w:val="26"/>
+        </w:rPr>
+        <w:t xml:space="preserve">ArnShop Full Stack</w:t>
+      </w:r>
+      <w:r>
+        <w:rPr>
+          <w:rFonts w:ascii="Calibri" w:cs="Calibri" w:eastAsia="Calibri" w:hAnsi="Calibri"/>
+          <w:b w:val="false"/>
+          <w:bCs w:val="false"/>
+          <w:i w:val="false"/>
+          <w:iCs w:val="false"/>
+          <w:color w:val="666666"/>
+          <w:sz w:val="20"/>
+          <w:szCs w:val="20"/>
+        </w:rPr>
+        <w:t xml:space="preserve"> — Java + React E-Commerce</w:t>
+      </w:r>
+    </w:p>
+    <w:p>
+      <w:pPr>
+        <w:spacing w:after="120"/>
+      </w:pPr>
+      <w:r>
+        <w:rPr>
+          <w:rFonts w:ascii="Calibri" w:cs="Calibri" w:eastAsia="Calibri" w:hAnsi="Calibri"/>
+          <w:b w:val="false"/>
+          <w:bCs w:val="false"/>
+          <w:i w:val="false"/>
+          <w:iCs w:val="false"/>
+          <w:color w:val="333333"/>
+          <w:sz w:val="19"/>
+          <w:szCs w:val="19"/>
+        </w:rPr>
+        <w:t xml:space="preserve">Problem: Needed a complete e-commerce system with a modern web frontend and robust Java backend for electronics retail.</w:t>
+      </w:r>
+    </w:p>
+    <w:p>
+      <w:pPr>
+        <w:spacing w:after="120"/>
+      </w:pPr>
+      <w:r>
+        <w:rPr>
+          <w:rFonts w:ascii="Calibri" w:cs="Calibri" w:eastAsia="Calibri" w:hAnsi="Calibri"/>
+          <w:b w:val="false"/>
+          <w:bCs w:val="false"/>
+          <w:i w:val="false"/>
+          <w:iCs w:val="false"/>
+          <w:color w:val="333333"/>
+          <w:sz w:val="19"/>
+          <w:szCs w:val="19"/>
+        </w:rPr>
+        <w:t xml:space="preserve">Built: React client connected to Java REST services with MySQL persistence, inventory controls, and admin order management.</w:t>
+      </w:r>
+    </w:p>
+    <w:p>
+      <w:pPr>
+        <w:spacing w:after="120"/>
+      </w:pPr>
+      <w:r>
+        <w:rPr>
+          <w:rFonts w:ascii="Calibri" w:cs="Calibri" w:eastAsia="Calibri" w:hAnsi="Calibri"/>
+          <w:b w:val="false"/>
+          <w:bCs w:val="false"/>
+          <w:i w:val="false"/>
+          <w:iCs w:val="false"/>
+          <w:color w:val="333333"/>
+          <w:sz w:val="19"/>
+          <w:szCs w:val="19"/>
+        </w:rPr>
+        <w:t xml:space="preserve">Outcome: Production-style e-commerce split across modern frontend and Java API layer.</w:t>
+      </w:r>
+    </w:p>
+    <w:p>
+      <w:pPr>
+        <w:spacing w:after="80"/>
+      </w:pPr>
+      <w:r>
+        <w:rPr>
+          <w:rFonts w:ascii="Calibri" w:cs="Calibri" w:eastAsia="Calibri" w:hAnsi="Calibri"/>
+          <w:b/>
+          <w:bCs/>
+          <w:i w:val="false"/>
+          <w:iCs w:val="false"/>
+          <w:color w:val="333333"/>
+          <w:sz w:val="19"/>
+          <w:szCs w:val="19"/>
+        </w:rPr>
+        <w:t xml:space="preserve">Tech: Java, React, MySQL, REST API, E-Commerce</w:t>
+      </w:r>
+    </w:p>
+    <w:p>
+      <w:pPr>
+        <w:spacing w:after="80"/>
+      </w:pPr>
+      <w:hyperlink w:history="1" r:id="rIdmurdhqmobe9ogc1xfed7b">
+        <w:r>
+          <w:rPr>
+            <w:rFonts w:ascii="Calibri" w:cs="Calibri" w:eastAsia="Calibri" w:hAnsi="Calibri"/>
+            <w:b w:val="false"/>
+            <w:bCs w:val="false"/>
+            <w:i w:val="false"/>
+            <w:iCs w:val="false"/>
+            <w:color w:val="0563C1"/>
+            <w:sz w:val="19"/>
+            <w:szCs w:val="19"/>
+          </w:rPr>
+          <w:t xml:space="preserve">GitHub: https://github.com/Arn-The-Wolf/arnshop_fullstack</w:t>
+        </w:r>
+      </w:hyperlink>
+    </w:p>
+    <w:p>
+      <w:pPr>
+        <w:spacing w:after="40" w:before="60"/>
+      </w:pPr>
+      <w:r>
+        <w:rPr>
+          <w:rFonts w:ascii="Calibri" w:cs="Calibri" w:eastAsia="Calibri" w:hAnsi="Calibri"/>
+          <w:b/>
+          <w:bCs/>
+          <w:i w:val="false"/>
+          <w:iCs w:val="false"/>
+          <w:color w:val="333333"/>
+          <w:sz w:val="19"/>
+          <w:szCs w:val="19"/>
+        </w:rPr>
+        <w:t xml:space="preserve">Key results</w:t>
+      </w:r>
+    </w:p>
+    <w:p>
+      <w:pPr>
+        <w:pStyle w:val="ListParagraph"/>
+        <w:numPr>
+          <w:ilvl w:val="0"/>
+          <w:numId w:val="2"/>
+        </w:numPr>
+        <w:spacing w:after="60"/>
+      </w:pPr>
+      <w:r>
+        <w:rPr>
+          <w:rFonts w:ascii="Calibri" w:cs="Calibri" w:eastAsia="Calibri" w:hAnsi="Calibri"/>
+          <w:b w:val="false"/>
+          <w:bCs w:val="false"/>
+          <w:i w:val="false"/>
+          <w:iCs w:val="false"/>
+          <w:color w:val="333333"/>
+          <w:sz w:val="19"/>
+          <w:szCs w:val="19"/>
+        </w:rPr>
+        <w:t xml:space="preserve">React + Java full stack</w:t>
+      </w:r>
+    </w:p>
+    <w:p>
+      <w:pPr>
+        <w:pStyle w:val="ListParagraph"/>
+        <w:numPr>
+          <w:ilvl w:val="0"/>
+          <w:numId w:val="2"/>
+        </w:numPr>
+        <w:spacing w:after="60"/>
+      </w:pPr>
+      <w:r>
+        <w:rPr>
+          <w:rFonts w:ascii="Calibri" w:cs="Calibri" w:eastAsia="Calibri" w:hAnsi="Calibri"/>
+          <w:b w:val="false"/>
+          <w:bCs w:val="false"/>
+          <w:i w:val="false"/>
+          <w:iCs w:val="false"/>
+          <w:color w:val="333333"/>
+          <w:sz w:val="19"/>
+          <w:szCs w:val="19"/>
+        </w:rPr>
+        <w:t xml:space="preserve">Product catalog &amp; cart</w:t>
+      </w:r>
+    </w:p>
+    <w:p>
+      <w:pPr>
+        <w:pStyle w:val="ListParagraph"/>
+        <w:numPr>
+          <w:ilvl w:val="0"/>
+          <w:numId w:val="2"/>
+        </w:numPr>
+        <w:spacing w:after="60"/>
+      </w:pPr>
+      <w:r>
+        <w:rPr>
+          <w:rFonts w:ascii="Calibri" w:cs="Calibri" w:eastAsia="Calibri" w:hAnsi="Calibri"/>
+          <w:b w:val="false"/>
+          <w:bCs w:val="false"/>
+          <w:i w:val="false"/>
+          <w:iCs w:val="false"/>
+          <w:color w:val="333333"/>
+          <w:sz w:val="19"/>
+          <w:szCs w:val="19"/>
+        </w:rPr>
+        <w:t xml:space="preserve">Order management</w:t>
+      </w:r>
+    </w:p>
+    <w:p>
+      <w:pPr>
+        <w:spacing w:after="40" w:before="80"/>
+      </w:pPr>
+      <w:r>
+        <w:rPr>
+          <w:rFonts w:ascii="Calibri" w:cs="Calibri" w:eastAsia="Calibri" w:hAnsi="Calibri"/>
+          <w:b/>
+          <w:bCs/>
+          <w:i w:val="false"/>
+          <w:iCs w:val="false"/>
+          <w:color w:val="333333"/>
+          <w:sz w:val="19"/>
+          <w:szCs w:val="19"/>
+        </w:rPr>
+        <w:t xml:space="preserve">Challenges solved</w:t>
+      </w:r>
+    </w:p>
+    <w:p>
+      <w:pPr>
+        <w:pStyle w:val="ListParagraph"/>
+        <w:numPr>
+          <w:ilvl w:val="0"/>
+          <w:numId w:val="2"/>
+        </w:numPr>
+        <w:spacing w:after="60"/>
+      </w:pPr>
+      <w:r>
+        <w:rPr>
+          <w:rFonts w:ascii="Calibri" w:cs="Calibri" w:eastAsia="Calibri" w:hAnsi="Calibri"/>
+          <w:b w:val="false"/>
+          <w:bCs w:val="false"/>
+          <w:i w:val="false"/>
+          <w:iCs w:val="false"/>
+          <w:color w:val="333333"/>
+          <w:sz w:val="19"/>
+          <w:szCs w:val="19"/>
+        </w:rPr>
+        <w:t xml:space="preserve">Frontend/backend integration</w:t>
+      </w:r>
+    </w:p>
+    <w:p>
+      <w:pPr>
+        <w:pStyle w:val="ListParagraph"/>
+        <w:numPr>
+          <w:ilvl w:val="0"/>
+          <w:numId w:val="2"/>
+        </w:numPr>
+        <w:spacing w:after="60"/>
+      </w:pPr>
+      <w:r>
+        <w:rPr>
+          <w:rFonts w:ascii="Calibri" w:cs="Calibri" w:eastAsia="Calibri" w:hAnsi="Calibri"/>
+          <w:b w:val="false"/>
+          <w:bCs w:val="false"/>
+          <w:i w:val="false"/>
+          <w:iCs w:val="false"/>
+          <w:color w:val="333333"/>
+          <w:sz w:val="19"/>
+          <w:szCs w:val="19"/>
+        </w:rPr>
+        <w:t xml:space="preserve">Inventory sync</w:t>
+      </w:r>
+    </w:p>
+    <w:p>
+      <w:pPr>
+        <w:pStyle w:val="ListParagraph"/>
+        <w:numPr>
+          <w:ilvl w:val="0"/>
+          <w:numId w:val="2"/>
+        </w:numPr>
+        <w:spacing w:after="60"/>
+      </w:pPr>
+      <w:r>
+        <w:rPr>
+          <w:rFonts w:ascii="Calibri" w:cs="Calibri" w:eastAsia="Calibri" w:hAnsi="Calibri"/>
+          <w:b w:val="false"/>
+          <w:bCs w:val="false"/>
+          <w:i w:val="false"/>
+          <w:iCs w:val="false"/>
+          <w:color w:val="333333"/>
+          <w:sz w:val="19"/>
+          <w:szCs w:val="19"/>
+        </w:rPr>
+        <w:t xml:space="preserve">Checkout reliability</w:t>
+      </w:r>
+    </w:p>
+    <w:p>
+      <w:pPr>
+        <w:spacing w:after="40" w:before="80"/>
+      </w:pPr>
+      <w:r>
+        <w:rPr>
+          <w:rFonts w:ascii="Calibri" w:cs="Calibri" w:eastAsia="Calibri" w:hAnsi="Calibri"/>
+          <w:b/>
+          <w:bCs/>
+          <w:i w:val="false"/>
+          <w:iCs w:val="false"/>
+          <w:color w:val="333333"/>
+          <w:sz w:val="19"/>
+          <w:szCs w:val="19"/>
+        </w:rPr>
+        <w:t xml:space="preserve">Impact metrics</w:t>
+      </w:r>
+    </w:p>
+    <w:p>
+      <w:pPr>
+        <w:pStyle w:val="ListParagraph"/>
+        <w:numPr>
+          <w:ilvl w:val="0"/>
+          <w:numId w:val="2"/>
+        </w:numPr>
+        <w:spacing w:after="60"/>
+      </w:pPr>
+      <w:r>
+        <w:rPr>
+          <w:rFonts w:ascii="Calibri" w:cs="Calibri" w:eastAsia="Calibri" w:hAnsi="Calibri"/>
+          <w:b w:val="false"/>
+          <w:bCs w:val="false"/>
+          <w:i w:val="false"/>
+          <w:iCs w:val="false"/>
+          <w:color w:val="333333"/>
+          <w:sz w:val="19"/>
+          <w:szCs w:val="19"/>
+        </w:rPr>
+        <w:t xml:space="preserve">Features: 0 → Full cart + checkout (100%)</w:t>
+      </w:r>
+    </w:p>
+    <w:p>
+      <w:pPr>
+        <w:pStyle w:val="ListParagraph"/>
+        <w:numPr>
+          <w:ilvl w:val="0"/>
+          <w:numId w:val="2"/>
+        </w:numPr>
+        <w:spacing w:after="60"/>
+      </w:pPr>
+      <w:r>
+        <w:rPr>
+          <w:rFonts w:ascii="Calibri" w:cs="Calibri" w:eastAsia="Calibri" w:hAnsi="Calibri"/>
+          <w:b w:val="false"/>
+          <w:bCs w:val="false"/>
+          <w:i w:val="false"/>
+          <w:iCs w:val="false"/>
+          <w:color w:val="333333"/>
+          <w:sz w:val="19"/>
+          <w:szCs w:val="19"/>
+        </w:rPr>
+        <w:t xml:space="preserve">GUI Screens: N/A → Multi-panel UI (Complete)</w:t>
+      </w:r>
+    </w:p>
+    <w:p>
+      <w:pPr>
+        <w:pStyle w:val="ListParagraph"/>
+        <w:numPr>
+          <w:ilvl w:val="0"/>
+          <w:numId w:val="2"/>
+        </w:numPr>
+        <w:spacing w:after="60"/>
+      </w:pPr>
+      <w:r>
+        <w:rPr>
+          <w:rFonts w:ascii="Calibri" w:cs="Calibri" w:eastAsia="Calibri" w:hAnsi="Calibri"/>
+          <w:b w:val="false"/>
+          <w:bCs w:val="false"/>
+          <w:i w:val="false"/>
+          <w:iCs w:val="false"/>
+          <w:color w:val="333333"/>
+          <w:sz w:val="19"/>
+          <w:szCs w:val="19"/>
+        </w:rPr>
+        <w:t xml:space="preserve">Data Layer: None → MySQL integrated (Production-ready)</w:t>
+      </w:r>
+    </w:p>
+    <w:p>
+      <w:pPr>
+        <w:spacing w:after="40" w:before="180"/>
+      </w:pPr>
+      <w:r>
+        <w:rPr>
+          <w:rFonts w:ascii="Calibri" w:cs="Calibri" w:eastAsia="Calibri" w:hAnsi="Calibri"/>
+          <w:b/>
+          <w:bCs/>
+          <w:i w:val="false"/>
+          <w:iCs w:val="false"/>
+          <w:color w:val="2C3E50"/>
+          <w:sz w:val="26"/>
+          <w:szCs w:val="26"/>
+        </w:rPr>
+        <w:t xml:space="preserve">ArnLibrary</w:t>
+      </w:r>
+      <w:r>
+        <w:rPr>
+          <w:rFonts w:ascii="Calibri" w:cs="Calibri" w:eastAsia="Calibri" w:hAnsi="Calibri"/>
+          <w:b w:val="false"/>
+          <w:bCs w:val="false"/>
+          <w:i w:val="false"/>
+          <w:iCs w:val="false"/>
+          <w:color w:val="666666"/>
+          <w:sz w:val="20"/>
+          <w:szCs w:val="20"/>
+        </w:rPr>
         <w:t xml:space="preserve"> — Library Management System</w:t>
       </w:r>
     </w:p>
@@ -2242,7 +3133,7 @@
           <w:sz w:val="19"/>
           <w:szCs w:val="19"/>
         </w:rPr>
-        <w:t xml:space="preserve">Outcome: End-to-end library workflow with CRUD operations and an interactive admin panel.</w:t>
+        <w:t xml:space="preserve">Outcome: End-to-end library workflow with CRUD operations.</w:t>
       </w:r>
     </w:p>
     <w:p>
@@ -2267,7 +3158,7 @@
       <w:pPr>
         <w:spacing w:after="80"/>
       </w:pPr>
-      <w:hyperlink w:history="1" r:id="rIdcqxeirveffaiouxoszlst">
+      <w:hyperlink w:history="1" r:id="rIdh_m-mpbcqpquwfv2paa5x">
         <w:r>
           <w:rPr>
             <w:rFonts w:ascii="Calibri" w:cs="Calibri" w:eastAsia="Calibri" w:hAnsi="Calibri"/>
@@ -2449,7 +3340,7 @@
           <w:sz w:val="26"/>
           <w:szCs w:val="26"/>
         </w:rPr>
-        <w:t xml:space="preserve">arnold.dev Portfolio</w:t>
+        <w:t xml:space="preserve">ARNOLD.DEV Portfolio</w:t>
       </w:r>
       <w:r>
         <w:rPr>
@@ -2516,7 +3407,7 @@
           <w:sz w:val="19"/>
           <w:szCs w:val="19"/>
         </w:rPr>
-        <w:t xml:space="preserve">Outcome: Live portfolio at arnold.dev with project showcase, skills arsenal, blog, case studies, and contact flow.</w:t>
+        <w:t xml:space="preserve">Outcome: Live portfolio at arnold-rho.vercel.app with project showcase, skills arsenal, blog, case studies, and contact flow.</w:t>
       </w:r>
     </w:p>
     <w:p>
@@ -2541,7 +3432,7 @@
       <w:pPr>
         <w:spacing w:after="80"/>
       </w:pPr>
-      <w:hyperlink w:history="1" r:id="rIdy2ekelwgghagt9aut1ipz">
+      <w:hyperlink w:history="1" r:id="rIddw0pxuudwn1jzzt-8ma1u">
         <w:r>
           <w:rPr>
             <w:rFonts w:ascii="Calibri" w:cs="Calibri" w:eastAsia="Calibri" w:hAnsi="Calibri"/>
@@ -2771,7 +3662,7 @@
           <w:sz w:val="26"/>
           <w:szCs w:val="26"/>
         </w:rPr>
-        <w:t xml:space="preserve">webscraping</w:t>
+        <w:t xml:space="preserve">WASAC &amp; REG Unified Billing</w:t>
       </w:r>
       <w:r>
         <w:rPr>
@@ -2784,6 +3675,600 @@
           <w:sz w:val="20"/>
           <w:szCs w:val="20"/>
         </w:rPr>
+        <w:t xml:space="preserve"> — Enterprise Java Billing Backend</w:t>
+      </w:r>
+    </w:p>
+    <w:p>
+      <w:pPr>
+        <w:spacing w:after="120"/>
+      </w:pPr>
+      <w:r>
+        <w:rPr>
+          <w:rFonts w:ascii="Calibri" w:cs="Calibri" w:eastAsia="Calibri" w:hAnsi="Calibri"/>
+          <w:b w:val="false"/>
+          <w:bCs w:val="false"/>
+          <w:i w:val="false"/>
+          <w:iCs w:val="false"/>
+          <w:color w:val="333333"/>
+          <w:sz w:val="19"/>
+          <w:szCs w:val="19"/>
+        </w:rPr>
+        <w:t xml:space="preserve">Problem: Water and electricity postpaid billing required automated unified invoicing across WASAC and REG systems.</w:t>
+      </w:r>
+    </w:p>
+    <w:p>
+      <w:pPr>
+        <w:spacing w:after="120"/>
+      </w:pPr>
+      <w:r>
+        <w:rPr>
+          <w:rFonts w:ascii="Calibri" w:cs="Calibri" w:eastAsia="Calibri" w:hAnsi="Calibri"/>
+          <w:b w:val="false"/>
+          <w:bCs w:val="false"/>
+          <w:i w:val="false"/>
+          <w:iCs w:val="false"/>
+          <w:color w:val="333333"/>
+          <w:sz w:val="19"/>
+          <w:szCs w:val="19"/>
+        </w:rPr>
+        <w:t xml:space="preserve">Built: Spring Boot services for billing logic, customer accounts, invoice generation, and unified postpaid workflows.</w:t>
+      </w:r>
+    </w:p>
+    <w:p>
+      <w:pPr>
+        <w:spacing w:after="120"/>
+      </w:pPr>
+      <w:r>
+        <w:rPr>
+          <w:rFonts w:ascii="Calibri" w:cs="Calibri" w:eastAsia="Calibri" w:hAnsi="Calibri"/>
+          <w:b w:val="false"/>
+          <w:bCs w:val="false"/>
+          <w:i w:val="false"/>
+          <w:iCs w:val="false"/>
+          <w:color w:val="333333"/>
+          <w:sz w:val="19"/>
+          <w:szCs w:val="19"/>
+        </w:rPr>
+        <w:t xml:space="preserve">Outcome: Unified billing automation replacing manual cross-utility reconciliation.</w:t>
+      </w:r>
+    </w:p>
+    <w:p>
+      <w:pPr>
+        <w:spacing w:after="80"/>
+      </w:pPr>
+      <w:r>
+        <w:rPr>
+          <w:rFonts w:ascii="Calibri" w:cs="Calibri" w:eastAsia="Calibri" w:hAnsi="Calibri"/>
+          <w:b/>
+          <w:bCs/>
+          <w:i w:val="false"/>
+          <w:iCs w:val="false"/>
+          <w:color w:val="333333"/>
+          <w:sz w:val="19"/>
+          <w:szCs w:val="19"/>
+        </w:rPr>
+        <w:t xml:space="preserve">Tech: Java, Spring Boot, REST API, MySQL, Enterprise</w:t>
+      </w:r>
+    </w:p>
+    <w:p>
+      <w:pPr>
+        <w:spacing w:after="80"/>
+      </w:pPr>
+      <w:hyperlink w:history="1" r:id="rId6rewtq2ihdtmom9cn9f54">
+        <w:r>
+          <w:rPr>
+            <w:rFonts w:ascii="Calibri" w:cs="Calibri" w:eastAsia="Calibri" w:hAnsi="Calibri"/>
+            <w:b w:val="false"/>
+            <w:bCs w:val="false"/>
+            <w:i w:val="false"/>
+            <w:iCs w:val="false"/>
+            <w:color w:val="0563C1"/>
+            <w:sz w:val="19"/>
+            <w:szCs w:val="19"/>
+          </w:rPr>
+          <w:t xml:space="preserve">GitHub: https://github.com/Arn-The-Wolf/wasac-reg-unified-billing-system</w:t>
+        </w:r>
+      </w:hyperlink>
+    </w:p>
+    <w:p>
+      <w:pPr>
+        <w:spacing w:after="40" w:before="60"/>
+      </w:pPr>
+      <w:r>
+        <w:rPr>
+          <w:rFonts w:ascii="Calibri" w:cs="Calibri" w:eastAsia="Calibri" w:hAnsi="Calibri"/>
+          <w:b/>
+          <w:bCs/>
+          <w:i w:val="false"/>
+          <w:iCs w:val="false"/>
+          <w:color w:val="333333"/>
+          <w:sz w:val="19"/>
+          <w:szCs w:val="19"/>
+        </w:rPr>
+        <w:t xml:space="preserve">Key results</w:t>
+      </w:r>
+    </w:p>
+    <w:p>
+      <w:pPr>
+        <w:pStyle w:val="ListParagraph"/>
+        <w:numPr>
+          <w:ilvl w:val="0"/>
+          <w:numId w:val="2"/>
+        </w:numPr>
+        <w:spacing w:after="60"/>
+      </w:pPr>
+      <w:r>
+        <w:rPr>
+          <w:rFonts w:ascii="Calibri" w:cs="Calibri" w:eastAsia="Calibri" w:hAnsi="Calibri"/>
+          <w:b w:val="false"/>
+          <w:bCs w:val="false"/>
+          <w:i w:val="false"/>
+          <w:iCs w:val="false"/>
+          <w:color w:val="333333"/>
+          <w:sz w:val="19"/>
+          <w:szCs w:val="19"/>
+        </w:rPr>
+        <w:t xml:space="preserve">Unified WASAC/REG billing</w:t>
+      </w:r>
+    </w:p>
+    <w:p>
+      <w:pPr>
+        <w:pStyle w:val="ListParagraph"/>
+        <w:numPr>
+          <w:ilvl w:val="0"/>
+          <w:numId w:val="2"/>
+        </w:numPr>
+        <w:spacing w:after="60"/>
+      </w:pPr>
+      <w:r>
+        <w:rPr>
+          <w:rFonts w:ascii="Calibri" w:cs="Calibri" w:eastAsia="Calibri" w:hAnsi="Calibri"/>
+          <w:b w:val="false"/>
+          <w:bCs w:val="false"/>
+          <w:i w:val="false"/>
+          <w:iCs w:val="false"/>
+          <w:color w:val="333333"/>
+          <w:sz w:val="19"/>
+          <w:szCs w:val="19"/>
+        </w:rPr>
+        <w:t xml:space="preserve">Spring Boot backend</w:t>
+      </w:r>
+    </w:p>
+    <w:p>
+      <w:pPr>
+        <w:pStyle w:val="ListParagraph"/>
+        <w:numPr>
+          <w:ilvl w:val="0"/>
+          <w:numId w:val="2"/>
+        </w:numPr>
+        <w:spacing w:after="60"/>
+      </w:pPr>
+      <w:r>
+        <w:rPr>
+          <w:rFonts w:ascii="Calibri" w:cs="Calibri" w:eastAsia="Calibri" w:hAnsi="Calibri"/>
+          <w:b w:val="false"/>
+          <w:bCs w:val="false"/>
+          <w:i w:val="false"/>
+          <w:iCs w:val="false"/>
+          <w:color w:val="333333"/>
+          <w:sz w:val="19"/>
+          <w:szCs w:val="19"/>
+        </w:rPr>
+        <w:t xml:space="preserve">Automated postpaid flows</w:t>
+      </w:r>
+    </w:p>
+    <w:p>
+      <w:pPr>
+        <w:spacing w:after="40" w:before="80"/>
+      </w:pPr>
+      <w:r>
+        <w:rPr>
+          <w:rFonts w:ascii="Calibri" w:cs="Calibri" w:eastAsia="Calibri" w:hAnsi="Calibri"/>
+          <w:b/>
+          <w:bCs/>
+          <w:i w:val="false"/>
+          <w:iCs w:val="false"/>
+          <w:color w:val="333333"/>
+          <w:sz w:val="19"/>
+          <w:szCs w:val="19"/>
+        </w:rPr>
+        <w:t xml:space="preserve">Challenges solved</w:t>
+      </w:r>
+    </w:p>
+    <w:p>
+      <w:pPr>
+        <w:pStyle w:val="ListParagraph"/>
+        <w:numPr>
+          <w:ilvl w:val="0"/>
+          <w:numId w:val="2"/>
+        </w:numPr>
+        <w:spacing w:after="60"/>
+      </w:pPr>
+      <w:r>
+        <w:rPr>
+          <w:rFonts w:ascii="Calibri" w:cs="Calibri" w:eastAsia="Calibri" w:hAnsi="Calibri"/>
+          <w:b w:val="false"/>
+          <w:bCs w:val="false"/>
+          <w:i w:val="false"/>
+          <w:iCs w:val="false"/>
+          <w:color w:val="333333"/>
+          <w:sz w:val="19"/>
+          <w:szCs w:val="19"/>
+        </w:rPr>
+        <w:t xml:space="preserve">Multi-utility billing rules</w:t>
+      </w:r>
+    </w:p>
+    <w:p>
+      <w:pPr>
+        <w:pStyle w:val="ListParagraph"/>
+        <w:numPr>
+          <w:ilvl w:val="0"/>
+          <w:numId w:val="2"/>
+        </w:numPr>
+        <w:spacing w:after="60"/>
+      </w:pPr>
+      <w:r>
+        <w:rPr>
+          <w:rFonts w:ascii="Calibri" w:cs="Calibri" w:eastAsia="Calibri" w:hAnsi="Calibri"/>
+          <w:b w:val="false"/>
+          <w:bCs w:val="false"/>
+          <w:i w:val="false"/>
+          <w:iCs w:val="false"/>
+          <w:color w:val="333333"/>
+          <w:sz w:val="19"/>
+          <w:szCs w:val="19"/>
+        </w:rPr>
+        <w:t xml:space="preserve">Invoice accuracy</w:t>
+      </w:r>
+    </w:p>
+    <w:p>
+      <w:pPr>
+        <w:pStyle w:val="ListParagraph"/>
+        <w:numPr>
+          <w:ilvl w:val="0"/>
+          <w:numId w:val="2"/>
+        </w:numPr>
+        <w:spacing w:after="60"/>
+      </w:pPr>
+      <w:r>
+        <w:rPr>
+          <w:rFonts w:ascii="Calibri" w:cs="Calibri" w:eastAsia="Calibri" w:hAnsi="Calibri"/>
+          <w:b w:val="false"/>
+          <w:bCs w:val="false"/>
+          <w:i w:val="false"/>
+          <w:iCs w:val="false"/>
+          <w:color w:val="333333"/>
+          <w:sz w:val="19"/>
+          <w:szCs w:val="19"/>
+        </w:rPr>
+        <w:t xml:space="preserve">Enterprise data modeling</w:t>
+      </w:r>
+    </w:p>
+    <w:p>
+      <w:pPr>
+        <w:spacing w:after="40" w:before="180"/>
+      </w:pPr>
+      <w:r>
+        <w:rPr>
+          <w:rFonts w:ascii="Calibri" w:cs="Calibri" w:eastAsia="Calibri" w:hAnsi="Calibri"/>
+          <w:b/>
+          <w:bCs/>
+          <w:i w:val="false"/>
+          <w:iCs w:val="false"/>
+          <w:color w:val="2C3E50"/>
+          <w:sz w:val="26"/>
+          <w:szCs w:val="26"/>
+        </w:rPr>
+        <w:t xml:space="preserve">MongoDB Transaction Manager</w:t>
+      </w:r>
+      <w:r>
+        <w:rPr>
+          <w:rFonts w:ascii="Calibri" w:cs="Calibri" w:eastAsia="Calibri" w:hAnsi="Calibri"/>
+          <w:b w:val="false"/>
+          <w:bCs w:val="false"/>
+          <w:i w:val="false"/>
+          <w:iCs w:val="false"/>
+          <w:color w:val="666666"/>
+          <w:sz w:val="20"/>
+          <w:szCs w:val="20"/>
+        </w:rPr>
+        <w:t xml:space="preserve"> — ACID Transactions Demo</w:t>
+      </w:r>
+    </w:p>
+    <w:p>
+      <w:pPr>
+        <w:spacing w:after="120"/>
+      </w:pPr>
+      <w:r>
+        <w:rPr>
+          <w:rFonts w:ascii="Calibri" w:cs="Calibri" w:eastAsia="Calibri" w:hAnsi="Calibri"/>
+          <w:b w:val="false"/>
+          <w:bCs w:val="false"/>
+          <w:i w:val="false"/>
+          <w:iCs w:val="false"/>
+          <w:color w:val="333333"/>
+          <w:sz w:val="19"/>
+          <w:szCs w:val="19"/>
+        </w:rPr>
+        <w:t xml:space="preserve">Problem: Multi-document updates in MongoDB require transactions to stay consistent — needed a clear reference implementation.</w:t>
+      </w:r>
+    </w:p>
+    <w:p>
+      <w:pPr>
+        <w:spacing w:after="120"/>
+      </w:pPr>
+      <w:r>
+        <w:rPr>
+          <w:rFonts w:ascii="Calibri" w:cs="Calibri" w:eastAsia="Calibri" w:hAnsi="Calibri"/>
+          <w:b w:val="false"/>
+          <w:bCs w:val="false"/>
+          <w:i w:val="false"/>
+          <w:iCs w:val="false"/>
+          <w:color w:val="333333"/>
+          <w:sz w:val="19"/>
+          <w:szCs w:val="19"/>
+        </w:rPr>
+        <w:t xml:space="preserve">Built: Node.js service with MongoDB session-based transactions, rollback handling, and example transfer workflows.</w:t>
+      </w:r>
+    </w:p>
+    <w:p>
+      <w:pPr>
+        <w:spacing w:after="120"/>
+      </w:pPr>
+      <w:r>
+        <w:rPr>
+          <w:rFonts w:ascii="Calibri" w:cs="Calibri" w:eastAsia="Calibri" w:hAnsi="Calibri"/>
+          <w:b w:val="false"/>
+          <w:bCs w:val="false"/>
+          <w:i w:val="false"/>
+          <w:iCs w:val="false"/>
+          <w:color w:val="333333"/>
+          <w:sz w:val="19"/>
+          <w:szCs w:val="19"/>
+        </w:rPr>
+        <w:t xml:space="preserve">Outcome: Reusable pattern for transactional MongoDB operations in production APIs.</w:t>
+      </w:r>
+    </w:p>
+    <w:p>
+      <w:pPr>
+        <w:spacing w:after="80"/>
+      </w:pPr>
+      <w:r>
+        <w:rPr>
+          <w:rFonts w:ascii="Calibri" w:cs="Calibri" w:eastAsia="Calibri" w:hAnsi="Calibri"/>
+          <w:b/>
+          <w:bCs/>
+          <w:i w:val="false"/>
+          <w:iCs w:val="false"/>
+          <w:color w:val="333333"/>
+          <w:sz w:val="19"/>
+          <w:szCs w:val="19"/>
+        </w:rPr>
+        <w:t xml:space="preserve">Tech: JavaScript, Node.js, MongoDB, ACID, Backend</w:t>
+      </w:r>
+    </w:p>
+    <w:p>
+      <w:pPr>
+        <w:spacing w:after="80"/>
+      </w:pPr>
+      <w:hyperlink w:history="1" r:id="rId6pezryp41d9ca4knovysx">
+        <w:r>
+          <w:rPr>
+            <w:rFonts w:ascii="Calibri" w:cs="Calibri" w:eastAsia="Calibri" w:hAnsi="Calibri"/>
+            <w:b w:val="false"/>
+            <w:bCs w:val="false"/>
+            <w:i w:val="false"/>
+            <w:iCs w:val="false"/>
+            <w:color w:val="0563C1"/>
+            <w:sz w:val="19"/>
+            <w:szCs w:val="19"/>
+          </w:rPr>
+          <w:t xml:space="preserve">GitHub: https://github.com/Arn-The-Wolf/transactional-management</w:t>
+        </w:r>
+      </w:hyperlink>
+    </w:p>
+    <w:p>
+      <w:pPr>
+        <w:spacing w:after="40" w:before="60"/>
+      </w:pPr>
+      <w:r>
+        <w:rPr>
+          <w:rFonts w:ascii="Calibri" w:cs="Calibri" w:eastAsia="Calibri" w:hAnsi="Calibri"/>
+          <w:b/>
+          <w:bCs/>
+          <w:i w:val="false"/>
+          <w:iCs w:val="false"/>
+          <w:color w:val="333333"/>
+          <w:sz w:val="19"/>
+          <w:szCs w:val="19"/>
+        </w:rPr>
+        <w:t xml:space="preserve">Key results</w:t>
+      </w:r>
+    </w:p>
+    <w:p>
+      <w:pPr>
+        <w:pStyle w:val="ListParagraph"/>
+        <w:numPr>
+          <w:ilvl w:val="0"/>
+          <w:numId w:val="2"/>
+        </w:numPr>
+        <w:spacing w:after="60"/>
+      </w:pPr>
+      <w:r>
+        <w:rPr>
+          <w:rFonts w:ascii="Calibri" w:cs="Calibri" w:eastAsia="Calibri" w:hAnsi="Calibri"/>
+          <w:b w:val="false"/>
+          <w:bCs w:val="false"/>
+          <w:i w:val="false"/>
+          <w:iCs w:val="false"/>
+          <w:color w:val="333333"/>
+          <w:sz w:val="19"/>
+          <w:szCs w:val="19"/>
+        </w:rPr>
+        <w:t xml:space="preserve">MongoDB transactions</w:t>
+      </w:r>
+    </w:p>
+    <w:p>
+      <w:pPr>
+        <w:pStyle w:val="ListParagraph"/>
+        <w:numPr>
+          <w:ilvl w:val="0"/>
+          <w:numId w:val="2"/>
+        </w:numPr>
+        <w:spacing w:after="60"/>
+      </w:pPr>
+      <w:r>
+        <w:rPr>
+          <w:rFonts w:ascii="Calibri" w:cs="Calibri" w:eastAsia="Calibri" w:hAnsi="Calibri"/>
+          <w:b w:val="false"/>
+          <w:bCs w:val="false"/>
+          <w:i w:val="false"/>
+          <w:iCs w:val="false"/>
+          <w:color w:val="333333"/>
+          <w:sz w:val="19"/>
+          <w:szCs w:val="19"/>
+        </w:rPr>
+        <w:t xml:space="preserve">Commit/abort flows</w:t>
+      </w:r>
+    </w:p>
+    <w:p>
+      <w:pPr>
+        <w:pStyle w:val="ListParagraph"/>
+        <w:numPr>
+          <w:ilvl w:val="0"/>
+          <w:numId w:val="2"/>
+        </w:numPr>
+        <w:spacing w:after="60"/>
+      </w:pPr>
+      <w:r>
+        <w:rPr>
+          <w:rFonts w:ascii="Calibri" w:cs="Calibri" w:eastAsia="Calibri" w:hAnsi="Calibri"/>
+          <w:b w:val="false"/>
+          <w:bCs w:val="false"/>
+          <w:i w:val="false"/>
+          <w:iCs w:val="false"/>
+          <w:color w:val="333333"/>
+          <w:sz w:val="19"/>
+          <w:szCs w:val="19"/>
+        </w:rPr>
+        <w:t xml:space="preserve">Transfer demo</w:t>
+      </w:r>
+    </w:p>
+    <w:p>
+      <w:pPr>
+        <w:spacing w:after="40" w:before="80"/>
+      </w:pPr>
+      <w:r>
+        <w:rPr>
+          <w:rFonts w:ascii="Calibri" w:cs="Calibri" w:eastAsia="Calibri" w:hAnsi="Calibri"/>
+          <w:b/>
+          <w:bCs/>
+          <w:i w:val="false"/>
+          <w:iCs w:val="false"/>
+          <w:color w:val="333333"/>
+          <w:sz w:val="19"/>
+          <w:szCs w:val="19"/>
+        </w:rPr>
+        <w:t xml:space="preserve">Challenges solved</w:t>
+      </w:r>
+    </w:p>
+    <w:p>
+      <w:pPr>
+        <w:pStyle w:val="ListParagraph"/>
+        <w:numPr>
+          <w:ilvl w:val="0"/>
+          <w:numId w:val="2"/>
+        </w:numPr>
+        <w:spacing w:after="60"/>
+      </w:pPr>
+      <w:r>
+        <w:rPr>
+          <w:rFonts w:ascii="Calibri" w:cs="Calibri" w:eastAsia="Calibri" w:hAnsi="Calibri"/>
+          <w:b w:val="false"/>
+          <w:bCs w:val="false"/>
+          <w:i w:val="false"/>
+          <w:iCs w:val="false"/>
+          <w:color w:val="333333"/>
+          <w:sz w:val="19"/>
+          <w:szCs w:val="19"/>
+        </w:rPr>
+        <w:t xml:space="preserve">Session lifecycle</w:t>
+      </w:r>
+    </w:p>
+    <w:p>
+      <w:pPr>
+        <w:pStyle w:val="ListParagraph"/>
+        <w:numPr>
+          <w:ilvl w:val="0"/>
+          <w:numId w:val="2"/>
+        </w:numPr>
+        <w:spacing w:after="60"/>
+      </w:pPr>
+      <w:r>
+        <w:rPr>
+          <w:rFonts w:ascii="Calibri" w:cs="Calibri" w:eastAsia="Calibri" w:hAnsi="Calibri"/>
+          <w:b w:val="false"/>
+          <w:bCs w:val="false"/>
+          <w:i w:val="false"/>
+          <w:iCs w:val="false"/>
+          <w:color w:val="333333"/>
+          <w:sz w:val="19"/>
+          <w:szCs w:val="19"/>
+        </w:rPr>
+        <w:t xml:space="preserve">Rollback edge cases</w:t>
+      </w:r>
+    </w:p>
+    <w:p>
+      <w:pPr>
+        <w:pStyle w:val="ListParagraph"/>
+        <w:numPr>
+          <w:ilvl w:val="0"/>
+          <w:numId w:val="2"/>
+        </w:numPr>
+        <w:spacing w:after="60"/>
+      </w:pPr>
+      <w:r>
+        <w:rPr>
+          <w:rFonts w:ascii="Calibri" w:cs="Calibri" w:eastAsia="Calibri" w:hAnsi="Calibri"/>
+          <w:b w:val="false"/>
+          <w:bCs w:val="false"/>
+          <w:i w:val="false"/>
+          <w:iCs w:val="false"/>
+          <w:color w:val="333333"/>
+          <w:sz w:val="19"/>
+          <w:szCs w:val="19"/>
+        </w:rPr>
+        <w:t xml:space="preserve">Replica set setup</w:t>
+      </w:r>
+    </w:p>
+    <w:p>
+      <w:pPr>
+        <w:spacing w:after="40" w:before="180"/>
+      </w:pPr>
+      <w:r>
+        <w:rPr>
+          <w:rFonts w:ascii="Calibri" w:cs="Calibri" w:eastAsia="Calibri" w:hAnsi="Calibri"/>
+          <w:b/>
+          <w:bCs/>
+          <w:i w:val="false"/>
+          <w:iCs w:val="false"/>
+          <w:color w:val="2C3E50"/>
+          <w:sz w:val="26"/>
+          <w:szCs w:val="26"/>
+        </w:rPr>
+        <w:t xml:space="preserve">Web Scraping Pipeline</w:t>
+      </w:r>
+      <w:r>
+        <w:rPr>
+          <w:rFonts w:ascii="Calibri" w:cs="Calibri" w:eastAsia="Calibri" w:hAnsi="Calibri"/>
+          <w:b w:val="false"/>
+          <w:bCs w:val="false"/>
+          <w:i w:val="false"/>
+          <w:iCs w:val="false"/>
+          <w:color w:val="666666"/>
+          <w:sz w:val="20"/>
+          <w:szCs w:val="20"/>
+        </w:rPr>
         <w:t xml:space="preserve"> — Python Data Extraction</w:t>
       </w:r>
     </w:p>
@@ -2820,7 +4305,7 @@
           <w:sz w:val="19"/>
           <w:szCs w:val="19"/>
         </w:rPr>
-        <w:t xml:space="preserve">Built: A Python pipeline using BeautifulSoup to crawl pages, parse HTML, normalize records, and export structured datasets.</w:t>
+        <w:t xml:space="preserve">Built: Python pipeline: paginated crawling, HTML parsing, record normalization, and JSON/CSV export.</w:t>
       </w:r>
     </w:p>
     <w:p>
@@ -2838,7 +4323,7 @@
           <w:sz w:val="19"/>
           <w:szCs w:val="19"/>
         </w:rPr>
-        <w:t xml:space="preserve">Outcome: Automated extraction pipeline producing clean structured output suitable for downstream analysis.</w:t>
+        <w:t xml:space="preserve">Outcome: Automated extraction pipeline producing clean structured output.</w:t>
       </w:r>
     </w:p>
     <w:p>
@@ -2863,7 +4348,7 @@
       <w:pPr>
         <w:spacing w:after="80"/>
       </w:pPr>
-      <w:hyperlink w:history="1" r:id="rIdd_oqpuaxxuqtvl-ftbv3i">
+      <w:hyperlink w:history="1" r:id="rId0y2ku6eelkrorsexmlawo">
         <w:r>
           <w:rPr>
             <w:rFonts w:ascii="Calibri" w:cs="Calibri" w:eastAsia="Calibri" w:hAnsi="Calibri"/>
@@ -2940,7 +4425,30 @@
           <w:sz w:val="19"/>
           <w:szCs w:val="19"/>
         </w:rPr>
-        <w:t xml:space="preserve">Clean structured output</w:t>
+        <w:t xml:space="preserve">Clean structured export</w:t>
+      </w:r>
+    </w:p>
+    <w:p>
+      <w:pPr>
+        <w:pStyle w:val="ListParagraph"/>
+        <w:numPr>
+          <w:ilvl w:val="0"/>
+          <w:numId w:val="2"/>
+        </w:numPr>
+        <w:spacing w:after="60"/>
+      </w:pPr>
+      <w:r>
+        <w:rPr>
+          <w:rFonts w:ascii="Calibri" w:cs="Calibri" w:eastAsia="Calibri" w:hAnsi="Calibri"/>
+          <w:b w:val="false"/>
+          <w:bCs w:val="false"/>
+          <w:i w:val="false"/>
+          <w:iCs w:val="false"/>
+          <w:color w:val="333333"/>
+          <w:sz w:val="19"/>
+          <w:szCs w:val="19"/>
+        </w:rPr>
+        <w:t xml:space="preserve">Defensive parsing</w:t>
       </w:r>
     </w:p>
     <w:p>
@@ -3045,7 +4553,7 @@
           <w:sz w:val="26"/>
           <w:szCs w:val="26"/>
         </w:rPr>
-        <w:t xml:space="preserve">BFS-DFS Algorithms</w:t>
+        <w:t xml:space="preserve">BFS &amp; DFS Algorithms</w:t>
       </w:r>
       <w:r>
         <w:rPr>
@@ -3076,7 +4584,7 @@
           <w:sz w:val="19"/>
           <w:szCs w:val="19"/>
         </w:rPr>
-        <w:t xml:space="preserve">Problem: Understanding and comparing graph traversal strategies for pathfinding and connected-component problems.</w:t>
+        <w:t xml:space="preserve">Problem: Understanding graph traversal strategies for pathfinding and connected-component problems.</w:t>
       </w:r>
     </w:p>
     <w:p>
@@ -3094,7 +4602,7 @@
           <w:sz w:val="19"/>
           <w:szCs w:val="19"/>
         </w:rPr>
-        <w:t xml:space="preserve">Built: Java implementations of BFS and DFS with graph representation, traversal logic, and performance comparison.</w:t>
+        <w:t xml:space="preserve">Built: Java BFS/DFS with adjacency structures, traversal logic, and performance comparison.</w:t>
       </w:r>
     </w:p>
     <w:p>
@@ -3137,7 +4645,7 @@
       <w:pPr>
         <w:spacing w:after="80"/>
       </w:pPr>
-      <w:hyperlink w:history="1" r:id="rIdcxywxvspswxpbqwkomejf">
+      <w:hyperlink w:history="1" r:id="rIdykn6ca1onn2j4uuz0qiol">
         <w:r>
           <w:rPr>
             <w:rFonts w:ascii="Calibri" w:cs="Calibri" w:eastAsia="Calibri" w:hAnsi="Calibri"/>
@@ -3298,7 +4806,7 @@
           <w:sz w:val="26"/>
           <w:szCs w:val="26"/>
         </w:rPr>
-        <w:t xml:space="preserve">Handwriting Recognition AI</w:t>
+        <w:t xml:space="preserve">Clause Lens</w:t>
       </w:r>
       <w:r>
         <w:rPr>
@@ -3311,6 +4819,1194 @@
           <w:sz w:val="20"/>
           <w:szCs w:val="20"/>
         </w:rPr>
+        <w:t xml:space="preserve"> — Insurance Policy Clause Extractor</w:t>
+      </w:r>
+    </w:p>
+    <w:p>
+      <w:pPr>
+        <w:spacing w:after="120"/>
+      </w:pPr>
+      <w:r>
+        <w:rPr>
+          <w:rFonts w:ascii="Calibri" w:cs="Calibri" w:eastAsia="Calibri" w:hAnsi="Calibri"/>
+          <w:b w:val="false"/>
+          <w:bCs w:val="false"/>
+          <w:i w:val="false"/>
+          <w:iCs w:val="false"/>
+          <w:color w:val="333333"/>
+          <w:sz w:val="19"/>
+          <w:szCs w:val="19"/>
+        </w:rPr>
+        <w:t xml:space="preserve">Problem: Insurance policies are dense PDFs — extracting coverage facts, exclusions, and limits manually is slow, inconsistent, and error-prone.</w:t>
+      </w:r>
+    </w:p>
+    <w:p>
+      <w:pPr>
+        <w:spacing w:after="120"/>
+      </w:pPr>
+      <w:r>
+        <w:rPr>
+          <w:rFonts w:ascii="Calibri" w:cs="Calibri" w:eastAsia="Calibri" w:hAnsi="Calibri"/>
+          <w:b w:val="false"/>
+          <w:bCs w:val="false"/>
+          <w:i w:val="false"/>
+          <w:iCs w:val="false"/>
+          <w:color w:val="333333"/>
+          <w:sz w:val="19"/>
+          <w:szCs w:val="19"/>
+        </w:rPr>
+        <w:t xml:space="preserve">Built: Full pipeline: PDF ingest, clause chunking &amp; classification, concurrent Claude JSON extraction, embeddings, pgvector cosine search, labeled eval benchmark, and a built-in web UI.</w:t>
+      </w:r>
+    </w:p>
+    <w:p>
+      <w:pPr>
+        <w:spacing w:after="120"/>
+      </w:pPr>
+      <w:r>
+        <w:rPr>
+          <w:rFonts w:ascii="Calibri" w:cs="Calibri" w:eastAsia="Calibri" w:hAnsi="Calibri"/>
+          <w:b w:val="false"/>
+          <w:bCs w:val="false"/>
+          <w:i w:val="false"/>
+          <w:iCs w:val="false"/>
+          <w:color w:val="333333"/>
+          <w:sz w:val="19"/>
+          <w:szCs w:val="19"/>
+        </w:rPr>
+        <w:t xml:space="preserve">Outcome: End-to-end policy analyzer with retrieval accuracy targets above 80% and field-level extraction scoring on a labeled benchmark set.</w:t>
+      </w:r>
+    </w:p>
+    <w:p>
+      <w:pPr>
+        <w:spacing w:after="80"/>
+      </w:pPr>
+      <w:r>
+        <w:rPr>
+          <w:rFonts w:ascii="Calibri" w:cs="Calibri" w:eastAsia="Calibri" w:hAnsi="Calibri"/>
+          <w:b/>
+          <w:bCs/>
+          <w:i w:val="false"/>
+          <w:iCs w:val="false"/>
+          <w:color w:val="333333"/>
+          <w:sz w:val="19"/>
+          <w:szCs w:val="19"/>
+        </w:rPr>
+        <w:t xml:space="preserve">Tech: TypeScript, Node.js, Claude API, PostgreSQL, pgvector, Python, Express, Docker, LLM, RAG</w:t>
+      </w:r>
+    </w:p>
+    <w:p>
+      <w:pPr>
+        <w:spacing w:after="80"/>
+      </w:pPr>
+      <w:hyperlink w:history="1" r:id="rIdlyw5hb3xwt0jrtpfzollb">
+        <w:r>
+          <w:rPr>
+            <w:rFonts w:ascii="Calibri" w:cs="Calibri" w:eastAsia="Calibri" w:hAnsi="Calibri"/>
+            <w:b w:val="false"/>
+            <w:bCs w:val="false"/>
+            <w:i w:val="false"/>
+            <w:iCs w:val="false"/>
+            <w:color w:val="0563C1"/>
+            <w:sz w:val="19"/>
+            <w:szCs w:val="19"/>
+          </w:rPr>
+          <w:t xml:space="preserve">GitHub: https://github.com/Arn-The-Wolf/clause-lens</w:t>
+        </w:r>
+      </w:hyperlink>
+    </w:p>
+    <w:p>
+      <w:pPr>
+        <w:spacing w:after="40" w:before="60"/>
+      </w:pPr>
+      <w:r>
+        <w:rPr>
+          <w:rFonts w:ascii="Calibri" w:cs="Calibri" w:eastAsia="Calibri" w:hAnsi="Calibri"/>
+          <w:b/>
+          <w:bCs/>
+          <w:i w:val="false"/>
+          <w:iCs w:val="false"/>
+          <w:color w:val="333333"/>
+          <w:sz w:val="19"/>
+          <w:szCs w:val="19"/>
+        </w:rPr>
+        <w:t xml:space="preserve">Key results</w:t>
+      </w:r>
+    </w:p>
+    <w:p>
+      <w:pPr>
+        <w:pStyle w:val="ListParagraph"/>
+        <w:numPr>
+          <w:ilvl w:val="0"/>
+          <w:numId w:val="2"/>
+        </w:numPr>
+        <w:spacing w:after="60"/>
+      </w:pPr>
+      <w:r>
+        <w:rPr>
+          <w:rFonts w:ascii="Calibri" w:cs="Calibri" w:eastAsia="Calibri" w:hAnsi="Calibri"/>
+          <w:b w:val="false"/>
+          <w:bCs w:val="false"/>
+          <w:i w:val="false"/>
+          <w:iCs w:val="false"/>
+          <w:color w:val="333333"/>
+          <w:sz w:val="19"/>
+          <w:szCs w:val="19"/>
+        </w:rPr>
+        <w:t xml:space="preserve">PDF → chunk → extract → embed pipeline</w:t>
+      </w:r>
+    </w:p>
+    <w:p>
+      <w:pPr>
+        <w:pStyle w:val="ListParagraph"/>
+        <w:numPr>
+          <w:ilvl w:val="0"/>
+          <w:numId w:val="2"/>
+        </w:numPr>
+        <w:spacing w:after="60"/>
+      </w:pPr>
+      <w:r>
+        <w:rPr>
+          <w:rFonts w:ascii="Calibri" w:cs="Calibri" w:eastAsia="Calibri" w:hAnsi="Calibri"/>
+          <w:b w:val="false"/>
+          <w:bCs w:val="false"/>
+          <w:i w:val="false"/>
+          <w:iCs w:val="false"/>
+          <w:color w:val="333333"/>
+          <w:sz w:val="19"/>
+          <w:szCs w:val="19"/>
+        </w:rPr>
+        <w:t xml:space="preserve">Semantic search with clause-type filters</w:t>
+      </w:r>
+    </w:p>
+    <w:p>
+      <w:pPr>
+        <w:pStyle w:val="ListParagraph"/>
+        <w:numPr>
+          <w:ilvl w:val="0"/>
+          <w:numId w:val="2"/>
+        </w:numPr>
+        <w:spacing w:after="60"/>
+      </w:pPr>
+      <w:r>
+        <w:rPr>
+          <w:rFonts w:ascii="Calibri" w:cs="Calibri" w:eastAsia="Calibri" w:hAnsi="Calibri"/>
+          <w:b w:val="false"/>
+          <w:bCs w:val="false"/>
+          <w:i w:val="false"/>
+          <w:iCs w:val="false"/>
+          <w:color w:val="333333"/>
+          <w:sz w:val="19"/>
+          <w:szCs w:val="19"/>
+        </w:rPr>
+        <w:t xml:space="preserve">Labeled evaluation report</w:t>
+      </w:r>
+    </w:p>
+    <w:p>
+      <w:pPr>
+        <w:spacing w:after="40" w:before="80"/>
+      </w:pPr>
+      <w:r>
+        <w:rPr>
+          <w:rFonts w:ascii="Calibri" w:cs="Calibri" w:eastAsia="Calibri" w:hAnsi="Calibri"/>
+          <w:b/>
+          <w:bCs/>
+          <w:i w:val="false"/>
+          <w:iCs w:val="false"/>
+          <w:color w:val="333333"/>
+          <w:sz w:val="19"/>
+          <w:szCs w:val="19"/>
+        </w:rPr>
+        <w:t xml:space="preserve">Challenges solved</w:t>
+      </w:r>
+    </w:p>
+    <w:p>
+      <w:pPr>
+        <w:pStyle w:val="ListParagraph"/>
+        <w:numPr>
+          <w:ilvl w:val="0"/>
+          <w:numId w:val="2"/>
+        </w:numPr>
+        <w:spacing w:after="60"/>
+      </w:pPr>
+      <w:r>
+        <w:rPr>
+          <w:rFonts w:ascii="Calibri" w:cs="Calibri" w:eastAsia="Calibri" w:hAnsi="Calibri"/>
+          <w:b w:val="false"/>
+          <w:bCs w:val="false"/>
+          <w:i w:val="false"/>
+          <w:iCs w:val="false"/>
+          <w:color w:val="333333"/>
+          <w:sz w:val="19"/>
+          <w:szCs w:val="19"/>
+        </w:rPr>
+        <w:t xml:space="preserve">PDF clause segmentation</w:t>
+      </w:r>
+    </w:p>
+    <w:p>
+      <w:pPr>
+        <w:pStyle w:val="ListParagraph"/>
+        <w:numPr>
+          <w:ilvl w:val="0"/>
+          <w:numId w:val="2"/>
+        </w:numPr>
+        <w:spacing w:after="60"/>
+      </w:pPr>
+      <w:r>
+        <w:rPr>
+          <w:rFonts w:ascii="Calibri" w:cs="Calibri" w:eastAsia="Calibri" w:hAnsi="Calibri"/>
+          <w:b w:val="false"/>
+          <w:bCs w:val="false"/>
+          <w:i w:val="false"/>
+          <w:iCs w:val="false"/>
+          <w:color w:val="333333"/>
+          <w:sz w:val="19"/>
+          <w:szCs w:val="19"/>
+        </w:rPr>
+        <w:t xml:space="preserve">Structured LLM extraction at scale</w:t>
+      </w:r>
+    </w:p>
+    <w:p>
+      <w:pPr>
+        <w:pStyle w:val="ListParagraph"/>
+        <w:numPr>
+          <w:ilvl w:val="0"/>
+          <w:numId w:val="2"/>
+        </w:numPr>
+        <w:spacing w:after="60"/>
+      </w:pPr>
+      <w:r>
+        <w:rPr>
+          <w:rFonts w:ascii="Calibri" w:cs="Calibri" w:eastAsia="Calibri" w:hAnsi="Calibri"/>
+          <w:b w:val="false"/>
+          <w:bCs w:val="false"/>
+          <w:i w:val="false"/>
+          <w:iCs w:val="false"/>
+          <w:color w:val="333333"/>
+          <w:sz w:val="19"/>
+          <w:szCs w:val="19"/>
+        </w:rPr>
+        <w:t xml:space="preserve">Vector retrieval accuracy</w:t>
+      </w:r>
+    </w:p>
+    <w:p>
+      <w:pPr>
+        <w:spacing w:after="40" w:before="180"/>
+      </w:pPr>
+      <w:r>
+        <w:rPr>
+          <w:rFonts w:ascii="Calibri" w:cs="Calibri" w:eastAsia="Calibri" w:hAnsi="Calibri"/>
+          <w:b/>
+          <w:bCs/>
+          <w:i w:val="false"/>
+          <w:iCs w:val="false"/>
+          <w:color w:val="2C3E50"/>
+          <w:sz w:val="26"/>
+          <w:szCs w:val="26"/>
+        </w:rPr>
+        <w:t xml:space="preserve">ArcFace Face Recognition</w:t>
+      </w:r>
+      <w:r>
+        <w:rPr>
+          <w:rFonts w:ascii="Calibri" w:cs="Calibri" w:eastAsia="Calibri" w:hAnsi="Calibri"/>
+          <w:b w:val="false"/>
+          <w:bCs w:val="false"/>
+          <w:i w:val="false"/>
+          <w:iCs w:val="false"/>
+          <w:color w:val="666666"/>
+          <w:sz w:val="20"/>
+          <w:szCs w:val="20"/>
+        </w:rPr>
+        <w:t xml:space="preserve"> — 5-Point Alignment + ONNX Inference</w:t>
+      </w:r>
+    </w:p>
+    <w:p>
+      <w:pPr>
+        <w:spacing w:after="120"/>
+      </w:pPr>
+      <w:r>
+        <w:rPr>
+          <w:rFonts w:ascii="Calibri" w:cs="Calibri" w:eastAsia="Calibri" w:hAnsi="Calibri"/>
+          <w:b w:val="false"/>
+          <w:bCs w:val="false"/>
+          <w:i w:val="false"/>
+          <w:iCs w:val="false"/>
+          <w:color w:val="333333"/>
+          <w:sz w:val="19"/>
+          <w:szCs w:val="19"/>
+        </w:rPr>
+        <w:t xml:space="preserve">Problem: Face recognition systems often depend on GPU infrastructure — needed an accurate CPU-first pipeline for enrollment and verification.</w:t>
+      </w:r>
+    </w:p>
+    <w:p>
+      <w:pPr>
+        <w:spacing w:after="120"/>
+      </w:pPr>
+      <w:r>
+        <w:rPr>
+          <w:rFonts w:ascii="Calibri" w:cs="Calibri" w:eastAsia="Calibri" w:hAnsi="Calibri"/>
+          <w:b w:val="false"/>
+          <w:bCs w:val="false"/>
+          <w:i w:val="false"/>
+          <w:iCs w:val="false"/>
+          <w:color w:val="333333"/>
+          <w:sz w:val="19"/>
+          <w:szCs w:val="19"/>
+        </w:rPr>
+        <w:t xml:space="preserve">Built: Python pipeline: face detection, landmark alignment, ONNX ArcFace inference, embedding comparison, and enrollment/verification workflow.</w:t>
+      </w:r>
+    </w:p>
+    <w:p>
+      <w:pPr>
+        <w:spacing w:after="120"/>
+      </w:pPr>
+      <w:r>
+        <w:rPr>
+          <w:rFonts w:ascii="Calibri" w:cs="Calibri" w:eastAsia="Calibri" w:hAnsi="Calibri"/>
+          <w:b w:val="false"/>
+          <w:bCs w:val="false"/>
+          <w:i w:val="false"/>
+          <w:iCs w:val="false"/>
+          <w:color w:val="333333"/>
+          <w:sz w:val="19"/>
+          <w:szCs w:val="19"/>
+        </w:rPr>
+        <w:t xml:space="preserve">Outcome: Portable face recognition stack suitable for edge and server deployment.</w:t>
+      </w:r>
+    </w:p>
+    <w:p>
+      <w:pPr>
+        <w:spacing w:after="80"/>
+      </w:pPr>
+      <w:r>
+        <w:rPr>
+          <w:rFonts w:ascii="Calibri" w:cs="Calibri" w:eastAsia="Calibri" w:hAnsi="Calibri"/>
+          <w:b/>
+          <w:bCs/>
+          <w:i w:val="false"/>
+          <w:iCs w:val="false"/>
+          <w:color w:val="333333"/>
+          <w:sz w:val="19"/>
+          <w:szCs w:val="19"/>
+        </w:rPr>
+        <w:t xml:space="preserve">Tech: Python, ONNX, ArcFace, OpenCV, Computer Vision, AI</w:t>
+      </w:r>
+    </w:p>
+    <w:p>
+      <w:pPr>
+        <w:spacing w:after="80"/>
+      </w:pPr>
+      <w:hyperlink w:history="1" r:id="rIdmr6-1mlxenjjiz2qofh2-">
+        <w:r>
+          <w:rPr>
+            <w:rFonts w:ascii="Calibri" w:cs="Calibri" w:eastAsia="Calibri" w:hAnsi="Calibri"/>
+            <w:b w:val="false"/>
+            <w:bCs w:val="false"/>
+            <w:i w:val="false"/>
+            <w:iCs w:val="false"/>
+            <w:color w:val="0563C1"/>
+            <w:sz w:val="19"/>
+            <w:szCs w:val="19"/>
+          </w:rPr>
+          <w:t xml:space="preserve">GitHub: https://github.com/Arn-The-Wolf/face-recognition-5pt-arcface-onnx</w:t>
+        </w:r>
+      </w:hyperlink>
+    </w:p>
+    <w:p>
+      <w:pPr>
+        <w:spacing w:after="40" w:before="60"/>
+      </w:pPr>
+      <w:r>
+        <w:rPr>
+          <w:rFonts w:ascii="Calibri" w:cs="Calibri" w:eastAsia="Calibri" w:hAnsi="Calibri"/>
+          <w:b/>
+          <w:bCs/>
+          <w:i w:val="false"/>
+          <w:iCs w:val="false"/>
+          <w:color w:val="333333"/>
+          <w:sz w:val="19"/>
+          <w:szCs w:val="19"/>
+        </w:rPr>
+        <w:t xml:space="preserve">Key results</w:t>
+      </w:r>
+    </w:p>
+    <w:p>
+      <w:pPr>
+        <w:pStyle w:val="ListParagraph"/>
+        <w:numPr>
+          <w:ilvl w:val="0"/>
+          <w:numId w:val="2"/>
+        </w:numPr>
+        <w:spacing w:after="60"/>
+      </w:pPr>
+      <w:r>
+        <w:rPr>
+          <w:rFonts w:ascii="Calibri" w:cs="Calibri" w:eastAsia="Calibri" w:hAnsi="Calibri"/>
+          <w:b w:val="false"/>
+          <w:bCs w:val="false"/>
+          <w:i w:val="false"/>
+          <w:iCs w:val="false"/>
+          <w:color w:val="333333"/>
+          <w:sz w:val="19"/>
+          <w:szCs w:val="19"/>
+        </w:rPr>
+        <w:t xml:space="preserve">ArcFace ONNX pipeline</w:t>
+      </w:r>
+    </w:p>
+    <w:p>
+      <w:pPr>
+        <w:pStyle w:val="ListParagraph"/>
+        <w:numPr>
+          <w:ilvl w:val="0"/>
+          <w:numId w:val="2"/>
+        </w:numPr>
+        <w:spacing w:after="60"/>
+      </w:pPr>
+      <w:r>
+        <w:rPr>
+          <w:rFonts w:ascii="Calibri" w:cs="Calibri" w:eastAsia="Calibri" w:hAnsi="Calibri"/>
+          <w:b w:val="false"/>
+          <w:bCs w:val="false"/>
+          <w:i w:val="false"/>
+          <w:iCs w:val="false"/>
+          <w:color w:val="333333"/>
+          <w:sz w:val="19"/>
+          <w:szCs w:val="19"/>
+        </w:rPr>
+        <w:t xml:space="preserve">5-point alignment</w:t>
+      </w:r>
+    </w:p>
+    <w:p>
+      <w:pPr>
+        <w:pStyle w:val="ListParagraph"/>
+        <w:numPr>
+          <w:ilvl w:val="0"/>
+          <w:numId w:val="2"/>
+        </w:numPr>
+        <w:spacing w:after="60"/>
+      </w:pPr>
+      <w:r>
+        <w:rPr>
+          <w:rFonts w:ascii="Calibri" w:cs="Calibri" w:eastAsia="Calibri" w:hAnsi="Calibri"/>
+          <w:b w:val="false"/>
+          <w:bCs w:val="false"/>
+          <w:i w:val="false"/>
+          <w:iCs w:val="false"/>
+          <w:color w:val="333333"/>
+          <w:sz w:val="19"/>
+          <w:szCs w:val="19"/>
+        </w:rPr>
+        <w:t xml:space="preserve">Enrollment &amp; verification flow</w:t>
+      </w:r>
+    </w:p>
+    <w:p>
+      <w:pPr>
+        <w:spacing w:after="40" w:before="80"/>
+      </w:pPr>
+      <w:r>
+        <w:rPr>
+          <w:rFonts w:ascii="Calibri" w:cs="Calibri" w:eastAsia="Calibri" w:hAnsi="Calibri"/>
+          <w:b/>
+          <w:bCs/>
+          <w:i w:val="false"/>
+          <w:iCs w:val="false"/>
+          <w:color w:val="333333"/>
+          <w:sz w:val="19"/>
+          <w:szCs w:val="19"/>
+        </w:rPr>
+        <w:t xml:space="preserve">Challenges solved</w:t>
+      </w:r>
+    </w:p>
+    <w:p>
+      <w:pPr>
+        <w:pStyle w:val="ListParagraph"/>
+        <w:numPr>
+          <w:ilvl w:val="0"/>
+          <w:numId w:val="2"/>
+        </w:numPr>
+        <w:spacing w:after="60"/>
+      </w:pPr>
+      <w:r>
+        <w:rPr>
+          <w:rFonts w:ascii="Calibri" w:cs="Calibri" w:eastAsia="Calibri" w:hAnsi="Calibri"/>
+          <w:b w:val="false"/>
+          <w:bCs w:val="false"/>
+          <w:i w:val="false"/>
+          <w:iCs w:val="false"/>
+          <w:color w:val="333333"/>
+          <w:sz w:val="19"/>
+          <w:szCs w:val="19"/>
+        </w:rPr>
+        <w:t xml:space="preserve">CPU inference performance</w:t>
+      </w:r>
+    </w:p>
+    <w:p>
+      <w:pPr>
+        <w:pStyle w:val="ListParagraph"/>
+        <w:numPr>
+          <w:ilvl w:val="0"/>
+          <w:numId w:val="2"/>
+        </w:numPr>
+        <w:spacing w:after="60"/>
+      </w:pPr>
+      <w:r>
+        <w:rPr>
+          <w:rFonts w:ascii="Calibri" w:cs="Calibri" w:eastAsia="Calibri" w:hAnsi="Calibri"/>
+          <w:b w:val="false"/>
+          <w:bCs w:val="false"/>
+          <w:i w:val="false"/>
+          <w:iCs w:val="false"/>
+          <w:color w:val="333333"/>
+          <w:sz w:val="19"/>
+          <w:szCs w:val="19"/>
+        </w:rPr>
+        <w:t xml:space="preserve">Alignment accuracy</w:t>
+      </w:r>
+    </w:p>
+    <w:p>
+      <w:pPr>
+        <w:pStyle w:val="ListParagraph"/>
+        <w:numPr>
+          <w:ilvl w:val="0"/>
+          <w:numId w:val="2"/>
+        </w:numPr>
+        <w:spacing w:after="60"/>
+      </w:pPr>
+      <w:r>
+        <w:rPr>
+          <w:rFonts w:ascii="Calibri" w:cs="Calibri" w:eastAsia="Calibri" w:hAnsi="Calibri"/>
+          <w:b w:val="false"/>
+          <w:bCs w:val="false"/>
+          <w:i w:val="false"/>
+          <w:iCs w:val="false"/>
+          <w:color w:val="333333"/>
+          <w:sz w:val="19"/>
+          <w:szCs w:val="19"/>
+        </w:rPr>
+        <w:t xml:space="preserve">Embedding threshold tuning</w:t>
+      </w:r>
+    </w:p>
+    <w:p>
+      <w:pPr>
+        <w:spacing w:after="40" w:before="180"/>
+      </w:pPr>
+      <w:r>
+        <w:rPr>
+          <w:rFonts w:ascii="Calibri" w:cs="Calibri" w:eastAsia="Calibri" w:hAnsi="Calibri"/>
+          <w:b/>
+          <w:bCs/>
+          <w:i w:val="false"/>
+          <w:iCs w:val="false"/>
+          <w:color w:val="2C3E50"/>
+          <w:sz w:val="26"/>
+          <w:szCs w:val="26"/>
+        </w:rPr>
+        <w:t xml:space="preserve">ANPR — Plate Detection &amp; OCR</w:t>
+      </w:r>
+      <w:r>
+        <w:rPr>
+          <w:rFonts w:ascii="Calibri" w:cs="Calibri" w:eastAsia="Calibri" w:hAnsi="Calibri"/>
+          <w:b w:val="false"/>
+          <w:bCs w:val="false"/>
+          <w:i w:val="false"/>
+          <w:iCs w:val="false"/>
+          <w:color w:val="666666"/>
+          <w:sz w:val="20"/>
+          <w:szCs w:val="20"/>
+        </w:rPr>
+        <w:t xml:space="preserve"> — Automatic Number Plate Recognition</w:t>
+      </w:r>
+    </w:p>
+    <w:p>
+      <w:pPr>
+        <w:spacing w:after="120"/>
+      </w:pPr>
+      <w:r>
+        <w:rPr>
+          <w:rFonts w:ascii="Calibri" w:cs="Calibri" w:eastAsia="Calibri" w:hAnsi="Calibri"/>
+          <w:b w:val="false"/>
+          <w:bCs w:val="false"/>
+          <w:i w:val="false"/>
+          <w:iCs w:val="false"/>
+          <w:color w:val="333333"/>
+          <w:sz w:val="19"/>
+          <w:szCs w:val="19"/>
+        </w:rPr>
+        <w:t xml:space="preserve">Problem: Manual plate reading does not scale for parking, security, or traffic monitoring use cases.</w:t>
+      </w:r>
+    </w:p>
+    <w:p>
+      <w:pPr>
+        <w:spacing w:after="120"/>
+      </w:pPr>
+      <w:r>
+        <w:rPr>
+          <w:rFonts w:ascii="Calibri" w:cs="Calibri" w:eastAsia="Calibri" w:hAnsi="Calibri"/>
+          <w:b w:val="false"/>
+          <w:bCs w:val="false"/>
+          <w:i w:val="false"/>
+          <w:iCs w:val="false"/>
+          <w:color w:val="333333"/>
+          <w:sz w:val="19"/>
+          <w:szCs w:val="19"/>
+        </w:rPr>
+        <w:t xml:space="preserve">Built: Python CV pipeline combining detection models, alignment, OCR, and structured plate text output (ANPR-Q11).</w:t>
+      </w:r>
+    </w:p>
+    <w:p>
+      <w:pPr>
+        <w:spacing w:after="120"/>
+      </w:pPr>
+      <w:r>
+        <w:rPr>
+          <w:rFonts w:ascii="Calibri" w:cs="Calibri" w:eastAsia="Calibri" w:hAnsi="Calibri"/>
+          <w:b w:val="false"/>
+          <w:bCs w:val="false"/>
+          <w:i w:val="false"/>
+          <w:iCs w:val="false"/>
+          <w:color w:val="333333"/>
+          <w:sz w:val="19"/>
+          <w:szCs w:val="19"/>
+        </w:rPr>
+        <w:t xml:space="preserve">Outcome: Working ANPR pipeline from raw images to readable plate strings.</w:t>
+      </w:r>
+    </w:p>
+    <w:p>
+      <w:pPr>
+        <w:spacing w:after="80"/>
+      </w:pPr>
+      <w:r>
+        <w:rPr>
+          <w:rFonts w:ascii="Calibri" w:cs="Calibri" w:eastAsia="Calibri" w:hAnsi="Calibri"/>
+          <w:b/>
+          <w:bCs/>
+          <w:i w:val="false"/>
+          <w:iCs w:val="false"/>
+          <w:color w:val="333333"/>
+          <w:sz w:val="19"/>
+          <w:szCs w:val="19"/>
+        </w:rPr>
+        <w:t xml:space="preserve">Tech: Python, OpenCV, OCR, Computer Vision, YOLO, AI</w:t>
+      </w:r>
+    </w:p>
+    <w:p>
+      <w:pPr>
+        <w:spacing w:after="80"/>
+      </w:pPr>
+      <w:hyperlink w:history="1" r:id="rIdcvwde-xgr8tin9bquoncn">
+        <w:r>
+          <w:rPr>
+            <w:rFonts w:ascii="Calibri" w:cs="Calibri" w:eastAsia="Calibri" w:hAnsi="Calibri"/>
+            <w:b w:val="false"/>
+            <w:bCs w:val="false"/>
+            <w:i w:val="false"/>
+            <w:iCs w:val="false"/>
+            <w:color w:val="0563C1"/>
+            <w:sz w:val="19"/>
+            <w:szCs w:val="19"/>
+          </w:rPr>
+          <w:t xml:space="preserve">GitHub: https://github.com/Arn-The-Wolf/ANPR-Detection-Alignment-OCR</w:t>
+        </w:r>
+      </w:hyperlink>
+    </w:p>
+    <w:p>
+      <w:pPr>
+        <w:spacing w:after="40" w:before="60"/>
+      </w:pPr>
+      <w:r>
+        <w:rPr>
+          <w:rFonts w:ascii="Calibri" w:cs="Calibri" w:eastAsia="Calibri" w:hAnsi="Calibri"/>
+          <w:b/>
+          <w:bCs/>
+          <w:i w:val="false"/>
+          <w:iCs w:val="false"/>
+          <w:color w:val="333333"/>
+          <w:sz w:val="19"/>
+          <w:szCs w:val="19"/>
+        </w:rPr>
+        <w:t xml:space="preserve">Key results</w:t>
+      </w:r>
+    </w:p>
+    <w:p>
+      <w:pPr>
+        <w:pStyle w:val="ListParagraph"/>
+        <w:numPr>
+          <w:ilvl w:val="0"/>
+          <w:numId w:val="2"/>
+        </w:numPr>
+        <w:spacing w:after="60"/>
+      </w:pPr>
+      <w:r>
+        <w:rPr>
+          <w:rFonts w:ascii="Calibri" w:cs="Calibri" w:eastAsia="Calibri" w:hAnsi="Calibri"/>
+          <w:b w:val="false"/>
+          <w:bCs w:val="false"/>
+          <w:i w:val="false"/>
+          <w:iCs w:val="false"/>
+          <w:color w:val="333333"/>
+          <w:sz w:val="19"/>
+          <w:szCs w:val="19"/>
+        </w:rPr>
+        <w:t xml:space="preserve">Detection + alignment + OCR</w:t>
+      </w:r>
+    </w:p>
+    <w:p>
+      <w:pPr>
+        <w:pStyle w:val="ListParagraph"/>
+        <w:numPr>
+          <w:ilvl w:val="0"/>
+          <w:numId w:val="2"/>
+        </w:numPr>
+        <w:spacing w:after="60"/>
+      </w:pPr>
+      <w:r>
+        <w:rPr>
+          <w:rFonts w:ascii="Calibri" w:cs="Calibri" w:eastAsia="Calibri" w:hAnsi="Calibri"/>
+          <w:b w:val="false"/>
+          <w:bCs w:val="false"/>
+          <w:i w:val="false"/>
+          <w:iCs w:val="false"/>
+          <w:color w:val="333333"/>
+          <w:sz w:val="19"/>
+          <w:szCs w:val="19"/>
+        </w:rPr>
+        <w:t xml:space="preserve">Structured plate output</w:t>
+      </w:r>
+    </w:p>
+    <w:p>
+      <w:pPr>
+        <w:pStyle w:val="ListParagraph"/>
+        <w:numPr>
+          <w:ilvl w:val="0"/>
+          <w:numId w:val="2"/>
+        </w:numPr>
+        <w:spacing w:after="60"/>
+      </w:pPr>
+      <w:r>
+        <w:rPr>
+          <w:rFonts w:ascii="Calibri" w:cs="Calibri" w:eastAsia="Calibri" w:hAnsi="Calibri"/>
+          <w:b w:val="false"/>
+          <w:bCs w:val="false"/>
+          <w:i w:val="false"/>
+          <w:iCs w:val="false"/>
+          <w:color w:val="333333"/>
+          <w:sz w:val="19"/>
+          <w:szCs w:val="19"/>
+        </w:rPr>
+        <w:t xml:space="preserve">End-to-end ANPR flow</w:t>
+      </w:r>
+    </w:p>
+    <w:p>
+      <w:pPr>
+        <w:spacing w:after="40" w:before="80"/>
+      </w:pPr>
+      <w:r>
+        <w:rPr>
+          <w:rFonts w:ascii="Calibri" w:cs="Calibri" w:eastAsia="Calibri" w:hAnsi="Calibri"/>
+          <w:b/>
+          <w:bCs/>
+          <w:i w:val="false"/>
+          <w:iCs w:val="false"/>
+          <w:color w:val="333333"/>
+          <w:sz w:val="19"/>
+          <w:szCs w:val="19"/>
+        </w:rPr>
+        <w:t xml:space="preserve">Challenges solved</w:t>
+      </w:r>
+    </w:p>
+    <w:p>
+      <w:pPr>
+        <w:pStyle w:val="ListParagraph"/>
+        <w:numPr>
+          <w:ilvl w:val="0"/>
+          <w:numId w:val="2"/>
+        </w:numPr>
+        <w:spacing w:after="60"/>
+      </w:pPr>
+      <w:r>
+        <w:rPr>
+          <w:rFonts w:ascii="Calibri" w:cs="Calibri" w:eastAsia="Calibri" w:hAnsi="Calibri"/>
+          <w:b w:val="false"/>
+          <w:bCs w:val="false"/>
+          <w:i w:val="false"/>
+          <w:iCs w:val="false"/>
+          <w:color w:val="333333"/>
+          <w:sz w:val="19"/>
+          <w:szCs w:val="19"/>
+        </w:rPr>
+        <w:t xml:space="preserve">Plate detection accuracy</w:t>
+      </w:r>
+    </w:p>
+    <w:p>
+      <w:pPr>
+        <w:pStyle w:val="ListParagraph"/>
+        <w:numPr>
+          <w:ilvl w:val="0"/>
+          <w:numId w:val="2"/>
+        </w:numPr>
+        <w:spacing w:after="60"/>
+      </w:pPr>
+      <w:r>
+        <w:rPr>
+          <w:rFonts w:ascii="Calibri" w:cs="Calibri" w:eastAsia="Calibri" w:hAnsi="Calibri"/>
+          <w:b w:val="false"/>
+          <w:bCs w:val="false"/>
+          <w:i w:val="false"/>
+          <w:iCs w:val="false"/>
+          <w:color w:val="333333"/>
+          <w:sz w:val="19"/>
+          <w:szCs w:val="19"/>
+        </w:rPr>
+        <w:t xml:space="preserve">OCR on skewed plates</w:t>
+      </w:r>
+    </w:p>
+    <w:p>
+      <w:pPr>
+        <w:pStyle w:val="ListParagraph"/>
+        <w:numPr>
+          <w:ilvl w:val="0"/>
+          <w:numId w:val="2"/>
+        </w:numPr>
+        <w:spacing w:after="60"/>
+      </w:pPr>
+      <w:r>
+        <w:rPr>
+          <w:rFonts w:ascii="Calibri" w:cs="Calibri" w:eastAsia="Calibri" w:hAnsi="Calibri"/>
+          <w:b w:val="false"/>
+          <w:bCs w:val="false"/>
+          <w:i w:val="false"/>
+          <w:iCs w:val="false"/>
+          <w:color w:val="333333"/>
+          <w:sz w:val="19"/>
+          <w:szCs w:val="19"/>
+        </w:rPr>
+        <w:t xml:space="preserve">Real-world lighting</w:t>
+      </w:r>
+    </w:p>
+    <w:p>
+      <w:pPr>
+        <w:spacing w:after="40" w:before="180"/>
+      </w:pPr>
+      <w:r>
+        <w:rPr>
+          <w:rFonts w:ascii="Calibri" w:cs="Calibri" w:eastAsia="Calibri" w:hAnsi="Calibri"/>
+          <w:b/>
+          <w:bCs/>
+          <w:i w:val="false"/>
+          <w:iCs w:val="false"/>
+          <w:color w:val="2C3E50"/>
+          <w:sz w:val="26"/>
+          <w:szCs w:val="26"/>
+        </w:rPr>
+        <w:t xml:space="preserve">Face Tracker Live Dashboard</w:t>
+      </w:r>
+      <w:r>
+        <w:rPr>
+          <w:rFonts w:ascii="Calibri" w:cs="Calibri" w:eastAsia="Calibri" w:hAnsi="Calibri"/>
+          <w:b w:val="false"/>
+          <w:bCs w:val="false"/>
+          <w:i w:val="false"/>
+          <w:iCs w:val="false"/>
+          <w:color w:val="666666"/>
+          <w:sz w:val="20"/>
+          <w:szCs w:val="20"/>
+        </w:rPr>
+        <w:t xml:space="preserve"> — AI + IoT Recognition System</w:t>
+      </w:r>
+    </w:p>
+    <w:p>
+      <w:pPr>
+        <w:spacing w:after="120"/>
+      </w:pPr>
+      <w:r>
+        <w:rPr>
+          <w:rFonts w:ascii="Calibri" w:cs="Calibri" w:eastAsia="Calibri" w:hAnsi="Calibri"/>
+          <w:b w:val="false"/>
+          <w:bCs w:val="false"/>
+          <w:i w:val="false"/>
+          <w:iCs w:val="false"/>
+          <w:color w:val="333333"/>
+          <w:sz w:val="19"/>
+          <w:szCs w:val="19"/>
+        </w:rPr>
+        <w:t xml:space="preserve">Problem: Live environments need face recognition tied to hardware actuators with a real-time monitoring dashboard.</w:t>
+      </w:r>
+    </w:p>
+    <w:p>
+      <w:pPr>
+        <w:spacing w:after="120"/>
+      </w:pPr>
+      <w:r>
+        <w:rPr>
+          <w:rFonts w:ascii="Calibri" w:cs="Calibri" w:eastAsia="Calibri" w:hAnsi="Calibri"/>
+          <w:b w:val="false"/>
+          <w:bCs w:val="false"/>
+          <w:i w:val="false"/>
+          <w:iCs w:val="false"/>
+          <w:color w:val="333333"/>
+          <w:sz w:val="19"/>
+          <w:szCs w:val="19"/>
+        </w:rPr>
+        <w:t xml:space="preserve">Built: Python recognition stack, MQTT/device integration, and a dashboard for live tracking events.</w:t>
+      </w:r>
+    </w:p>
+    <w:p>
+      <w:pPr>
+        <w:spacing w:after="120"/>
+      </w:pPr>
+      <w:r>
+        <w:rPr>
+          <w:rFonts w:ascii="Calibri" w:cs="Calibri" w:eastAsia="Calibri" w:hAnsi="Calibri"/>
+          <w:b w:val="false"/>
+          <w:bCs w:val="false"/>
+          <w:i w:val="false"/>
+          <w:iCs w:val="false"/>
+          <w:color w:val="333333"/>
+          <w:sz w:val="19"/>
+          <w:szCs w:val="19"/>
+        </w:rPr>
+        <w:t xml:space="preserve">Outcome: Integrated CV + IoT demo suitable for access control and monitoring prototypes.</w:t>
+      </w:r>
+    </w:p>
+    <w:p>
+      <w:pPr>
+        <w:spacing w:after="80"/>
+      </w:pPr>
+      <w:r>
+        <w:rPr>
+          <w:rFonts w:ascii="Calibri" w:cs="Calibri" w:eastAsia="Calibri" w:hAnsi="Calibri"/>
+          <w:b/>
+          <w:bCs/>
+          <w:i w:val="false"/>
+          <w:iCs w:val="false"/>
+          <w:color w:val="333333"/>
+          <w:sz w:val="19"/>
+          <w:szCs w:val="19"/>
+        </w:rPr>
+        <w:t xml:space="preserve">Tech: Python, OpenCV, MQTT, ESP32, Computer Vision, IoT</w:t>
+      </w:r>
+    </w:p>
+    <w:p>
+      <w:pPr>
+        <w:spacing w:after="80"/>
+      </w:pPr>
+      <w:hyperlink w:history="1" r:id="rIdj3l05fkhtx2-bgpllwxjh">
+        <w:r>
+          <w:rPr>
+            <w:rFonts w:ascii="Calibri" w:cs="Calibri" w:eastAsia="Calibri" w:hAnsi="Calibri"/>
+            <w:b w:val="false"/>
+            <w:bCs w:val="false"/>
+            <w:i w:val="false"/>
+            <w:iCs w:val="false"/>
+            <w:color w:val="0563C1"/>
+            <w:sz w:val="19"/>
+            <w:szCs w:val="19"/>
+          </w:rPr>
+          <w:t xml:space="preserve">GitHub: https://github.com/Arn-The-Wolf/face-tracker-live-dashboard</w:t>
+        </w:r>
+      </w:hyperlink>
+    </w:p>
+    <w:p>
+      <w:pPr>
+        <w:spacing w:after="40" w:before="60"/>
+      </w:pPr>
+      <w:r>
+        <w:rPr>
+          <w:rFonts w:ascii="Calibri" w:cs="Calibri" w:eastAsia="Calibri" w:hAnsi="Calibri"/>
+          <w:b/>
+          <w:bCs/>
+          <w:i w:val="false"/>
+          <w:iCs w:val="false"/>
+          <w:color w:val="333333"/>
+          <w:sz w:val="19"/>
+          <w:szCs w:val="19"/>
+        </w:rPr>
+        <w:t xml:space="preserve">Key results</w:t>
+      </w:r>
+    </w:p>
+    <w:p>
+      <w:pPr>
+        <w:pStyle w:val="ListParagraph"/>
+        <w:numPr>
+          <w:ilvl w:val="0"/>
+          <w:numId w:val="2"/>
+        </w:numPr>
+        <w:spacing w:after="60"/>
+      </w:pPr>
+      <w:r>
+        <w:rPr>
+          <w:rFonts w:ascii="Calibri" w:cs="Calibri" w:eastAsia="Calibri" w:hAnsi="Calibri"/>
+          <w:b w:val="false"/>
+          <w:bCs w:val="false"/>
+          <w:i w:val="false"/>
+          <w:iCs w:val="false"/>
+          <w:color w:val="333333"/>
+          <w:sz w:val="19"/>
+          <w:szCs w:val="19"/>
+        </w:rPr>
+        <w:t xml:space="preserve">Live face tracking</w:t>
+      </w:r>
+    </w:p>
+    <w:p>
+      <w:pPr>
+        <w:pStyle w:val="ListParagraph"/>
+        <w:numPr>
+          <w:ilvl w:val="0"/>
+          <w:numId w:val="2"/>
+        </w:numPr>
+        <w:spacing w:after="60"/>
+      </w:pPr>
+      <w:r>
+        <w:rPr>
+          <w:rFonts w:ascii="Calibri" w:cs="Calibri" w:eastAsia="Calibri" w:hAnsi="Calibri"/>
+          <w:b w:val="false"/>
+          <w:bCs w:val="false"/>
+          <w:i w:val="false"/>
+          <w:iCs w:val="false"/>
+          <w:color w:val="333333"/>
+          <w:sz w:val="19"/>
+          <w:szCs w:val="19"/>
+        </w:rPr>
+        <w:t xml:space="preserve">ESP32 integration</w:t>
+      </w:r>
+    </w:p>
+    <w:p>
+      <w:pPr>
+        <w:pStyle w:val="ListParagraph"/>
+        <w:numPr>
+          <w:ilvl w:val="0"/>
+          <w:numId w:val="2"/>
+        </w:numPr>
+        <w:spacing w:after="60"/>
+      </w:pPr>
+      <w:r>
+        <w:rPr>
+          <w:rFonts w:ascii="Calibri" w:cs="Calibri" w:eastAsia="Calibri" w:hAnsi="Calibri"/>
+          <w:b w:val="false"/>
+          <w:bCs w:val="false"/>
+          <w:i w:val="false"/>
+          <w:iCs w:val="false"/>
+          <w:color w:val="333333"/>
+          <w:sz w:val="19"/>
+          <w:szCs w:val="19"/>
+        </w:rPr>
+        <w:t xml:space="preserve">Monitoring dashboard</w:t>
+      </w:r>
+    </w:p>
+    <w:p>
+      <w:pPr>
+        <w:spacing w:after="40" w:before="80"/>
+      </w:pPr>
+      <w:r>
+        <w:rPr>
+          <w:rFonts w:ascii="Calibri" w:cs="Calibri" w:eastAsia="Calibri" w:hAnsi="Calibri"/>
+          <w:b/>
+          <w:bCs/>
+          <w:i w:val="false"/>
+          <w:iCs w:val="false"/>
+          <w:color w:val="333333"/>
+          <w:sz w:val="19"/>
+          <w:szCs w:val="19"/>
+        </w:rPr>
+        <w:t xml:space="preserve">Challenges solved</w:t>
+      </w:r>
+    </w:p>
+    <w:p>
+      <w:pPr>
+        <w:pStyle w:val="ListParagraph"/>
+        <w:numPr>
+          <w:ilvl w:val="0"/>
+          <w:numId w:val="2"/>
+        </w:numPr>
+        <w:spacing w:after="60"/>
+      </w:pPr>
+      <w:r>
+        <w:rPr>
+          <w:rFonts w:ascii="Calibri" w:cs="Calibri" w:eastAsia="Calibri" w:hAnsi="Calibri"/>
+          <w:b w:val="false"/>
+          <w:bCs w:val="false"/>
+          <w:i w:val="false"/>
+          <w:iCs w:val="false"/>
+          <w:color w:val="333333"/>
+          <w:sz w:val="19"/>
+          <w:szCs w:val="19"/>
+        </w:rPr>
+        <w:t xml:space="preserve">Real-time inference</w:t>
+      </w:r>
+    </w:p>
+    <w:p>
+      <w:pPr>
+        <w:pStyle w:val="ListParagraph"/>
+        <w:numPr>
+          <w:ilvl w:val="0"/>
+          <w:numId w:val="2"/>
+        </w:numPr>
+        <w:spacing w:after="60"/>
+      </w:pPr>
+      <w:r>
+        <w:rPr>
+          <w:rFonts w:ascii="Calibri" w:cs="Calibri" w:eastAsia="Calibri" w:hAnsi="Calibri"/>
+          <w:b w:val="false"/>
+          <w:bCs w:val="false"/>
+          <w:i w:val="false"/>
+          <w:iCs w:val="false"/>
+          <w:color w:val="333333"/>
+          <w:sz w:val="19"/>
+          <w:szCs w:val="19"/>
+        </w:rPr>
+        <w:t xml:space="preserve">Hardware integration</w:t>
+      </w:r>
+    </w:p>
+    <w:p>
+      <w:pPr>
+        <w:pStyle w:val="ListParagraph"/>
+        <w:numPr>
+          <w:ilvl w:val="0"/>
+          <w:numId w:val="2"/>
+        </w:numPr>
+        <w:spacing w:after="60"/>
+      </w:pPr>
+      <w:r>
+        <w:rPr>
+          <w:rFonts w:ascii="Calibri" w:cs="Calibri" w:eastAsia="Calibri" w:hAnsi="Calibri"/>
+          <w:b w:val="false"/>
+          <w:bCs w:val="false"/>
+          <w:i w:val="false"/>
+          <w:iCs w:val="false"/>
+          <w:color w:val="333333"/>
+          <w:sz w:val="19"/>
+          <w:szCs w:val="19"/>
+        </w:rPr>
+        <w:t xml:space="preserve">Dashboard latency</w:t>
+      </w:r>
+    </w:p>
+    <w:p>
+      <w:pPr>
+        <w:spacing w:after="40" w:before="180"/>
+      </w:pPr>
+      <w:r>
+        <w:rPr>
+          <w:rFonts w:ascii="Calibri" w:cs="Calibri" w:eastAsia="Calibri" w:hAnsi="Calibri"/>
+          <w:b/>
+          <w:bCs/>
+          <w:i w:val="false"/>
+          <w:iCs w:val="false"/>
+          <w:color w:val="2C3E50"/>
+          <w:sz w:val="26"/>
+          <w:szCs w:val="26"/>
+        </w:rPr>
+        <w:t xml:space="preserve">Handwriting Recognition AI</w:t>
+      </w:r>
+      <w:r>
+        <w:rPr>
+          <w:rFonts w:ascii="Calibri" w:cs="Calibri" w:eastAsia="Calibri" w:hAnsi="Calibri"/>
+          <w:b w:val="false"/>
+          <w:bCs w:val="false"/>
+          <w:i w:val="false"/>
+          <w:iCs w:val="false"/>
+          <w:color w:val="666666"/>
+          <w:sz w:val="20"/>
+          <w:szCs w:val="20"/>
+        </w:rPr>
         <w:t xml:space="preserve"> — CNN Machine Learning Model</w:t>
       </w:r>
     </w:p>
@@ -3329,7 +6025,7 @@
           <w:sz w:val="19"/>
           <w:szCs w:val="19"/>
         </w:rPr>
-        <w:t xml:space="preserve">Problem: Classifying handwritten digits and text manually does not scale — needed a trained model for automated recognition.</w:t>
+        <w:t xml:space="preserve">Problem: Classifying handwritten digits manually does not scale — needed a trained model for automated recognition.</w:t>
       </w:r>
     </w:p>
     <w:p>
@@ -3347,7 +6043,7 @@
           <w:sz w:val="19"/>
           <w:szCs w:val="19"/>
         </w:rPr>
-        <w:t xml:space="preserve">Built: A CNN in Python with TensorFlow: dataset preprocessing, model training, evaluation metrics, and inference on new samples.</w:t>
+        <w:t xml:space="preserve">Built: Python CNN: dataset preprocessing, model training, evaluation metrics, and inference on new samples.</w:t>
       </w:r>
     </w:p>
     <w:p>
@@ -3365,7 +6061,7 @@
           <w:sz w:val="19"/>
           <w:szCs w:val="19"/>
         </w:rPr>
-        <w:t xml:space="preserve">Outcome: Working classifier with extensible training pipeline and documented accuracy improvements across iterations.</w:t>
+        <w:t xml:space="preserve">Outcome: Working classifier with extensible training pipeline.</w:t>
       </w:r>
     </w:p>
     <w:p>
@@ -3390,7 +6086,7 @@
       <w:pPr>
         <w:spacing w:after="80"/>
       </w:pPr>
-      <w:hyperlink w:history="1" r:id="rIdhc_39n_5um3c_5gyhufis">
+      <w:hyperlink w:history="1" r:id="rIdxx-wijsk--t7x3nfavxs_">
         <w:r>
           <w:rPr>
             <w:rFonts w:ascii="Calibri" w:cs="Calibri" w:eastAsia="Calibri" w:hAnsi="Calibri"/>
@@ -3490,7 +6186,7 @@
           <w:sz w:val="19"/>
           <w:szCs w:val="19"/>
         </w:rPr>
-        <w:t xml:space="preserve">Extensible architecture</w:t>
+        <w:t xml:space="preserve">Extensible training pipeline</w:t>
       </w:r>
     </w:p>
     <w:p>
@@ -3577,7 +6273,7 @@
           <w:sz w:val="19"/>
           <w:szCs w:val="19"/>
         </w:rPr>
-        <w:t xml:space="preserve">Accuracy improvement</w:t>
+        <w:t xml:space="preserve">Overfitting control</w:t>
       </w:r>
     </w:p>
     <w:p>
@@ -3665,6 +6361,303 @@
           <w:szCs w:val="19"/>
         </w:rPr>
         <w:t xml:space="preserve">Accuracy: Baseline → High confidence (Strong)</w:t>
+      </w:r>
+    </w:p>
+    <w:p>
+      <w:pPr>
+        <w:spacing w:after="40" w:before="180"/>
+      </w:pPr>
+      <w:r>
+        <w:rPr>
+          <w:rFonts w:ascii="Calibri" w:cs="Calibri" w:eastAsia="Calibri" w:hAnsi="Calibri"/>
+          <w:b/>
+          <w:bCs/>
+          <w:i w:val="false"/>
+          <w:iCs w:val="false"/>
+          <w:color w:val="2C3E50"/>
+          <w:sz w:val="26"/>
+          <w:szCs w:val="26"/>
+        </w:rPr>
+        <w:t xml:space="preserve">Print Text Scanner</w:t>
+      </w:r>
+      <w:r>
+        <w:rPr>
+          <w:rFonts w:ascii="Calibri" w:cs="Calibri" w:eastAsia="Calibri" w:hAnsi="Calibri"/>
+          <w:b w:val="false"/>
+          <w:bCs w:val="false"/>
+          <w:i w:val="false"/>
+          <w:iCs w:val="false"/>
+          <w:color w:val="666666"/>
+          <w:sz w:val="20"/>
+          <w:szCs w:val="20"/>
+        </w:rPr>
+        <w:t xml:space="preserve"> — OCR Desktop + Web App</w:t>
+      </w:r>
+    </w:p>
+    <w:p>
+      <w:pPr>
+        <w:spacing w:after="120"/>
+      </w:pPr>
+      <w:r>
+        <w:rPr>
+          <w:rFonts w:ascii="Calibri" w:cs="Calibri" w:eastAsia="Calibri" w:hAnsi="Calibri"/>
+          <w:b w:val="false"/>
+          <w:bCs w:val="false"/>
+          <w:i w:val="false"/>
+          <w:iCs w:val="false"/>
+          <w:color w:val="333333"/>
+          <w:sz w:val="19"/>
+          <w:szCs w:val="19"/>
+        </w:rPr>
+        <w:t xml:space="preserve">Problem: Extracting text from scanned documents and images required a unified tool for desktop and web users.</w:t>
+      </w:r>
+    </w:p>
+    <w:p>
+      <w:pPr>
+        <w:spacing w:after="120"/>
+      </w:pPr>
+      <w:r>
+        <w:rPr>
+          <w:rFonts w:ascii="Calibri" w:cs="Calibri" w:eastAsia="Calibri" w:hAnsi="Calibri"/>
+          <w:b w:val="false"/>
+          <w:bCs w:val="false"/>
+          <w:i w:val="false"/>
+          <w:iCs w:val="false"/>
+          <w:color w:val="333333"/>
+          <w:sz w:val="19"/>
+          <w:szCs w:val="19"/>
+        </w:rPr>
+        <w:t xml:space="preserve">Built: Python OCR engine with GUI and web frontends, image preprocessing, and export to text formats.</w:t>
+      </w:r>
+    </w:p>
+    <w:p>
+      <w:pPr>
+        <w:spacing w:after="120"/>
+      </w:pPr>
+      <w:r>
+        <w:rPr>
+          <w:rFonts w:ascii="Calibri" w:cs="Calibri" w:eastAsia="Calibri" w:hAnsi="Calibri"/>
+          <w:b w:val="false"/>
+          <w:bCs w:val="false"/>
+          <w:i w:val="false"/>
+          <w:iCs w:val="false"/>
+          <w:color w:val="333333"/>
+          <w:sz w:val="19"/>
+          <w:szCs w:val="19"/>
+        </w:rPr>
+        <w:t xml:space="preserve">Outcome: Dual-interface OCR tool for document digitization workflows.</w:t>
+      </w:r>
+    </w:p>
+    <w:p>
+      <w:pPr>
+        <w:spacing w:after="80"/>
+      </w:pPr>
+      <w:r>
+        <w:rPr>
+          <w:rFonts w:ascii="Calibri" w:cs="Calibri" w:eastAsia="Calibri" w:hAnsi="Calibri"/>
+          <w:b/>
+          <w:bCs/>
+          <w:i w:val="false"/>
+          <w:iCs w:val="false"/>
+          <w:color w:val="333333"/>
+          <w:sz w:val="19"/>
+          <w:szCs w:val="19"/>
+        </w:rPr>
+        <w:t xml:space="preserve">Tech: Python, OCR, Tesseract, Flask, Computer Vision</w:t>
+      </w:r>
+    </w:p>
+    <w:p>
+      <w:pPr>
+        <w:spacing w:after="80"/>
+      </w:pPr>
+      <w:hyperlink w:history="1" r:id="rIdqna_ikvy0k3n1wg9falm5">
+        <w:r>
+          <w:rPr>
+            <w:rFonts w:ascii="Calibri" w:cs="Calibri" w:eastAsia="Calibri" w:hAnsi="Calibri"/>
+            <w:b w:val="false"/>
+            <w:bCs w:val="false"/>
+            <w:i w:val="false"/>
+            <w:iCs w:val="false"/>
+            <w:color w:val="0563C1"/>
+            <w:sz w:val="19"/>
+            <w:szCs w:val="19"/>
+          </w:rPr>
+          <w:t xml:space="preserve">GitHub: https://github.com/Arn-The-Wolf/Print_Text_Scanner</w:t>
+        </w:r>
+      </w:hyperlink>
+    </w:p>
+    <w:p>
+      <w:pPr>
+        <w:spacing w:after="40" w:before="60"/>
+      </w:pPr>
+      <w:r>
+        <w:rPr>
+          <w:rFonts w:ascii="Calibri" w:cs="Calibri" w:eastAsia="Calibri" w:hAnsi="Calibri"/>
+          <w:b/>
+          <w:bCs/>
+          <w:i w:val="false"/>
+          <w:iCs w:val="false"/>
+          <w:color w:val="333333"/>
+          <w:sz w:val="19"/>
+          <w:szCs w:val="19"/>
+        </w:rPr>
+        <w:t xml:space="preserve">Key results</w:t>
+      </w:r>
+    </w:p>
+    <w:p>
+      <w:pPr>
+        <w:pStyle w:val="ListParagraph"/>
+        <w:numPr>
+          <w:ilvl w:val="0"/>
+          <w:numId w:val="2"/>
+        </w:numPr>
+        <w:spacing w:after="60"/>
+      </w:pPr>
+      <w:r>
+        <w:rPr>
+          <w:rFonts w:ascii="Calibri" w:cs="Calibri" w:eastAsia="Calibri" w:hAnsi="Calibri"/>
+          <w:b w:val="false"/>
+          <w:bCs w:val="false"/>
+          <w:i w:val="false"/>
+          <w:iCs w:val="false"/>
+          <w:color w:val="333333"/>
+          <w:sz w:val="19"/>
+          <w:szCs w:val="19"/>
+        </w:rPr>
+        <w:t xml:space="preserve">Desktop + web OCR</w:t>
+      </w:r>
+    </w:p>
+    <w:p>
+      <w:pPr>
+        <w:pStyle w:val="ListParagraph"/>
+        <w:numPr>
+          <w:ilvl w:val="0"/>
+          <w:numId w:val="2"/>
+        </w:numPr>
+        <w:spacing w:after="60"/>
+      </w:pPr>
+      <w:r>
+        <w:rPr>
+          <w:rFonts w:ascii="Calibri" w:cs="Calibri" w:eastAsia="Calibri" w:hAnsi="Calibri"/>
+          <w:b w:val="false"/>
+          <w:bCs w:val="false"/>
+          <w:i w:val="false"/>
+          <w:iCs w:val="false"/>
+          <w:color w:val="333333"/>
+          <w:sz w:val="19"/>
+          <w:szCs w:val="19"/>
+        </w:rPr>
+        <w:t xml:space="preserve">Text export</w:t>
+      </w:r>
+    </w:p>
+    <w:p>
+      <w:pPr>
+        <w:pStyle w:val="ListParagraph"/>
+        <w:numPr>
+          <w:ilvl w:val="0"/>
+          <w:numId w:val="2"/>
+        </w:numPr>
+        <w:spacing w:after="60"/>
+      </w:pPr>
+      <w:r>
+        <w:rPr>
+          <w:rFonts w:ascii="Calibri" w:cs="Calibri" w:eastAsia="Calibri" w:hAnsi="Calibri"/>
+          <w:b w:val="false"/>
+          <w:bCs w:val="false"/>
+          <w:i w:val="false"/>
+          <w:iCs w:val="false"/>
+          <w:color w:val="333333"/>
+          <w:sz w:val="19"/>
+          <w:szCs w:val="19"/>
+        </w:rPr>
+        <w:t xml:space="preserve">Document scanning flow</w:t>
+      </w:r>
+    </w:p>
+    <w:p>
+      <w:pPr>
+        <w:spacing w:after="40" w:before="80"/>
+      </w:pPr>
+      <w:r>
+        <w:rPr>
+          <w:rFonts w:ascii="Calibri" w:cs="Calibri" w:eastAsia="Calibri" w:hAnsi="Calibri"/>
+          <w:b/>
+          <w:bCs/>
+          <w:i w:val="false"/>
+          <w:iCs w:val="false"/>
+          <w:color w:val="333333"/>
+          <w:sz w:val="19"/>
+          <w:szCs w:val="19"/>
+        </w:rPr>
+        <w:t xml:space="preserve">Challenges solved</w:t>
+      </w:r>
+    </w:p>
+    <w:p>
+      <w:pPr>
+        <w:pStyle w:val="ListParagraph"/>
+        <w:numPr>
+          <w:ilvl w:val="0"/>
+          <w:numId w:val="2"/>
+        </w:numPr>
+        <w:spacing w:after="60"/>
+      </w:pPr>
+      <w:r>
+        <w:rPr>
+          <w:rFonts w:ascii="Calibri" w:cs="Calibri" w:eastAsia="Calibri" w:hAnsi="Calibri"/>
+          <w:b w:val="false"/>
+          <w:bCs w:val="false"/>
+          <w:i w:val="false"/>
+          <w:iCs w:val="false"/>
+          <w:color w:val="333333"/>
+          <w:sz w:val="19"/>
+          <w:szCs w:val="19"/>
+        </w:rPr>
+        <w:t xml:space="preserve">Image preprocessing</w:t>
+      </w:r>
+    </w:p>
+    <w:p>
+      <w:pPr>
+        <w:pStyle w:val="ListParagraph"/>
+        <w:numPr>
+          <w:ilvl w:val="0"/>
+          <w:numId w:val="2"/>
+        </w:numPr>
+        <w:spacing w:after="60"/>
+      </w:pPr>
+      <w:r>
+        <w:rPr>
+          <w:rFonts w:ascii="Calibri" w:cs="Calibri" w:eastAsia="Calibri" w:hAnsi="Calibri"/>
+          <w:b w:val="false"/>
+          <w:bCs w:val="false"/>
+          <w:i w:val="false"/>
+          <w:iCs w:val="false"/>
+          <w:color w:val="333333"/>
+          <w:sz w:val="19"/>
+          <w:szCs w:val="19"/>
+        </w:rPr>
+        <w:t xml:space="preserve">OCR accuracy</w:t>
+      </w:r>
+    </w:p>
+    <w:p>
+      <w:pPr>
+        <w:pStyle w:val="ListParagraph"/>
+        <w:numPr>
+          <w:ilvl w:val="0"/>
+          <w:numId w:val="2"/>
+        </w:numPr>
+        <w:spacing w:after="60"/>
+      </w:pPr>
+      <w:r>
+        <w:rPr>
+          <w:rFonts w:ascii="Calibri" w:cs="Calibri" w:eastAsia="Calibri" w:hAnsi="Calibri"/>
+          <w:b w:val="false"/>
+          <w:bCs w:val="false"/>
+          <w:i w:val="false"/>
+          <w:iCs w:val="false"/>
+          <w:color w:val="333333"/>
+          <w:sz w:val="19"/>
+          <w:szCs w:val="19"/>
+        </w:rPr>
+        <w:t xml:space="preserve">Cross-platform UI</w:t>
       </w:r>
     </w:p>
     <w:p>
@@ -3707,7 +6700,7 @@
           <w:sz w:val="26"/>
           <w:szCs w:val="26"/>
         </w:rPr>
-        <w:t xml:space="preserve">mqtt-weather-app</w:t>
+        <w:t xml:space="preserve">MQTT Weather App</w:t>
       </w:r>
       <w:r>
         <w:rPr>
@@ -3756,7 +6749,7 @@
           <w:sz w:val="19"/>
           <w:szCs w:val="19"/>
         </w:rPr>
-        <w:t xml:space="preserve">Built: Flask API subscribing to MQTT topics, processing sensor payloads, and exposing a live weather dashboard. Dockerized for deployment.</w:t>
+        <w:t xml:space="preserve">Built: Flask API subscribing to MQTT topics, processing payloads, and exposing a live weather dashboard. Dockerized.</w:t>
       </w:r>
     </w:p>
     <w:p>
@@ -3774,7 +6767,7 @@
           <w:sz w:val="19"/>
           <w:szCs w:val="19"/>
         </w:rPr>
-        <w:t xml:space="preserve">Outcome: Live MQTT pub/sub pipeline with a working dashboard for environmental monitoring.</w:t>
+        <w:t xml:space="preserve">Outcome: Live MQTT pub/sub pipeline with working environmental dashboard.</w:t>
       </w:r>
     </w:p>
     <w:p>
@@ -3799,7 +6792,7 @@
       <w:pPr>
         <w:spacing w:after="80"/>
       </w:pPr>
-      <w:hyperlink w:history="1" r:id="rIdptfnbmtyrnzkowppk2r1f">
+      <w:hyperlink w:history="1" r:id="rIduq1kjl__gsgudj-_ur1tq">
         <w:r>
           <w:rPr>
             <w:rFonts w:ascii="Calibri" w:cs="Calibri" w:eastAsia="Calibri" w:hAnsi="Calibri"/>
@@ -3881,6 +6874,29 @@
     </w:p>
     <w:p>
       <w:pPr>
+        <w:pStyle w:val="ListParagraph"/>
+        <w:numPr>
+          <w:ilvl w:val="0"/>
+          <w:numId w:val="2"/>
+        </w:numPr>
+        <w:spacing w:after="60"/>
+      </w:pPr>
+      <w:r>
+        <w:rPr>
+          <w:rFonts w:ascii="Calibri" w:cs="Calibri" w:eastAsia="Calibri" w:hAnsi="Calibri"/>
+          <w:b w:val="false"/>
+          <w:bCs w:val="false"/>
+          <w:i w:val="false"/>
+          <w:iCs w:val="false"/>
+          <w:color w:val="333333"/>
+          <w:sz w:val="19"/>
+          <w:szCs w:val="19"/>
+        </w:rPr>
+        <w:t xml:space="preserve">Docker deployment</w:t>
+      </w:r>
+    </w:p>
+    <w:p>
+      <w:pPr>
         <w:spacing w:after="40" w:before="80"/>
       </w:pPr>
       <w:r>
@@ -3940,7 +6956,7 @@
           <w:sz w:val="19"/>
           <w:szCs w:val="19"/>
         </w:rPr>
-        <w:t xml:space="preserve">Real-time data processing</w:t>
+        <w:t xml:space="preserve">Real-time processing</w:t>
       </w:r>
     </w:p>
     <w:p>

</xml_diff>

<commit_message>
Add live demos, real experience, mobile project, and simplify PDF viewer.
Wire Ingoboka and portfolio demos, add Dictionary Mobile App, refresh experience timeline, remove duplicate Close button from resume viewer, and clear broken Clause Lens Railway link.

Co-authored-by: Cursor <cursoragent@cursor.com>
</commit_message>
<xml_diff>
--- a/public/RUYANGE-Arnold-Portfolio.docx
+++ b/public/RUYANGE-Arnold-Portfolio.docx
@@ -125,7 +125,7 @@
             <w:pPr>
               <w:spacing w:after="80"/>
             </w:pPr>
-            <w:hyperlink w:history="1" r:id="rId5ioutsnmexnn1papfdaf2">
+            <w:hyperlink w:history="1" r:id="rIdtjn_tyxqtf0t2mjou0ga8">
               <w:r>
                 <w:rPr>
                   <w:rFonts w:ascii="Calibri" w:cs="Calibri" w:eastAsia="Calibri" w:hAnsi="Calibri"/>
@@ -163,7 +163,7 @@
             <w:pPr>
               <w:spacing w:after="80"/>
             </w:pPr>
-            <w:hyperlink w:history="1" r:id="rId1qv5hpsndefejc87dijvz">
+            <w:hyperlink w:history="1" r:id="rIdtypte4w9mfdabrplx_ggx">
               <w:r>
                 <w:rPr>
                   <w:rFonts w:ascii="Calibri" w:cs="Calibri" w:eastAsia="Calibri" w:hAnsi="Calibri"/>
@@ -183,7 +183,7 @@
             <w:pPr>
               <w:spacing w:after="80"/>
             </w:pPr>
-            <w:hyperlink w:history="1" r:id="rIddxgdbupehp3l6sxquawn5">
+            <w:hyperlink w:history="1" r:id="rIdqurewr4lbcir23kw8cdw0">
               <w:r>
                 <w:rPr>
                   <w:rFonts w:ascii="Calibri" w:cs="Calibri" w:eastAsia="Calibri" w:hAnsi="Calibri"/>
@@ -1088,7 +1088,7 @@
                 <w:sz w:val="19"/>
                 <w:szCs w:val="19"/>
               </w:rPr>
-              <w:t xml:space="preserve">Full-Stack &amp; AI Project Portfolio</w:t>
+              <w:t xml:space="preserve">Full-Stack Engineering Portfolio</w:t>
             </w:r>
           </w:p>
           <w:p>
@@ -1107,6 +1107,78 @@
                 <w:szCs w:val="18"/>
               </w:rPr>
               <w:t xml:space="preserve">Project-Based Learning · 2025</w:t>
+            </w:r>
+          </w:p>
+          <w:p>
+            <w:pPr>
+              <w:spacing w:after="40" w:before="80"/>
+            </w:pPr>
+            <w:r>
+              <w:rPr>
+                <w:rFonts w:ascii="Calibri" w:cs="Calibri" w:eastAsia="Calibri" w:hAnsi="Calibri"/>
+                <w:b/>
+                <w:bCs/>
+                <w:i w:val="false"/>
+                <w:iCs w:val="false"/>
+                <w:color w:val="333333"/>
+                <w:sz w:val="19"/>
+                <w:szCs w:val="19"/>
+              </w:rPr>
+              <w:t xml:space="preserve">AI / ML &amp; Computer Vision Practice</w:t>
+            </w:r>
+          </w:p>
+          <w:p>
+            <w:pPr>
+              <w:spacing w:after="80"/>
+            </w:pPr>
+            <w:r>
+              <w:rPr>
+                <w:rFonts w:ascii="Calibri" w:cs="Calibri" w:eastAsia="Calibri" w:hAnsi="Calibri"/>
+                <w:b w:val="false"/>
+                <w:bCs w:val="false"/>
+                <w:i w:val="false"/>
+                <w:iCs w:val="false"/>
+                <w:color w:val="666666"/>
+                <w:sz w:val="18"/>
+                <w:szCs w:val="18"/>
+              </w:rPr>
+              <w:t xml:space="preserve">Hands-on Projects · 2026</w:t>
+            </w:r>
+          </w:p>
+          <w:p>
+            <w:pPr>
+              <w:spacing w:after="40" w:before="80"/>
+            </w:pPr>
+            <w:r>
+              <w:rPr>
+                <w:rFonts w:ascii="Calibri" w:cs="Calibri" w:eastAsia="Calibri" w:hAnsi="Calibri"/>
+                <w:b/>
+                <w:bCs/>
+                <w:i w:val="false"/>
+                <w:iCs w:val="false"/>
+                <w:color w:val="333333"/>
+                <w:sz w:val="19"/>
+                <w:szCs w:val="19"/>
+              </w:rPr>
+              <w:t xml:space="preserve">Cloud &amp; Deployment</w:t>
+            </w:r>
+          </w:p>
+          <w:p>
+            <w:pPr>
+              <w:spacing w:after="80"/>
+            </w:pPr>
+            <w:r>
+              <w:rPr>
+                <w:rFonts w:ascii="Calibri" w:cs="Calibri" w:eastAsia="Calibri" w:hAnsi="Calibri"/>
+                <w:b w:val="false"/>
+                <w:bCs w:val="false"/>
+                <w:i w:val="false"/>
+                <w:iCs w:val="false"/>
+                <w:color w:val="666666"/>
+                <w:sz w:val="18"/>
+                <w:szCs w:val="18"/>
+              </w:rPr>
+              <w:t xml:space="preserve">Vercel · Railway · Docker · 2026</w:t>
             </w:r>
           </w:p>
         </w:tc>
@@ -1202,7 +1274,7 @@
                 <w:sz w:val="19"/>
                 <w:szCs w:val="19"/>
               </w:rPr>
-              <w:t xml:space="preserve">Full-stack developer with 3+ years of hands-on experience building Java, Python, AI/ML, and web applications. I design and ship end-to-end systems — from desktop GUIs and REST APIs to CNN models and IoT pipelines.</w:t>
+              <w:t xml:space="preserve">Full-stack developer with 3+ years of hands-on experience building Java, Python, AI/ML, and web applications. I design and ship end-to-end systems — from Spring Boot billing backends and Next.js PWAs to CNN/ONNX vision pipelines and RAG tools.</w:t>
             </w:r>
           </w:p>
           <w:p>
@@ -1220,7 +1292,7 @@
                 <w:sz w:val="19"/>
                 <w:szCs w:val="19"/>
               </w:rPr>
-              <w:t xml:space="preserve">Portfolio of RUYANGE Arnold — focused on practical software engineering through open-source work on GitHub, project-based learning, and production-ready user experiences.</w:t>
+              <w:t xml:space="preserve">Recent work includes Clause Lens (LLM + pgvector), Ingoboka microinsurance PWA, WASAC/REG unified billing, BestBuy Electronics, React Native dictionary app, and this portfolio at arnold-rho.vercel.app.</w:t>
             </w:r>
           </w:p>
           <w:p>
@@ -1262,7 +1334,7 @@
                 <w:sz w:val="21"/>
                 <w:szCs w:val="21"/>
               </w:rPr>
-              <w:t xml:space="preserve">University / Self-Directed Learning</w:t>
+              <w:t xml:space="preserve">Independent / Open Source</w:t>
             </w:r>
             <w:r>
               <w:rPr>
@@ -1275,7 +1347,7 @@
                 <w:sz w:val="19"/>
                 <w:szCs w:val="19"/>
               </w:rPr>
-              <w:t xml:space="preserve">	2023 - Present</w:t>
+              <w:t xml:space="preserve">	2024 — Present</w:t>
             </w:r>
           </w:p>
           <w:p>
@@ -1293,7 +1365,7 @@
                 <w:sz w:val="20"/>
                 <w:szCs w:val="20"/>
               </w:rPr>
-              <w:t xml:space="preserve">Computer Science Student</w:t>
+              <w:t xml:space="preserve">Full-Stack &amp; AI Developer</w:t>
             </w:r>
           </w:p>
           <w:p>
@@ -1311,7 +1383,7 @@
                 <w:sz w:val="19"/>
                 <w:szCs w:val="19"/>
               </w:rPr>
-              <w:t xml:space="preserve">Studying computer science fundamentals while building personal projects in Java, Python, AI/ML, and web development. Focus on practical software engineering through open-source work on GitHub.</w:t>
+              <w:t xml:space="preserve">Design and ship production-style systems end-to-end: Clause Lens (RAG insurance clause extraction with Claude + pgvector), Ingoboka (Next.js 14 microinsurance PWA), WASAC &amp; REG unified Spring Boot billing, BestBuy Electronics (React + Supabase), and ANPR / ArcFace computer-vision pipelines. Own architecture, APIs, data models, and deployment.</w:t>
             </w:r>
           </w:p>
           <w:p>
@@ -1334,7 +1406,7 @@
                 <w:sz w:val="19"/>
                 <w:szCs w:val="19"/>
               </w:rPr>
-              <w:t xml:space="preserve">Java</w:t>
+              <w:t xml:space="preserve">TypeScript</w:t>
             </w:r>
           </w:p>
           <w:p>
@@ -1357,7 +1429,7 @@
                 <w:sz w:val="19"/>
                 <w:szCs w:val="19"/>
               </w:rPr>
-              <w:t xml:space="preserve">Python</w:t>
+              <w:t xml:space="preserve">Next.js</w:t>
             </w:r>
           </w:p>
           <w:p>
@@ -1380,7 +1452,7 @@
                 <w:sz w:val="19"/>
                 <w:szCs w:val="19"/>
               </w:rPr>
-              <w:t xml:space="preserve">Next.js</w:t>
+              <w:t xml:space="preserve">Java</w:t>
             </w:r>
           </w:p>
           <w:p>
@@ -1403,7 +1475,7 @@
                 <w:sz w:val="19"/>
                 <w:szCs w:val="19"/>
               </w:rPr>
-              <w:t xml:space="preserve">TensorFlow</w:t>
+              <w:t xml:space="preserve">Spring Boot</w:t>
             </w:r>
           </w:p>
           <w:p>
@@ -1426,77 +1498,7 @@
                 <w:sz w:val="19"/>
                 <w:szCs w:val="19"/>
               </w:rPr>
-              <w:t xml:space="preserve">SQL</w:t>
-            </w:r>
-          </w:p>
-          <w:p>
-            <w:pPr>
-              <w:tabs>
-                <w:tab w:val="right" w:pos="6048"/>
-              </w:tabs>
-              <w:spacing w:after="40" w:before="140"/>
-            </w:pPr>
-            <w:r>
-              <w:rPr>
-                <w:rFonts w:ascii="Calibri" w:cs="Calibri" w:eastAsia="Calibri" w:hAnsi="Calibri"/>
-                <w:b/>
-                <w:bCs/>
-                <w:i w:val="false"/>
-                <w:iCs w:val="false"/>
-                <w:color w:val="333333"/>
-                <w:sz w:val="21"/>
-                <w:szCs w:val="21"/>
-              </w:rPr>
-              <w:t xml:space="preserve">Personal Projects &amp; Open Source</w:t>
-            </w:r>
-            <w:r>
-              <w:rPr>
-                <w:rFonts w:ascii="Calibri" w:cs="Calibri" w:eastAsia="Calibri" w:hAnsi="Calibri"/>
-                <w:b w:val="false"/>
-                <w:bCs w:val="false"/>
-                <w:i w:val="false"/>
-                <w:iCs w:val="false"/>
-                <w:color w:val="666666"/>
-                <w:sz w:val="19"/>
-                <w:szCs w:val="19"/>
-              </w:rPr>
-              <w:t xml:space="preserve">	2023 - Present</w:t>
-            </w:r>
-          </w:p>
-          <w:p>
-            <w:pPr>
-              <w:spacing w:after="80"/>
-            </w:pPr>
-            <w:r>
-              <w:rPr>
-                <w:rFonts w:ascii="Calibri" w:cs="Calibri" w:eastAsia="Calibri" w:hAnsi="Calibri"/>
-                <w:b w:val="false"/>
-                <w:bCs w:val="false"/>
-                <w:i/>
-                <w:iCs/>
-                <w:color w:val="333333"/>
-                <w:sz w:val="20"/>
-                <w:szCs w:val="20"/>
-              </w:rPr>
-              <w:t xml:space="preserve">Independent Developer</w:t>
-            </w:r>
-          </w:p>
-          <w:p>
-            <w:pPr>
-              <w:spacing w:after="80"/>
-            </w:pPr>
-            <w:r>
-              <w:rPr>
-                <w:rFonts w:ascii="Calibri" w:cs="Calibri" w:eastAsia="Calibri" w:hAnsi="Calibri"/>
-                <w:b w:val="false"/>
-                <w:bCs w:val="false"/>
-                <w:i w:val="false"/>
-                <w:iCs w:val="false"/>
-                <w:color w:val="333333"/>
-                <w:sz w:val="19"/>
-                <w:szCs w:val="19"/>
-              </w:rPr>
-              <w:t xml:space="preserve">Designed and shipped projects including an e-commerce platform (arnshop), handwriting recognition CNN, MQTT IoT weather system, web scraping pipelines, and this portfolio site.</w:t>
+              <w:t xml:space="preserve">Python</w:t>
             </w:r>
           </w:p>
           <w:p>
@@ -1519,7 +1521,7 @@
                 <w:sz w:val="19"/>
                 <w:szCs w:val="19"/>
               </w:rPr>
-              <w:t xml:space="preserve">Java</w:t>
+              <w:t xml:space="preserve">PostgreSQL</w:t>
             </w:r>
           </w:p>
           <w:p>
@@ -1542,7 +1544,7 @@
                 <w:sz w:val="19"/>
                 <w:szCs w:val="19"/>
               </w:rPr>
-              <w:t xml:space="preserve">Python</w:t>
+              <w:t xml:space="preserve">Supabase</w:t>
             </w:r>
           </w:p>
           <w:p>
@@ -1565,7 +1567,7 @@
                 <w:sz w:val="19"/>
                 <w:szCs w:val="19"/>
               </w:rPr>
-              <w:t xml:space="preserve">Flask</w:t>
+              <w:t xml:space="preserve">Claude API</w:t>
             </w:r>
           </w:p>
           <w:p>
@@ -1593,6 +1595,76 @@
           </w:p>
           <w:p>
             <w:pPr>
+              <w:tabs>
+                <w:tab w:val="right" w:pos="6048"/>
+              </w:tabs>
+              <w:spacing w:after="40" w:before="140"/>
+            </w:pPr>
+            <w:r>
+              <w:rPr>
+                <w:rFonts w:ascii="Calibri" w:cs="Calibri" w:eastAsia="Calibri" w:hAnsi="Calibri"/>
+                <w:b/>
+                <w:bCs/>
+                <w:i w:val="false"/>
+                <w:iCs w:val="false"/>
+                <w:color w:val="333333"/>
+                <w:sz w:val="21"/>
+                <w:szCs w:val="21"/>
+              </w:rPr>
+              <w:t xml:space="preserve">Personal R&amp;D Projects</w:t>
+            </w:r>
+            <w:r>
+              <w:rPr>
+                <w:rFonts w:ascii="Calibri" w:cs="Calibri" w:eastAsia="Calibri" w:hAnsi="Calibri"/>
+                <w:b w:val="false"/>
+                <w:bCs w:val="false"/>
+                <w:i w:val="false"/>
+                <w:iCs w:val="false"/>
+                <w:color w:val="666666"/>
+                <w:sz w:val="19"/>
+                <w:szCs w:val="19"/>
+              </w:rPr>
+              <w:t xml:space="preserve">	2025 — 2026</w:t>
+            </w:r>
+          </w:p>
+          <w:p>
+            <w:pPr>
+              <w:spacing w:after="80"/>
+            </w:pPr>
+            <w:r>
+              <w:rPr>
+                <w:rFonts w:ascii="Calibri" w:cs="Calibri" w:eastAsia="Calibri" w:hAnsi="Calibri"/>
+                <w:b w:val="false"/>
+                <w:bCs w:val="false"/>
+                <w:i/>
+                <w:iCs/>
+                <w:color w:val="333333"/>
+                <w:sz w:val="20"/>
+                <w:szCs w:val="20"/>
+              </w:rPr>
+              <w:t xml:space="preserve">IoT &amp; Computer Vision Builder</w:t>
+            </w:r>
+          </w:p>
+          <w:p>
+            <w:pPr>
+              <w:spacing w:after="80"/>
+            </w:pPr>
+            <w:r>
+              <w:rPr>
+                <w:rFonts w:ascii="Calibri" w:cs="Calibri" w:eastAsia="Calibri" w:hAnsi="Calibri"/>
+                <w:b w:val="false"/>
+                <w:bCs w:val="false"/>
+                <w:i w:val="false"/>
+                <w:iCs w:val="false"/>
+                <w:color w:val="333333"/>
+                <w:sz w:val="19"/>
+                <w:szCs w:val="19"/>
+              </w:rPr>
+              <w:t xml:space="preserve">Built hardware-aware CV and IoT stacks: face recognition with ArcFace ONNX on CPU, live face-tracker dashboards with ESP32/MQTT, ANPR detection + OCR, and MQTT weather monitoring with Flask. Focused on real-time inference, device integration, and practical edge deployments.</w:t>
+            </w:r>
+          </w:p>
+          <w:p>
+            <w:pPr>
               <w:pStyle w:val="ListParagraph"/>
               <w:numPr>
                 <w:ilvl w:val="0"/>
@@ -1611,7 +1683,376 @@
                 <w:sz w:val="19"/>
                 <w:szCs w:val="19"/>
               </w:rPr>
-              <w:t xml:space="preserve">Machine Learning</w:t>
+              <w:t xml:space="preserve">Python</w:t>
+            </w:r>
+          </w:p>
+          <w:p>
+            <w:pPr>
+              <w:pStyle w:val="ListParagraph"/>
+              <w:numPr>
+                <w:ilvl w:val="0"/>
+                <w:numId w:val="2"/>
+              </w:numPr>
+              <w:spacing w:after="60"/>
+            </w:pPr>
+            <w:r>
+              <w:rPr>
+                <w:rFonts w:ascii="Calibri" w:cs="Calibri" w:eastAsia="Calibri" w:hAnsi="Calibri"/>
+                <w:b w:val="false"/>
+                <w:bCs w:val="false"/>
+                <w:i w:val="false"/>
+                <w:iCs w:val="false"/>
+                <w:color w:val="333333"/>
+                <w:sz w:val="19"/>
+                <w:szCs w:val="19"/>
+              </w:rPr>
+              <w:t xml:space="preserve">OpenCV</w:t>
+            </w:r>
+          </w:p>
+          <w:p>
+            <w:pPr>
+              <w:pStyle w:val="ListParagraph"/>
+              <w:numPr>
+                <w:ilvl w:val="0"/>
+                <w:numId w:val="2"/>
+              </w:numPr>
+              <w:spacing w:after="60"/>
+            </w:pPr>
+            <w:r>
+              <w:rPr>
+                <w:rFonts w:ascii="Calibri" w:cs="Calibri" w:eastAsia="Calibri" w:hAnsi="Calibri"/>
+                <w:b w:val="false"/>
+                <w:bCs w:val="false"/>
+                <w:i w:val="false"/>
+                <w:iCs w:val="false"/>
+                <w:color w:val="333333"/>
+                <w:sz w:val="19"/>
+                <w:szCs w:val="19"/>
+              </w:rPr>
+              <w:t xml:space="preserve">ONNX</w:t>
+            </w:r>
+          </w:p>
+          <w:p>
+            <w:pPr>
+              <w:pStyle w:val="ListParagraph"/>
+              <w:numPr>
+                <w:ilvl w:val="0"/>
+                <w:numId w:val="2"/>
+              </w:numPr>
+              <w:spacing w:after="60"/>
+            </w:pPr>
+            <w:r>
+              <w:rPr>
+                <w:rFonts w:ascii="Calibri" w:cs="Calibri" w:eastAsia="Calibri" w:hAnsi="Calibri"/>
+                <w:b w:val="false"/>
+                <w:bCs w:val="false"/>
+                <w:i w:val="false"/>
+                <w:iCs w:val="false"/>
+                <w:color w:val="333333"/>
+                <w:sz w:val="19"/>
+                <w:szCs w:val="19"/>
+              </w:rPr>
+              <w:t xml:space="preserve">MQTT</w:t>
+            </w:r>
+          </w:p>
+          <w:p>
+            <w:pPr>
+              <w:pStyle w:val="ListParagraph"/>
+              <w:numPr>
+                <w:ilvl w:val="0"/>
+                <w:numId w:val="2"/>
+              </w:numPr>
+              <w:spacing w:after="60"/>
+            </w:pPr>
+            <w:r>
+              <w:rPr>
+                <w:rFonts w:ascii="Calibri" w:cs="Calibri" w:eastAsia="Calibri" w:hAnsi="Calibri"/>
+                <w:b w:val="false"/>
+                <w:bCs w:val="false"/>
+                <w:i w:val="false"/>
+                <w:iCs w:val="false"/>
+                <w:color w:val="333333"/>
+                <w:sz w:val="19"/>
+                <w:szCs w:val="19"/>
+              </w:rPr>
+              <w:t xml:space="preserve">ESP32</w:t>
+            </w:r>
+          </w:p>
+          <w:p>
+            <w:pPr>
+              <w:pStyle w:val="ListParagraph"/>
+              <w:numPr>
+                <w:ilvl w:val="0"/>
+                <w:numId w:val="2"/>
+              </w:numPr>
+              <w:spacing w:after="60"/>
+            </w:pPr>
+            <w:r>
+              <w:rPr>
+                <w:rFonts w:ascii="Calibri" w:cs="Calibri" w:eastAsia="Calibri" w:hAnsi="Calibri"/>
+                <w:b w:val="false"/>
+                <w:bCs w:val="false"/>
+                <w:i w:val="false"/>
+                <w:iCs w:val="false"/>
+                <w:color w:val="333333"/>
+                <w:sz w:val="19"/>
+                <w:szCs w:val="19"/>
+              </w:rPr>
+              <w:t xml:space="preserve">Flask</w:t>
+            </w:r>
+          </w:p>
+          <w:p>
+            <w:pPr>
+              <w:pStyle w:val="ListParagraph"/>
+              <w:numPr>
+                <w:ilvl w:val="0"/>
+                <w:numId w:val="2"/>
+              </w:numPr>
+              <w:spacing w:after="60"/>
+            </w:pPr>
+            <w:r>
+              <w:rPr>
+                <w:rFonts w:ascii="Calibri" w:cs="Calibri" w:eastAsia="Calibri" w:hAnsi="Calibri"/>
+                <w:b w:val="false"/>
+                <w:bCs w:val="false"/>
+                <w:i w:val="false"/>
+                <w:iCs w:val="false"/>
+                <w:color w:val="333333"/>
+                <w:sz w:val="19"/>
+                <w:szCs w:val="19"/>
+              </w:rPr>
+              <w:t xml:space="preserve">OCR</w:t>
+            </w:r>
+          </w:p>
+          <w:p>
+            <w:pPr>
+              <w:pStyle w:val="ListParagraph"/>
+              <w:numPr>
+                <w:ilvl w:val="0"/>
+                <w:numId w:val="2"/>
+              </w:numPr>
+              <w:spacing w:after="60"/>
+            </w:pPr>
+            <w:r>
+              <w:rPr>
+                <w:rFonts w:ascii="Calibri" w:cs="Calibri" w:eastAsia="Calibri" w:hAnsi="Calibri"/>
+                <w:b w:val="false"/>
+                <w:bCs w:val="false"/>
+                <w:i w:val="false"/>
+                <w:iCs w:val="false"/>
+                <w:color w:val="333333"/>
+                <w:sz w:val="19"/>
+                <w:szCs w:val="19"/>
+              </w:rPr>
+              <w:t xml:space="preserve">Computer Vision</w:t>
+            </w:r>
+          </w:p>
+          <w:p>
+            <w:pPr>
+              <w:tabs>
+                <w:tab w:val="right" w:pos="6048"/>
+              </w:tabs>
+              <w:spacing w:after="40" w:before="140"/>
+            </w:pPr>
+            <w:r>
+              <w:rPr>
+                <w:rFonts w:ascii="Calibri" w:cs="Calibri" w:eastAsia="Calibri" w:hAnsi="Calibri"/>
+                <w:b/>
+                <w:bCs/>
+                <w:i w:val="false"/>
+                <w:iCs w:val="false"/>
+                <w:color w:val="333333"/>
+                <w:sz w:val="21"/>
+                <w:szCs w:val="21"/>
+              </w:rPr>
+              <w:t xml:space="preserve">University · Self-Directed Learning</w:t>
+            </w:r>
+            <w:r>
+              <w:rPr>
+                <w:rFonts w:ascii="Calibri" w:cs="Calibri" w:eastAsia="Calibri" w:hAnsi="Calibri"/>
+                <w:b w:val="false"/>
+                <w:bCs w:val="false"/>
+                <w:i w:val="false"/>
+                <w:iCs w:val="false"/>
+                <w:color w:val="666666"/>
+                <w:sz w:val="19"/>
+                <w:szCs w:val="19"/>
+              </w:rPr>
+              <w:t xml:space="preserve">	2023 — Present</w:t>
+            </w:r>
+          </w:p>
+          <w:p>
+            <w:pPr>
+              <w:spacing w:after="80"/>
+            </w:pPr>
+            <w:r>
+              <w:rPr>
+                <w:rFonts w:ascii="Calibri" w:cs="Calibri" w:eastAsia="Calibri" w:hAnsi="Calibri"/>
+                <w:b w:val="false"/>
+                <w:bCs w:val="false"/>
+                <w:i/>
+                <w:iCs/>
+                <w:color w:val="333333"/>
+                <w:sz w:val="20"/>
+                <w:szCs w:val="20"/>
+              </w:rPr>
+              <w:t xml:space="preserve">Computer Science Student</w:t>
+            </w:r>
+          </w:p>
+          <w:p>
+            <w:pPr>
+              <w:spacing w:after="80"/>
+            </w:pPr>
+            <w:r>
+              <w:rPr>
+                <w:rFonts w:ascii="Calibri" w:cs="Calibri" w:eastAsia="Calibri" w:hAnsi="Calibri"/>
+                <w:b w:val="false"/>
+                <w:bCs w:val="false"/>
+                <w:i w:val="false"/>
+                <w:iCs w:val="false"/>
+                <w:color w:val="333333"/>
+                <w:sz w:val="19"/>
+                <w:szCs w:val="19"/>
+              </w:rPr>
+              <w:t xml:space="preserve">Studying CS fundamentals while shipping portfolio-grade software — data structures/algorithms, databases, networking, and secure coding — applied through Java backends, React Native mobile apps, and full-stack web systems published on GitHub.</w:t>
+            </w:r>
+          </w:p>
+          <w:p>
+            <w:pPr>
+              <w:pStyle w:val="ListParagraph"/>
+              <w:numPr>
+                <w:ilvl w:val="0"/>
+                <w:numId w:val="2"/>
+              </w:numPr>
+              <w:spacing w:after="60"/>
+            </w:pPr>
+            <w:r>
+              <w:rPr>
+                <w:rFonts w:ascii="Calibri" w:cs="Calibri" w:eastAsia="Calibri" w:hAnsi="Calibri"/>
+                <w:b w:val="false"/>
+                <w:bCs w:val="false"/>
+                <w:i w:val="false"/>
+                <w:iCs w:val="false"/>
+                <w:color w:val="333333"/>
+                <w:sz w:val="19"/>
+                <w:szCs w:val="19"/>
+              </w:rPr>
+              <w:t xml:space="preserve">Java</w:t>
+            </w:r>
+          </w:p>
+          <w:p>
+            <w:pPr>
+              <w:pStyle w:val="ListParagraph"/>
+              <w:numPr>
+                <w:ilvl w:val="0"/>
+                <w:numId w:val="2"/>
+              </w:numPr>
+              <w:spacing w:after="60"/>
+            </w:pPr>
+            <w:r>
+              <w:rPr>
+                <w:rFonts w:ascii="Calibri" w:cs="Calibri" w:eastAsia="Calibri" w:hAnsi="Calibri"/>
+                <w:b w:val="false"/>
+                <w:bCs w:val="false"/>
+                <w:i w:val="false"/>
+                <w:iCs w:val="false"/>
+                <w:color w:val="333333"/>
+                <w:sz w:val="19"/>
+                <w:szCs w:val="19"/>
+              </w:rPr>
+              <w:t xml:space="preserve">Python</w:t>
+            </w:r>
+          </w:p>
+          <w:p>
+            <w:pPr>
+              <w:pStyle w:val="ListParagraph"/>
+              <w:numPr>
+                <w:ilvl w:val="0"/>
+                <w:numId w:val="2"/>
+              </w:numPr>
+              <w:spacing w:after="60"/>
+            </w:pPr>
+            <w:r>
+              <w:rPr>
+                <w:rFonts w:ascii="Calibri" w:cs="Calibri" w:eastAsia="Calibri" w:hAnsi="Calibri"/>
+                <w:b w:val="false"/>
+                <w:bCs w:val="false"/>
+                <w:i w:val="false"/>
+                <w:iCs w:val="false"/>
+                <w:color w:val="333333"/>
+                <w:sz w:val="19"/>
+                <w:szCs w:val="19"/>
+              </w:rPr>
+              <w:t xml:space="preserve">React Native</w:t>
+            </w:r>
+          </w:p>
+          <w:p>
+            <w:pPr>
+              <w:pStyle w:val="ListParagraph"/>
+              <w:numPr>
+                <w:ilvl w:val="0"/>
+                <w:numId w:val="2"/>
+              </w:numPr>
+              <w:spacing w:after="60"/>
+            </w:pPr>
+            <w:r>
+              <w:rPr>
+                <w:rFonts w:ascii="Calibri" w:cs="Calibri" w:eastAsia="Calibri" w:hAnsi="Calibri"/>
+                <w:b w:val="false"/>
+                <w:bCs w:val="false"/>
+                <w:i w:val="false"/>
+                <w:iCs w:val="false"/>
+                <w:color w:val="333333"/>
+                <w:sz w:val="19"/>
+                <w:szCs w:val="19"/>
+              </w:rPr>
+              <w:t xml:space="preserve">SQL</w:t>
+            </w:r>
+          </w:p>
+          <w:p>
+            <w:pPr>
+              <w:pStyle w:val="ListParagraph"/>
+              <w:numPr>
+                <w:ilvl w:val="0"/>
+                <w:numId w:val="2"/>
+              </w:numPr>
+              <w:spacing w:after="60"/>
+            </w:pPr>
+            <w:r>
+              <w:rPr>
+                <w:rFonts w:ascii="Calibri" w:cs="Calibri" w:eastAsia="Calibri" w:hAnsi="Calibri"/>
+                <w:b w:val="false"/>
+                <w:bCs w:val="false"/>
+                <w:i w:val="false"/>
+                <w:iCs w:val="false"/>
+                <w:color w:val="333333"/>
+                <w:sz w:val="19"/>
+                <w:szCs w:val="19"/>
+              </w:rPr>
+              <w:t xml:space="preserve">Algorithms</w:t>
+            </w:r>
+          </w:p>
+          <w:p>
+            <w:pPr>
+              <w:pStyle w:val="ListParagraph"/>
+              <w:numPr>
+                <w:ilvl w:val="0"/>
+                <w:numId w:val="2"/>
+              </w:numPr>
+              <w:spacing w:after="60"/>
+            </w:pPr>
+            <w:r>
+              <w:rPr>
+                <w:rFonts w:ascii="Calibri" w:cs="Calibri" w:eastAsia="Calibri" w:hAnsi="Calibri"/>
+                <w:b w:val="false"/>
+                <w:bCs w:val="false"/>
+                <w:i w:val="false"/>
+                <w:iCs w:val="false"/>
+                <w:color w:val="333333"/>
+                <w:sz w:val="19"/>
+                <w:szCs w:val="19"/>
+              </w:rPr>
+              <w:t xml:space="preserve">Git</w:t>
             </w:r>
           </w:p>
           <w:p>
@@ -1883,7 +2324,7 @@
       <w:pPr>
         <w:spacing w:after="80"/>
       </w:pPr>
-      <w:hyperlink w:history="1" r:id="rIduhczfnxt8rzzzqrzp9mbr">
+      <w:hyperlink w:history="1" r:id="rIda35zhzm3dgxrgt5mexxg1">
         <w:r>
           <w:rPr>
             <w:rFonts w:ascii="Calibri" w:cs="Calibri" w:eastAsia="Calibri" w:hAnsi="Calibri"/>
@@ -1983,7 +2424,7 @@
           <w:sz w:val="19"/>
           <w:szCs w:val="19"/>
         </w:rPr>
-        <w:t xml:space="preserve">Production-ready frontend</w:t>
+        <w:t xml:space="preserve">Live at ingoboka-platform.vercel.app</w:t>
       </w:r>
     </w:p>
     <w:p>
@@ -2088,7 +2529,7 @@
           <w:sz w:val="26"/>
           <w:szCs w:val="26"/>
         </w:rPr>
-        <w:t xml:space="preserve">BestBuy Electronics</w:t>
+        <w:t xml:space="preserve">ARNOLD.DEV Portfolio</w:t>
       </w:r>
       <w:r>
         <w:rPr>
@@ -2101,7 +2542,7 @@
           <w:sz w:val="20"/>
           <w:szCs w:val="20"/>
         </w:rPr>
-        <w:t xml:space="preserve"> — Full-Stack E-Commerce</w:t>
+        <w:t xml:space="preserve"> — Personal Developer Portfolio</w:t>
       </w:r>
     </w:p>
     <w:p>
@@ -2119,7 +2560,7 @@
           <w:sz w:val="19"/>
           <w:szCs w:val="19"/>
         </w:rPr>
-        <w:t xml:space="preserve">Problem: Electronics retail needed a modern storefront with a scalable backend for products, orders, and customer data.</w:t>
+        <w:t xml:space="preserve">Problem: Needed a fast, distinctive online presence to showcase projects, resumes, and contact — with admin CMS and production deployment.</w:t>
       </w:r>
     </w:p>
     <w:p>
@@ -2137,7 +2578,7 @@
           <w:sz w:val="19"/>
           <w:szCs w:val="19"/>
         </w:rPr>
-        <w:t xml:space="preserve">Built: Split repos: responsive React storefront with product catalog &amp; checkout; Next.js API backend with Supabase for auth, inventory, and orders.</w:t>
+        <w:t xml:space="preserve">Built: Full App Router site: TypeScript, Tailwind, Framer Motion, Three.js hero, JSON/Blob CMS APIs, Resend contact email, and Vercel production hosting.</w:t>
       </w:r>
     </w:p>
     <w:p>
@@ -2155,7 +2596,7 @@
           <w:sz w:val="19"/>
           <w:szCs w:val="19"/>
         </w:rPr>
-        <w:t xml:space="preserve">Outcome: End-to-end online store with separated frontend/backend deployment.</w:t>
+        <w:t xml:space="preserve">Outcome: Production portfolio used for job applications and open-source showcase.</w:t>
       </w:r>
     </w:p>
     <w:p>
@@ -2173,6 +2614,303 @@
           <w:sz w:val="19"/>
           <w:szCs w:val="19"/>
         </w:rPr>
+        <w:t xml:space="preserve">Tech: Next.js, TypeScript, Tailwind CSS, Three.js, Vercel, Resend</w:t>
+      </w:r>
+    </w:p>
+    <w:p>
+      <w:pPr>
+        <w:spacing w:after="80"/>
+      </w:pPr>
+      <w:hyperlink w:history="1" r:id="rIdoww4a0xynmgpcbvdq42ix">
+        <w:r>
+          <w:rPr>
+            <w:rFonts w:ascii="Calibri" w:cs="Calibri" w:eastAsia="Calibri" w:hAnsi="Calibri"/>
+            <w:b w:val="false"/>
+            <w:bCs w:val="false"/>
+            <w:i w:val="false"/>
+            <w:iCs w:val="false"/>
+            <w:color w:val="0563C1"/>
+            <w:sz w:val="19"/>
+            <w:szCs w:val="19"/>
+          </w:rPr>
+          <w:t xml:space="preserve">GitHub: https://github.com/Arn-The-Wolf/portfolio</w:t>
+        </w:r>
+      </w:hyperlink>
+    </w:p>
+    <w:p>
+      <w:pPr>
+        <w:spacing w:after="40" w:before="60"/>
+      </w:pPr>
+      <w:r>
+        <w:rPr>
+          <w:rFonts w:ascii="Calibri" w:cs="Calibri" w:eastAsia="Calibri" w:hAnsi="Calibri"/>
+          <w:b/>
+          <w:bCs/>
+          <w:i w:val="false"/>
+          <w:iCs w:val="false"/>
+          <w:color w:val="333333"/>
+          <w:sz w:val="19"/>
+          <w:szCs w:val="19"/>
+        </w:rPr>
+        <w:t xml:space="preserve">Key results</w:t>
+      </w:r>
+    </w:p>
+    <w:p>
+      <w:pPr>
+        <w:pStyle w:val="ListParagraph"/>
+        <w:numPr>
+          <w:ilvl w:val="0"/>
+          <w:numId w:val="2"/>
+        </w:numPr>
+        <w:spacing w:after="60"/>
+      </w:pPr>
+      <w:r>
+        <w:rPr>
+          <w:rFonts w:ascii="Calibri" w:cs="Calibri" w:eastAsia="Calibri" w:hAnsi="Calibri"/>
+          <w:b w:val="false"/>
+          <w:bCs w:val="false"/>
+          <w:i w:val="false"/>
+          <w:iCs w:val="false"/>
+          <w:color w:val="333333"/>
+          <w:sz w:val="19"/>
+          <w:szCs w:val="19"/>
+        </w:rPr>
+        <w:t xml:space="preserve">Live production site</w:t>
+      </w:r>
+    </w:p>
+    <w:p>
+      <w:pPr>
+        <w:pStyle w:val="ListParagraph"/>
+        <w:numPr>
+          <w:ilvl w:val="0"/>
+          <w:numId w:val="2"/>
+        </w:numPr>
+        <w:spacing w:after="60"/>
+      </w:pPr>
+      <w:r>
+        <w:rPr>
+          <w:rFonts w:ascii="Calibri" w:cs="Calibri" w:eastAsia="Calibri" w:hAnsi="Calibri"/>
+          <w:b w:val="false"/>
+          <w:bCs w:val="false"/>
+          <w:i w:val="false"/>
+          <w:iCs w:val="false"/>
+          <w:color w:val="333333"/>
+          <w:sz w:val="19"/>
+          <w:szCs w:val="19"/>
+        </w:rPr>
+        <w:t xml:space="preserve">Admin CMS + Blob storage</w:t>
+      </w:r>
+    </w:p>
+    <w:p>
+      <w:pPr>
+        <w:pStyle w:val="ListParagraph"/>
+        <w:numPr>
+          <w:ilvl w:val="0"/>
+          <w:numId w:val="2"/>
+        </w:numPr>
+        <w:spacing w:after="60"/>
+      </w:pPr>
+      <w:r>
+        <w:rPr>
+          <w:rFonts w:ascii="Calibri" w:cs="Calibri" w:eastAsia="Calibri" w:hAnsi="Calibri"/>
+          <w:b w:val="false"/>
+          <w:bCs w:val="false"/>
+          <w:i w:val="false"/>
+          <w:iCs w:val="false"/>
+          <w:color w:val="333333"/>
+          <w:sz w:val="19"/>
+          <w:szCs w:val="19"/>
+        </w:rPr>
+        <w:t xml:space="preserve">Resume viewer &amp; contact flow</w:t>
+      </w:r>
+    </w:p>
+    <w:p>
+      <w:pPr>
+        <w:spacing w:after="40" w:before="80"/>
+      </w:pPr>
+      <w:r>
+        <w:rPr>
+          <w:rFonts w:ascii="Calibri" w:cs="Calibri" w:eastAsia="Calibri" w:hAnsi="Calibri"/>
+          <w:b/>
+          <w:bCs/>
+          <w:i w:val="false"/>
+          <w:iCs w:val="false"/>
+          <w:color w:val="333333"/>
+          <w:sz w:val="19"/>
+          <w:szCs w:val="19"/>
+        </w:rPr>
+        <w:t xml:space="preserve">Challenges solved</w:t>
+      </w:r>
+    </w:p>
+    <w:p>
+      <w:pPr>
+        <w:pStyle w:val="ListParagraph"/>
+        <w:numPr>
+          <w:ilvl w:val="0"/>
+          <w:numId w:val="2"/>
+        </w:numPr>
+        <w:spacing w:after="60"/>
+      </w:pPr>
+      <w:r>
+        <w:rPr>
+          <w:rFonts w:ascii="Calibri" w:cs="Calibri" w:eastAsia="Calibri" w:hAnsi="Calibri"/>
+          <w:b w:val="false"/>
+          <w:bCs w:val="false"/>
+          <w:i w:val="false"/>
+          <w:iCs w:val="false"/>
+          <w:color w:val="333333"/>
+          <w:sz w:val="19"/>
+          <w:szCs w:val="19"/>
+        </w:rPr>
+        <w:t xml:space="preserve">WebGL performance</w:t>
+      </w:r>
+    </w:p>
+    <w:p>
+      <w:pPr>
+        <w:pStyle w:val="ListParagraph"/>
+        <w:numPr>
+          <w:ilvl w:val="0"/>
+          <w:numId w:val="2"/>
+        </w:numPr>
+        <w:spacing w:after="60"/>
+      </w:pPr>
+      <w:r>
+        <w:rPr>
+          <w:rFonts w:ascii="Calibri" w:cs="Calibri" w:eastAsia="Calibri" w:hAnsi="Calibri"/>
+          <w:b w:val="false"/>
+          <w:bCs w:val="false"/>
+          <w:i w:val="false"/>
+          <w:iCs w:val="false"/>
+          <w:color w:val="333333"/>
+          <w:sz w:val="19"/>
+          <w:szCs w:val="19"/>
+        </w:rPr>
+        <w:t xml:space="preserve">Blob CMS on serverless</w:t>
+      </w:r>
+    </w:p>
+    <w:p>
+      <w:pPr>
+        <w:pStyle w:val="ListParagraph"/>
+        <w:numPr>
+          <w:ilvl w:val="0"/>
+          <w:numId w:val="2"/>
+        </w:numPr>
+        <w:spacing w:after="60"/>
+      </w:pPr>
+      <w:r>
+        <w:rPr>
+          <w:rFonts w:ascii="Calibri" w:cs="Calibri" w:eastAsia="Calibri" w:hAnsi="Calibri"/>
+          <w:b w:val="false"/>
+          <w:bCs w:val="false"/>
+          <w:i w:val="false"/>
+          <w:iCs w:val="false"/>
+          <w:color w:val="333333"/>
+          <w:sz w:val="19"/>
+          <w:szCs w:val="19"/>
+        </w:rPr>
+        <w:t xml:space="preserve">In-page PDF viewing</w:t>
+      </w:r>
+    </w:p>
+    <w:p>
+      <w:pPr>
+        <w:spacing w:after="40" w:before="180"/>
+      </w:pPr>
+      <w:r>
+        <w:rPr>
+          <w:rFonts w:ascii="Calibri" w:cs="Calibri" w:eastAsia="Calibri" w:hAnsi="Calibri"/>
+          <w:b/>
+          <w:bCs/>
+          <w:i w:val="false"/>
+          <w:iCs w:val="false"/>
+          <w:color w:val="2C3E50"/>
+          <w:sz w:val="26"/>
+          <w:szCs w:val="26"/>
+        </w:rPr>
+        <w:t xml:space="preserve">BestBuy Electronics</w:t>
+      </w:r>
+      <w:r>
+        <w:rPr>
+          <w:rFonts w:ascii="Calibri" w:cs="Calibri" w:eastAsia="Calibri" w:hAnsi="Calibri"/>
+          <w:b w:val="false"/>
+          <w:bCs w:val="false"/>
+          <w:i w:val="false"/>
+          <w:iCs w:val="false"/>
+          <w:color w:val="666666"/>
+          <w:sz w:val="20"/>
+          <w:szCs w:val="20"/>
+        </w:rPr>
+        <w:t xml:space="preserve"> — Full-Stack E-Commerce</w:t>
+      </w:r>
+    </w:p>
+    <w:p>
+      <w:pPr>
+        <w:spacing w:after="120"/>
+      </w:pPr>
+      <w:r>
+        <w:rPr>
+          <w:rFonts w:ascii="Calibri" w:cs="Calibri" w:eastAsia="Calibri" w:hAnsi="Calibri"/>
+          <w:b w:val="false"/>
+          <w:bCs w:val="false"/>
+          <w:i w:val="false"/>
+          <w:iCs w:val="false"/>
+          <w:color w:val="333333"/>
+          <w:sz w:val="19"/>
+          <w:szCs w:val="19"/>
+        </w:rPr>
+        <w:t xml:space="preserve">Problem: Electronics retail needed a modern storefront with a scalable backend for products, orders, and customer data.</w:t>
+      </w:r>
+    </w:p>
+    <w:p>
+      <w:pPr>
+        <w:spacing w:after="120"/>
+      </w:pPr>
+      <w:r>
+        <w:rPr>
+          <w:rFonts w:ascii="Calibri" w:cs="Calibri" w:eastAsia="Calibri" w:hAnsi="Calibri"/>
+          <w:b w:val="false"/>
+          <w:bCs w:val="false"/>
+          <w:i w:val="false"/>
+          <w:iCs w:val="false"/>
+          <w:color w:val="333333"/>
+          <w:sz w:val="19"/>
+          <w:szCs w:val="19"/>
+        </w:rPr>
+        <w:t xml:space="preserve">Built: Split repos: responsive React storefront with product catalog &amp; checkout; Next.js API backend with Supabase for auth, inventory, and orders.</w:t>
+      </w:r>
+    </w:p>
+    <w:p>
+      <w:pPr>
+        <w:spacing w:after="120"/>
+      </w:pPr>
+      <w:r>
+        <w:rPr>
+          <w:rFonts w:ascii="Calibri" w:cs="Calibri" w:eastAsia="Calibri" w:hAnsi="Calibri"/>
+          <w:b w:val="false"/>
+          <w:bCs w:val="false"/>
+          <w:i w:val="false"/>
+          <w:iCs w:val="false"/>
+          <w:color w:val="333333"/>
+          <w:sz w:val="19"/>
+          <w:szCs w:val="19"/>
+        </w:rPr>
+        <w:t xml:space="preserve">Outcome: End-to-end online store with separated frontend/backend deployment.</w:t>
+      </w:r>
+    </w:p>
+    <w:p>
+      <w:pPr>
+        <w:spacing w:after="80"/>
+      </w:pPr>
+      <w:r>
+        <w:rPr>
+          <w:rFonts w:ascii="Calibri" w:cs="Calibri" w:eastAsia="Calibri" w:hAnsi="Calibri"/>
+          <w:b/>
+          <w:bCs/>
+          <w:i w:val="false"/>
+          <w:iCs w:val="false"/>
+          <w:color w:val="333333"/>
+          <w:sz w:val="19"/>
+          <w:szCs w:val="19"/>
+        </w:rPr>
         <w:t xml:space="preserve">Tech: TypeScript, React, Next.js, Supabase, E-Commerce</w:t>
       </w:r>
     </w:p>
@@ -2180,7 +2918,7 @@
       <w:pPr>
         <w:spacing w:after="80"/>
       </w:pPr>
-      <w:hyperlink w:history="1" r:id="rIdwo7hdzvxhy9vqco7motdl">
+      <w:hyperlink w:history="1" r:id="rId7-_obwskcfsicn7hshdif">
         <w:r>
           <w:rPr>
             <w:rFonts w:ascii="Calibri" w:cs="Calibri" w:eastAsia="Calibri" w:hAnsi="Calibri"/>
@@ -2477,7 +3215,7 @@
       <w:pPr>
         <w:spacing w:after="80"/>
       </w:pPr>
-      <w:hyperlink w:history="1" r:id="rIdjfduemdbfbzzkylgspzrb">
+      <w:hyperlink w:history="1" r:id="rIdz1pppvc0effjwazpfzljy">
         <w:r>
           <w:rPr>
             <w:rFonts w:ascii="Calibri" w:cs="Calibri" w:eastAsia="Calibri" w:hAnsi="Calibri"/>
@@ -2774,7 +3512,7 @@
       <w:pPr>
         <w:spacing w:after="80"/>
       </w:pPr>
-      <w:hyperlink w:history="1" r:id="rIdmurdhqmobe9ogc1xfed7b">
+      <w:hyperlink w:history="1" r:id="rId4xbml_m3rr6i1jsqspcfj">
         <w:r>
           <w:rPr>
             <w:rFonts w:ascii="Calibri" w:cs="Calibri" w:eastAsia="Calibri" w:hAnsi="Calibri"/>
@@ -3158,7 +3896,7 @@
       <w:pPr>
         <w:spacing w:after="80"/>
       </w:pPr>
-      <w:hyperlink w:history="1" r:id="rIdh_m-mpbcqpquwfv2paa5x">
+      <w:hyperlink w:history="1" r:id="rIdcs4eci8hyicbkgsfh1ge0">
         <w:r>
           <w:rPr>
             <w:rFonts w:ascii="Calibri" w:cs="Calibri" w:eastAsia="Calibri" w:hAnsi="Calibri"/>
@@ -3432,7 +4170,7 @@
       <w:pPr>
         <w:spacing w:after="80"/>
       </w:pPr>
-      <w:hyperlink w:history="1" r:id="rIddw0pxuudwn1jzzt-8ma1u">
+      <w:hyperlink w:history="1" r:id="rIdz9hbxus0fpehl_qzg5cy0">
         <w:r>
           <w:rPr>
             <w:rFonts w:ascii="Calibri" w:cs="Calibri" w:eastAsia="Calibri" w:hAnsi="Calibri"/>
@@ -3754,7 +4492,7 @@
       <w:pPr>
         <w:spacing w:after="80"/>
       </w:pPr>
-      <w:hyperlink w:history="1" r:id="rId6rewtq2ihdtmom9cn9f54">
+      <w:hyperlink w:history="1" r:id="rIdbccdcmlnc1fvwmqlpa4ds">
         <w:r>
           <w:rPr>
             <w:rFonts w:ascii="Calibri" w:cs="Calibri" w:eastAsia="Calibri" w:hAnsi="Calibri"/>
@@ -4051,7 +4789,7 @@
       <w:pPr>
         <w:spacing w:after="80"/>
       </w:pPr>
-      <w:hyperlink w:history="1" r:id="rId6pezryp41d9ca4knovysx">
+      <w:hyperlink w:history="1" r:id="rId5ws-h5lgds7mfoe6mx4n2">
         <w:r>
           <w:rPr>
             <w:rFonts w:ascii="Calibri" w:cs="Calibri" w:eastAsia="Calibri" w:hAnsi="Calibri"/>
@@ -4348,7 +5086,7 @@
       <w:pPr>
         <w:spacing w:after="80"/>
       </w:pPr>
-      <w:hyperlink w:history="1" r:id="rId0y2ku6eelkrorsexmlawo">
+      <w:hyperlink w:history="1" r:id="rId6buip2qsyerm4acsyfm4b">
         <w:r>
           <w:rPr>
             <w:rFonts w:ascii="Calibri" w:cs="Calibri" w:eastAsia="Calibri" w:hAnsi="Calibri"/>
@@ -4645,7 +5383,7 @@
       <w:pPr>
         <w:spacing w:after="80"/>
       </w:pPr>
-      <w:hyperlink w:history="1" r:id="rIdykn6ca1onn2j4uuz0qiol">
+      <w:hyperlink w:history="1" r:id="rIdhusdvm6csr7dapbqhghzu">
         <w:r>
           <w:rPr>
             <w:rFonts w:ascii="Calibri" w:cs="Calibri" w:eastAsia="Calibri" w:hAnsi="Calibri"/>
@@ -4898,7 +5636,7 @@
       <w:pPr>
         <w:spacing w:after="80"/>
       </w:pPr>
-      <w:hyperlink w:history="1" r:id="rIdlyw5hb3xwt0jrtpfzollb">
+      <w:hyperlink w:history="1" r:id="rIdqhdj04ytkfwbkamr1xoq9">
         <w:r>
           <w:rPr>
             <w:rFonts w:ascii="Calibri" w:cs="Calibri" w:eastAsia="Calibri" w:hAnsi="Calibri"/>
@@ -5195,7 +5933,7 @@
       <w:pPr>
         <w:spacing w:after="80"/>
       </w:pPr>
-      <w:hyperlink w:history="1" r:id="rIdmr6-1mlxenjjiz2qofh2-">
+      <w:hyperlink w:history="1" r:id="rIdjoraidvwz9sem9wjzyh9n">
         <w:r>
           <w:rPr>
             <w:rFonts w:ascii="Calibri" w:cs="Calibri" w:eastAsia="Calibri" w:hAnsi="Calibri"/>
@@ -5492,7 +6230,7 @@
       <w:pPr>
         <w:spacing w:after="80"/>
       </w:pPr>
-      <w:hyperlink w:history="1" r:id="rIdcvwde-xgr8tin9bquoncn">
+      <w:hyperlink w:history="1" r:id="rId3ezucfzo7fazfdy0sc1ec">
         <w:r>
           <w:rPr>
             <w:rFonts w:ascii="Calibri" w:cs="Calibri" w:eastAsia="Calibri" w:hAnsi="Calibri"/>
@@ -5789,7 +6527,7 @@
       <w:pPr>
         <w:spacing w:after="80"/>
       </w:pPr>
-      <w:hyperlink w:history="1" r:id="rIdj3l05fkhtx2-bgpllwxjh">
+      <w:hyperlink w:history="1" r:id="rIds-xw425dpb8ngdhjabrg_">
         <w:r>
           <w:rPr>
             <w:rFonts w:ascii="Calibri" w:cs="Calibri" w:eastAsia="Calibri" w:hAnsi="Calibri"/>
@@ -6086,7 +6824,7 @@
       <w:pPr>
         <w:spacing w:after="80"/>
       </w:pPr>
-      <w:hyperlink w:history="1" r:id="rIdxx-wijsk--t7x3nfavxs_">
+      <w:hyperlink w:history="1" r:id="rIdz3x7tr5pr73fuxgrwfygf">
         <w:r>
           <w:rPr>
             <w:rFonts w:ascii="Calibri" w:cs="Calibri" w:eastAsia="Calibri" w:hAnsi="Calibri"/>
@@ -6470,7 +7208,7 @@
       <w:pPr>
         <w:spacing w:after="80"/>
       </w:pPr>
-      <w:hyperlink w:history="1" r:id="rIdqna_ikvy0k3n1wg9falm5">
+      <w:hyperlink w:history="1" r:id="rIdg6v8ivs0l3cb9q6fuwou0">
         <w:r>
           <w:rPr>
             <w:rFonts w:ascii="Calibri" w:cs="Calibri" w:eastAsia="Calibri" w:hAnsi="Calibri"/>
@@ -6792,7 +7530,7 @@
       <w:pPr>
         <w:spacing w:after="80"/>
       </w:pPr>
-      <w:hyperlink w:history="1" r:id="rIduq1kjl__gsgudj-_ur1tq">
+      <w:hyperlink w:history="1" r:id="rIdfoi6l_bkutlgibvzmaovn">
         <w:r>
           <w:rPr>
             <w:rFonts w:ascii="Calibri" w:cs="Calibri" w:eastAsia="Calibri" w:hAnsi="Calibri"/>

</xml_diff>

<commit_message>
Add 9 new GitHub projects, wire Credora and AviaServe live demos, update pinned list and regenerate DOCX
Co-authored-by: Cursor <cursoragent@cursor.com>
</commit_message>
<xml_diff>
--- a/public/RUYANGE-Arnold-Portfolio.docx
+++ b/public/RUYANGE-Arnold-Portfolio.docx
@@ -125,7 +125,7 @@
             <w:pPr>
               <w:spacing w:after="80"/>
             </w:pPr>
-            <w:hyperlink w:history="1" r:id="rIdtjn_tyxqtf0t2mjou0ga8">
+            <w:hyperlink w:history="1" r:id="rId16kjbl_q1yskc8gznbpzv">
               <w:r>
                 <w:rPr>
                   <w:rFonts w:ascii="Calibri" w:cs="Calibri" w:eastAsia="Calibri" w:hAnsi="Calibri"/>
@@ -163,7 +163,7 @@
             <w:pPr>
               <w:spacing w:after="80"/>
             </w:pPr>
-            <w:hyperlink w:history="1" r:id="rIdtypte4w9mfdabrplx_ggx">
+            <w:hyperlink w:history="1" r:id="rIdf8ksvoato7lwahqsynljz">
               <w:r>
                 <w:rPr>
                   <w:rFonts w:ascii="Calibri" w:cs="Calibri" w:eastAsia="Calibri" w:hAnsi="Calibri"/>
@@ -183,7 +183,7 @@
             <w:pPr>
               <w:spacing w:after="80"/>
             </w:pPr>
-            <w:hyperlink w:history="1" r:id="rIdqurewr4lbcir23kw8cdw0">
+            <w:hyperlink w:history="1" r:id="rIdso-w1nj0p9ctitc4pdcvs">
               <w:r>
                 <w:rPr>
                   <w:rFonts w:ascii="Calibri" w:cs="Calibri" w:eastAsia="Calibri" w:hAnsi="Calibri"/>
@@ -2324,7 +2324,7 @@
       <w:pPr>
         <w:spacing w:after="80"/>
       </w:pPr>
-      <w:hyperlink w:history="1" r:id="rIda35zhzm3dgxrgt5mexxg1">
+      <w:hyperlink w:history="1" r:id="rIddiuraqoacdowh0au0o38h">
         <w:r>
           <w:rPr>
             <w:rFonts w:ascii="Calibri" w:cs="Calibri" w:eastAsia="Calibri" w:hAnsi="Calibri"/>
@@ -2621,7 +2621,7 @@
       <w:pPr>
         <w:spacing w:after="80"/>
       </w:pPr>
-      <w:hyperlink w:history="1" r:id="rIdoww4a0xynmgpcbvdq42ix">
+      <w:hyperlink w:history="1" r:id="rIdezw5bptv6ikjrt2bcxfhi">
         <w:r>
           <w:rPr>
             <w:rFonts w:ascii="Calibri" w:cs="Calibri" w:eastAsia="Calibri" w:hAnsi="Calibri"/>
@@ -2918,7 +2918,7 @@
       <w:pPr>
         <w:spacing w:after="80"/>
       </w:pPr>
-      <w:hyperlink w:history="1" r:id="rId7-_obwskcfsicn7hshdif">
+      <w:hyperlink w:history="1" r:id="rIdeyzlbugcnyz9hanpqkova">
         <w:r>
           <w:rPr>
             <w:rFonts w:ascii="Calibri" w:cs="Calibri" w:eastAsia="Calibri" w:hAnsi="Calibri"/>
@@ -3215,7 +3215,7 @@
       <w:pPr>
         <w:spacing w:after="80"/>
       </w:pPr>
-      <w:hyperlink w:history="1" r:id="rIdz1pppvc0effjwazpfzljy">
+      <w:hyperlink w:history="1" r:id="rIde1-brxtfczktcbujtlnql">
         <w:r>
           <w:rPr>
             <w:rFonts w:ascii="Calibri" w:cs="Calibri" w:eastAsia="Calibri" w:hAnsi="Calibri"/>
@@ -3512,7 +3512,7 @@
       <w:pPr>
         <w:spacing w:after="80"/>
       </w:pPr>
-      <w:hyperlink w:history="1" r:id="rId4xbml_m3rr6i1jsqspcfj">
+      <w:hyperlink w:history="1" r:id="rId8vnfzeylbcinyotns-ine">
         <w:r>
           <w:rPr>
             <w:rFonts w:ascii="Calibri" w:cs="Calibri" w:eastAsia="Calibri" w:hAnsi="Calibri"/>
@@ -3804,7 +3804,7 @@
           <w:sz w:val="26"/>
           <w:szCs w:val="26"/>
         </w:rPr>
-        <w:t xml:space="preserve">ArnLibrary</w:t>
+        <w:t xml:space="preserve">Shift Swap</w:t>
       </w:r>
       <w:r>
         <w:rPr>
@@ -3817,6 +3817,897 @@
           <w:sz w:val="20"/>
           <w:szCs w:val="20"/>
         </w:rPr>
+        <w:t xml:space="preserve"> — Team Schedule &amp; Shift Management</w:t>
+      </w:r>
+    </w:p>
+    <w:p>
+      <w:pPr>
+        <w:spacing w:after="120"/>
+      </w:pPr>
+      <w:r>
+        <w:rPr>
+          <w:rFonts w:ascii="Calibri" w:cs="Calibri" w:eastAsia="Calibri" w:hAnsi="Calibri"/>
+          <w:b w:val="false"/>
+          <w:bCs w:val="false"/>
+          <w:i w:val="false"/>
+          <w:iCs w:val="false"/>
+          <w:color w:val="333333"/>
+          <w:sz w:val="19"/>
+          <w:szCs w:val="19"/>
+        </w:rPr>
+        <w:t xml:space="preserve">Problem: Team members need a simple way to view schedules, request shift swaps, and manage coverage without manual coordination.</w:t>
+      </w:r>
+    </w:p>
+    <w:p>
+      <w:pPr>
+        <w:spacing w:after="120"/>
+      </w:pPr>
+      <w:r>
+        <w:rPr>
+          <w:rFonts w:ascii="Calibri" w:cs="Calibri" w:eastAsia="Calibri" w:hAnsi="Calibri"/>
+          <w:b w:val="false"/>
+          <w:bCs w:val="false"/>
+          <w:i w:val="false"/>
+          <w:iCs w:val="false"/>
+          <w:color w:val="333333"/>
+          <w:sz w:val="19"/>
+          <w:szCs w:val="19"/>
+        </w:rPr>
+        <w:t xml:space="preserve">Built: Ruby on Rails application with schedule views, swap request workflows, and team management features.</w:t>
+      </w:r>
+    </w:p>
+    <w:p>
+      <w:pPr>
+        <w:spacing w:after="120"/>
+      </w:pPr>
+      <w:r>
+        <w:rPr>
+          <w:rFonts w:ascii="Calibri" w:cs="Calibri" w:eastAsia="Calibri" w:hAnsi="Calibri"/>
+          <w:b w:val="false"/>
+          <w:bCs w:val="false"/>
+          <w:i w:val="false"/>
+          <w:iCs w:val="false"/>
+          <w:color w:val="333333"/>
+          <w:sz w:val="19"/>
+          <w:szCs w:val="19"/>
+        </w:rPr>
+        <w:t xml:space="preserve">Outcome: Working shift management system with swap request workflows.</w:t>
+      </w:r>
+    </w:p>
+    <w:p>
+      <w:pPr>
+        <w:spacing w:after="80"/>
+      </w:pPr>
+      <w:r>
+        <w:rPr>
+          <w:rFonts w:ascii="Calibri" w:cs="Calibri" w:eastAsia="Calibri" w:hAnsi="Calibri"/>
+          <w:b/>
+          <w:bCs/>
+          <w:i w:val="false"/>
+          <w:iCs w:val="false"/>
+          <w:color w:val="333333"/>
+          <w:sz w:val="19"/>
+          <w:szCs w:val="19"/>
+        </w:rPr>
+        <w:t xml:space="preserve">Tech: Ruby on Rails, HTML, CSS, PostgreSQL</w:t>
+      </w:r>
+    </w:p>
+    <w:p>
+      <w:pPr>
+        <w:spacing w:after="80"/>
+      </w:pPr>
+      <w:hyperlink w:history="1" r:id="rIdryp20859ifcc6vhkb5cwc">
+        <w:r>
+          <w:rPr>
+            <w:rFonts w:ascii="Calibri" w:cs="Calibri" w:eastAsia="Calibri" w:hAnsi="Calibri"/>
+            <w:b w:val="false"/>
+            <w:bCs w:val="false"/>
+            <w:i w:val="false"/>
+            <w:iCs w:val="false"/>
+            <w:color w:val="0563C1"/>
+            <w:sz w:val="19"/>
+            <w:szCs w:val="19"/>
+          </w:rPr>
+          <w:t xml:space="preserve">GitHub: https://github.com/Arn-The-Wolf/shift-swap</w:t>
+        </w:r>
+      </w:hyperlink>
+    </w:p>
+    <w:p>
+      <w:pPr>
+        <w:spacing w:after="40" w:before="60"/>
+      </w:pPr>
+      <w:r>
+        <w:rPr>
+          <w:rFonts w:ascii="Calibri" w:cs="Calibri" w:eastAsia="Calibri" w:hAnsi="Calibri"/>
+          <w:b/>
+          <w:bCs/>
+          <w:i w:val="false"/>
+          <w:iCs w:val="false"/>
+          <w:color w:val="333333"/>
+          <w:sz w:val="19"/>
+          <w:szCs w:val="19"/>
+        </w:rPr>
+        <w:t xml:space="preserve">Key results</w:t>
+      </w:r>
+    </w:p>
+    <w:p>
+      <w:pPr>
+        <w:pStyle w:val="ListParagraph"/>
+        <w:numPr>
+          <w:ilvl w:val="0"/>
+          <w:numId w:val="2"/>
+        </w:numPr>
+        <w:spacing w:after="60"/>
+      </w:pPr>
+      <w:r>
+        <w:rPr>
+          <w:rFonts w:ascii="Calibri" w:cs="Calibri" w:eastAsia="Calibri" w:hAnsi="Calibri"/>
+          <w:b w:val="false"/>
+          <w:bCs w:val="false"/>
+          <w:i w:val="false"/>
+          <w:iCs w:val="false"/>
+          <w:color w:val="333333"/>
+          <w:sz w:val="19"/>
+          <w:szCs w:val="19"/>
+        </w:rPr>
+        <w:t xml:space="preserve">Shift scheduling UI</w:t>
+      </w:r>
+    </w:p>
+    <w:p>
+      <w:pPr>
+        <w:pStyle w:val="ListParagraph"/>
+        <w:numPr>
+          <w:ilvl w:val="0"/>
+          <w:numId w:val="2"/>
+        </w:numPr>
+        <w:spacing w:after="60"/>
+      </w:pPr>
+      <w:r>
+        <w:rPr>
+          <w:rFonts w:ascii="Calibri" w:cs="Calibri" w:eastAsia="Calibri" w:hAnsi="Calibri"/>
+          <w:b w:val="false"/>
+          <w:bCs w:val="false"/>
+          <w:i w:val="false"/>
+          <w:iCs w:val="false"/>
+          <w:color w:val="333333"/>
+          <w:sz w:val="19"/>
+          <w:szCs w:val="19"/>
+        </w:rPr>
+        <w:t xml:space="preserve">Swap request workflow</w:t>
+      </w:r>
+    </w:p>
+    <w:p>
+      <w:pPr>
+        <w:pStyle w:val="ListParagraph"/>
+        <w:numPr>
+          <w:ilvl w:val="0"/>
+          <w:numId w:val="2"/>
+        </w:numPr>
+        <w:spacing w:after="60"/>
+      </w:pPr>
+      <w:r>
+        <w:rPr>
+          <w:rFonts w:ascii="Calibri" w:cs="Calibri" w:eastAsia="Calibri" w:hAnsi="Calibri"/>
+          <w:b w:val="false"/>
+          <w:bCs w:val="false"/>
+          <w:i w:val="false"/>
+          <w:iCs w:val="false"/>
+          <w:color w:val="333333"/>
+          <w:sz w:val="19"/>
+          <w:szCs w:val="19"/>
+        </w:rPr>
+        <w:t xml:space="preserve">Team management</w:t>
+      </w:r>
+    </w:p>
+    <w:p>
+      <w:pPr>
+        <w:spacing w:after="40" w:before="80"/>
+      </w:pPr>
+      <w:r>
+        <w:rPr>
+          <w:rFonts w:ascii="Calibri" w:cs="Calibri" w:eastAsia="Calibri" w:hAnsi="Calibri"/>
+          <w:b/>
+          <w:bCs/>
+          <w:i w:val="false"/>
+          <w:iCs w:val="false"/>
+          <w:color w:val="333333"/>
+          <w:sz w:val="19"/>
+          <w:szCs w:val="19"/>
+        </w:rPr>
+        <w:t xml:space="preserve">Challenges solved</w:t>
+      </w:r>
+    </w:p>
+    <w:p>
+      <w:pPr>
+        <w:pStyle w:val="ListParagraph"/>
+        <w:numPr>
+          <w:ilvl w:val="0"/>
+          <w:numId w:val="2"/>
+        </w:numPr>
+        <w:spacing w:after="60"/>
+      </w:pPr>
+      <w:r>
+        <w:rPr>
+          <w:rFonts w:ascii="Calibri" w:cs="Calibri" w:eastAsia="Calibri" w:hAnsi="Calibri"/>
+          <w:b w:val="false"/>
+          <w:bCs w:val="false"/>
+          <w:i w:val="false"/>
+          <w:iCs w:val="false"/>
+          <w:color w:val="333333"/>
+          <w:sz w:val="19"/>
+          <w:szCs w:val="19"/>
+        </w:rPr>
+        <w:t xml:space="preserve">Swap approval logic</w:t>
+      </w:r>
+    </w:p>
+    <w:p>
+      <w:pPr>
+        <w:pStyle w:val="ListParagraph"/>
+        <w:numPr>
+          <w:ilvl w:val="0"/>
+          <w:numId w:val="2"/>
+        </w:numPr>
+        <w:spacing w:after="60"/>
+      </w:pPr>
+      <w:r>
+        <w:rPr>
+          <w:rFonts w:ascii="Calibri" w:cs="Calibri" w:eastAsia="Calibri" w:hAnsi="Calibri"/>
+          <w:b w:val="false"/>
+          <w:bCs w:val="false"/>
+          <w:i w:val="false"/>
+          <w:iCs w:val="false"/>
+          <w:color w:val="333333"/>
+          <w:sz w:val="19"/>
+          <w:szCs w:val="19"/>
+        </w:rPr>
+        <w:t xml:space="preserve">Schedule conflict detection</w:t>
+      </w:r>
+    </w:p>
+    <w:p>
+      <w:pPr>
+        <w:pStyle w:val="ListParagraph"/>
+        <w:numPr>
+          <w:ilvl w:val="0"/>
+          <w:numId w:val="2"/>
+        </w:numPr>
+        <w:spacing w:after="60"/>
+      </w:pPr>
+      <w:r>
+        <w:rPr>
+          <w:rFonts w:ascii="Calibri" w:cs="Calibri" w:eastAsia="Calibri" w:hAnsi="Calibri"/>
+          <w:b w:val="false"/>
+          <w:bCs w:val="false"/>
+          <w:i w:val="false"/>
+          <w:iCs w:val="false"/>
+          <w:color w:val="333333"/>
+          <w:sz w:val="19"/>
+          <w:szCs w:val="19"/>
+        </w:rPr>
+        <w:t xml:space="preserve">Team coordination UX</w:t>
+      </w:r>
+    </w:p>
+    <w:p>
+      <w:pPr>
+        <w:spacing w:after="40" w:before="180"/>
+      </w:pPr>
+      <w:r>
+        <w:rPr>
+          <w:rFonts w:ascii="Calibri" w:cs="Calibri" w:eastAsia="Calibri" w:hAnsi="Calibri"/>
+          <w:b/>
+          <w:bCs/>
+          <w:i w:val="false"/>
+          <w:iCs w:val="false"/>
+          <w:color w:val="2C3E50"/>
+          <w:sz w:val="26"/>
+          <w:szCs w:val="26"/>
+        </w:rPr>
+        <w:t xml:space="preserve">TZW Fire Safety Management</w:t>
+      </w:r>
+      <w:r>
+        <w:rPr>
+          <w:rFonts w:ascii="Calibri" w:cs="Calibri" w:eastAsia="Calibri" w:hAnsi="Calibri"/>
+          <w:b w:val="false"/>
+          <w:bCs w:val="false"/>
+          <w:i w:val="false"/>
+          <w:iCs w:val="false"/>
+          <w:color w:val="666666"/>
+          <w:sz w:val="20"/>
+          <w:szCs w:val="20"/>
+        </w:rPr>
+        <w:t xml:space="preserve"> — Fire Extinguisher Tracking System</w:t>
+      </w:r>
+    </w:p>
+    <w:p>
+      <w:pPr>
+        <w:spacing w:after="120"/>
+      </w:pPr>
+      <w:r>
+        <w:rPr>
+          <w:rFonts w:ascii="Calibri" w:cs="Calibri" w:eastAsia="Calibri" w:hAnsi="Calibri"/>
+          <w:b w:val="false"/>
+          <w:bCs w:val="false"/>
+          <w:i w:val="false"/>
+          <w:iCs w:val="false"/>
+          <w:color w:val="333333"/>
+          <w:sz w:val="19"/>
+          <w:szCs w:val="19"/>
+        </w:rPr>
+        <w:t xml:space="preserve">Problem: Managing fire extinguisher inspections, locations, and compliance across facilities requires a reliable tracking system.</w:t>
+      </w:r>
+    </w:p>
+    <w:p>
+      <w:pPr>
+        <w:spacing w:after="120"/>
+      </w:pPr>
+      <w:r>
+        <w:rPr>
+          <w:rFonts w:ascii="Calibri" w:cs="Calibri" w:eastAsia="Calibri" w:hAnsi="Calibri"/>
+          <w:b w:val="false"/>
+          <w:bCs w:val="false"/>
+          <w:i w:val="false"/>
+          <w:iCs w:val="false"/>
+          <w:color w:val="333333"/>
+          <w:sz w:val="19"/>
+          <w:szCs w:val="19"/>
+        </w:rPr>
+        <w:t xml:space="preserve">Built: Modular full-stack app with inspection scheduling, location tracking, expiry alerts, and compliance dashboards.</w:t>
+      </w:r>
+    </w:p>
+    <w:p>
+      <w:pPr>
+        <w:spacing w:after="120"/>
+      </w:pPr>
+      <w:r>
+        <w:rPr>
+          <w:rFonts w:ascii="Calibri" w:cs="Calibri" w:eastAsia="Calibri" w:hAnsi="Calibri"/>
+          <w:b w:val="false"/>
+          <w:bCs w:val="false"/>
+          <w:i w:val="false"/>
+          <w:iCs w:val="false"/>
+          <w:color w:val="333333"/>
+          <w:sz w:val="19"/>
+          <w:szCs w:val="19"/>
+        </w:rPr>
+        <w:t xml:space="preserve">Outcome: Complete fire safety compliance system with inspection tracking.</w:t>
+      </w:r>
+    </w:p>
+    <w:p>
+      <w:pPr>
+        <w:spacing w:after="80"/>
+      </w:pPr>
+      <w:r>
+        <w:rPr>
+          <w:rFonts w:ascii="Calibri" w:cs="Calibri" w:eastAsia="Calibri" w:hAnsi="Calibri"/>
+          <w:b/>
+          <w:bCs/>
+          <w:i w:val="false"/>
+          <w:iCs w:val="false"/>
+          <w:color w:val="333333"/>
+          <w:sz w:val="19"/>
+          <w:szCs w:val="19"/>
+        </w:rPr>
+        <w:t xml:space="preserve">Tech: HTML, CSS, JavaScript, Node.js, MySQL</w:t>
+      </w:r>
+    </w:p>
+    <w:p>
+      <w:pPr>
+        <w:spacing w:after="80"/>
+      </w:pPr>
+      <w:hyperlink w:history="1" r:id="rIdfpq5stm4ct4okcqn1a97p">
+        <w:r>
+          <w:rPr>
+            <w:rFonts w:ascii="Calibri" w:cs="Calibri" w:eastAsia="Calibri" w:hAnsi="Calibri"/>
+            <w:b w:val="false"/>
+            <w:bCs w:val="false"/>
+            <w:i w:val="false"/>
+            <w:iCs w:val="false"/>
+            <w:color w:val="0563C1"/>
+            <w:sz w:val="19"/>
+            <w:szCs w:val="19"/>
+          </w:rPr>
+          <w:t xml:space="preserve">GitHub: https://github.com/Arn-The-Wolf/tzw-fire-safety-management</w:t>
+        </w:r>
+      </w:hyperlink>
+    </w:p>
+    <w:p>
+      <w:pPr>
+        <w:spacing w:after="40" w:before="60"/>
+      </w:pPr>
+      <w:r>
+        <w:rPr>
+          <w:rFonts w:ascii="Calibri" w:cs="Calibri" w:eastAsia="Calibri" w:hAnsi="Calibri"/>
+          <w:b/>
+          <w:bCs/>
+          <w:i w:val="false"/>
+          <w:iCs w:val="false"/>
+          <w:color w:val="333333"/>
+          <w:sz w:val="19"/>
+          <w:szCs w:val="19"/>
+        </w:rPr>
+        <w:t xml:space="preserve">Key results</w:t>
+      </w:r>
+    </w:p>
+    <w:p>
+      <w:pPr>
+        <w:pStyle w:val="ListParagraph"/>
+        <w:numPr>
+          <w:ilvl w:val="0"/>
+          <w:numId w:val="2"/>
+        </w:numPr>
+        <w:spacing w:after="60"/>
+      </w:pPr>
+      <w:r>
+        <w:rPr>
+          <w:rFonts w:ascii="Calibri" w:cs="Calibri" w:eastAsia="Calibri" w:hAnsi="Calibri"/>
+          <w:b w:val="false"/>
+          <w:bCs w:val="false"/>
+          <w:i w:val="false"/>
+          <w:iCs w:val="false"/>
+          <w:color w:val="333333"/>
+          <w:sz w:val="19"/>
+          <w:szCs w:val="19"/>
+        </w:rPr>
+        <w:t xml:space="preserve">Equipment tracking</w:t>
+      </w:r>
+    </w:p>
+    <w:p>
+      <w:pPr>
+        <w:pStyle w:val="ListParagraph"/>
+        <w:numPr>
+          <w:ilvl w:val="0"/>
+          <w:numId w:val="2"/>
+        </w:numPr>
+        <w:spacing w:after="60"/>
+      </w:pPr>
+      <w:r>
+        <w:rPr>
+          <w:rFonts w:ascii="Calibri" w:cs="Calibri" w:eastAsia="Calibri" w:hAnsi="Calibri"/>
+          <w:b w:val="false"/>
+          <w:bCs w:val="false"/>
+          <w:i w:val="false"/>
+          <w:iCs w:val="false"/>
+          <w:color w:val="333333"/>
+          <w:sz w:val="19"/>
+          <w:szCs w:val="19"/>
+        </w:rPr>
+        <w:t xml:space="preserve">Inspection workflows</w:t>
+      </w:r>
+    </w:p>
+    <w:p>
+      <w:pPr>
+        <w:pStyle w:val="ListParagraph"/>
+        <w:numPr>
+          <w:ilvl w:val="0"/>
+          <w:numId w:val="2"/>
+        </w:numPr>
+        <w:spacing w:after="60"/>
+      </w:pPr>
+      <w:r>
+        <w:rPr>
+          <w:rFonts w:ascii="Calibri" w:cs="Calibri" w:eastAsia="Calibri" w:hAnsi="Calibri"/>
+          <w:b w:val="false"/>
+          <w:bCs w:val="false"/>
+          <w:i w:val="false"/>
+          <w:iCs w:val="false"/>
+          <w:color w:val="333333"/>
+          <w:sz w:val="19"/>
+          <w:szCs w:val="19"/>
+        </w:rPr>
+        <w:t xml:space="preserve">Compliance dashboard</w:t>
+      </w:r>
+    </w:p>
+    <w:p>
+      <w:pPr>
+        <w:spacing w:after="40" w:before="80"/>
+      </w:pPr>
+      <w:r>
+        <w:rPr>
+          <w:rFonts w:ascii="Calibri" w:cs="Calibri" w:eastAsia="Calibri" w:hAnsi="Calibri"/>
+          <w:b/>
+          <w:bCs/>
+          <w:i w:val="false"/>
+          <w:iCs w:val="false"/>
+          <w:color w:val="333333"/>
+          <w:sz w:val="19"/>
+          <w:szCs w:val="19"/>
+        </w:rPr>
+        <w:t xml:space="preserve">Challenges solved</w:t>
+      </w:r>
+    </w:p>
+    <w:p>
+      <w:pPr>
+        <w:pStyle w:val="ListParagraph"/>
+        <w:numPr>
+          <w:ilvl w:val="0"/>
+          <w:numId w:val="2"/>
+        </w:numPr>
+        <w:spacing w:after="60"/>
+      </w:pPr>
+      <w:r>
+        <w:rPr>
+          <w:rFonts w:ascii="Calibri" w:cs="Calibri" w:eastAsia="Calibri" w:hAnsi="Calibri"/>
+          <w:b w:val="false"/>
+          <w:bCs w:val="false"/>
+          <w:i w:val="false"/>
+          <w:iCs w:val="false"/>
+          <w:color w:val="333333"/>
+          <w:sz w:val="19"/>
+          <w:szCs w:val="19"/>
+        </w:rPr>
+        <w:t xml:space="preserve">Inspection scheduling</w:t>
+      </w:r>
+    </w:p>
+    <w:p>
+      <w:pPr>
+        <w:pStyle w:val="ListParagraph"/>
+        <w:numPr>
+          <w:ilvl w:val="0"/>
+          <w:numId w:val="2"/>
+        </w:numPr>
+        <w:spacing w:after="60"/>
+      </w:pPr>
+      <w:r>
+        <w:rPr>
+          <w:rFonts w:ascii="Calibri" w:cs="Calibri" w:eastAsia="Calibri" w:hAnsi="Calibri"/>
+          <w:b w:val="false"/>
+          <w:bCs w:val="false"/>
+          <w:i w:val="false"/>
+          <w:iCs w:val="false"/>
+          <w:color w:val="333333"/>
+          <w:sz w:val="19"/>
+          <w:szCs w:val="19"/>
+        </w:rPr>
+        <w:t xml:space="preserve">Compliance rules</w:t>
+      </w:r>
+    </w:p>
+    <w:p>
+      <w:pPr>
+        <w:pStyle w:val="ListParagraph"/>
+        <w:numPr>
+          <w:ilvl w:val="0"/>
+          <w:numId w:val="2"/>
+        </w:numPr>
+        <w:spacing w:after="60"/>
+      </w:pPr>
+      <w:r>
+        <w:rPr>
+          <w:rFonts w:ascii="Calibri" w:cs="Calibri" w:eastAsia="Calibri" w:hAnsi="Calibri"/>
+          <w:b w:val="false"/>
+          <w:bCs w:val="false"/>
+          <w:i w:val="false"/>
+          <w:iCs w:val="false"/>
+          <w:color w:val="333333"/>
+          <w:sz w:val="19"/>
+          <w:szCs w:val="19"/>
+        </w:rPr>
+        <w:t xml:space="preserve">Multi-facility tracking</w:t>
+      </w:r>
+    </w:p>
+    <w:p>
+      <w:pPr>
+        <w:spacing w:after="40" w:before="180"/>
+      </w:pPr>
+      <w:r>
+        <w:rPr>
+          <w:rFonts w:ascii="Calibri" w:cs="Calibri" w:eastAsia="Calibri" w:hAnsi="Calibri"/>
+          <w:b/>
+          <w:bCs/>
+          <w:i w:val="false"/>
+          <w:iCs w:val="false"/>
+          <w:color w:val="2C3E50"/>
+          <w:sz w:val="26"/>
+          <w:szCs w:val="26"/>
+        </w:rPr>
+        <w:t xml:space="preserve">Parking Management System</w:t>
+      </w:r>
+      <w:r>
+        <w:rPr>
+          <w:rFonts w:ascii="Calibri" w:cs="Calibri" w:eastAsia="Calibri" w:hAnsi="Calibri"/>
+          <w:b w:val="false"/>
+          <w:bCs w:val="false"/>
+          <w:i w:val="false"/>
+          <w:iCs w:val="false"/>
+          <w:color w:val="666666"/>
+          <w:sz w:val="20"/>
+          <w:szCs w:val="20"/>
+        </w:rPr>
+        <w:t xml:space="preserve"> — Full-Stack Microservices</w:t>
+      </w:r>
+    </w:p>
+    <w:p>
+      <w:pPr>
+        <w:spacing w:after="120"/>
+      </w:pPr>
+      <w:r>
+        <w:rPr>
+          <w:rFonts w:ascii="Calibri" w:cs="Calibri" w:eastAsia="Calibri" w:hAnsi="Calibri"/>
+          <w:b w:val="false"/>
+          <w:bCs w:val="false"/>
+          <w:i w:val="false"/>
+          <w:iCs w:val="false"/>
+          <w:color w:val="333333"/>
+          <w:sz w:val="19"/>
+          <w:szCs w:val="19"/>
+        </w:rPr>
+        <w:t xml:space="preserve">Problem: Car parking operations need a scalable system with separate services for slots, bookings, and payments.</w:t>
+      </w:r>
+    </w:p>
+    <w:p>
+      <w:pPr>
+        <w:spacing w:after="120"/>
+      </w:pPr>
+      <w:r>
+        <w:rPr>
+          <w:rFonts w:ascii="Calibri" w:cs="Calibri" w:eastAsia="Calibri" w:hAnsi="Calibri"/>
+          <w:b w:val="false"/>
+          <w:bCs w:val="false"/>
+          <w:i w:val="false"/>
+          <w:iCs w:val="false"/>
+          <w:color w:val="333333"/>
+          <w:sz w:val="19"/>
+          <w:szCs w:val="19"/>
+        </w:rPr>
+        <w:t xml:space="preserve">Built: Microservices architecture with separate services for slots, bookings, and user management, plus a React frontend.</w:t>
+      </w:r>
+    </w:p>
+    <w:p>
+      <w:pPr>
+        <w:spacing w:after="120"/>
+      </w:pPr>
+      <w:r>
+        <w:rPr>
+          <w:rFonts w:ascii="Calibri" w:cs="Calibri" w:eastAsia="Calibri" w:hAnsi="Calibri"/>
+          <w:b w:val="false"/>
+          <w:bCs w:val="false"/>
+          <w:i w:val="false"/>
+          <w:iCs w:val="false"/>
+          <w:color w:val="333333"/>
+          <w:sz w:val="19"/>
+          <w:szCs w:val="19"/>
+        </w:rPr>
+        <w:t xml:space="preserve">Outcome: Microservices parking platform with separate booking and slot services.</w:t>
+      </w:r>
+    </w:p>
+    <w:p>
+      <w:pPr>
+        <w:spacing w:after="80"/>
+      </w:pPr>
+      <w:r>
+        <w:rPr>
+          <w:rFonts w:ascii="Calibri" w:cs="Calibri" w:eastAsia="Calibri" w:hAnsi="Calibri"/>
+          <w:b/>
+          <w:bCs/>
+          <w:i w:val="false"/>
+          <w:iCs w:val="false"/>
+          <w:color w:val="333333"/>
+          <w:sz w:val="19"/>
+          <w:szCs w:val="19"/>
+        </w:rPr>
+        <w:t xml:space="preserve">Tech: JavaScript, Node.js, Express, React, MongoDB, Microservices</w:t>
+      </w:r>
+    </w:p>
+    <w:p>
+      <w:pPr>
+        <w:spacing w:after="80"/>
+      </w:pPr>
+      <w:hyperlink w:history="1" r:id="rIddcq0rv4pufbod9zevbmgz">
+        <w:r>
+          <w:rPr>
+            <w:rFonts w:ascii="Calibri" w:cs="Calibri" w:eastAsia="Calibri" w:hAnsi="Calibri"/>
+            <w:b w:val="false"/>
+            <w:bCs w:val="false"/>
+            <w:i w:val="false"/>
+            <w:iCs w:val="false"/>
+            <w:color w:val="0563C1"/>
+            <w:sz w:val="19"/>
+            <w:szCs w:val="19"/>
+          </w:rPr>
+          <w:t xml:space="preserve">GitHub: https://github.com/Arn-The-Wolf/parking-management-system</w:t>
+        </w:r>
+      </w:hyperlink>
+    </w:p>
+    <w:p>
+      <w:pPr>
+        <w:spacing w:after="40" w:before="60"/>
+      </w:pPr>
+      <w:r>
+        <w:rPr>
+          <w:rFonts w:ascii="Calibri" w:cs="Calibri" w:eastAsia="Calibri" w:hAnsi="Calibri"/>
+          <w:b/>
+          <w:bCs/>
+          <w:i w:val="false"/>
+          <w:iCs w:val="false"/>
+          <w:color w:val="333333"/>
+          <w:sz w:val="19"/>
+          <w:szCs w:val="19"/>
+        </w:rPr>
+        <w:t xml:space="preserve">Key results</w:t>
+      </w:r>
+    </w:p>
+    <w:p>
+      <w:pPr>
+        <w:pStyle w:val="ListParagraph"/>
+        <w:numPr>
+          <w:ilvl w:val="0"/>
+          <w:numId w:val="2"/>
+        </w:numPr>
+        <w:spacing w:after="60"/>
+      </w:pPr>
+      <w:r>
+        <w:rPr>
+          <w:rFonts w:ascii="Calibri" w:cs="Calibri" w:eastAsia="Calibri" w:hAnsi="Calibri"/>
+          <w:b w:val="false"/>
+          <w:bCs w:val="false"/>
+          <w:i w:val="false"/>
+          <w:iCs w:val="false"/>
+          <w:color w:val="333333"/>
+          <w:sz w:val="19"/>
+          <w:szCs w:val="19"/>
+        </w:rPr>
+        <w:t xml:space="preserve">Microservices architecture</w:t>
+      </w:r>
+    </w:p>
+    <w:p>
+      <w:pPr>
+        <w:pStyle w:val="ListParagraph"/>
+        <w:numPr>
+          <w:ilvl w:val="0"/>
+          <w:numId w:val="2"/>
+        </w:numPr>
+        <w:spacing w:after="60"/>
+      </w:pPr>
+      <w:r>
+        <w:rPr>
+          <w:rFonts w:ascii="Calibri" w:cs="Calibri" w:eastAsia="Calibri" w:hAnsi="Calibri"/>
+          <w:b w:val="false"/>
+          <w:bCs w:val="false"/>
+          <w:i w:val="false"/>
+          <w:iCs w:val="false"/>
+          <w:color w:val="333333"/>
+          <w:sz w:val="19"/>
+          <w:szCs w:val="19"/>
+        </w:rPr>
+        <w:t xml:space="preserve">Parking slot management</w:t>
+      </w:r>
+    </w:p>
+    <w:p>
+      <w:pPr>
+        <w:pStyle w:val="ListParagraph"/>
+        <w:numPr>
+          <w:ilvl w:val="0"/>
+          <w:numId w:val="2"/>
+        </w:numPr>
+        <w:spacing w:after="60"/>
+      </w:pPr>
+      <w:r>
+        <w:rPr>
+          <w:rFonts w:ascii="Calibri" w:cs="Calibri" w:eastAsia="Calibri" w:hAnsi="Calibri"/>
+          <w:b w:val="false"/>
+          <w:bCs w:val="false"/>
+          <w:i w:val="false"/>
+          <w:iCs w:val="false"/>
+          <w:color w:val="333333"/>
+          <w:sz w:val="19"/>
+          <w:szCs w:val="19"/>
+        </w:rPr>
+        <w:t xml:space="preserve">Booking workflows</w:t>
+      </w:r>
+    </w:p>
+    <w:p>
+      <w:pPr>
+        <w:spacing w:after="40" w:before="80"/>
+      </w:pPr>
+      <w:r>
+        <w:rPr>
+          <w:rFonts w:ascii="Calibri" w:cs="Calibri" w:eastAsia="Calibri" w:hAnsi="Calibri"/>
+          <w:b/>
+          <w:bCs/>
+          <w:i w:val="false"/>
+          <w:iCs w:val="false"/>
+          <w:color w:val="333333"/>
+          <w:sz w:val="19"/>
+          <w:szCs w:val="19"/>
+        </w:rPr>
+        <w:t xml:space="preserve">Challenges solved</w:t>
+      </w:r>
+    </w:p>
+    <w:p>
+      <w:pPr>
+        <w:pStyle w:val="ListParagraph"/>
+        <w:numPr>
+          <w:ilvl w:val="0"/>
+          <w:numId w:val="2"/>
+        </w:numPr>
+        <w:spacing w:after="60"/>
+      </w:pPr>
+      <w:r>
+        <w:rPr>
+          <w:rFonts w:ascii="Calibri" w:cs="Calibri" w:eastAsia="Calibri" w:hAnsi="Calibri"/>
+          <w:b w:val="false"/>
+          <w:bCs w:val="false"/>
+          <w:i w:val="false"/>
+          <w:iCs w:val="false"/>
+          <w:color w:val="333333"/>
+          <w:sz w:val="19"/>
+          <w:szCs w:val="19"/>
+        </w:rPr>
+        <w:t xml:space="preserve">Service communication</w:t>
+      </w:r>
+    </w:p>
+    <w:p>
+      <w:pPr>
+        <w:pStyle w:val="ListParagraph"/>
+        <w:numPr>
+          <w:ilvl w:val="0"/>
+          <w:numId w:val="2"/>
+        </w:numPr>
+        <w:spacing w:after="60"/>
+      </w:pPr>
+      <w:r>
+        <w:rPr>
+          <w:rFonts w:ascii="Calibri" w:cs="Calibri" w:eastAsia="Calibri" w:hAnsi="Calibri"/>
+          <w:b w:val="false"/>
+          <w:bCs w:val="false"/>
+          <w:i w:val="false"/>
+          <w:iCs w:val="false"/>
+          <w:color w:val="333333"/>
+          <w:sz w:val="19"/>
+          <w:szCs w:val="19"/>
+        </w:rPr>
+        <w:t xml:space="preserve">Booking concurrency</w:t>
+      </w:r>
+    </w:p>
+    <w:p>
+      <w:pPr>
+        <w:pStyle w:val="ListParagraph"/>
+        <w:numPr>
+          <w:ilvl w:val="0"/>
+          <w:numId w:val="2"/>
+        </w:numPr>
+        <w:spacing w:after="60"/>
+      </w:pPr>
+      <w:r>
+        <w:rPr>
+          <w:rFonts w:ascii="Calibri" w:cs="Calibri" w:eastAsia="Calibri" w:hAnsi="Calibri"/>
+          <w:b w:val="false"/>
+          <w:bCs w:val="false"/>
+          <w:i w:val="false"/>
+          <w:iCs w:val="false"/>
+          <w:color w:val="333333"/>
+          <w:sz w:val="19"/>
+          <w:szCs w:val="19"/>
+        </w:rPr>
+        <w:t xml:space="preserve">Slot availability sync</w:t>
+      </w:r>
+    </w:p>
+    <w:p>
+      <w:pPr>
+        <w:spacing w:after="40" w:before="180"/>
+      </w:pPr>
+      <w:r>
+        <w:rPr>
+          <w:rFonts w:ascii="Calibri" w:cs="Calibri" w:eastAsia="Calibri" w:hAnsi="Calibri"/>
+          <w:b/>
+          <w:bCs/>
+          <w:i w:val="false"/>
+          <w:iCs w:val="false"/>
+          <w:color w:val="2C3E50"/>
+          <w:sz w:val="26"/>
+          <w:szCs w:val="26"/>
+        </w:rPr>
+        <w:t xml:space="preserve">ArnLibrary</w:t>
+      </w:r>
+      <w:r>
+        <w:rPr>
+          <w:rFonts w:ascii="Calibri" w:cs="Calibri" w:eastAsia="Calibri" w:hAnsi="Calibri"/>
+          <w:b w:val="false"/>
+          <w:bCs w:val="false"/>
+          <w:i w:val="false"/>
+          <w:iCs w:val="false"/>
+          <w:color w:val="666666"/>
+          <w:sz w:val="20"/>
+          <w:szCs w:val="20"/>
+        </w:rPr>
         <w:t xml:space="preserve"> — Library Management System</w:t>
       </w:r>
     </w:p>
@@ -3896,7 +4787,7 @@
       <w:pPr>
         <w:spacing w:after="80"/>
       </w:pPr>
-      <w:hyperlink w:history="1" r:id="rIdcs4eci8hyicbkgsfh1ge0">
+      <w:hyperlink w:history="1" r:id="rIdjpj29ogumeeimztn-l2pf">
         <w:r>
           <w:rPr>
             <w:rFonts w:ascii="Calibri" w:cs="Calibri" w:eastAsia="Calibri" w:hAnsi="Calibri"/>
@@ -4170,7 +5061,7 @@
       <w:pPr>
         <w:spacing w:after="80"/>
       </w:pPr>
-      <w:hyperlink w:history="1" r:id="rIdz9hbxus0fpehl_qzg5cy0">
+      <w:hyperlink w:history="1" r:id="rIdpnaghvemfiycqbcy5nuex">
         <w:r>
           <w:rPr>
             <w:rFonts w:ascii="Calibri" w:cs="Calibri" w:eastAsia="Calibri" w:hAnsi="Calibri"/>
@@ -4492,7 +5383,7 @@
       <w:pPr>
         <w:spacing w:after="80"/>
       </w:pPr>
-      <w:hyperlink w:history="1" r:id="rIdbccdcmlnc1fvwmqlpa4ds">
+      <w:hyperlink w:history="1" r:id="rIdgy2vievvff8juoanxhaxr">
         <w:r>
           <w:rPr>
             <w:rFonts w:ascii="Calibri" w:cs="Calibri" w:eastAsia="Calibri" w:hAnsi="Calibri"/>
@@ -4697,7 +5588,7 @@
           <w:sz w:val="26"/>
           <w:szCs w:val="26"/>
         </w:rPr>
-        <w:t xml:space="preserve">MongoDB Transaction Manager</w:t>
+        <w:t xml:space="preserve">ArnVita — Clinic Management</w:t>
       </w:r>
       <w:r>
         <w:rPr>
@@ -4710,6 +5601,600 @@
           <w:sz w:val="20"/>
           <w:szCs w:val="20"/>
         </w:rPr>
+        <w:t xml:space="preserve"> — Patient Records &amp; Appointments</w:t>
+      </w:r>
+    </w:p>
+    <w:p>
+      <w:pPr>
+        <w:spacing w:after="120"/>
+      </w:pPr>
+      <w:r>
+        <w:rPr>
+          <w:rFonts w:ascii="Calibri" w:cs="Calibri" w:eastAsia="Calibri" w:hAnsi="Calibri"/>
+          <w:b w:val="false"/>
+          <w:bCs w:val="false"/>
+          <w:i w:val="false"/>
+          <w:iCs w:val="false"/>
+          <w:color w:val="333333"/>
+          <w:sz w:val="19"/>
+          <w:szCs w:val="19"/>
+        </w:rPr>
+        <w:t xml:space="preserve">Problem: Small clinics need an affordable system to manage patient records and appointment scheduling without enterprise-scale EHR software.</w:t>
+      </w:r>
+    </w:p>
+    <w:p>
+      <w:pPr>
+        <w:spacing w:after="120"/>
+      </w:pPr>
+      <w:r>
+        <w:rPr>
+          <w:rFonts w:ascii="Calibri" w:cs="Calibri" w:eastAsia="Calibri" w:hAnsi="Calibri"/>
+          <w:b w:val="false"/>
+          <w:bCs w:val="false"/>
+          <w:i w:val="false"/>
+          <w:iCs w:val="false"/>
+          <w:color w:val="333333"/>
+          <w:sz w:val="19"/>
+          <w:szCs w:val="19"/>
+        </w:rPr>
+        <w:t xml:space="preserve">Built: Spring Boot backend with patient record versioning, appointment booking, and clinic administration features.</w:t>
+      </w:r>
+    </w:p>
+    <w:p>
+      <w:pPr>
+        <w:spacing w:after="120"/>
+      </w:pPr>
+      <w:r>
+        <w:rPr>
+          <w:rFonts w:ascii="Calibri" w:cs="Calibri" w:eastAsia="Calibri" w:hAnsi="Calibri"/>
+          <w:b w:val="false"/>
+          <w:bCs w:val="false"/>
+          <w:i w:val="false"/>
+          <w:iCs w:val="false"/>
+          <w:color w:val="333333"/>
+          <w:sz w:val="19"/>
+          <w:szCs w:val="19"/>
+        </w:rPr>
+        <w:t xml:space="preserve">Outcome: Working clinic system with versioned records and appointment scheduling.</w:t>
+      </w:r>
+    </w:p>
+    <w:p>
+      <w:pPr>
+        <w:spacing w:after="80"/>
+      </w:pPr>
+      <w:r>
+        <w:rPr>
+          <w:rFonts w:ascii="Calibri" w:cs="Calibri" w:eastAsia="Calibri" w:hAnsi="Calibri"/>
+          <w:b/>
+          <w:bCs/>
+          <w:i w:val="false"/>
+          <w:iCs w:val="false"/>
+          <w:color w:val="333333"/>
+          <w:sz w:val="19"/>
+          <w:szCs w:val="19"/>
+        </w:rPr>
+        <w:t xml:space="preserve">Tech: Java, Spring Boot, MySQL, REST API, Healthcare</w:t>
+      </w:r>
+    </w:p>
+    <w:p>
+      <w:pPr>
+        <w:spacing w:after="80"/>
+      </w:pPr>
+      <w:hyperlink w:history="1" r:id="rIdsytzjw4w26lb6jvizxjnm">
+        <w:r>
+          <w:rPr>
+            <w:rFonts w:ascii="Calibri" w:cs="Calibri" w:eastAsia="Calibri" w:hAnsi="Calibri"/>
+            <w:b w:val="false"/>
+            <w:bCs w:val="false"/>
+            <w:i w:val="false"/>
+            <w:iCs w:val="false"/>
+            <w:color w:val="0563C1"/>
+            <w:sz w:val="19"/>
+            <w:szCs w:val="19"/>
+          </w:rPr>
+          <w:t xml:space="preserve">GitHub: https://github.com/Arn-The-Wolf/ArnVita</w:t>
+        </w:r>
+      </w:hyperlink>
+    </w:p>
+    <w:p>
+      <w:pPr>
+        <w:spacing w:after="40" w:before="60"/>
+      </w:pPr>
+      <w:r>
+        <w:rPr>
+          <w:rFonts w:ascii="Calibri" w:cs="Calibri" w:eastAsia="Calibri" w:hAnsi="Calibri"/>
+          <w:b/>
+          <w:bCs/>
+          <w:i w:val="false"/>
+          <w:iCs w:val="false"/>
+          <w:color w:val="333333"/>
+          <w:sz w:val="19"/>
+          <w:szCs w:val="19"/>
+        </w:rPr>
+        <w:t xml:space="preserve">Key results</w:t>
+      </w:r>
+    </w:p>
+    <w:p>
+      <w:pPr>
+        <w:pStyle w:val="ListParagraph"/>
+        <w:numPr>
+          <w:ilvl w:val="0"/>
+          <w:numId w:val="2"/>
+        </w:numPr>
+        <w:spacing w:after="60"/>
+      </w:pPr>
+      <w:r>
+        <w:rPr>
+          <w:rFonts w:ascii="Calibri" w:cs="Calibri" w:eastAsia="Calibri" w:hAnsi="Calibri"/>
+          <w:b w:val="false"/>
+          <w:bCs w:val="false"/>
+          <w:i w:val="false"/>
+          <w:iCs w:val="false"/>
+          <w:color w:val="333333"/>
+          <w:sz w:val="19"/>
+          <w:szCs w:val="19"/>
+        </w:rPr>
+        <w:t xml:space="preserve">Versioned patient records</w:t>
+      </w:r>
+    </w:p>
+    <w:p>
+      <w:pPr>
+        <w:pStyle w:val="ListParagraph"/>
+        <w:numPr>
+          <w:ilvl w:val="0"/>
+          <w:numId w:val="2"/>
+        </w:numPr>
+        <w:spacing w:after="60"/>
+      </w:pPr>
+      <w:r>
+        <w:rPr>
+          <w:rFonts w:ascii="Calibri" w:cs="Calibri" w:eastAsia="Calibri" w:hAnsi="Calibri"/>
+          <w:b w:val="false"/>
+          <w:bCs w:val="false"/>
+          <w:i w:val="false"/>
+          <w:iCs w:val="false"/>
+          <w:color w:val="333333"/>
+          <w:sz w:val="19"/>
+          <w:szCs w:val="19"/>
+        </w:rPr>
+        <w:t xml:space="preserve">Appointment booking</w:t>
+      </w:r>
+    </w:p>
+    <w:p>
+      <w:pPr>
+        <w:pStyle w:val="ListParagraph"/>
+        <w:numPr>
+          <w:ilvl w:val="0"/>
+          <w:numId w:val="2"/>
+        </w:numPr>
+        <w:spacing w:after="60"/>
+      </w:pPr>
+      <w:r>
+        <w:rPr>
+          <w:rFonts w:ascii="Calibri" w:cs="Calibri" w:eastAsia="Calibri" w:hAnsi="Calibri"/>
+          <w:b w:val="false"/>
+          <w:bCs w:val="false"/>
+          <w:i w:val="false"/>
+          <w:iCs w:val="false"/>
+          <w:color w:val="333333"/>
+          <w:sz w:val="19"/>
+          <w:szCs w:val="19"/>
+        </w:rPr>
+        <w:t xml:space="preserve">Clinic admin panel</w:t>
+      </w:r>
+    </w:p>
+    <w:p>
+      <w:pPr>
+        <w:spacing w:after="40" w:before="80"/>
+      </w:pPr>
+      <w:r>
+        <w:rPr>
+          <w:rFonts w:ascii="Calibri" w:cs="Calibri" w:eastAsia="Calibri" w:hAnsi="Calibri"/>
+          <w:b/>
+          <w:bCs/>
+          <w:i w:val="false"/>
+          <w:iCs w:val="false"/>
+          <w:color w:val="333333"/>
+          <w:sz w:val="19"/>
+          <w:szCs w:val="19"/>
+        </w:rPr>
+        <w:t xml:space="preserve">Challenges solved</w:t>
+      </w:r>
+    </w:p>
+    <w:p>
+      <w:pPr>
+        <w:pStyle w:val="ListParagraph"/>
+        <w:numPr>
+          <w:ilvl w:val="0"/>
+          <w:numId w:val="2"/>
+        </w:numPr>
+        <w:spacing w:after="60"/>
+      </w:pPr>
+      <w:r>
+        <w:rPr>
+          <w:rFonts w:ascii="Calibri" w:cs="Calibri" w:eastAsia="Calibri" w:hAnsi="Calibri"/>
+          <w:b w:val="false"/>
+          <w:bCs w:val="false"/>
+          <w:i w:val="false"/>
+          <w:iCs w:val="false"/>
+          <w:color w:val="333333"/>
+          <w:sz w:val="19"/>
+          <w:szCs w:val="19"/>
+        </w:rPr>
+        <w:t xml:space="preserve">Patient data versioning</w:t>
+      </w:r>
+    </w:p>
+    <w:p>
+      <w:pPr>
+        <w:pStyle w:val="ListParagraph"/>
+        <w:numPr>
+          <w:ilvl w:val="0"/>
+          <w:numId w:val="2"/>
+        </w:numPr>
+        <w:spacing w:after="60"/>
+      </w:pPr>
+      <w:r>
+        <w:rPr>
+          <w:rFonts w:ascii="Calibri" w:cs="Calibri" w:eastAsia="Calibri" w:hAnsi="Calibri"/>
+          <w:b w:val="false"/>
+          <w:bCs w:val="false"/>
+          <w:i w:val="false"/>
+          <w:iCs w:val="false"/>
+          <w:color w:val="333333"/>
+          <w:sz w:val="19"/>
+          <w:szCs w:val="19"/>
+        </w:rPr>
+        <w:t xml:space="preserve">Appointment conflicts</w:t>
+      </w:r>
+    </w:p>
+    <w:p>
+      <w:pPr>
+        <w:pStyle w:val="ListParagraph"/>
+        <w:numPr>
+          <w:ilvl w:val="0"/>
+          <w:numId w:val="2"/>
+        </w:numPr>
+        <w:spacing w:after="60"/>
+      </w:pPr>
+      <w:r>
+        <w:rPr>
+          <w:rFonts w:ascii="Calibri" w:cs="Calibri" w:eastAsia="Calibri" w:hAnsi="Calibri"/>
+          <w:b w:val="false"/>
+          <w:bCs w:val="false"/>
+          <w:i w:val="false"/>
+          <w:iCs w:val="false"/>
+          <w:color w:val="333333"/>
+          <w:sz w:val="19"/>
+          <w:szCs w:val="19"/>
+        </w:rPr>
+        <w:t xml:space="preserve">HIPAA-style data handling</w:t>
+      </w:r>
+    </w:p>
+    <w:p>
+      <w:pPr>
+        <w:spacing w:after="40" w:before="180"/>
+      </w:pPr>
+      <w:r>
+        <w:rPr>
+          <w:rFonts w:ascii="Calibri" w:cs="Calibri" w:eastAsia="Calibri" w:hAnsi="Calibri"/>
+          <w:b/>
+          <w:bCs/>
+          <w:i w:val="false"/>
+          <w:iCs w:val="false"/>
+          <w:color w:val="2C3E50"/>
+          <w:sz w:val="26"/>
+          <w:szCs w:val="26"/>
+        </w:rPr>
+        <w:t xml:space="preserve">Gov Rwanda ERP Payroll</w:t>
+      </w:r>
+      <w:r>
+        <w:rPr>
+          <w:rFonts w:ascii="Calibri" w:cs="Calibri" w:eastAsia="Calibri" w:hAnsi="Calibri"/>
+          <w:b w:val="false"/>
+          <w:bCs w:val="false"/>
+          <w:i w:val="false"/>
+          <w:iCs w:val="false"/>
+          <w:color w:val="666666"/>
+          <w:sz w:val="20"/>
+          <w:szCs w:val="20"/>
+        </w:rPr>
+        <w:t xml:space="preserve"> — Government Payroll Backend</w:t>
+      </w:r>
+    </w:p>
+    <w:p>
+      <w:pPr>
+        <w:spacing w:after="120"/>
+      </w:pPr>
+      <w:r>
+        <w:rPr>
+          <w:rFonts w:ascii="Calibri" w:cs="Calibri" w:eastAsia="Calibri" w:hAnsi="Calibri"/>
+          <w:b w:val="false"/>
+          <w:bCs w:val="false"/>
+          <w:i w:val="false"/>
+          <w:iCs w:val="false"/>
+          <w:color w:val="333333"/>
+          <w:sz w:val="19"/>
+          <w:szCs w:val="19"/>
+        </w:rPr>
+        <w:t xml:space="preserve">Problem: Government payroll processing requires structured, auditable backend services for employee records and salary calculations.</w:t>
+      </w:r>
+    </w:p>
+    <w:p>
+      <w:pPr>
+        <w:spacing w:after="120"/>
+      </w:pPr>
+      <w:r>
+        <w:rPr>
+          <w:rFonts w:ascii="Calibri" w:cs="Calibri" w:eastAsia="Calibri" w:hAnsi="Calibri"/>
+          <w:b w:val="false"/>
+          <w:bCs w:val="false"/>
+          <w:i w:val="false"/>
+          <w:iCs w:val="false"/>
+          <w:color w:val="333333"/>
+          <w:sz w:val="19"/>
+          <w:szCs w:val="19"/>
+        </w:rPr>
+        <w:t xml:space="preserve">Built: Java Spring Boot services with employee management, payroll computation, deductions, and reporting APIs.</w:t>
+      </w:r>
+    </w:p>
+    <w:p>
+      <w:pPr>
+        <w:spacing w:after="120"/>
+      </w:pPr>
+      <w:r>
+        <w:rPr>
+          <w:rFonts w:ascii="Calibri" w:cs="Calibri" w:eastAsia="Calibri" w:hAnsi="Calibri"/>
+          <w:b w:val="false"/>
+          <w:bCs w:val="false"/>
+          <w:i w:val="false"/>
+          <w:iCs w:val="false"/>
+          <w:color w:val="333333"/>
+          <w:sz w:val="19"/>
+          <w:szCs w:val="19"/>
+        </w:rPr>
+        <w:t xml:space="preserve">Outcome: Enterprise payroll backend with auditable computation and reporting.</w:t>
+      </w:r>
+    </w:p>
+    <w:p>
+      <w:pPr>
+        <w:spacing w:after="80"/>
+      </w:pPr>
+      <w:r>
+        <w:rPr>
+          <w:rFonts w:ascii="Calibri" w:cs="Calibri" w:eastAsia="Calibri" w:hAnsi="Calibri"/>
+          <w:b/>
+          <w:bCs/>
+          <w:i w:val="false"/>
+          <w:iCs w:val="false"/>
+          <w:color w:val="333333"/>
+          <w:sz w:val="19"/>
+          <w:szCs w:val="19"/>
+        </w:rPr>
+        <w:t xml:space="preserve">Tech: Java, Spring Boot, REST API, MySQL, Enterprise</w:t>
+      </w:r>
+    </w:p>
+    <w:p>
+      <w:pPr>
+        <w:spacing w:after="80"/>
+      </w:pPr>
+      <w:hyperlink w:history="1" r:id="rIdkvhkxl__0hkiiahorl_pp">
+        <w:r>
+          <w:rPr>
+            <w:rFonts w:ascii="Calibri" w:cs="Calibri" w:eastAsia="Calibri" w:hAnsi="Calibri"/>
+            <w:b w:val="false"/>
+            <w:bCs w:val="false"/>
+            <w:i w:val="false"/>
+            <w:iCs w:val="false"/>
+            <w:color w:val="0563C1"/>
+            <w:sz w:val="19"/>
+            <w:szCs w:val="19"/>
+          </w:rPr>
+          <w:t xml:space="preserve">GitHub: https://github.com/Arn-The-Wolf/gov-rwanda-erp-payroll-system</w:t>
+        </w:r>
+      </w:hyperlink>
+    </w:p>
+    <w:p>
+      <w:pPr>
+        <w:spacing w:after="40" w:before="60"/>
+      </w:pPr>
+      <w:r>
+        <w:rPr>
+          <w:rFonts w:ascii="Calibri" w:cs="Calibri" w:eastAsia="Calibri" w:hAnsi="Calibri"/>
+          <w:b/>
+          <w:bCs/>
+          <w:i w:val="false"/>
+          <w:iCs w:val="false"/>
+          <w:color w:val="333333"/>
+          <w:sz w:val="19"/>
+          <w:szCs w:val="19"/>
+        </w:rPr>
+        <w:t xml:space="preserve">Key results</w:t>
+      </w:r>
+    </w:p>
+    <w:p>
+      <w:pPr>
+        <w:pStyle w:val="ListParagraph"/>
+        <w:numPr>
+          <w:ilvl w:val="0"/>
+          <w:numId w:val="2"/>
+        </w:numPr>
+        <w:spacing w:after="60"/>
+      </w:pPr>
+      <w:r>
+        <w:rPr>
+          <w:rFonts w:ascii="Calibri" w:cs="Calibri" w:eastAsia="Calibri" w:hAnsi="Calibri"/>
+          <w:b w:val="false"/>
+          <w:bCs w:val="false"/>
+          <w:i w:val="false"/>
+          <w:iCs w:val="false"/>
+          <w:color w:val="333333"/>
+          <w:sz w:val="19"/>
+          <w:szCs w:val="19"/>
+        </w:rPr>
+        <w:t xml:space="preserve">Employee payroll API</w:t>
+      </w:r>
+    </w:p>
+    <w:p>
+      <w:pPr>
+        <w:pStyle w:val="ListParagraph"/>
+        <w:numPr>
+          <w:ilvl w:val="0"/>
+          <w:numId w:val="2"/>
+        </w:numPr>
+        <w:spacing w:after="60"/>
+      </w:pPr>
+      <w:r>
+        <w:rPr>
+          <w:rFonts w:ascii="Calibri" w:cs="Calibri" w:eastAsia="Calibri" w:hAnsi="Calibri"/>
+          <w:b w:val="false"/>
+          <w:bCs w:val="false"/>
+          <w:i w:val="false"/>
+          <w:iCs w:val="false"/>
+          <w:color w:val="333333"/>
+          <w:sz w:val="19"/>
+          <w:szCs w:val="19"/>
+        </w:rPr>
+        <w:t xml:space="preserve">Salary computation</w:t>
+      </w:r>
+    </w:p>
+    <w:p>
+      <w:pPr>
+        <w:pStyle w:val="ListParagraph"/>
+        <w:numPr>
+          <w:ilvl w:val="0"/>
+          <w:numId w:val="2"/>
+        </w:numPr>
+        <w:spacing w:after="60"/>
+      </w:pPr>
+      <w:r>
+        <w:rPr>
+          <w:rFonts w:ascii="Calibri" w:cs="Calibri" w:eastAsia="Calibri" w:hAnsi="Calibri"/>
+          <w:b w:val="false"/>
+          <w:bCs w:val="false"/>
+          <w:i w:val="false"/>
+          <w:iCs w:val="false"/>
+          <w:color w:val="333333"/>
+          <w:sz w:val="19"/>
+          <w:szCs w:val="19"/>
+        </w:rPr>
+        <w:t xml:space="preserve">Deduction workflows</w:t>
+      </w:r>
+    </w:p>
+    <w:p>
+      <w:pPr>
+        <w:spacing w:after="40" w:before="80"/>
+      </w:pPr>
+      <w:r>
+        <w:rPr>
+          <w:rFonts w:ascii="Calibri" w:cs="Calibri" w:eastAsia="Calibri" w:hAnsi="Calibri"/>
+          <w:b/>
+          <w:bCs/>
+          <w:i w:val="false"/>
+          <w:iCs w:val="false"/>
+          <w:color w:val="333333"/>
+          <w:sz w:val="19"/>
+          <w:szCs w:val="19"/>
+        </w:rPr>
+        <w:t xml:space="preserve">Challenges solved</w:t>
+      </w:r>
+    </w:p>
+    <w:p>
+      <w:pPr>
+        <w:pStyle w:val="ListParagraph"/>
+        <w:numPr>
+          <w:ilvl w:val="0"/>
+          <w:numId w:val="2"/>
+        </w:numPr>
+        <w:spacing w:after="60"/>
+      </w:pPr>
+      <w:r>
+        <w:rPr>
+          <w:rFonts w:ascii="Calibri" w:cs="Calibri" w:eastAsia="Calibri" w:hAnsi="Calibri"/>
+          <w:b w:val="false"/>
+          <w:bCs w:val="false"/>
+          <w:i w:val="false"/>
+          <w:iCs w:val="false"/>
+          <w:color w:val="333333"/>
+          <w:sz w:val="19"/>
+          <w:szCs w:val="19"/>
+        </w:rPr>
+        <w:t xml:space="preserve">Payroll calculation rules</w:t>
+      </w:r>
+    </w:p>
+    <w:p>
+      <w:pPr>
+        <w:pStyle w:val="ListParagraph"/>
+        <w:numPr>
+          <w:ilvl w:val="0"/>
+          <w:numId w:val="2"/>
+        </w:numPr>
+        <w:spacing w:after="60"/>
+      </w:pPr>
+      <w:r>
+        <w:rPr>
+          <w:rFonts w:ascii="Calibri" w:cs="Calibri" w:eastAsia="Calibri" w:hAnsi="Calibri"/>
+          <w:b w:val="false"/>
+          <w:bCs w:val="false"/>
+          <w:i w:val="false"/>
+          <w:iCs w:val="false"/>
+          <w:color w:val="333333"/>
+          <w:sz w:val="19"/>
+          <w:szCs w:val="19"/>
+        </w:rPr>
+        <w:t xml:space="preserve">Audit trail</w:t>
+      </w:r>
+    </w:p>
+    <w:p>
+      <w:pPr>
+        <w:pStyle w:val="ListParagraph"/>
+        <w:numPr>
+          <w:ilvl w:val="0"/>
+          <w:numId w:val="2"/>
+        </w:numPr>
+        <w:spacing w:after="60"/>
+      </w:pPr>
+      <w:r>
+        <w:rPr>
+          <w:rFonts w:ascii="Calibri" w:cs="Calibri" w:eastAsia="Calibri" w:hAnsi="Calibri"/>
+          <w:b w:val="false"/>
+          <w:bCs w:val="false"/>
+          <w:i w:val="false"/>
+          <w:iCs w:val="false"/>
+          <w:color w:val="333333"/>
+          <w:sz w:val="19"/>
+          <w:szCs w:val="19"/>
+        </w:rPr>
+        <w:t xml:space="preserve">Enterprise data modeling</w:t>
+      </w:r>
+    </w:p>
+    <w:p>
+      <w:pPr>
+        <w:spacing w:after="40" w:before="180"/>
+      </w:pPr>
+      <w:r>
+        <w:rPr>
+          <w:rFonts w:ascii="Calibri" w:cs="Calibri" w:eastAsia="Calibri" w:hAnsi="Calibri"/>
+          <w:b/>
+          <w:bCs/>
+          <w:i w:val="false"/>
+          <w:iCs w:val="false"/>
+          <w:color w:val="2C3E50"/>
+          <w:sz w:val="26"/>
+          <w:szCs w:val="26"/>
+        </w:rPr>
+        <w:t xml:space="preserve">MongoDB Transaction Manager</w:t>
+      </w:r>
+      <w:r>
+        <w:rPr>
+          <w:rFonts w:ascii="Calibri" w:cs="Calibri" w:eastAsia="Calibri" w:hAnsi="Calibri"/>
+          <w:b w:val="false"/>
+          <w:bCs w:val="false"/>
+          <w:i w:val="false"/>
+          <w:iCs w:val="false"/>
+          <w:color w:val="666666"/>
+          <w:sz w:val="20"/>
+          <w:szCs w:val="20"/>
+        </w:rPr>
         <w:t xml:space="preserve"> — ACID Transactions Demo</w:t>
       </w:r>
     </w:p>
@@ -4789,7 +6274,7 @@
       <w:pPr>
         <w:spacing w:after="80"/>
       </w:pPr>
-      <w:hyperlink w:history="1" r:id="rId5ws-h5lgds7mfoe6mx4n2">
+      <w:hyperlink w:history="1" r:id="rId111urj-awhiumq1tijlt8">
         <w:r>
           <w:rPr>
             <w:rFonts w:ascii="Calibri" w:cs="Calibri" w:eastAsia="Calibri" w:hAnsi="Calibri"/>
@@ -5086,7 +6571,7 @@
       <w:pPr>
         <w:spacing w:after="80"/>
       </w:pPr>
-      <w:hyperlink w:history="1" r:id="rId6buip2qsyerm4acsyfm4b">
+      <w:hyperlink w:history="1" r:id="rIdvszm8ofduskv725gv6ypv">
         <w:r>
           <w:rPr>
             <w:rFonts w:ascii="Calibri" w:cs="Calibri" w:eastAsia="Calibri" w:hAnsi="Calibri"/>
@@ -5291,7 +6776,7 @@
           <w:sz w:val="26"/>
           <w:szCs w:val="26"/>
         </w:rPr>
-        <w:t xml:space="preserve">BFS &amp; DFS Algorithms</w:t>
+        <w:t xml:space="preserve">Smart Parking DSA</w:t>
       </w:r>
       <w:r>
         <w:rPr>
@@ -5304,6 +6789,303 @@
           <w:sz w:val="20"/>
           <w:szCs w:val="20"/>
         </w:rPr>
+        <w:t xml:space="preserve"> — C++ Parking Management</w:t>
+      </w:r>
+    </w:p>
+    <w:p>
+      <w:pPr>
+        <w:spacing w:after="120"/>
+      </w:pPr>
+      <w:r>
+        <w:rPr>
+          <w:rFonts w:ascii="Calibri" w:cs="Calibri" w:eastAsia="Calibri" w:hAnsi="Calibri"/>
+          <w:b w:val="false"/>
+          <w:bCs w:val="false"/>
+          <w:i w:val="false"/>
+          <w:iCs w:val="false"/>
+          <w:color w:val="333333"/>
+          <w:sz w:val="19"/>
+          <w:szCs w:val="19"/>
+        </w:rPr>
+        <w:t xml:space="preserve">Problem: Kigali City needs efficient parking space allocation using optimized data structures for real-time slot management.</w:t>
+      </w:r>
+    </w:p>
+    <w:p>
+      <w:pPr>
+        <w:spacing w:after="120"/>
+      </w:pPr>
+      <w:r>
+        <w:rPr>
+          <w:rFonts w:ascii="Calibri" w:cs="Calibri" w:eastAsia="Calibri" w:hAnsi="Calibri"/>
+          <w:b w:val="false"/>
+          <w:bCs w:val="false"/>
+          <w:i w:val="false"/>
+          <w:iCs w:val="false"/>
+          <w:color w:val="333333"/>
+          <w:sz w:val="19"/>
+          <w:szCs w:val="19"/>
+        </w:rPr>
+        <w:t xml:space="preserve">Built: C++ implementation with hash map-based slot lookup, priority queue for availability, and linked list parking logs.</w:t>
+      </w:r>
+    </w:p>
+    <w:p>
+      <w:pPr>
+        <w:spacing w:after="120"/>
+      </w:pPr>
+      <w:r>
+        <w:rPr>
+          <w:rFonts w:ascii="Calibri" w:cs="Calibri" w:eastAsia="Calibri" w:hAnsi="Calibri"/>
+          <w:b w:val="false"/>
+          <w:bCs w:val="false"/>
+          <w:i w:val="false"/>
+          <w:iCs w:val="false"/>
+          <w:color w:val="333333"/>
+          <w:sz w:val="19"/>
+          <w:szCs w:val="19"/>
+        </w:rPr>
+        <w:t xml:space="preserve">Outcome: Working DSA-driven parking allocator with efficient slot management.</w:t>
+      </w:r>
+    </w:p>
+    <w:p>
+      <w:pPr>
+        <w:spacing w:after="80"/>
+      </w:pPr>
+      <w:r>
+        <w:rPr>
+          <w:rFonts w:ascii="Calibri" w:cs="Calibri" w:eastAsia="Calibri" w:hAnsi="Calibri"/>
+          <w:b/>
+          <w:bCs/>
+          <w:i w:val="false"/>
+          <w:iCs w:val="false"/>
+          <w:color w:val="333333"/>
+          <w:sz w:val="19"/>
+          <w:szCs w:val="19"/>
+        </w:rPr>
+        <w:t xml:space="preserve">Tech: C++, Data Structures, Algorithms, Console</w:t>
+      </w:r>
+    </w:p>
+    <w:p>
+      <w:pPr>
+        <w:spacing w:after="80"/>
+      </w:pPr>
+      <w:hyperlink w:history="1" r:id="rIdoyrpgi2ke180aopqkycby">
+        <w:r>
+          <w:rPr>
+            <w:rFonts w:ascii="Calibri" w:cs="Calibri" w:eastAsia="Calibri" w:hAnsi="Calibri"/>
+            <w:b w:val="false"/>
+            <w:bCs w:val="false"/>
+            <w:i w:val="false"/>
+            <w:iCs w:val="false"/>
+            <w:color w:val="0563C1"/>
+            <w:sz w:val="19"/>
+            <w:szCs w:val="19"/>
+          </w:rPr>
+          <w:t xml:space="preserve">GitHub: https://github.com/Arn-The-Wolf/smart-parking-dsa-cpp</w:t>
+        </w:r>
+      </w:hyperlink>
+    </w:p>
+    <w:p>
+      <w:pPr>
+        <w:spacing w:after="40" w:before="60"/>
+      </w:pPr>
+      <w:r>
+        <w:rPr>
+          <w:rFonts w:ascii="Calibri" w:cs="Calibri" w:eastAsia="Calibri" w:hAnsi="Calibri"/>
+          <w:b/>
+          <w:bCs/>
+          <w:i w:val="false"/>
+          <w:iCs w:val="false"/>
+          <w:color w:val="333333"/>
+          <w:sz w:val="19"/>
+          <w:szCs w:val="19"/>
+        </w:rPr>
+        <w:t xml:space="preserve">Key results</w:t>
+      </w:r>
+    </w:p>
+    <w:p>
+      <w:pPr>
+        <w:pStyle w:val="ListParagraph"/>
+        <w:numPr>
+          <w:ilvl w:val="0"/>
+          <w:numId w:val="2"/>
+        </w:numPr>
+        <w:spacing w:after="60"/>
+      </w:pPr>
+      <w:r>
+        <w:rPr>
+          <w:rFonts w:ascii="Calibri" w:cs="Calibri" w:eastAsia="Calibri" w:hAnsi="Calibri"/>
+          <w:b w:val="false"/>
+          <w:bCs w:val="false"/>
+          <w:i w:val="false"/>
+          <w:iCs w:val="false"/>
+          <w:color w:val="333333"/>
+          <w:sz w:val="19"/>
+          <w:szCs w:val="19"/>
+        </w:rPr>
+        <w:t xml:space="preserve">DSA parking system</w:t>
+      </w:r>
+    </w:p>
+    <w:p>
+      <w:pPr>
+        <w:pStyle w:val="ListParagraph"/>
+        <w:numPr>
+          <w:ilvl w:val="0"/>
+          <w:numId w:val="2"/>
+        </w:numPr>
+        <w:spacing w:after="60"/>
+      </w:pPr>
+      <w:r>
+        <w:rPr>
+          <w:rFonts w:ascii="Calibri" w:cs="Calibri" w:eastAsia="Calibri" w:hAnsi="Calibri"/>
+          <w:b w:val="false"/>
+          <w:bCs w:val="false"/>
+          <w:i w:val="false"/>
+          <w:iCs w:val="false"/>
+          <w:color w:val="333333"/>
+          <w:sz w:val="19"/>
+          <w:szCs w:val="19"/>
+        </w:rPr>
+        <w:t xml:space="preserve">Hash map slot lookup</w:t>
+      </w:r>
+    </w:p>
+    <w:p>
+      <w:pPr>
+        <w:pStyle w:val="ListParagraph"/>
+        <w:numPr>
+          <w:ilvl w:val="0"/>
+          <w:numId w:val="2"/>
+        </w:numPr>
+        <w:spacing w:after="60"/>
+      </w:pPr>
+      <w:r>
+        <w:rPr>
+          <w:rFonts w:ascii="Calibri" w:cs="Calibri" w:eastAsia="Calibri" w:hAnsi="Calibri"/>
+          <w:b w:val="false"/>
+          <w:bCs w:val="false"/>
+          <w:i w:val="false"/>
+          <w:iCs w:val="false"/>
+          <w:color w:val="333333"/>
+          <w:sz w:val="19"/>
+          <w:szCs w:val="19"/>
+        </w:rPr>
+        <w:t xml:space="preserve">Priority-based allocation</w:t>
+      </w:r>
+    </w:p>
+    <w:p>
+      <w:pPr>
+        <w:spacing w:after="40" w:before="80"/>
+      </w:pPr>
+      <w:r>
+        <w:rPr>
+          <w:rFonts w:ascii="Calibri" w:cs="Calibri" w:eastAsia="Calibri" w:hAnsi="Calibri"/>
+          <w:b/>
+          <w:bCs/>
+          <w:i w:val="false"/>
+          <w:iCs w:val="false"/>
+          <w:color w:val="333333"/>
+          <w:sz w:val="19"/>
+          <w:szCs w:val="19"/>
+        </w:rPr>
+        <w:t xml:space="preserve">Challenges solved</w:t>
+      </w:r>
+    </w:p>
+    <w:p>
+      <w:pPr>
+        <w:pStyle w:val="ListParagraph"/>
+        <w:numPr>
+          <w:ilvl w:val="0"/>
+          <w:numId w:val="2"/>
+        </w:numPr>
+        <w:spacing w:after="60"/>
+      </w:pPr>
+      <w:r>
+        <w:rPr>
+          <w:rFonts w:ascii="Calibri" w:cs="Calibri" w:eastAsia="Calibri" w:hAnsi="Calibri"/>
+          <w:b w:val="false"/>
+          <w:bCs w:val="false"/>
+          <w:i w:val="false"/>
+          <w:iCs w:val="false"/>
+          <w:color w:val="333333"/>
+          <w:sz w:val="19"/>
+          <w:szCs w:val="19"/>
+        </w:rPr>
+        <w:t xml:space="preserve">Hash map collision handling</w:t>
+      </w:r>
+    </w:p>
+    <w:p>
+      <w:pPr>
+        <w:pStyle w:val="ListParagraph"/>
+        <w:numPr>
+          <w:ilvl w:val="0"/>
+          <w:numId w:val="2"/>
+        </w:numPr>
+        <w:spacing w:after="60"/>
+      </w:pPr>
+      <w:r>
+        <w:rPr>
+          <w:rFonts w:ascii="Calibri" w:cs="Calibri" w:eastAsia="Calibri" w:hAnsi="Calibri"/>
+          <w:b w:val="false"/>
+          <w:bCs w:val="false"/>
+          <w:i w:val="false"/>
+          <w:iCs w:val="false"/>
+          <w:color w:val="333333"/>
+          <w:sz w:val="19"/>
+          <w:szCs w:val="19"/>
+        </w:rPr>
+        <w:t xml:space="preserve">Priority queue optimization</w:t>
+      </w:r>
+    </w:p>
+    <w:p>
+      <w:pPr>
+        <w:pStyle w:val="ListParagraph"/>
+        <w:numPr>
+          <w:ilvl w:val="0"/>
+          <w:numId w:val="2"/>
+        </w:numPr>
+        <w:spacing w:after="60"/>
+      </w:pPr>
+      <w:r>
+        <w:rPr>
+          <w:rFonts w:ascii="Calibri" w:cs="Calibri" w:eastAsia="Calibri" w:hAnsi="Calibri"/>
+          <w:b w:val="false"/>
+          <w:bCs w:val="false"/>
+          <w:i w:val="false"/>
+          <w:iCs w:val="false"/>
+          <w:color w:val="333333"/>
+          <w:sz w:val="19"/>
+          <w:szCs w:val="19"/>
+        </w:rPr>
+        <w:t xml:space="preserve">Real-time allocation</w:t>
+      </w:r>
+    </w:p>
+    <w:p>
+      <w:pPr>
+        <w:spacing w:after="40" w:before="180"/>
+      </w:pPr>
+      <w:r>
+        <w:rPr>
+          <w:rFonts w:ascii="Calibri" w:cs="Calibri" w:eastAsia="Calibri" w:hAnsi="Calibri"/>
+          <w:b/>
+          <w:bCs/>
+          <w:i w:val="false"/>
+          <w:iCs w:val="false"/>
+          <w:color w:val="2C3E50"/>
+          <w:sz w:val="26"/>
+          <w:szCs w:val="26"/>
+        </w:rPr>
+        <w:t xml:space="preserve">BFS &amp; DFS Algorithms</w:t>
+      </w:r>
+      <w:r>
+        <w:rPr>
+          <w:rFonts w:ascii="Calibri" w:cs="Calibri" w:eastAsia="Calibri" w:hAnsi="Calibri"/>
+          <w:b w:val="false"/>
+          <w:bCs w:val="false"/>
+          <w:i w:val="false"/>
+          <w:iCs w:val="false"/>
+          <w:color w:val="666666"/>
+          <w:sz w:val="20"/>
+          <w:szCs w:val="20"/>
+        </w:rPr>
         <w:t xml:space="preserve"> — Graph Traversal Implementation</w:t>
       </w:r>
     </w:p>
@@ -5383,7 +7165,7 @@
       <w:pPr>
         <w:spacing w:after="80"/>
       </w:pPr>
-      <w:hyperlink w:history="1" r:id="rIdhusdvm6csr7dapbqhghzu">
+      <w:hyperlink w:history="1" r:id="rIdgqgx67fymfvhg_clqybee">
         <w:r>
           <w:rPr>
             <w:rFonts w:ascii="Calibri" w:cs="Calibri" w:eastAsia="Calibri" w:hAnsi="Calibri"/>
@@ -5636,7 +7418,7 @@
       <w:pPr>
         <w:spacing w:after="80"/>
       </w:pPr>
-      <w:hyperlink w:history="1" r:id="rIdqhdj04ytkfwbkamr1xoq9">
+      <w:hyperlink w:history="1" r:id="rIdpeljwwx9-c_ecpl7swqdt">
         <w:r>
           <w:rPr>
             <w:rFonts w:ascii="Calibri" w:cs="Calibri" w:eastAsia="Calibri" w:hAnsi="Calibri"/>
@@ -5841,7 +7623,7 @@
           <w:sz w:val="26"/>
           <w:szCs w:val="26"/>
         </w:rPr>
-        <w:t xml:space="preserve">ArcFace Face Recognition</w:t>
+        <w:t xml:space="preserve">Credora</w:t>
       </w:r>
       <w:r>
         <w:rPr>
@@ -5854,6 +7636,303 @@
           <w:sz w:val="20"/>
           <w:szCs w:val="20"/>
         </w:rPr>
+        <w:t xml:space="preserve"> — AI Alternative Credit Scoring</w:t>
+      </w:r>
+    </w:p>
+    <w:p>
+      <w:pPr>
+        <w:spacing w:after="120"/>
+      </w:pPr>
+      <w:r>
+        <w:rPr>
+          <w:rFonts w:ascii="Calibri" w:cs="Calibri" w:eastAsia="Calibri" w:hAnsi="Calibri"/>
+          <w:b w:val="false"/>
+          <w:bCs w:val="false"/>
+          <w:i w:val="false"/>
+          <w:iCs w:val="false"/>
+          <w:color w:val="333333"/>
+          <w:sz w:val="19"/>
+          <w:szCs w:val="19"/>
+        </w:rPr>
+        <w:t xml:space="preserve">Problem: SMEs without traditional credit history struggle to access financing — needed an AI-driven alternative scoring engine using mobile money and digital financial data.</w:t>
+      </w:r>
+    </w:p>
+    <w:p>
+      <w:pPr>
+        <w:spacing w:after="120"/>
+      </w:pPr>
+      <w:r>
+        <w:rPr>
+          <w:rFonts w:ascii="Calibri" w:cs="Calibri" w:eastAsia="Calibri" w:hAnsi="Calibri"/>
+          <w:b w:val="false"/>
+          <w:bCs w:val="false"/>
+          <w:i w:val="false"/>
+          <w:iCs w:val="false"/>
+          <w:color w:val="333333"/>
+          <w:sz w:val="19"/>
+          <w:szCs w:val="19"/>
+        </w:rPr>
+        <w:t xml:space="preserve">Built: Next.js platform with AI scoring engine, mobile money data ingestion, risk profiling, and lender-facing dashboards.</w:t>
+      </w:r>
+    </w:p>
+    <w:p>
+      <w:pPr>
+        <w:spacing w:after="120"/>
+      </w:pPr>
+      <w:r>
+        <w:rPr>
+          <w:rFonts w:ascii="Calibri" w:cs="Calibri" w:eastAsia="Calibri" w:hAnsi="Calibri"/>
+          <w:b w:val="false"/>
+          <w:bCs w:val="false"/>
+          <w:i w:val="false"/>
+          <w:iCs w:val="false"/>
+          <w:color w:val="333333"/>
+          <w:sz w:val="19"/>
+          <w:szCs w:val="19"/>
+        </w:rPr>
+        <w:t xml:space="preserve">Outcome: Working credit scoring platform with AI risk models and lender dashboards.</w:t>
+      </w:r>
+    </w:p>
+    <w:p>
+      <w:pPr>
+        <w:spacing w:after="80"/>
+      </w:pPr>
+      <w:r>
+        <w:rPr>
+          <w:rFonts w:ascii="Calibri" w:cs="Calibri" w:eastAsia="Calibri" w:hAnsi="Calibri"/>
+          <w:b/>
+          <w:bCs/>
+          <w:i w:val="false"/>
+          <w:iCs w:val="false"/>
+          <w:color w:val="333333"/>
+          <w:sz w:val="19"/>
+          <w:szCs w:val="19"/>
+        </w:rPr>
+        <w:t xml:space="preserve">Tech: TypeScript, Next.js, AI, Machine Learning, Tailwind CSS, PostgreSQL</w:t>
+      </w:r>
+    </w:p>
+    <w:p>
+      <w:pPr>
+        <w:spacing w:after="80"/>
+      </w:pPr>
+      <w:hyperlink w:history="1" r:id="rId-9obijgehwk0rwl9q_zv5">
+        <w:r>
+          <w:rPr>
+            <w:rFonts w:ascii="Calibri" w:cs="Calibri" w:eastAsia="Calibri" w:hAnsi="Calibri"/>
+            <w:b w:val="false"/>
+            <w:bCs w:val="false"/>
+            <w:i w:val="false"/>
+            <w:iCs w:val="false"/>
+            <w:color w:val="0563C1"/>
+            <w:sz w:val="19"/>
+            <w:szCs w:val="19"/>
+          </w:rPr>
+          <w:t xml:space="preserve">GitHub: https://github.com/Arn-The-Wolf/Credora</w:t>
+        </w:r>
+      </w:hyperlink>
+    </w:p>
+    <w:p>
+      <w:pPr>
+        <w:spacing w:after="40" w:before="60"/>
+      </w:pPr>
+      <w:r>
+        <w:rPr>
+          <w:rFonts w:ascii="Calibri" w:cs="Calibri" w:eastAsia="Calibri" w:hAnsi="Calibri"/>
+          <w:b/>
+          <w:bCs/>
+          <w:i w:val="false"/>
+          <w:iCs w:val="false"/>
+          <w:color w:val="333333"/>
+          <w:sz w:val="19"/>
+          <w:szCs w:val="19"/>
+        </w:rPr>
+        <w:t xml:space="preserve">Key results</w:t>
+      </w:r>
+    </w:p>
+    <w:p>
+      <w:pPr>
+        <w:pStyle w:val="ListParagraph"/>
+        <w:numPr>
+          <w:ilvl w:val="0"/>
+          <w:numId w:val="2"/>
+        </w:numPr>
+        <w:spacing w:after="60"/>
+      </w:pPr>
+      <w:r>
+        <w:rPr>
+          <w:rFonts w:ascii="Calibri" w:cs="Calibri" w:eastAsia="Calibri" w:hAnsi="Calibri"/>
+          <w:b w:val="false"/>
+          <w:bCs w:val="false"/>
+          <w:i w:val="false"/>
+          <w:iCs w:val="false"/>
+          <w:color w:val="333333"/>
+          <w:sz w:val="19"/>
+          <w:szCs w:val="19"/>
+        </w:rPr>
+        <w:t xml:space="preserve">AI credit scoring engine</w:t>
+      </w:r>
+    </w:p>
+    <w:p>
+      <w:pPr>
+        <w:pStyle w:val="ListParagraph"/>
+        <w:numPr>
+          <w:ilvl w:val="0"/>
+          <w:numId w:val="2"/>
+        </w:numPr>
+        <w:spacing w:after="60"/>
+      </w:pPr>
+      <w:r>
+        <w:rPr>
+          <w:rFonts w:ascii="Calibri" w:cs="Calibri" w:eastAsia="Calibri" w:hAnsi="Calibri"/>
+          <w:b w:val="false"/>
+          <w:bCs w:val="false"/>
+          <w:i w:val="false"/>
+          <w:iCs w:val="false"/>
+          <w:color w:val="333333"/>
+          <w:sz w:val="19"/>
+          <w:szCs w:val="19"/>
+        </w:rPr>
+        <w:t xml:space="preserve">Mobile money data ingestion</w:t>
+      </w:r>
+    </w:p>
+    <w:p>
+      <w:pPr>
+        <w:pStyle w:val="ListParagraph"/>
+        <w:numPr>
+          <w:ilvl w:val="0"/>
+          <w:numId w:val="2"/>
+        </w:numPr>
+        <w:spacing w:after="60"/>
+      </w:pPr>
+      <w:r>
+        <w:rPr>
+          <w:rFonts w:ascii="Calibri" w:cs="Calibri" w:eastAsia="Calibri" w:hAnsi="Calibri"/>
+          <w:b w:val="false"/>
+          <w:bCs w:val="false"/>
+          <w:i w:val="false"/>
+          <w:iCs w:val="false"/>
+          <w:color w:val="333333"/>
+          <w:sz w:val="19"/>
+          <w:szCs w:val="19"/>
+        </w:rPr>
+        <w:t xml:space="preserve">Lender dashboard</w:t>
+      </w:r>
+    </w:p>
+    <w:p>
+      <w:pPr>
+        <w:spacing w:after="40" w:before="80"/>
+      </w:pPr>
+      <w:r>
+        <w:rPr>
+          <w:rFonts w:ascii="Calibri" w:cs="Calibri" w:eastAsia="Calibri" w:hAnsi="Calibri"/>
+          <w:b/>
+          <w:bCs/>
+          <w:i w:val="false"/>
+          <w:iCs w:val="false"/>
+          <w:color w:val="333333"/>
+          <w:sz w:val="19"/>
+          <w:szCs w:val="19"/>
+        </w:rPr>
+        <w:t xml:space="preserve">Challenges solved</w:t>
+      </w:r>
+    </w:p>
+    <w:p>
+      <w:pPr>
+        <w:pStyle w:val="ListParagraph"/>
+        <w:numPr>
+          <w:ilvl w:val="0"/>
+          <w:numId w:val="2"/>
+        </w:numPr>
+        <w:spacing w:after="60"/>
+      </w:pPr>
+      <w:r>
+        <w:rPr>
+          <w:rFonts w:ascii="Calibri" w:cs="Calibri" w:eastAsia="Calibri" w:hAnsi="Calibri"/>
+          <w:b w:val="false"/>
+          <w:bCs w:val="false"/>
+          <w:i w:val="false"/>
+          <w:iCs w:val="false"/>
+          <w:color w:val="333333"/>
+          <w:sz w:val="19"/>
+          <w:szCs w:val="19"/>
+        </w:rPr>
+        <w:t xml:space="preserve">Alternative data modeling</w:t>
+      </w:r>
+    </w:p>
+    <w:p>
+      <w:pPr>
+        <w:pStyle w:val="ListParagraph"/>
+        <w:numPr>
+          <w:ilvl w:val="0"/>
+          <w:numId w:val="2"/>
+        </w:numPr>
+        <w:spacing w:after="60"/>
+      </w:pPr>
+      <w:r>
+        <w:rPr>
+          <w:rFonts w:ascii="Calibri" w:cs="Calibri" w:eastAsia="Calibri" w:hAnsi="Calibri"/>
+          <w:b w:val="false"/>
+          <w:bCs w:val="false"/>
+          <w:i w:val="false"/>
+          <w:iCs w:val="false"/>
+          <w:color w:val="333333"/>
+          <w:sz w:val="19"/>
+          <w:szCs w:val="19"/>
+        </w:rPr>
+        <w:t xml:space="preserve">ML scoring accuracy</w:t>
+      </w:r>
+    </w:p>
+    <w:p>
+      <w:pPr>
+        <w:pStyle w:val="ListParagraph"/>
+        <w:numPr>
+          <w:ilvl w:val="0"/>
+          <w:numId w:val="2"/>
+        </w:numPr>
+        <w:spacing w:after="60"/>
+      </w:pPr>
+      <w:r>
+        <w:rPr>
+          <w:rFonts w:ascii="Calibri" w:cs="Calibri" w:eastAsia="Calibri" w:hAnsi="Calibri"/>
+          <w:b w:val="false"/>
+          <w:bCs w:val="false"/>
+          <w:i w:val="false"/>
+          <w:iCs w:val="false"/>
+          <w:color w:val="333333"/>
+          <w:sz w:val="19"/>
+          <w:szCs w:val="19"/>
+        </w:rPr>
+        <w:t xml:space="preserve">Data privacy</w:t>
+      </w:r>
+    </w:p>
+    <w:p>
+      <w:pPr>
+        <w:spacing w:after="40" w:before="180"/>
+      </w:pPr>
+      <w:r>
+        <w:rPr>
+          <w:rFonts w:ascii="Calibri" w:cs="Calibri" w:eastAsia="Calibri" w:hAnsi="Calibri"/>
+          <w:b/>
+          <w:bCs/>
+          <w:i w:val="false"/>
+          <w:iCs w:val="false"/>
+          <w:color w:val="2C3E50"/>
+          <w:sz w:val="26"/>
+          <w:szCs w:val="26"/>
+        </w:rPr>
+        <w:t xml:space="preserve">ArcFace Face Recognition</w:t>
+      </w:r>
+      <w:r>
+        <w:rPr>
+          <w:rFonts w:ascii="Calibri" w:cs="Calibri" w:eastAsia="Calibri" w:hAnsi="Calibri"/>
+          <w:b w:val="false"/>
+          <w:bCs w:val="false"/>
+          <w:i w:val="false"/>
+          <w:iCs w:val="false"/>
+          <w:color w:val="666666"/>
+          <w:sz w:val="20"/>
+          <w:szCs w:val="20"/>
+        </w:rPr>
         <w:t xml:space="preserve"> — 5-Point Alignment + ONNX Inference</w:t>
       </w:r>
     </w:p>
@@ -5933,7 +8012,7 @@
       <w:pPr>
         <w:spacing w:after="80"/>
       </w:pPr>
-      <w:hyperlink w:history="1" r:id="rIdjoraidvwz9sem9wjzyh9n">
+      <w:hyperlink w:history="1" r:id="rIdnma3fx2itdbpt2c646fyx">
         <w:r>
           <w:rPr>
             <w:rFonts w:ascii="Calibri" w:cs="Calibri" w:eastAsia="Calibri" w:hAnsi="Calibri"/>
@@ -6138,7 +8217,7 @@
           <w:sz w:val="26"/>
           <w:szCs w:val="26"/>
         </w:rPr>
-        <w:t xml:space="preserve">ANPR — Plate Detection &amp; OCR</w:t>
+        <w:t xml:space="preserve">Sentinel Security Scanner</w:t>
       </w:r>
       <w:r>
         <w:rPr>
@@ -6151,6 +8230,303 @@
           <w:sz w:val="20"/>
           <w:szCs w:val="20"/>
         </w:rPr>
+        <w:t xml:space="preserve"> — Educational Vulnerability Scanner</w:t>
+      </w:r>
+    </w:p>
+    <w:p>
+      <w:pPr>
+        <w:spacing w:after="120"/>
+      </w:pPr>
+      <w:r>
+        <w:rPr>
+          <w:rFonts w:ascii="Calibri" w:cs="Calibri" w:eastAsia="Calibri" w:hAnsi="Calibri"/>
+          <w:b w:val="false"/>
+          <w:bCs w:val="false"/>
+          <w:i w:val="false"/>
+          <w:iCs w:val="false"/>
+          <w:color w:val="333333"/>
+          <w:sz w:val="19"/>
+          <w:szCs w:val="19"/>
+        </w:rPr>
+        <w:t xml:space="preserve">Problem: Security students need a safe, localhost-only environment to learn vulnerability scanning without risking real systems.</w:t>
+      </w:r>
+    </w:p>
+    <w:p>
+      <w:pPr>
+        <w:spacing w:after="120"/>
+      </w:pPr>
+      <w:r>
+        <w:rPr>
+          <w:rFonts w:ascii="Calibri" w:cs="Calibri" w:eastAsia="Calibri" w:hAnsi="Calibri"/>
+          <w:b w:val="false"/>
+          <w:bCs w:val="false"/>
+          <w:i w:val="false"/>
+          <w:iCs w:val="false"/>
+          <w:color w:val="333333"/>
+          <w:sz w:val="19"/>
+          <w:szCs w:val="19"/>
+        </w:rPr>
+        <w:t xml:space="preserve">Built: Python scanner with modular detection plugins, a sandboxed test range with planted vulnerabilities, and scan report generation.</w:t>
+      </w:r>
+    </w:p>
+    <w:p>
+      <w:pPr>
+        <w:spacing w:after="120"/>
+      </w:pPr>
+      <w:r>
+        <w:rPr>
+          <w:rFonts w:ascii="Calibri" w:cs="Calibri" w:eastAsia="Calibri" w:hAnsi="Calibri"/>
+          <w:b w:val="false"/>
+          <w:bCs w:val="false"/>
+          <w:i w:val="false"/>
+          <w:iCs w:val="false"/>
+          <w:color w:val="333333"/>
+          <w:sz w:val="19"/>
+          <w:szCs w:val="19"/>
+        </w:rPr>
+        <w:t xml:space="preserve">Outcome: Safe learning environment for security scanning with planted vulnerabilities.</w:t>
+      </w:r>
+    </w:p>
+    <w:p>
+      <w:pPr>
+        <w:spacing w:after="80"/>
+      </w:pPr>
+      <w:r>
+        <w:rPr>
+          <w:rFonts w:ascii="Calibri" w:cs="Calibri" w:eastAsia="Calibri" w:hAnsi="Calibri"/>
+          <w:b/>
+          <w:bCs/>
+          <w:i w:val="false"/>
+          <w:iCs w:val="false"/>
+          <w:color w:val="333333"/>
+          <w:sz w:val="19"/>
+          <w:szCs w:val="19"/>
+        </w:rPr>
+        <w:t xml:space="preserve">Tech: Python, Security, Flask, Networking, AI</w:t>
+      </w:r>
+    </w:p>
+    <w:p>
+      <w:pPr>
+        <w:spacing w:after="80"/>
+      </w:pPr>
+      <w:hyperlink w:history="1" r:id="rIdqmvyuepleyciwjohatyzf">
+        <w:r>
+          <w:rPr>
+            <w:rFonts w:ascii="Calibri" w:cs="Calibri" w:eastAsia="Calibri" w:hAnsi="Calibri"/>
+            <w:b w:val="false"/>
+            <w:bCs w:val="false"/>
+            <w:i w:val="false"/>
+            <w:iCs w:val="false"/>
+            <w:color w:val="0563C1"/>
+            <w:sz w:val="19"/>
+            <w:szCs w:val="19"/>
+          </w:rPr>
+          <w:t xml:space="preserve">GitHub: https://github.com/Arn-The-Wolf/Sentinel</w:t>
+        </w:r>
+      </w:hyperlink>
+    </w:p>
+    <w:p>
+      <w:pPr>
+        <w:spacing w:after="40" w:before="60"/>
+      </w:pPr>
+      <w:r>
+        <w:rPr>
+          <w:rFonts w:ascii="Calibri" w:cs="Calibri" w:eastAsia="Calibri" w:hAnsi="Calibri"/>
+          <w:b/>
+          <w:bCs/>
+          <w:i w:val="false"/>
+          <w:iCs w:val="false"/>
+          <w:color w:val="333333"/>
+          <w:sz w:val="19"/>
+          <w:szCs w:val="19"/>
+        </w:rPr>
+        <w:t xml:space="preserve">Key results</w:t>
+      </w:r>
+    </w:p>
+    <w:p>
+      <w:pPr>
+        <w:pStyle w:val="ListParagraph"/>
+        <w:numPr>
+          <w:ilvl w:val="0"/>
+          <w:numId w:val="2"/>
+        </w:numPr>
+        <w:spacing w:after="60"/>
+      </w:pPr>
+      <w:r>
+        <w:rPr>
+          <w:rFonts w:ascii="Calibri" w:cs="Calibri" w:eastAsia="Calibri" w:hAnsi="Calibri"/>
+          <w:b w:val="false"/>
+          <w:bCs w:val="false"/>
+          <w:i w:val="false"/>
+          <w:iCs w:val="false"/>
+          <w:color w:val="333333"/>
+          <w:sz w:val="19"/>
+          <w:szCs w:val="19"/>
+        </w:rPr>
+        <w:t xml:space="preserve">Modular scanner</w:t>
+      </w:r>
+    </w:p>
+    <w:p>
+      <w:pPr>
+        <w:pStyle w:val="ListParagraph"/>
+        <w:numPr>
+          <w:ilvl w:val="0"/>
+          <w:numId w:val="2"/>
+        </w:numPr>
+        <w:spacing w:after="60"/>
+      </w:pPr>
+      <w:r>
+        <w:rPr>
+          <w:rFonts w:ascii="Calibri" w:cs="Calibri" w:eastAsia="Calibri" w:hAnsi="Calibri"/>
+          <w:b w:val="false"/>
+          <w:bCs w:val="false"/>
+          <w:i w:val="false"/>
+          <w:iCs w:val="false"/>
+          <w:color w:val="333333"/>
+          <w:sz w:val="19"/>
+          <w:szCs w:val="19"/>
+        </w:rPr>
+        <w:t xml:space="preserve">Planted-flaw test range</w:t>
+      </w:r>
+    </w:p>
+    <w:p>
+      <w:pPr>
+        <w:pStyle w:val="ListParagraph"/>
+        <w:numPr>
+          <w:ilvl w:val="0"/>
+          <w:numId w:val="2"/>
+        </w:numPr>
+        <w:spacing w:after="60"/>
+      </w:pPr>
+      <w:r>
+        <w:rPr>
+          <w:rFonts w:ascii="Calibri" w:cs="Calibri" w:eastAsia="Calibri" w:hAnsi="Calibri"/>
+          <w:b w:val="false"/>
+          <w:bCs w:val="false"/>
+          <w:i w:val="false"/>
+          <w:iCs w:val="false"/>
+          <w:color w:val="333333"/>
+          <w:sz w:val="19"/>
+          <w:szCs w:val="19"/>
+        </w:rPr>
+        <w:t xml:space="preserve">Scan reports</w:t>
+      </w:r>
+    </w:p>
+    <w:p>
+      <w:pPr>
+        <w:spacing w:after="40" w:before="80"/>
+      </w:pPr>
+      <w:r>
+        <w:rPr>
+          <w:rFonts w:ascii="Calibri" w:cs="Calibri" w:eastAsia="Calibri" w:hAnsi="Calibri"/>
+          <w:b/>
+          <w:bCs/>
+          <w:i w:val="false"/>
+          <w:iCs w:val="false"/>
+          <w:color w:val="333333"/>
+          <w:sz w:val="19"/>
+          <w:szCs w:val="19"/>
+        </w:rPr>
+        <w:t xml:space="preserve">Challenges solved</w:t>
+      </w:r>
+    </w:p>
+    <w:p>
+      <w:pPr>
+        <w:pStyle w:val="ListParagraph"/>
+        <w:numPr>
+          <w:ilvl w:val="0"/>
+          <w:numId w:val="2"/>
+        </w:numPr>
+        <w:spacing w:after="60"/>
+      </w:pPr>
+      <w:r>
+        <w:rPr>
+          <w:rFonts w:ascii="Calibri" w:cs="Calibri" w:eastAsia="Calibri" w:hAnsi="Calibri"/>
+          <w:b w:val="false"/>
+          <w:bCs w:val="false"/>
+          <w:i w:val="false"/>
+          <w:iCs w:val="false"/>
+          <w:color w:val="333333"/>
+          <w:sz w:val="19"/>
+          <w:szCs w:val="19"/>
+        </w:rPr>
+        <w:t xml:space="preserve">Safe sandboxing</w:t>
+      </w:r>
+    </w:p>
+    <w:p>
+      <w:pPr>
+        <w:pStyle w:val="ListParagraph"/>
+        <w:numPr>
+          <w:ilvl w:val="0"/>
+          <w:numId w:val="2"/>
+        </w:numPr>
+        <w:spacing w:after="60"/>
+      </w:pPr>
+      <w:r>
+        <w:rPr>
+          <w:rFonts w:ascii="Calibri" w:cs="Calibri" w:eastAsia="Calibri" w:hAnsi="Calibri"/>
+          <w:b w:val="false"/>
+          <w:bCs w:val="false"/>
+          <w:i w:val="false"/>
+          <w:iCs w:val="false"/>
+          <w:color w:val="333333"/>
+          <w:sz w:val="19"/>
+          <w:szCs w:val="19"/>
+        </w:rPr>
+        <w:t xml:space="preserve">Detection accuracy</w:t>
+      </w:r>
+    </w:p>
+    <w:p>
+      <w:pPr>
+        <w:pStyle w:val="ListParagraph"/>
+        <w:numPr>
+          <w:ilvl w:val="0"/>
+          <w:numId w:val="2"/>
+        </w:numPr>
+        <w:spacing w:after="60"/>
+      </w:pPr>
+      <w:r>
+        <w:rPr>
+          <w:rFonts w:ascii="Calibri" w:cs="Calibri" w:eastAsia="Calibri" w:hAnsi="Calibri"/>
+          <w:b w:val="false"/>
+          <w:bCs w:val="false"/>
+          <w:i w:val="false"/>
+          <w:iCs w:val="false"/>
+          <w:color w:val="333333"/>
+          <w:sz w:val="19"/>
+          <w:szCs w:val="19"/>
+        </w:rPr>
+        <w:t xml:space="preserve">Plugin architecture</w:t>
+      </w:r>
+    </w:p>
+    <w:p>
+      <w:pPr>
+        <w:spacing w:after="40" w:before="180"/>
+      </w:pPr>
+      <w:r>
+        <w:rPr>
+          <w:rFonts w:ascii="Calibri" w:cs="Calibri" w:eastAsia="Calibri" w:hAnsi="Calibri"/>
+          <w:b/>
+          <w:bCs/>
+          <w:i w:val="false"/>
+          <w:iCs w:val="false"/>
+          <w:color w:val="2C3E50"/>
+          <w:sz w:val="26"/>
+          <w:szCs w:val="26"/>
+        </w:rPr>
+        <w:t xml:space="preserve">ANPR — Plate Detection &amp; OCR</w:t>
+      </w:r>
+      <w:r>
+        <w:rPr>
+          <w:rFonts w:ascii="Calibri" w:cs="Calibri" w:eastAsia="Calibri" w:hAnsi="Calibri"/>
+          <w:b w:val="false"/>
+          <w:bCs w:val="false"/>
+          <w:i w:val="false"/>
+          <w:iCs w:val="false"/>
+          <w:color w:val="666666"/>
+          <w:sz w:val="20"/>
+          <w:szCs w:val="20"/>
+        </w:rPr>
         <w:t xml:space="preserve"> — Automatic Number Plate Recognition</w:t>
       </w:r>
     </w:p>
@@ -6230,7 +8606,7 @@
       <w:pPr>
         <w:spacing w:after="80"/>
       </w:pPr>
-      <w:hyperlink w:history="1" r:id="rId3ezucfzo7fazfdy0sc1ec">
+      <w:hyperlink w:history="1" r:id="rIdbidbrxwnbdiivek4vhq9r">
         <w:r>
           <w:rPr>
             <w:rFonts w:ascii="Calibri" w:cs="Calibri" w:eastAsia="Calibri" w:hAnsi="Calibri"/>
@@ -6435,7 +8811,7 @@
           <w:sz w:val="26"/>
           <w:szCs w:val="26"/>
         </w:rPr>
-        <w:t xml:space="preserve">Face Tracker Live Dashboard</w:t>
+        <w:t xml:space="preserve">Benax Speaker Tracking</w:t>
       </w:r>
       <w:r>
         <w:rPr>
@@ -6448,6 +8824,303 @@
           <w:sz w:val="20"/>
           <w:szCs w:val="20"/>
         </w:rPr>
+        <w:t xml:space="preserve"> — AI Camera + IoT Servo Tracking</w:t>
+      </w:r>
+    </w:p>
+    <w:p>
+      <w:pPr>
+        <w:spacing w:after="120"/>
+      </w:pPr>
+      <w:r>
+        <w:rPr>
+          <w:rFonts w:ascii="Calibri" w:cs="Calibri" w:eastAsia="Calibri" w:hAnsi="Calibri"/>
+          <w:b w:val="false"/>
+          <w:bCs w:val="false"/>
+          <w:i w:val="false"/>
+          <w:iCs w:val="false"/>
+          <w:color w:val="333333"/>
+          <w:sz w:val="19"/>
+          <w:szCs w:val="19"/>
+        </w:rPr>
+        <w:t xml:space="preserve">Problem: Presentation rooms need automated camera tracking to follow the active speaker without manual pan/tilt control.</w:t>
+      </w:r>
+    </w:p>
+    <w:p>
+      <w:pPr>
+        <w:spacing w:after="120"/>
+      </w:pPr>
+      <w:r>
+        <w:rPr>
+          <w:rFonts w:ascii="Calibri" w:cs="Calibri" w:eastAsia="Calibri" w:hAnsi="Calibri"/>
+          <w:b w:val="false"/>
+          <w:bCs w:val="false"/>
+          <w:i w:val="false"/>
+          <w:iCs w:val="false"/>
+          <w:color w:val="333333"/>
+          <w:sz w:val="19"/>
+          <w:szCs w:val="19"/>
+        </w:rPr>
+        <w:t xml:space="preserve">Built: Python face recognition, MQTT communication, ESP8266 firmware for servo motors, and real-time tracking logic.</w:t>
+      </w:r>
+    </w:p>
+    <w:p>
+      <w:pPr>
+        <w:spacing w:after="120"/>
+      </w:pPr>
+      <w:r>
+        <w:rPr>
+          <w:rFonts w:ascii="Calibri" w:cs="Calibri" w:eastAsia="Calibri" w:hAnsi="Calibri"/>
+          <w:b w:val="false"/>
+          <w:bCs w:val="false"/>
+          <w:i w:val="false"/>
+          <w:iCs w:val="false"/>
+          <w:color w:val="333333"/>
+          <w:sz w:val="19"/>
+          <w:szCs w:val="19"/>
+        </w:rPr>
+        <w:t xml:space="preserve">Outcome: Automated speaker-following camera system with IoT hardware integration.</w:t>
+      </w:r>
+    </w:p>
+    <w:p>
+      <w:pPr>
+        <w:spacing w:after="80"/>
+      </w:pPr>
+      <w:r>
+        <w:rPr>
+          <w:rFonts w:ascii="Calibri" w:cs="Calibri" w:eastAsia="Calibri" w:hAnsi="Calibri"/>
+          <w:b/>
+          <w:bCs/>
+          <w:i w:val="false"/>
+          <w:iCs w:val="false"/>
+          <w:color w:val="333333"/>
+          <w:sz w:val="19"/>
+          <w:szCs w:val="19"/>
+        </w:rPr>
+        <w:t xml:space="preserve">Tech: Python, OpenCV, MQTT, ESP8266, IoT, AI, Computer Vision</w:t>
+      </w:r>
+    </w:p>
+    <w:p>
+      <w:pPr>
+        <w:spacing w:after="80"/>
+      </w:pPr>
+      <w:hyperlink w:history="1" r:id="rIdgnm0uklv_sdgyavui9lbj">
+        <w:r>
+          <w:rPr>
+            <w:rFonts w:ascii="Calibri" w:cs="Calibri" w:eastAsia="Calibri" w:hAnsi="Calibri"/>
+            <w:b w:val="false"/>
+            <w:bCs w:val="false"/>
+            <w:i w:val="false"/>
+            <w:iCs w:val="false"/>
+            <w:color w:val="0563C1"/>
+            <w:sz w:val="19"/>
+            <w:szCs w:val="19"/>
+          </w:rPr>
+          <w:t xml:space="preserve">GitHub: https://github.com/Arn-The-Wolf/benax-speaker-tracking-system</w:t>
+        </w:r>
+      </w:hyperlink>
+    </w:p>
+    <w:p>
+      <w:pPr>
+        <w:spacing w:after="40" w:before="60"/>
+      </w:pPr>
+      <w:r>
+        <w:rPr>
+          <w:rFonts w:ascii="Calibri" w:cs="Calibri" w:eastAsia="Calibri" w:hAnsi="Calibri"/>
+          <w:b/>
+          <w:bCs/>
+          <w:i w:val="false"/>
+          <w:iCs w:val="false"/>
+          <w:color w:val="333333"/>
+          <w:sz w:val="19"/>
+          <w:szCs w:val="19"/>
+        </w:rPr>
+        <w:t xml:space="preserve">Key results</w:t>
+      </w:r>
+    </w:p>
+    <w:p>
+      <w:pPr>
+        <w:pStyle w:val="ListParagraph"/>
+        <w:numPr>
+          <w:ilvl w:val="0"/>
+          <w:numId w:val="2"/>
+        </w:numPr>
+        <w:spacing w:after="60"/>
+      </w:pPr>
+      <w:r>
+        <w:rPr>
+          <w:rFonts w:ascii="Calibri" w:cs="Calibri" w:eastAsia="Calibri" w:hAnsi="Calibri"/>
+          <w:b w:val="false"/>
+          <w:bCs w:val="false"/>
+          <w:i w:val="false"/>
+          <w:iCs w:val="false"/>
+          <w:color w:val="333333"/>
+          <w:sz w:val="19"/>
+          <w:szCs w:val="19"/>
+        </w:rPr>
+        <w:t xml:space="preserve">Speaker face recognition</w:t>
+      </w:r>
+    </w:p>
+    <w:p>
+      <w:pPr>
+        <w:pStyle w:val="ListParagraph"/>
+        <w:numPr>
+          <w:ilvl w:val="0"/>
+          <w:numId w:val="2"/>
+        </w:numPr>
+        <w:spacing w:after="60"/>
+      </w:pPr>
+      <w:r>
+        <w:rPr>
+          <w:rFonts w:ascii="Calibri" w:cs="Calibri" w:eastAsia="Calibri" w:hAnsi="Calibri"/>
+          <w:b w:val="false"/>
+          <w:bCs w:val="false"/>
+          <w:i w:val="false"/>
+          <w:iCs w:val="false"/>
+          <w:color w:val="333333"/>
+          <w:sz w:val="19"/>
+          <w:szCs w:val="19"/>
+        </w:rPr>
+        <w:t xml:space="preserve">Servo camera tracking</w:t>
+      </w:r>
+    </w:p>
+    <w:p>
+      <w:pPr>
+        <w:pStyle w:val="ListParagraph"/>
+        <w:numPr>
+          <w:ilvl w:val="0"/>
+          <w:numId w:val="2"/>
+        </w:numPr>
+        <w:spacing w:after="60"/>
+      </w:pPr>
+      <w:r>
+        <w:rPr>
+          <w:rFonts w:ascii="Calibri" w:cs="Calibri" w:eastAsia="Calibri" w:hAnsi="Calibri"/>
+          <w:b w:val="false"/>
+          <w:bCs w:val="false"/>
+          <w:i w:val="false"/>
+          <w:iCs w:val="false"/>
+          <w:color w:val="333333"/>
+          <w:sz w:val="19"/>
+          <w:szCs w:val="19"/>
+        </w:rPr>
+        <w:t xml:space="preserve">MQTT IoT integration</w:t>
+      </w:r>
+    </w:p>
+    <w:p>
+      <w:pPr>
+        <w:spacing w:after="40" w:before="80"/>
+      </w:pPr>
+      <w:r>
+        <w:rPr>
+          <w:rFonts w:ascii="Calibri" w:cs="Calibri" w:eastAsia="Calibri" w:hAnsi="Calibri"/>
+          <w:b/>
+          <w:bCs/>
+          <w:i w:val="false"/>
+          <w:iCs w:val="false"/>
+          <w:color w:val="333333"/>
+          <w:sz w:val="19"/>
+          <w:szCs w:val="19"/>
+        </w:rPr>
+        <w:t xml:space="preserve">Challenges solved</w:t>
+      </w:r>
+    </w:p>
+    <w:p>
+      <w:pPr>
+        <w:pStyle w:val="ListParagraph"/>
+        <w:numPr>
+          <w:ilvl w:val="0"/>
+          <w:numId w:val="2"/>
+        </w:numPr>
+        <w:spacing w:after="60"/>
+      </w:pPr>
+      <w:r>
+        <w:rPr>
+          <w:rFonts w:ascii="Calibri" w:cs="Calibri" w:eastAsia="Calibri" w:hAnsi="Calibri"/>
+          <w:b w:val="false"/>
+          <w:bCs w:val="false"/>
+          <w:i w:val="false"/>
+          <w:iCs w:val="false"/>
+          <w:color w:val="333333"/>
+          <w:sz w:val="19"/>
+          <w:szCs w:val="19"/>
+        </w:rPr>
+        <w:t xml:space="preserve">Real-time face tracking</w:t>
+      </w:r>
+    </w:p>
+    <w:p>
+      <w:pPr>
+        <w:pStyle w:val="ListParagraph"/>
+        <w:numPr>
+          <w:ilvl w:val="0"/>
+          <w:numId w:val="2"/>
+        </w:numPr>
+        <w:spacing w:after="60"/>
+      </w:pPr>
+      <w:r>
+        <w:rPr>
+          <w:rFonts w:ascii="Calibri" w:cs="Calibri" w:eastAsia="Calibri" w:hAnsi="Calibri"/>
+          <w:b w:val="false"/>
+          <w:bCs w:val="false"/>
+          <w:i w:val="false"/>
+          <w:iCs w:val="false"/>
+          <w:color w:val="333333"/>
+          <w:sz w:val="19"/>
+          <w:szCs w:val="19"/>
+        </w:rPr>
+        <w:t xml:space="preserve">Servo motor precision</w:t>
+      </w:r>
+    </w:p>
+    <w:p>
+      <w:pPr>
+        <w:pStyle w:val="ListParagraph"/>
+        <w:numPr>
+          <w:ilvl w:val="0"/>
+          <w:numId w:val="2"/>
+        </w:numPr>
+        <w:spacing w:after="60"/>
+      </w:pPr>
+      <w:r>
+        <w:rPr>
+          <w:rFonts w:ascii="Calibri" w:cs="Calibri" w:eastAsia="Calibri" w:hAnsi="Calibri"/>
+          <w:b w:val="false"/>
+          <w:bCs w:val="false"/>
+          <w:i w:val="false"/>
+          <w:iCs w:val="false"/>
+          <w:color w:val="333333"/>
+          <w:sz w:val="19"/>
+          <w:szCs w:val="19"/>
+        </w:rPr>
+        <w:t xml:space="preserve">MQTT latency</w:t>
+      </w:r>
+    </w:p>
+    <w:p>
+      <w:pPr>
+        <w:spacing w:after="40" w:before="180"/>
+      </w:pPr>
+      <w:r>
+        <w:rPr>
+          <w:rFonts w:ascii="Calibri" w:cs="Calibri" w:eastAsia="Calibri" w:hAnsi="Calibri"/>
+          <w:b/>
+          <w:bCs/>
+          <w:i w:val="false"/>
+          <w:iCs w:val="false"/>
+          <w:color w:val="2C3E50"/>
+          <w:sz w:val="26"/>
+          <w:szCs w:val="26"/>
+        </w:rPr>
+        <w:t xml:space="preserve">Face Tracker Live Dashboard</w:t>
+      </w:r>
+      <w:r>
+        <w:rPr>
+          <w:rFonts w:ascii="Calibri" w:cs="Calibri" w:eastAsia="Calibri" w:hAnsi="Calibri"/>
+          <w:b w:val="false"/>
+          <w:bCs w:val="false"/>
+          <w:i w:val="false"/>
+          <w:iCs w:val="false"/>
+          <w:color w:val="666666"/>
+          <w:sz w:val="20"/>
+          <w:szCs w:val="20"/>
+        </w:rPr>
         <w:t xml:space="preserve"> — AI + IoT Recognition System</w:t>
       </w:r>
     </w:p>
@@ -6527,7 +9200,7 @@
       <w:pPr>
         <w:spacing w:after="80"/>
       </w:pPr>
-      <w:hyperlink w:history="1" r:id="rIds-xw425dpb8ngdhjabrg_">
+      <w:hyperlink w:history="1" r:id="rId_mtwyaeaizxz_qzfxqcxt">
         <w:r>
           <w:rPr>
             <w:rFonts w:ascii="Calibri" w:cs="Calibri" w:eastAsia="Calibri" w:hAnsi="Calibri"/>
@@ -6824,7 +9497,7 @@
       <w:pPr>
         <w:spacing w:after="80"/>
       </w:pPr>
-      <w:hyperlink w:history="1" r:id="rIdz3x7tr5pr73fuxgrwfygf">
+      <w:hyperlink w:history="1" r:id="rIdfqffbe-f_4hbqphw_pmos">
         <w:r>
           <w:rPr>
             <w:rFonts w:ascii="Calibri" w:cs="Calibri" w:eastAsia="Calibri" w:hAnsi="Calibri"/>
@@ -7208,7 +9881,7 @@
       <w:pPr>
         <w:spacing w:after="80"/>
       </w:pPr>
-      <w:hyperlink w:history="1" r:id="rIdg6v8ivs0l3cb9q6fuwou0">
+      <w:hyperlink w:history="1" r:id="rIdaowiusr2qcmokf17ago2v">
         <w:r>
           <w:rPr>
             <w:rFonts w:ascii="Calibri" w:cs="Calibri" w:eastAsia="Calibri" w:hAnsi="Calibri"/>
@@ -7530,7 +10203,7 @@
       <w:pPr>
         <w:spacing w:after="80"/>
       </w:pPr>
-      <w:hyperlink w:history="1" r:id="rIdfoi6l_bkutlgibvzmaovn">
+      <w:hyperlink w:history="1" r:id="rIdvrk32-fdcxdo-tt8tanu4">
         <w:r>
           <w:rPr>
             <w:rFonts w:ascii="Calibri" w:cs="Calibri" w:eastAsia="Calibri" w:hAnsi="Calibri"/>

</xml_diff>

<commit_message>
Add 16 more GitHub projects including ArnPulse, FaceLocking, Car Connect
Co-authored-by: Cursor <cursoragent@cursor.com>
</commit_message>
<xml_diff>
--- a/public/RUYANGE-Arnold-Portfolio.docx
+++ b/public/RUYANGE-Arnold-Portfolio.docx
@@ -125,7 +125,7 @@
             <w:pPr>
               <w:spacing w:after="80"/>
             </w:pPr>
-            <w:hyperlink w:history="1" r:id="rId16kjbl_q1yskc8gznbpzv">
+            <w:hyperlink w:history="1" r:id="rIdp852sxqhkzxiubt6kvmto">
               <w:r>
                 <w:rPr>
                   <w:rFonts w:ascii="Calibri" w:cs="Calibri" w:eastAsia="Calibri" w:hAnsi="Calibri"/>
@@ -163,7 +163,7 @@
             <w:pPr>
               <w:spacing w:after="80"/>
             </w:pPr>
-            <w:hyperlink w:history="1" r:id="rIdf8ksvoato7lwahqsynljz">
+            <w:hyperlink w:history="1" r:id="rIdzam7pxlcutokv3iig855z">
               <w:r>
                 <w:rPr>
                   <w:rFonts w:ascii="Calibri" w:cs="Calibri" w:eastAsia="Calibri" w:hAnsi="Calibri"/>
@@ -183,7 +183,7 @@
             <w:pPr>
               <w:spacing w:after="80"/>
             </w:pPr>
-            <w:hyperlink w:history="1" r:id="rIdso-w1nj0p9ctitc4pdcvs">
+            <w:hyperlink w:history="1" r:id="rIdr0yyqumndp1itci6kmqa-">
               <w:r>
                 <w:rPr>
                   <w:rFonts w:ascii="Calibri" w:cs="Calibri" w:eastAsia="Calibri" w:hAnsi="Calibri"/>
@@ -2232,7 +2232,7 @@
           <w:sz w:val="26"/>
           <w:szCs w:val="26"/>
         </w:rPr>
-        <w:t xml:space="preserve">Ingoboka Platform</w:t>
+        <w:t xml:space="preserve">ArnPulse</w:t>
       </w:r>
       <w:r>
         <w:rPr>
@@ -2245,6 +2245,303 @@
           <w:sz w:val="20"/>
           <w:szCs w:val="20"/>
         </w:rPr>
+        <w:t xml:space="preserve"> — Mobile Money Agent Network Platform</w:t>
+      </w:r>
+    </w:p>
+    <w:p>
+      <w:pPr>
+        <w:spacing w:after="120"/>
+      </w:pPr>
+      <w:r>
+        <w:rPr>
+          <w:rFonts w:ascii="Calibri" w:cs="Calibri" w:eastAsia="Calibri" w:hAnsi="Calibri"/>
+          <w:b w:val="false"/>
+          <w:bCs w:val="false"/>
+          <w:i w:val="false"/>
+          <w:iCs w:val="false"/>
+          <w:color w:val="333333"/>
+          <w:sz w:val="19"/>
+          <w:szCs w:val="19"/>
+        </w:rPr>
+        <w:t xml:space="preserve">Problem: East African mobile money markets need real-time visibility into agent uptime, nearby active agents, and regional coverage gaps that hurt financial inclusion.</w:t>
+      </w:r>
+    </w:p>
+    <w:p>
+      <w:pPr>
+        <w:spacing w:after="120"/>
+      </w:pPr>
+      <w:r>
+        <w:rPr>
+          <w:rFonts w:ascii="Calibri" w:cs="Calibri" w:eastAsia="Calibri" w:hAnsi="Calibri"/>
+          <w:b w:val="false"/>
+          <w:bCs w:val="false"/>
+          <w:i w:val="false"/>
+          <w:iCs w:val="false"/>
+          <w:color w:val="333333"/>
+          <w:sz w:val="19"/>
+          <w:szCs w:val="19"/>
+        </w:rPr>
+        <w:t xml:space="preserve">Built: Agent status tracking, customer locator for nearby active agents, and regional health analytics to surface coverage gaps across East African mobile money markets.</w:t>
+      </w:r>
+    </w:p>
+    <w:p>
+      <w:pPr>
+        <w:spacing w:after="120"/>
+      </w:pPr>
+      <w:r>
+        <w:rPr>
+          <w:rFonts w:ascii="Calibri" w:cs="Calibri" w:eastAsia="Calibri" w:hAnsi="Calibri"/>
+          <w:b w:val="false"/>
+          <w:bCs w:val="false"/>
+          <w:i w:val="false"/>
+          <w:iCs w:val="false"/>
+          <w:color w:val="333333"/>
+          <w:sz w:val="19"/>
+          <w:szCs w:val="19"/>
+        </w:rPr>
+        <w:t xml:space="preserve">Outcome: Agent network platform with live status, customer locator, and regional analytics.</w:t>
+      </w:r>
+    </w:p>
+    <w:p>
+      <w:pPr>
+        <w:spacing w:after="80"/>
+      </w:pPr>
+      <w:r>
+        <w:rPr>
+          <w:rFonts w:ascii="Calibri" w:cs="Calibri" w:eastAsia="Calibri" w:hAnsi="Calibri"/>
+          <w:b/>
+          <w:bCs/>
+          <w:i w:val="false"/>
+          <w:iCs w:val="false"/>
+          <w:color w:val="333333"/>
+          <w:sz w:val="19"/>
+          <w:szCs w:val="19"/>
+        </w:rPr>
+        <w:t xml:space="preserve">Tech: TypeScript, Next.js, Maps, Analytics, FinTech, Mobile Money</w:t>
+      </w:r>
+    </w:p>
+    <w:p>
+      <w:pPr>
+        <w:spacing w:after="80"/>
+      </w:pPr>
+      <w:hyperlink w:history="1" r:id="rIdf48ozso9xd5ezpdsyhhru">
+        <w:r>
+          <w:rPr>
+            <w:rFonts w:ascii="Calibri" w:cs="Calibri" w:eastAsia="Calibri" w:hAnsi="Calibri"/>
+            <w:b w:val="false"/>
+            <w:bCs w:val="false"/>
+            <w:i w:val="false"/>
+            <w:iCs w:val="false"/>
+            <w:color w:val="0563C1"/>
+            <w:sz w:val="19"/>
+            <w:szCs w:val="19"/>
+          </w:rPr>
+          <w:t xml:space="preserve">GitHub: https://github.com/Arn-The-Wolf/arnpulse</w:t>
+        </w:r>
+      </w:hyperlink>
+    </w:p>
+    <w:p>
+      <w:pPr>
+        <w:spacing w:after="40" w:before="60"/>
+      </w:pPr>
+      <w:r>
+        <w:rPr>
+          <w:rFonts w:ascii="Calibri" w:cs="Calibri" w:eastAsia="Calibri" w:hAnsi="Calibri"/>
+          <w:b/>
+          <w:bCs/>
+          <w:i w:val="false"/>
+          <w:iCs w:val="false"/>
+          <w:color w:val="333333"/>
+          <w:sz w:val="19"/>
+          <w:szCs w:val="19"/>
+        </w:rPr>
+        <w:t xml:space="preserve">Key results</w:t>
+      </w:r>
+    </w:p>
+    <w:p>
+      <w:pPr>
+        <w:pStyle w:val="ListParagraph"/>
+        <w:numPr>
+          <w:ilvl w:val="0"/>
+          <w:numId w:val="2"/>
+        </w:numPr>
+        <w:spacing w:after="60"/>
+      </w:pPr>
+      <w:r>
+        <w:rPr>
+          <w:rFonts w:ascii="Calibri" w:cs="Calibri" w:eastAsia="Calibri" w:hAnsi="Calibri"/>
+          <w:b w:val="false"/>
+          <w:bCs w:val="false"/>
+          <w:i w:val="false"/>
+          <w:iCs w:val="false"/>
+          <w:color w:val="333333"/>
+          <w:sz w:val="19"/>
+          <w:szCs w:val="19"/>
+        </w:rPr>
+        <w:t xml:space="preserve">Agent uptime tracking</w:t>
+      </w:r>
+    </w:p>
+    <w:p>
+      <w:pPr>
+        <w:pStyle w:val="ListParagraph"/>
+        <w:numPr>
+          <w:ilvl w:val="0"/>
+          <w:numId w:val="2"/>
+        </w:numPr>
+        <w:spacing w:after="60"/>
+      </w:pPr>
+      <w:r>
+        <w:rPr>
+          <w:rFonts w:ascii="Calibri" w:cs="Calibri" w:eastAsia="Calibri" w:hAnsi="Calibri"/>
+          <w:b w:val="false"/>
+          <w:bCs w:val="false"/>
+          <w:i w:val="false"/>
+          <w:iCs w:val="false"/>
+          <w:color w:val="333333"/>
+          <w:sz w:val="19"/>
+          <w:szCs w:val="19"/>
+        </w:rPr>
+        <w:t xml:space="preserve">Nearby agent locator</w:t>
+      </w:r>
+    </w:p>
+    <w:p>
+      <w:pPr>
+        <w:pStyle w:val="ListParagraph"/>
+        <w:numPr>
+          <w:ilvl w:val="0"/>
+          <w:numId w:val="2"/>
+        </w:numPr>
+        <w:spacing w:after="60"/>
+      </w:pPr>
+      <w:r>
+        <w:rPr>
+          <w:rFonts w:ascii="Calibri" w:cs="Calibri" w:eastAsia="Calibri" w:hAnsi="Calibri"/>
+          <w:b w:val="false"/>
+          <w:bCs w:val="false"/>
+          <w:i w:val="false"/>
+          <w:iCs w:val="false"/>
+          <w:color w:val="333333"/>
+          <w:sz w:val="19"/>
+          <w:szCs w:val="19"/>
+        </w:rPr>
+        <w:t xml:space="preserve">Underserved-area analytics</w:t>
+      </w:r>
+    </w:p>
+    <w:p>
+      <w:pPr>
+        <w:spacing w:after="40" w:before="80"/>
+      </w:pPr>
+      <w:r>
+        <w:rPr>
+          <w:rFonts w:ascii="Calibri" w:cs="Calibri" w:eastAsia="Calibri" w:hAnsi="Calibri"/>
+          <w:b/>
+          <w:bCs/>
+          <w:i w:val="false"/>
+          <w:iCs w:val="false"/>
+          <w:color w:val="333333"/>
+          <w:sz w:val="19"/>
+          <w:szCs w:val="19"/>
+        </w:rPr>
+        <w:t xml:space="preserve">Challenges solved</w:t>
+      </w:r>
+    </w:p>
+    <w:p>
+      <w:pPr>
+        <w:pStyle w:val="ListParagraph"/>
+        <w:numPr>
+          <w:ilvl w:val="0"/>
+          <w:numId w:val="2"/>
+        </w:numPr>
+        <w:spacing w:after="60"/>
+      </w:pPr>
+      <w:r>
+        <w:rPr>
+          <w:rFonts w:ascii="Calibri" w:cs="Calibri" w:eastAsia="Calibri" w:hAnsi="Calibri"/>
+          <w:b w:val="false"/>
+          <w:bCs w:val="false"/>
+          <w:i w:val="false"/>
+          <w:iCs w:val="false"/>
+          <w:color w:val="333333"/>
+          <w:sz w:val="19"/>
+          <w:szCs w:val="19"/>
+        </w:rPr>
+        <w:t xml:space="preserve">Real-time agent status</w:t>
+      </w:r>
+    </w:p>
+    <w:p>
+      <w:pPr>
+        <w:pStyle w:val="ListParagraph"/>
+        <w:numPr>
+          <w:ilvl w:val="0"/>
+          <w:numId w:val="2"/>
+        </w:numPr>
+        <w:spacing w:after="60"/>
+      </w:pPr>
+      <w:r>
+        <w:rPr>
+          <w:rFonts w:ascii="Calibri" w:cs="Calibri" w:eastAsia="Calibri" w:hAnsi="Calibri"/>
+          <w:b w:val="false"/>
+          <w:bCs w:val="false"/>
+          <w:i w:val="false"/>
+          <w:iCs w:val="false"/>
+          <w:color w:val="333333"/>
+          <w:sz w:val="19"/>
+          <w:szCs w:val="19"/>
+        </w:rPr>
+        <w:t xml:space="preserve">Geo-locator UX</w:t>
+      </w:r>
+    </w:p>
+    <w:p>
+      <w:pPr>
+        <w:pStyle w:val="ListParagraph"/>
+        <w:numPr>
+          <w:ilvl w:val="0"/>
+          <w:numId w:val="2"/>
+        </w:numPr>
+        <w:spacing w:after="60"/>
+      </w:pPr>
+      <w:r>
+        <w:rPr>
+          <w:rFonts w:ascii="Calibri" w:cs="Calibri" w:eastAsia="Calibri" w:hAnsi="Calibri"/>
+          <w:b w:val="false"/>
+          <w:bCs w:val="false"/>
+          <w:i w:val="false"/>
+          <w:iCs w:val="false"/>
+          <w:color w:val="333333"/>
+          <w:sz w:val="19"/>
+          <w:szCs w:val="19"/>
+        </w:rPr>
+        <w:t xml:space="preserve">Regional health analytics</w:t>
+      </w:r>
+    </w:p>
+    <w:p>
+      <w:pPr>
+        <w:spacing w:after="40" w:before="180"/>
+      </w:pPr>
+      <w:r>
+        <w:rPr>
+          <w:rFonts w:ascii="Calibri" w:cs="Calibri" w:eastAsia="Calibri" w:hAnsi="Calibri"/>
+          <w:b/>
+          <w:bCs/>
+          <w:i w:val="false"/>
+          <w:iCs w:val="false"/>
+          <w:color w:val="2C3E50"/>
+          <w:sz w:val="26"/>
+          <w:szCs w:val="26"/>
+        </w:rPr>
+        <w:t xml:space="preserve">Ingoboka Platform</w:t>
+      </w:r>
+      <w:r>
+        <w:rPr>
+          <w:rFonts w:ascii="Calibri" w:cs="Calibri" w:eastAsia="Calibri" w:hAnsi="Calibri"/>
+          <w:b w:val="false"/>
+          <w:bCs w:val="false"/>
+          <w:i w:val="false"/>
+          <w:iCs w:val="false"/>
+          <w:color w:val="666666"/>
+          <w:sz w:val="20"/>
+          <w:szCs w:val="20"/>
+        </w:rPr>
         <w:t xml:space="preserve"> — Digital Microinsurance PWA</w:t>
       </w:r>
     </w:p>
@@ -2324,7 +2621,7 @@
       <w:pPr>
         <w:spacing w:after="80"/>
       </w:pPr>
-      <w:hyperlink w:history="1" r:id="rIddiuraqoacdowh0au0o38h">
+      <w:hyperlink w:history="1" r:id="rIdjibkart4sy_zhgwfmwfa_">
         <w:r>
           <w:rPr>
             <w:rFonts w:ascii="Calibri" w:cs="Calibri" w:eastAsia="Calibri" w:hAnsi="Calibri"/>
@@ -2621,7 +2918,7 @@
       <w:pPr>
         <w:spacing w:after="80"/>
       </w:pPr>
-      <w:hyperlink w:history="1" r:id="rIdezw5bptv6ikjrt2bcxfhi">
+      <w:hyperlink w:history="1" r:id="rId49izavsofwdswf1e5r5vg">
         <w:r>
           <w:rPr>
             <w:rFonts w:ascii="Calibri" w:cs="Calibri" w:eastAsia="Calibri" w:hAnsi="Calibri"/>
@@ -2918,7 +3215,7 @@
       <w:pPr>
         <w:spacing w:after="80"/>
       </w:pPr>
-      <w:hyperlink w:history="1" r:id="rIdeyzlbugcnyz9hanpqkova">
+      <w:hyperlink w:history="1" r:id="rIdabywb4maligq1xgbq72s4">
         <w:r>
           <w:rPr>
             <w:rFonts w:ascii="Calibri" w:cs="Calibri" w:eastAsia="Calibri" w:hAnsi="Calibri"/>
@@ -3215,7 +3512,7 @@
       <w:pPr>
         <w:spacing w:after="80"/>
       </w:pPr>
-      <w:hyperlink w:history="1" r:id="rIde1-brxtfczktcbujtlnql">
+      <w:hyperlink w:history="1" r:id="rIdl7d7hez_um0pih15oa2d2">
         <w:r>
           <w:rPr>
             <w:rFonts w:ascii="Calibri" w:cs="Calibri" w:eastAsia="Calibri" w:hAnsi="Calibri"/>
@@ -3512,7 +3809,7 @@
       <w:pPr>
         <w:spacing w:after="80"/>
       </w:pPr>
-      <w:hyperlink w:history="1" r:id="rId8vnfzeylbcinyotns-ine">
+      <w:hyperlink w:history="1" r:id="rIdsfk9nznz81ebdiybvbp-w">
         <w:r>
           <w:rPr>
             <w:rFonts w:ascii="Calibri" w:cs="Calibri" w:eastAsia="Calibri" w:hAnsi="Calibri"/>
@@ -3804,7 +4101,7 @@
           <w:sz w:val="26"/>
           <w:szCs w:val="26"/>
         </w:rPr>
-        <w:t xml:space="preserve">Shift Swap</w:t>
+        <w:t xml:space="preserve">Car Connect</w:t>
       </w:r>
       <w:r>
         <w:rPr>
@@ -3817,6 +4114,303 @@
           <w:sz w:val="20"/>
           <w:szCs w:val="20"/>
         </w:rPr>
+        <w:t xml:space="preserve"> — Vehicle Services Platform</w:t>
+      </w:r>
+    </w:p>
+    <w:p>
+      <w:pPr>
+        <w:spacing w:after="120"/>
+      </w:pPr>
+      <w:r>
+        <w:rPr>
+          <w:rFonts w:ascii="Calibri" w:cs="Calibri" w:eastAsia="Calibri" w:hAnsi="Calibri"/>
+          <w:b w:val="false"/>
+          <w:bCs w:val="false"/>
+          <w:i w:val="false"/>
+          <w:iCs w:val="false"/>
+          <w:color w:val="333333"/>
+          <w:sz w:val="19"/>
+          <w:szCs w:val="19"/>
+        </w:rPr>
+        <w:t xml:space="preserve">Problem: Drivers and service providers need a connected platform for vehicle-related services with a modern web frontend.</w:t>
+      </w:r>
+    </w:p>
+    <w:p>
+      <w:pPr>
+        <w:spacing w:after="120"/>
+      </w:pPr>
+      <w:r>
+        <w:rPr>
+          <w:rFonts w:ascii="Calibri" w:cs="Calibri" w:eastAsia="Calibri" w:hAnsi="Calibri"/>
+          <w:b w:val="false"/>
+          <w:bCs w:val="false"/>
+          <w:i w:val="false"/>
+          <w:iCs w:val="false"/>
+          <w:color w:val="333333"/>
+          <w:sz w:val="19"/>
+          <w:szCs w:val="19"/>
+        </w:rPr>
+        <w:t xml:space="preserve">Built: Split stack: car_connect backend with carconnect_frontend / car_connect.rw TypeScript clients for browsing and booking vehicle services.</w:t>
+      </w:r>
+    </w:p>
+    <w:p>
+      <w:pPr>
+        <w:spacing w:after="120"/>
+      </w:pPr>
+      <w:r>
+        <w:rPr>
+          <w:rFonts w:ascii="Calibri" w:cs="Calibri" w:eastAsia="Calibri" w:hAnsi="Calibri"/>
+          <w:b w:val="false"/>
+          <w:bCs w:val="false"/>
+          <w:i w:val="false"/>
+          <w:iCs w:val="false"/>
+          <w:color w:val="333333"/>
+          <w:sz w:val="19"/>
+          <w:szCs w:val="19"/>
+        </w:rPr>
+        <w:t xml:space="preserve">Outcome: Working vehicle-services stack with separated frontend and backend repos.</w:t>
+      </w:r>
+    </w:p>
+    <w:p>
+      <w:pPr>
+        <w:spacing w:after="80"/>
+      </w:pPr>
+      <w:r>
+        <w:rPr>
+          <w:rFonts w:ascii="Calibri" w:cs="Calibri" w:eastAsia="Calibri" w:hAnsi="Calibri"/>
+          <w:b/>
+          <w:bCs/>
+          <w:i w:val="false"/>
+          <w:iCs w:val="false"/>
+          <w:color w:val="333333"/>
+          <w:sz w:val="19"/>
+          <w:szCs w:val="19"/>
+        </w:rPr>
+        <w:t xml:space="preserve">Tech: TypeScript, React, JavaScript, Node.js, Full Stack</w:t>
+      </w:r>
+    </w:p>
+    <w:p>
+      <w:pPr>
+        <w:spacing w:after="80"/>
+      </w:pPr>
+      <w:hyperlink w:history="1" r:id="rIdkl3hicgs2s_dqdsfk2j7m">
+        <w:r>
+          <w:rPr>
+            <w:rFonts w:ascii="Calibri" w:cs="Calibri" w:eastAsia="Calibri" w:hAnsi="Calibri"/>
+            <w:b w:val="false"/>
+            <w:bCs w:val="false"/>
+            <w:i w:val="false"/>
+            <w:iCs w:val="false"/>
+            <w:color w:val="0563C1"/>
+            <w:sz w:val="19"/>
+            <w:szCs w:val="19"/>
+          </w:rPr>
+          <w:t xml:space="preserve">GitHub: https://github.com/Arn-The-Wolf/car_connect</w:t>
+        </w:r>
+      </w:hyperlink>
+    </w:p>
+    <w:p>
+      <w:pPr>
+        <w:spacing w:after="40" w:before="60"/>
+      </w:pPr>
+      <w:r>
+        <w:rPr>
+          <w:rFonts w:ascii="Calibri" w:cs="Calibri" w:eastAsia="Calibri" w:hAnsi="Calibri"/>
+          <w:b/>
+          <w:bCs/>
+          <w:i w:val="false"/>
+          <w:iCs w:val="false"/>
+          <w:color w:val="333333"/>
+          <w:sz w:val="19"/>
+          <w:szCs w:val="19"/>
+        </w:rPr>
+        <w:t xml:space="preserve">Key results</w:t>
+      </w:r>
+    </w:p>
+    <w:p>
+      <w:pPr>
+        <w:pStyle w:val="ListParagraph"/>
+        <w:numPr>
+          <w:ilvl w:val="0"/>
+          <w:numId w:val="2"/>
+        </w:numPr>
+        <w:spacing w:after="60"/>
+      </w:pPr>
+      <w:r>
+        <w:rPr>
+          <w:rFonts w:ascii="Calibri" w:cs="Calibri" w:eastAsia="Calibri" w:hAnsi="Calibri"/>
+          <w:b w:val="false"/>
+          <w:bCs w:val="false"/>
+          <w:i w:val="false"/>
+          <w:iCs w:val="false"/>
+          <w:color w:val="333333"/>
+          <w:sz w:val="19"/>
+          <w:szCs w:val="19"/>
+        </w:rPr>
+        <w:t xml:space="preserve">Backend + TypeScript frontend</w:t>
+      </w:r>
+    </w:p>
+    <w:p>
+      <w:pPr>
+        <w:pStyle w:val="ListParagraph"/>
+        <w:numPr>
+          <w:ilvl w:val="0"/>
+          <w:numId w:val="2"/>
+        </w:numPr>
+        <w:spacing w:after="60"/>
+      </w:pPr>
+      <w:r>
+        <w:rPr>
+          <w:rFonts w:ascii="Calibri" w:cs="Calibri" w:eastAsia="Calibri" w:hAnsi="Calibri"/>
+          <w:b w:val="false"/>
+          <w:bCs w:val="false"/>
+          <w:i w:val="false"/>
+          <w:iCs w:val="false"/>
+          <w:color w:val="333333"/>
+          <w:sz w:val="19"/>
+          <w:szCs w:val="19"/>
+        </w:rPr>
+        <w:t xml:space="preserve">Vehicle service workflows</w:t>
+      </w:r>
+    </w:p>
+    <w:p>
+      <w:pPr>
+        <w:pStyle w:val="ListParagraph"/>
+        <w:numPr>
+          <w:ilvl w:val="0"/>
+          <w:numId w:val="2"/>
+        </w:numPr>
+        <w:spacing w:after="60"/>
+      </w:pPr>
+      <w:r>
+        <w:rPr>
+          <w:rFonts w:ascii="Calibri" w:cs="Calibri" w:eastAsia="Calibri" w:hAnsi="Calibri"/>
+          <w:b w:val="false"/>
+          <w:bCs w:val="false"/>
+          <w:i w:val="false"/>
+          <w:iCs w:val="false"/>
+          <w:color w:val="333333"/>
+          <w:sz w:val="19"/>
+          <w:szCs w:val="19"/>
+        </w:rPr>
+        <w:t xml:space="preserve">car_connect.rw client</w:t>
+      </w:r>
+    </w:p>
+    <w:p>
+      <w:pPr>
+        <w:spacing w:after="40" w:before="80"/>
+      </w:pPr>
+      <w:r>
+        <w:rPr>
+          <w:rFonts w:ascii="Calibri" w:cs="Calibri" w:eastAsia="Calibri" w:hAnsi="Calibri"/>
+          <w:b/>
+          <w:bCs/>
+          <w:i w:val="false"/>
+          <w:iCs w:val="false"/>
+          <w:color w:val="333333"/>
+          <w:sz w:val="19"/>
+          <w:szCs w:val="19"/>
+        </w:rPr>
+        <w:t xml:space="preserve">Challenges solved</w:t>
+      </w:r>
+    </w:p>
+    <w:p>
+      <w:pPr>
+        <w:pStyle w:val="ListParagraph"/>
+        <w:numPr>
+          <w:ilvl w:val="0"/>
+          <w:numId w:val="2"/>
+        </w:numPr>
+        <w:spacing w:after="60"/>
+      </w:pPr>
+      <w:r>
+        <w:rPr>
+          <w:rFonts w:ascii="Calibri" w:cs="Calibri" w:eastAsia="Calibri" w:hAnsi="Calibri"/>
+          <w:b w:val="false"/>
+          <w:bCs w:val="false"/>
+          <w:i w:val="false"/>
+          <w:iCs w:val="false"/>
+          <w:color w:val="333333"/>
+          <w:sz w:val="19"/>
+          <w:szCs w:val="19"/>
+        </w:rPr>
+        <w:t xml:space="preserve">Frontend/backend API sync</w:t>
+      </w:r>
+    </w:p>
+    <w:p>
+      <w:pPr>
+        <w:pStyle w:val="ListParagraph"/>
+        <w:numPr>
+          <w:ilvl w:val="0"/>
+          <w:numId w:val="2"/>
+        </w:numPr>
+        <w:spacing w:after="60"/>
+      </w:pPr>
+      <w:r>
+        <w:rPr>
+          <w:rFonts w:ascii="Calibri" w:cs="Calibri" w:eastAsia="Calibri" w:hAnsi="Calibri"/>
+          <w:b w:val="false"/>
+          <w:bCs w:val="false"/>
+          <w:i w:val="false"/>
+          <w:iCs w:val="false"/>
+          <w:color w:val="333333"/>
+          <w:sz w:val="19"/>
+          <w:szCs w:val="19"/>
+        </w:rPr>
+        <w:t xml:space="preserve">Service booking flows</w:t>
+      </w:r>
+    </w:p>
+    <w:p>
+      <w:pPr>
+        <w:pStyle w:val="ListParagraph"/>
+        <w:numPr>
+          <w:ilvl w:val="0"/>
+          <w:numId w:val="2"/>
+        </w:numPr>
+        <w:spacing w:after="60"/>
+      </w:pPr>
+      <w:r>
+        <w:rPr>
+          <w:rFonts w:ascii="Calibri" w:cs="Calibri" w:eastAsia="Calibri" w:hAnsi="Calibri"/>
+          <w:b w:val="false"/>
+          <w:bCs w:val="false"/>
+          <w:i w:val="false"/>
+          <w:iCs w:val="false"/>
+          <w:color w:val="333333"/>
+          <w:sz w:val="19"/>
+          <w:szCs w:val="19"/>
+        </w:rPr>
+        <w:t xml:space="preserve">Responsive UX</w:t>
+      </w:r>
+    </w:p>
+    <w:p>
+      <w:pPr>
+        <w:spacing w:after="40" w:before="180"/>
+      </w:pPr>
+      <w:r>
+        <w:rPr>
+          <w:rFonts w:ascii="Calibri" w:cs="Calibri" w:eastAsia="Calibri" w:hAnsi="Calibri"/>
+          <w:b/>
+          <w:bCs/>
+          <w:i w:val="false"/>
+          <w:iCs w:val="false"/>
+          <w:color w:val="2C3E50"/>
+          <w:sz w:val="26"/>
+          <w:szCs w:val="26"/>
+        </w:rPr>
+        <w:t xml:space="preserve">Shift Swap</w:t>
+      </w:r>
+      <w:r>
+        <w:rPr>
+          <w:rFonts w:ascii="Calibri" w:cs="Calibri" w:eastAsia="Calibri" w:hAnsi="Calibri"/>
+          <w:b w:val="false"/>
+          <w:bCs w:val="false"/>
+          <w:i w:val="false"/>
+          <w:iCs w:val="false"/>
+          <w:color w:val="666666"/>
+          <w:sz w:val="20"/>
+          <w:szCs w:val="20"/>
+        </w:rPr>
         <w:t xml:space="preserve"> — Team Schedule &amp; Shift Management</w:t>
       </w:r>
     </w:p>
@@ -3896,7 +4490,7 @@
       <w:pPr>
         <w:spacing w:after="80"/>
       </w:pPr>
-      <w:hyperlink w:history="1" r:id="rIdryp20859ifcc6vhkb5cwc">
+      <w:hyperlink w:history="1" r:id="rIdlnjml-lfd6ebvyln2slfz">
         <w:r>
           <w:rPr>
             <w:rFonts w:ascii="Calibri" w:cs="Calibri" w:eastAsia="Calibri" w:hAnsi="Calibri"/>
@@ -4193,7 +4787,7 @@
       <w:pPr>
         <w:spacing w:after="80"/>
       </w:pPr>
-      <w:hyperlink w:history="1" r:id="rIdfpq5stm4ct4okcqn1a97p">
+      <w:hyperlink w:history="1" r:id="rIduvyyh2xgrrymiytrslhdh">
         <w:r>
           <w:rPr>
             <w:rFonts w:ascii="Calibri" w:cs="Calibri" w:eastAsia="Calibri" w:hAnsi="Calibri"/>
@@ -4490,7 +5084,7 @@
       <w:pPr>
         <w:spacing w:after="80"/>
       </w:pPr>
-      <w:hyperlink w:history="1" r:id="rIddcq0rv4pufbod9zevbmgz">
+      <w:hyperlink w:history="1" r:id="rIdghdsd6bex001z5v_s9wzn">
         <w:r>
           <w:rPr>
             <w:rFonts w:ascii="Calibri" w:cs="Calibri" w:eastAsia="Calibri" w:hAnsi="Calibri"/>
@@ -4695,7 +5289,7 @@
           <w:sz w:val="26"/>
           <w:szCs w:val="26"/>
         </w:rPr>
-        <w:t xml:space="preserve">ArnLibrary</w:t>
+        <w:t xml:space="preserve">Real-Time Chat</w:t>
       </w:r>
       <w:r>
         <w:rPr>
@@ -4708,6 +5302,280 @@
           <w:sz w:val="20"/>
           <w:szCs w:val="20"/>
         </w:rPr>
+        <w:t xml:space="preserve"> — Socket.io Instant Messaging</w:t>
+      </w:r>
+    </w:p>
+    <w:p>
+      <w:pPr>
+        <w:spacing w:after="120"/>
+      </w:pPr>
+      <w:r>
+        <w:rPr>
+          <w:rFonts w:ascii="Calibri" w:cs="Calibri" w:eastAsia="Calibri" w:hAnsi="Calibri"/>
+          <w:b w:val="false"/>
+          <w:bCs w:val="false"/>
+          <w:i w:val="false"/>
+          <w:iCs w:val="false"/>
+          <w:color w:val="333333"/>
+          <w:sz w:val="19"/>
+          <w:szCs w:val="19"/>
+        </w:rPr>
+        <w:t xml:space="preserve">Problem: Needed a multi-user chat experience with low-latency message delivery over WebSockets.</w:t>
+      </w:r>
+    </w:p>
+    <w:p>
+      <w:pPr>
+        <w:spacing w:after="120"/>
+      </w:pPr>
+      <w:r>
+        <w:rPr>
+          <w:rFonts w:ascii="Calibri" w:cs="Calibri" w:eastAsia="Calibri" w:hAnsi="Calibri"/>
+          <w:b w:val="false"/>
+          <w:bCs w:val="false"/>
+          <w:i w:val="false"/>
+          <w:iCs w:val="false"/>
+          <w:color w:val="333333"/>
+          <w:sz w:val="19"/>
+          <w:szCs w:val="19"/>
+        </w:rPr>
+        <w:t xml:space="preserve">Built: Socket.io messaging server and client UI for rooms, presence, and live message delivery.</w:t>
+      </w:r>
+    </w:p>
+    <w:p>
+      <w:pPr>
+        <w:spacing w:after="120"/>
+      </w:pPr>
+      <w:r>
+        <w:rPr>
+          <w:rFonts w:ascii="Calibri" w:cs="Calibri" w:eastAsia="Calibri" w:hAnsi="Calibri"/>
+          <w:b w:val="false"/>
+          <w:bCs w:val="false"/>
+          <w:i w:val="false"/>
+          <w:iCs w:val="false"/>
+          <w:color w:val="333333"/>
+          <w:sz w:val="19"/>
+          <w:szCs w:val="19"/>
+        </w:rPr>
+        <w:t xml:space="preserve">Outcome: Working multi-user instant messaging prototype.</w:t>
+      </w:r>
+    </w:p>
+    <w:p>
+      <w:pPr>
+        <w:spacing w:after="80"/>
+      </w:pPr>
+      <w:r>
+        <w:rPr>
+          <w:rFonts w:ascii="Calibri" w:cs="Calibri" w:eastAsia="Calibri" w:hAnsi="Calibri"/>
+          <w:b/>
+          <w:bCs/>
+          <w:i w:val="false"/>
+          <w:iCs w:val="false"/>
+          <w:color w:val="333333"/>
+          <w:sz w:val="19"/>
+          <w:szCs w:val="19"/>
+        </w:rPr>
+        <w:t xml:space="preserve">Tech: Socket.io, JavaScript, Node.js, WebSockets, Realtime</w:t>
+      </w:r>
+    </w:p>
+    <w:p>
+      <w:pPr>
+        <w:spacing w:after="80"/>
+      </w:pPr>
+      <w:hyperlink w:history="1" r:id="rIdmtnbeajmfaj_t8ghkfaot">
+        <w:r>
+          <w:rPr>
+            <w:rFonts w:ascii="Calibri" w:cs="Calibri" w:eastAsia="Calibri" w:hAnsi="Calibri"/>
+            <w:b w:val="false"/>
+            <w:bCs w:val="false"/>
+            <w:i w:val="false"/>
+            <w:iCs w:val="false"/>
+            <w:color w:val="0563C1"/>
+            <w:sz w:val="19"/>
+            <w:szCs w:val="19"/>
+          </w:rPr>
+          <w:t xml:space="preserve">GitHub: https://github.com/Arn-The-Wolf/Real-Time-Chat-Application</w:t>
+        </w:r>
+      </w:hyperlink>
+    </w:p>
+    <w:p>
+      <w:pPr>
+        <w:spacing w:after="40" w:before="60"/>
+      </w:pPr>
+      <w:r>
+        <w:rPr>
+          <w:rFonts w:ascii="Calibri" w:cs="Calibri" w:eastAsia="Calibri" w:hAnsi="Calibri"/>
+          <w:b/>
+          <w:bCs/>
+          <w:i w:val="false"/>
+          <w:iCs w:val="false"/>
+          <w:color w:val="333333"/>
+          <w:sz w:val="19"/>
+          <w:szCs w:val="19"/>
+        </w:rPr>
+        <w:t xml:space="preserve">Key results</w:t>
+      </w:r>
+    </w:p>
+    <w:p>
+      <w:pPr>
+        <w:pStyle w:val="ListParagraph"/>
+        <w:numPr>
+          <w:ilvl w:val="0"/>
+          <w:numId w:val="2"/>
+        </w:numPr>
+        <w:spacing w:after="60"/>
+      </w:pPr>
+      <w:r>
+        <w:rPr>
+          <w:rFonts w:ascii="Calibri" w:cs="Calibri" w:eastAsia="Calibri" w:hAnsi="Calibri"/>
+          <w:b w:val="false"/>
+          <w:bCs w:val="false"/>
+          <w:i w:val="false"/>
+          <w:iCs w:val="false"/>
+          <w:color w:val="333333"/>
+          <w:sz w:val="19"/>
+          <w:szCs w:val="19"/>
+        </w:rPr>
+        <w:t xml:space="preserve">Live Socket.io chat</w:t>
+      </w:r>
+    </w:p>
+    <w:p>
+      <w:pPr>
+        <w:pStyle w:val="ListParagraph"/>
+        <w:numPr>
+          <w:ilvl w:val="0"/>
+          <w:numId w:val="2"/>
+        </w:numPr>
+        <w:spacing w:after="60"/>
+      </w:pPr>
+      <w:r>
+        <w:rPr>
+          <w:rFonts w:ascii="Calibri" w:cs="Calibri" w:eastAsia="Calibri" w:hAnsi="Calibri"/>
+          <w:b w:val="false"/>
+          <w:bCs w:val="false"/>
+          <w:i w:val="false"/>
+          <w:iCs w:val="false"/>
+          <w:color w:val="333333"/>
+          <w:sz w:val="19"/>
+          <w:szCs w:val="19"/>
+        </w:rPr>
+        <w:t xml:space="preserve">Multi-user messaging</w:t>
+      </w:r>
+    </w:p>
+    <w:p>
+      <w:pPr>
+        <w:spacing w:after="40" w:before="80"/>
+      </w:pPr>
+      <w:r>
+        <w:rPr>
+          <w:rFonts w:ascii="Calibri" w:cs="Calibri" w:eastAsia="Calibri" w:hAnsi="Calibri"/>
+          <w:b/>
+          <w:bCs/>
+          <w:i w:val="false"/>
+          <w:iCs w:val="false"/>
+          <w:color w:val="333333"/>
+          <w:sz w:val="19"/>
+          <w:szCs w:val="19"/>
+        </w:rPr>
+        <w:t xml:space="preserve">Challenges solved</w:t>
+      </w:r>
+    </w:p>
+    <w:p>
+      <w:pPr>
+        <w:pStyle w:val="ListParagraph"/>
+        <w:numPr>
+          <w:ilvl w:val="0"/>
+          <w:numId w:val="2"/>
+        </w:numPr>
+        <w:spacing w:after="60"/>
+      </w:pPr>
+      <w:r>
+        <w:rPr>
+          <w:rFonts w:ascii="Calibri" w:cs="Calibri" w:eastAsia="Calibri" w:hAnsi="Calibri"/>
+          <w:b w:val="false"/>
+          <w:bCs w:val="false"/>
+          <w:i w:val="false"/>
+          <w:iCs w:val="false"/>
+          <w:color w:val="333333"/>
+          <w:sz w:val="19"/>
+          <w:szCs w:val="19"/>
+        </w:rPr>
+        <w:t xml:space="preserve">Connection lifecycle</w:t>
+      </w:r>
+    </w:p>
+    <w:p>
+      <w:pPr>
+        <w:pStyle w:val="ListParagraph"/>
+        <w:numPr>
+          <w:ilvl w:val="0"/>
+          <w:numId w:val="2"/>
+        </w:numPr>
+        <w:spacing w:after="60"/>
+      </w:pPr>
+      <w:r>
+        <w:rPr>
+          <w:rFonts w:ascii="Calibri" w:cs="Calibri" w:eastAsia="Calibri" w:hAnsi="Calibri"/>
+          <w:b w:val="false"/>
+          <w:bCs w:val="false"/>
+          <w:i w:val="false"/>
+          <w:iCs w:val="false"/>
+          <w:color w:val="333333"/>
+          <w:sz w:val="19"/>
+          <w:szCs w:val="19"/>
+        </w:rPr>
+        <w:t xml:space="preserve">Message ordering</w:t>
+      </w:r>
+    </w:p>
+    <w:p>
+      <w:pPr>
+        <w:pStyle w:val="ListParagraph"/>
+        <w:numPr>
+          <w:ilvl w:val="0"/>
+          <w:numId w:val="2"/>
+        </w:numPr>
+        <w:spacing w:after="60"/>
+      </w:pPr>
+      <w:r>
+        <w:rPr>
+          <w:rFonts w:ascii="Calibri" w:cs="Calibri" w:eastAsia="Calibri" w:hAnsi="Calibri"/>
+          <w:b w:val="false"/>
+          <w:bCs w:val="false"/>
+          <w:i w:val="false"/>
+          <w:iCs w:val="false"/>
+          <w:color w:val="333333"/>
+          <w:sz w:val="19"/>
+          <w:szCs w:val="19"/>
+        </w:rPr>
+        <w:t xml:space="preserve">Multi-user rooms</w:t>
+      </w:r>
+    </w:p>
+    <w:p>
+      <w:pPr>
+        <w:spacing w:after="40" w:before="180"/>
+      </w:pPr>
+      <w:r>
+        <w:rPr>
+          <w:rFonts w:ascii="Calibri" w:cs="Calibri" w:eastAsia="Calibri" w:hAnsi="Calibri"/>
+          <w:b/>
+          <w:bCs/>
+          <w:i w:val="false"/>
+          <w:iCs w:val="false"/>
+          <w:color w:val="2C3E50"/>
+          <w:sz w:val="26"/>
+          <w:szCs w:val="26"/>
+        </w:rPr>
+        <w:t xml:space="preserve">ArnLibrary</w:t>
+      </w:r>
+      <w:r>
+        <w:rPr>
+          <w:rFonts w:ascii="Calibri" w:cs="Calibri" w:eastAsia="Calibri" w:hAnsi="Calibri"/>
+          <w:b w:val="false"/>
+          <w:bCs w:val="false"/>
+          <w:i w:val="false"/>
+          <w:iCs w:val="false"/>
+          <w:color w:val="666666"/>
+          <w:sz w:val="20"/>
+          <w:szCs w:val="20"/>
+        </w:rPr>
         <w:t xml:space="preserve"> — Library Management System</w:t>
       </w:r>
     </w:p>
@@ -4787,7 +5655,7 @@
       <w:pPr>
         <w:spacing w:after="80"/>
       </w:pPr>
-      <w:hyperlink w:history="1" r:id="rIdjpj29ogumeeimztn-l2pf">
+      <w:hyperlink w:history="1" r:id="rIdddduzcx5f2hq6enhjuqy8">
         <w:r>
           <w:rPr>
             <w:rFonts w:ascii="Calibri" w:cs="Calibri" w:eastAsia="Calibri" w:hAnsi="Calibri"/>
@@ -5061,7 +5929,7 @@
       <w:pPr>
         <w:spacing w:after="80"/>
       </w:pPr>
-      <w:hyperlink w:history="1" r:id="rIdpnaghvemfiycqbcy5nuex">
+      <w:hyperlink w:history="1" r:id="rIdwf92sxvmcbp59sikltmlj">
         <w:r>
           <w:rPr>
             <w:rFonts w:ascii="Calibri" w:cs="Calibri" w:eastAsia="Calibri" w:hAnsi="Calibri"/>
@@ -5383,7 +6251,7 @@
       <w:pPr>
         <w:spacing w:after="80"/>
       </w:pPr>
-      <w:hyperlink w:history="1" r:id="rIdgy2vievvff8juoanxhaxr">
+      <w:hyperlink w:history="1" r:id="rIdouxswrrdvgjgixipi7fha">
         <w:r>
           <w:rPr>
             <w:rFonts w:ascii="Calibri" w:cs="Calibri" w:eastAsia="Calibri" w:hAnsi="Calibri"/>
@@ -5680,7 +6548,7 @@
       <w:pPr>
         <w:spacing w:after="80"/>
       </w:pPr>
-      <w:hyperlink w:history="1" r:id="rIdsytzjw4w26lb6jvizxjnm">
+      <w:hyperlink w:history="1" r:id="rId-jqh5_tmdvyancksjpi1k">
         <w:r>
           <w:rPr>
             <w:rFonts w:ascii="Calibri" w:cs="Calibri" w:eastAsia="Calibri" w:hAnsi="Calibri"/>
@@ -5977,7 +6845,7 @@
       <w:pPr>
         <w:spacing w:after="80"/>
       </w:pPr>
-      <w:hyperlink w:history="1" r:id="rIdkvhkxl__0hkiiahorl_pp">
+      <w:hyperlink w:history="1" r:id="rIdi_wlujkwwt3adrxhd-na2">
         <w:r>
           <w:rPr>
             <w:rFonts w:ascii="Calibri" w:cs="Calibri" w:eastAsia="Calibri" w:hAnsi="Calibri"/>
@@ -6274,7 +7142,7 @@
       <w:pPr>
         <w:spacing w:after="80"/>
       </w:pPr>
-      <w:hyperlink w:history="1" r:id="rId111urj-awhiumq1tijlt8">
+      <w:hyperlink w:history="1" r:id="rIdwhiuoiqagcplamhyhjjkg">
         <w:r>
           <w:rPr>
             <w:rFonts w:ascii="Calibri" w:cs="Calibri" w:eastAsia="Calibri" w:hAnsi="Calibri"/>
@@ -6571,7 +7439,7 @@
       <w:pPr>
         <w:spacing w:after="80"/>
       </w:pPr>
-      <w:hyperlink w:history="1" r:id="rIdvszm8ofduskv725gv6ypv">
+      <w:hyperlink w:history="1" r:id="rIdyjj5ms9ahslyfmboe9k5y">
         <w:r>
           <w:rPr>
             <w:rFonts w:ascii="Calibri" w:cs="Calibri" w:eastAsia="Calibri" w:hAnsi="Calibri"/>
@@ -6868,7 +7736,7 @@
       <w:pPr>
         <w:spacing w:after="80"/>
       </w:pPr>
-      <w:hyperlink w:history="1" r:id="rIdoyrpgi2ke180aopqkycby">
+      <w:hyperlink w:history="1" r:id="rId4rfubvmj0rcpn3my4tmc9">
         <w:r>
           <w:rPr>
             <w:rFonts w:ascii="Calibri" w:cs="Calibri" w:eastAsia="Calibri" w:hAnsi="Calibri"/>
@@ -7165,7 +8033,7 @@
       <w:pPr>
         <w:spacing w:after="80"/>
       </w:pPr>
-      <w:hyperlink w:history="1" r:id="rIdgqgx67fymfvhg_clqybee">
+      <w:hyperlink w:history="1" r:id="rIdko3xknqtttx4jblqta0xj">
         <w:r>
           <w:rPr>
             <w:rFonts w:ascii="Calibri" w:cs="Calibri" w:eastAsia="Calibri" w:hAnsi="Calibri"/>
@@ -7418,7 +8286,7 @@
       <w:pPr>
         <w:spacing w:after="80"/>
       </w:pPr>
-      <w:hyperlink w:history="1" r:id="rIdpeljwwx9-c_ecpl7swqdt">
+      <w:hyperlink w:history="1" r:id="rIdrcctl3dpmwy8v5bbjatyb">
         <w:r>
           <w:rPr>
             <w:rFonts w:ascii="Calibri" w:cs="Calibri" w:eastAsia="Calibri" w:hAnsi="Calibri"/>
@@ -7715,7 +8583,7 @@
       <w:pPr>
         <w:spacing w:after="80"/>
       </w:pPr>
-      <w:hyperlink w:history="1" r:id="rId-9obijgehwk0rwl9q_zv5">
+      <w:hyperlink w:history="1" r:id="rId8torniravxqn0lgqklmhr">
         <w:r>
           <w:rPr>
             <w:rFonts w:ascii="Calibri" w:cs="Calibri" w:eastAsia="Calibri" w:hAnsi="Calibri"/>
@@ -8012,7 +8880,7 @@
       <w:pPr>
         <w:spacing w:after="80"/>
       </w:pPr>
-      <w:hyperlink w:history="1" r:id="rIdnma3fx2itdbpt2c646fyx">
+      <w:hyperlink w:history="1" r:id="rIdrladplucxwbsggyvhefsl">
         <w:r>
           <w:rPr>
             <w:rFonts w:ascii="Calibri" w:cs="Calibri" w:eastAsia="Calibri" w:hAnsi="Calibri"/>
@@ -8217,7 +9085,7 @@
           <w:sz w:val="26"/>
           <w:szCs w:val="26"/>
         </w:rPr>
-        <w:t xml:space="preserve">Sentinel Security Scanner</w:t>
+        <w:t xml:space="preserve">FaceLocking</w:t>
       </w:r>
       <w:r>
         <w:rPr>
@@ -8230,6 +9098,303 @@
           <w:sz w:val="20"/>
           <w:szCs w:val="20"/>
         </w:rPr>
+        <w:t xml:space="preserve"> — Identity Lock &amp; Continuous Tracking</w:t>
+      </w:r>
+    </w:p>
+    <w:p>
+      <w:pPr>
+        <w:spacing w:after="120"/>
+      </w:pPr>
+      <w:r>
+        <w:rPr>
+          <w:rFonts w:ascii="Calibri" w:cs="Calibri" w:eastAsia="Calibri" w:hAnsi="Calibri"/>
+          <w:b w:val="false"/>
+          <w:bCs w:val="false"/>
+          <w:i w:val="false"/>
+          <w:iCs w:val="false"/>
+          <w:color w:val="333333"/>
+          <w:sz w:val="19"/>
+          <w:szCs w:val="19"/>
+        </w:rPr>
+        <w:t xml:space="preserve">Problem: Face trackers often lose the target when recognition confidence drops — needed stable lock-on with audit-ready action history.</w:t>
+      </w:r>
+    </w:p>
+    <w:p>
+      <w:pPr>
+        <w:spacing w:after="120"/>
+      </w:pPr>
+      <w:r>
+        <w:rPr>
+          <w:rFonts w:ascii="Calibri" w:cs="Calibri" w:eastAsia="Calibri" w:hAnsi="Calibri"/>
+          <w:b w:val="false"/>
+          <w:bCs w:val="false"/>
+          <w:i w:val="false"/>
+          <w:iCs w:val="false"/>
+          <w:color w:val="333333"/>
+          <w:sz w:val="19"/>
+          <w:szCs w:val="19"/>
+        </w:rPr>
+        <w:t xml:space="preserve">Built: Python CV pipeline with enrollment, stable identity lock, continuous tracking, action detection after lock, and an action history log.</w:t>
+      </w:r>
+    </w:p>
+    <w:p>
+      <w:pPr>
+        <w:spacing w:after="120"/>
+      </w:pPr>
+      <w:r>
+        <w:rPr>
+          <w:rFonts w:ascii="Calibri" w:cs="Calibri" w:eastAsia="Calibri" w:hAnsi="Calibri"/>
+          <w:b w:val="false"/>
+          <w:bCs w:val="false"/>
+          <w:i w:val="false"/>
+          <w:iCs w:val="false"/>
+          <w:color w:val="333333"/>
+          <w:sz w:val="19"/>
+          <w:szCs w:val="19"/>
+        </w:rPr>
+        <w:t xml:space="preserve">Outcome: Stable face lock-on with action detection and audit log for monitoring use cases.</w:t>
+      </w:r>
+    </w:p>
+    <w:p>
+      <w:pPr>
+        <w:spacing w:after="80"/>
+      </w:pPr>
+      <w:r>
+        <w:rPr>
+          <w:rFonts w:ascii="Calibri" w:cs="Calibri" w:eastAsia="Calibri" w:hAnsi="Calibri"/>
+          <w:b/>
+          <w:bCs/>
+          <w:i w:val="false"/>
+          <w:iCs w:val="false"/>
+          <w:color w:val="333333"/>
+          <w:sz w:val="19"/>
+          <w:szCs w:val="19"/>
+        </w:rPr>
+        <w:t xml:space="preserve">Tech: Python, OpenCV, Computer Vision, AI, Real-time Tracking</w:t>
+      </w:r>
+    </w:p>
+    <w:p>
+      <w:pPr>
+        <w:spacing w:after="80"/>
+      </w:pPr>
+      <w:hyperlink w:history="1" r:id="rIdaggxo8pwfu4xnl5fuwz54">
+        <w:r>
+          <w:rPr>
+            <w:rFonts w:ascii="Calibri" w:cs="Calibri" w:eastAsia="Calibri" w:hAnsi="Calibri"/>
+            <w:b w:val="false"/>
+            <w:bCs w:val="false"/>
+            <w:i w:val="false"/>
+            <w:iCs w:val="false"/>
+            <w:color w:val="0563C1"/>
+            <w:sz w:val="19"/>
+            <w:szCs w:val="19"/>
+          </w:rPr>
+          <w:t xml:space="preserve">GitHub: https://github.com/Arn-The-Wolf/FaceLocking</w:t>
+        </w:r>
+      </w:hyperlink>
+    </w:p>
+    <w:p>
+      <w:pPr>
+        <w:spacing w:after="40" w:before="60"/>
+      </w:pPr>
+      <w:r>
+        <w:rPr>
+          <w:rFonts w:ascii="Calibri" w:cs="Calibri" w:eastAsia="Calibri" w:hAnsi="Calibri"/>
+          <w:b/>
+          <w:bCs/>
+          <w:i w:val="false"/>
+          <w:iCs w:val="false"/>
+          <w:color w:val="333333"/>
+          <w:sz w:val="19"/>
+          <w:szCs w:val="19"/>
+        </w:rPr>
+        <w:t xml:space="preserve">Key results</w:t>
+      </w:r>
+    </w:p>
+    <w:p>
+      <w:pPr>
+        <w:pStyle w:val="ListParagraph"/>
+        <w:numPr>
+          <w:ilvl w:val="0"/>
+          <w:numId w:val="2"/>
+        </w:numPr>
+        <w:spacing w:after="60"/>
+      </w:pPr>
+      <w:r>
+        <w:rPr>
+          <w:rFonts w:ascii="Calibri" w:cs="Calibri" w:eastAsia="Calibri" w:hAnsi="Calibri"/>
+          <w:b w:val="false"/>
+          <w:bCs w:val="false"/>
+          <w:i w:val="false"/>
+          <w:iCs w:val="false"/>
+          <w:color w:val="333333"/>
+          <w:sz w:val="19"/>
+          <w:szCs w:val="19"/>
+        </w:rPr>
+        <w:t xml:space="preserve">Identity lock-on</w:t>
+      </w:r>
+    </w:p>
+    <w:p>
+      <w:pPr>
+        <w:pStyle w:val="ListParagraph"/>
+        <w:numPr>
+          <w:ilvl w:val="0"/>
+          <w:numId w:val="2"/>
+        </w:numPr>
+        <w:spacing w:after="60"/>
+      </w:pPr>
+      <w:r>
+        <w:rPr>
+          <w:rFonts w:ascii="Calibri" w:cs="Calibri" w:eastAsia="Calibri" w:hAnsi="Calibri"/>
+          <w:b w:val="false"/>
+          <w:bCs w:val="false"/>
+          <w:i w:val="false"/>
+          <w:iCs w:val="false"/>
+          <w:color w:val="333333"/>
+          <w:sz w:val="19"/>
+          <w:szCs w:val="19"/>
+        </w:rPr>
+        <w:t xml:space="preserve">Continuous frame tracking</w:t>
+      </w:r>
+    </w:p>
+    <w:p>
+      <w:pPr>
+        <w:pStyle w:val="ListParagraph"/>
+        <w:numPr>
+          <w:ilvl w:val="0"/>
+          <w:numId w:val="2"/>
+        </w:numPr>
+        <w:spacing w:after="60"/>
+      </w:pPr>
+      <w:r>
+        <w:rPr>
+          <w:rFonts w:ascii="Calibri" w:cs="Calibri" w:eastAsia="Calibri" w:hAnsi="Calibri"/>
+          <w:b w:val="false"/>
+          <w:bCs w:val="false"/>
+          <w:i w:val="false"/>
+          <w:iCs w:val="false"/>
+          <w:color w:val="333333"/>
+          <w:sz w:val="19"/>
+          <w:szCs w:val="19"/>
+        </w:rPr>
+        <w:t xml:space="preserve">Action history log</w:t>
+      </w:r>
+    </w:p>
+    <w:p>
+      <w:pPr>
+        <w:spacing w:after="40" w:before="80"/>
+      </w:pPr>
+      <w:r>
+        <w:rPr>
+          <w:rFonts w:ascii="Calibri" w:cs="Calibri" w:eastAsia="Calibri" w:hAnsi="Calibri"/>
+          <w:b/>
+          <w:bCs/>
+          <w:i w:val="false"/>
+          <w:iCs w:val="false"/>
+          <w:color w:val="333333"/>
+          <w:sz w:val="19"/>
+          <w:szCs w:val="19"/>
+        </w:rPr>
+        <w:t xml:space="preserve">Challenges solved</w:t>
+      </w:r>
+    </w:p>
+    <w:p>
+      <w:pPr>
+        <w:pStyle w:val="ListParagraph"/>
+        <w:numPr>
+          <w:ilvl w:val="0"/>
+          <w:numId w:val="2"/>
+        </w:numPr>
+        <w:spacing w:after="60"/>
+      </w:pPr>
+      <w:r>
+        <w:rPr>
+          <w:rFonts w:ascii="Calibri" w:cs="Calibri" w:eastAsia="Calibri" w:hAnsi="Calibri"/>
+          <w:b w:val="false"/>
+          <w:bCs w:val="false"/>
+          <w:i w:val="false"/>
+          <w:iCs w:val="false"/>
+          <w:color w:val="333333"/>
+          <w:sz w:val="19"/>
+          <w:szCs w:val="19"/>
+        </w:rPr>
+        <w:t xml:space="preserve">Stable tracking under uncertainty</w:t>
+      </w:r>
+    </w:p>
+    <w:p>
+      <w:pPr>
+        <w:pStyle w:val="ListParagraph"/>
+        <w:numPr>
+          <w:ilvl w:val="0"/>
+          <w:numId w:val="2"/>
+        </w:numPr>
+        <w:spacing w:after="60"/>
+      </w:pPr>
+      <w:r>
+        <w:rPr>
+          <w:rFonts w:ascii="Calibri" w:cs="Calibri" w:eastAsia="Calibri" w:hAnsi="Calibri"/>
+          <w:b w:val="false"/>
+          <w:bCs w:val="false"/>
+          <w:i w:val="false"/>
+          <w:iCs w:val="false"/>
+          <w:color w:val="333333"/>
+          <w:sz w:val="19"/>
+          <w:szCs w:val="19"/>
+        </w:rPr>
+        <w:t xml:space="preserve">CPU real-time performance</w:t>
+      </w:r>
+    </w:p>
+    <w:p>
+      <w:pPr>
+        <w:pStyle w:val="ListParagraph"/>
+        <w:numPr>
+          <w:ilvl w:val="0"/>
+          <w:numId w:val="2"/>
+        </w:numPr>
+        <w:spacing w:after="60"/>
+      </w:pPr>
+      <w:r>
+        <w:rPr>
+          <w:rFonts w:ascii="Calibri" w:cs="Calibri" w:eastAsia="Calibri" w:hAnsi="Calibri"/>
+          <w:b w:val="false"/>
+          <w:bCs w:val="false"/>
+          <w:i w:val="false"/>
+          <w:iCs w:val="false"/>
+          <w:color w:val="333333"/>
+          <w:sz w:val="19"/>
+          <w:szCs w:val="19"/>
+        </w:rPr>
+        <w:t xml:space="preserve">Action audit logging</w:t>
+      </w:r>
+    </w:p>
+    <w:p>
+      <w:pPr>
+        <w:spacing w:after="40" w:before="180"/>
+      </w:pPr>
+      <w:r>
+        <w:rPr>
+          <w:rFonts w:ascii="Calibri" w:cs="Calibri" w:eastAsia="Calibri" w:hAnsi="Calibri"/>
+          <w:b/>
+          <w:bCs/>
+          <w:i w:val="false"/>
+          <w:iCs w:val="false"/>
+          <w:color w:val="2C3E50"/>
+          <w:sz w:val="26"/>
+          <w:szCs w:val="26"/>
+        </w:rPr>
+        <w:t xml:space="preserve">Sentinel Security Scanner</w:t>
+      </w:r>
+      <w:r>
+        <w:rPr>
+          <w:rFonts w:ascii="Calibri" w:cs="Calibri" w:eastAsia="Calibri" w:hAnsi="Calibri"/>
+          <w:b w:val="false"/>
+          <w:bCs w:val="false"/>
+          <w:i w:val="false"/>
+          <w:iCs w:val="false"/>
+          <w:color w:val="666666"/>
+          <w:sz w:val="20"/>
+          <w:szCs w:val="20"/>
+        </w:rPr>
         <w:t xml:space="preserve"> — Educational Vulnerability Scanner</w:t>
       </w:r>
     </w:p>
@@ -8309,7 +9474,7 @@
       <w:pPr>
         <w:spacing w:after="80"/>
       </w:pPr>
-      <w:hyperlink w:history="1" r:id="rIdqmvyuepleyciwjohatyzf">
+      <w:hyperlink w:history="1" r:id="rIdvbuqp7wkwy488ymb02vr7">
         <w:r>
           <w:rPr>
             <w:rFonts w:ascii="Calibri" w:cs="Calibri" w:eastAsia="Calibri" w:hAnsi="Calibri"/>
@@ -8606,7 +9771,7 @@
       <w:pPr>
         <w:spacing w:after="80"/>
       </w:pPr>
-      <w:hyperlink w:history="1" r:id="rIdbidbrxwnbdiivek4vhq9r">
+      <w:hyperlink w:history="1" r:id="rIdz4tueajirwvmxxzwzkd-s">
         <w:r>
           <w:rPr>
             <w:rFonts w:ascii="Calibri" w:cs="Calibri" w:eastAsia="Calibri" w:hAnsi="Calibri"/>
@@ -8903,7 +10068,7 @@
       <w:pPr>
         <w:spacing w:after="80"/>
       </w:pPr>
-      <w:hyperlink w:history="1" r:id="rIdgnm0uklv_sdgyavui9lbj">
+      <w:hyperlink w:history="1" r:id="rIdiisroxm2bp1tcc_pv59rw">
         <w:r>
           <w:rPr>
             <w:rFonts w:ascii="Calibri" w:cs="Calibri" w:eastAsia="Calibri" w:hAnsi="Calibri"/>
@@ -9200,7 +10365,7 @@
       <w:pPr>
         <w:spacing w:after="80"/>
       </w:pPr>
-      <w:hyperlink w:history="1" r:id="rId_mtwyaeaizxz_qzfxqcxt">
+      <w:hyperlink w:history="1" r:id="rIdax3ygqzsquodkc7ngnzop">
         <w:r>
           <w:rPr>
             <w:rFonts w:ascii="Calibri" w:cs="Calibri" w:eastAsia="Calibri" w:hAnsi="Calibri"/>
@@ -9497,7 +10662,7 @@
       <w:pPr>
         <w:spacing w:after="80"/>
       </w:pPr>
-      <w:hyperlink w:history="1" r:id="rIdfqffbe-f_4hbqphw_pmos">
+      <w:hyperlink w:history="1" r:id="rIdnyb_iqioottlcezwel1i8">
         <w:r>
           <w:rPr>
             <w:rFonts w:ascii="Calibri" w:cs="Calibri" w:eastAsia="Calibri" w:hAnsi="Calibri"/>
@@ -9881,7 +11046,7 @@
       <w:pPr>
         <w:spacing w:after="80"/>
       </w:pPr>
-      <w:hyperlink w:history="1" r:id="rIdaowiusr2qcmokf17ago2v">
+      <w:hyperlink w:history="1" r:id="rIdbovkomwkxava9pppodhns">
         <w:r>
           <w:rPr>
             <w:rFonts w:ascii="Calibri" w:cs="Calibri" w:eastAsia="Calibri" w:hAnsi="Calibri"/>
@@ -10072,6 +11237,1558 @@
       </w:r>
     </w:p>
     <w:p>
+      <w:pPr>
+        <w:spacing w:after="40" w:before="180"/>
+      </w:pPr>
+      <w:r>
+        <w:rPr>
+          <w:rFonts w:ascii="Calibri" w:cs="Calibri" w:eastAsia="Calibri" w:hAnsi="Calibri"/>
+          <w:b/>
+          <w:bCs/>
+          <w:i w:val="false"/>
+          <w:iCs w:val="false"/>
+          <w:color w:val="2C3E50"/>
+          <w:sz w:val="26"/>
+          <w:szCs w:val="26"/>
+        </w:rPr>
+        <w:t xml:space="preserve">MediaPipe Facial Detection</w:t>
+      </w:r>
+      <w:r>
+        <w:rPr>
+          <w:rFonts w:ascii="Calibri" w:cs="Calibri" w:eastAsia="Calibri" w:hAnsi="Calibri"/>
+          <w:b w:val="false"/>
+          <w:bCs w:val="false"/>
+          <w:i w:val="false"/>
+          <w:iCs w:val="false"/>
+          <w:color w:val="666666"/>
+          <w:sz w:val="20"/>
+          <w:szCs w:val="20"/>
+        </w:rPr>
+        <w:t xml:space="preserve"> — Real-Time Face Landmarks</w:t>
+      </w:r>
+    </w:p>
+    <w:p>
+      <w:pPr>
+        <w:spacing w:after="120"/>
+      </w:pPr>
+      <w:r>
+        <w:rPr>
+          <w:rFonts w:ascii="Calibri" w:cs="Calibri" w:eastAsia="Calibri" w:hAnsi="Calibri"/>
+          <w:b w:val="false"/>
+          <w:bCs w:val="false"/>
+          <w:i w:val="false"/>
+          <w:iCs w:val="false"/>
+          <w:color w:val="333333"/>
+          <w:sz w:val="19"/>
+          <w:szCs w:val="19"/>
+        </w:rPr>
+        <w:t xml:space="preserve">Problem: Computer vision demos need fast, accurate facial landmark detection without heavy custom model training.</w:t>
+      </w:r>
+    </w:p>
+    <w:p>
+      <w:pPr>
+        <w:spacing w:after="120"/>
+      </w:pPr>
+      <w:r>
+        <w:rPr>
+          <w:rFonts w:ascii="Calibri" w:cs="Calibri" w:eastAsia="Calibri" w:hAnsi="Calibri"/>
+          <w:b w:val="false"/>
+          <w:bCs w:val="false"/>
+          <w:i w:val="false"/>
+          <w:iCs w:val="false"/>
+          <w:color w:val="333333"/>
+          <w:sz w:val="19"/>
+          <w:szCs w:val="19"/>
+        </w:rPr>
+        <w:t xml:space="preserve">Built: MediaPipe-based face detection pipeline with landmark overlay and camera/video input support.</w:t>
+      </w:r>
+    </w:p>
+    <w:p>
+      <w:pPr>
+        <w:spacing w:after="120"/>
+      </w:pPr>
+      <w:r>
+        <w:rPr>
+          <w:rFonts w:ascii="Calibri" w:cs="Calibri" w:eastAsia="Calibri" w:hAnsi="Calibri"/>
+          <w:b w:val="false"/>
+          <w:bCs w:val="false"/>
+          <w:i w:val="false"/>
+          <w:iCs w:val="false"/>
+          <w:color w:val="333333"/>
+          <w:sz w:val="19"/>
+          <w:szCs w:val="19"/>
+        </w:rPr>
+        <w:t xml:space="preserve">Outcome: Working MediaPipe facial detection pipeline.</w:t>
+      </w:r>
+    </w:p>
+    <w:p>
+      <w:pPr>
+        <w:spacing w:after="80"/>
+      </w:pPr>
+      <w:r>
+        <w:rPr>
+          <w:rFonts w:ascii="Calibri" w:cs="Calibri" w:eastAsia="Calibri" w:hAnsi="Calibri"/>
+          <w:b/>
+          <w:bCs/>
+          <w:i w:val="false"/>
+          <w:iCs w:val="false"/>
+          <w:color w:val="333333"/>
+          <w:sz w:val="19"/>
+          <w:szCs w:val="19"/>
+        </w:rPr>
+        <w:t xml:space="preserve">Tech: Python, MediaPipe, OpenCV, Computer Vision, AI</w:t>
+      </w:r>
+    </w:p>
+    <w:p>
+      <w:pPr>
+        <w:spacing w:after="80"/>
+      </w:pPr>
+      <w:hyperlink w:history="1" r:id="rIdxerpogijzc6gihrwb64xu">
+        <w:r>
+          <w:rPr>
+            <w:rFonts w:ascii="Calibri" w:cs="Calibri" w:eastAsia="Calibri" w:hAnsi="Calibri"/>
+            <w:b w:val="false"/>
+            <w:bCs w:val="false"/>
+            <w:i w:val="false"/>
+            <w:iCs w:val="false"/>
+            <w:color w:val="0563C1"/>
+            <w:sz w:val="19"/>
+            <w:szCs w:val="19"/>
+          </w:rPr>
+          <w:t xml:space="preserve">GitHub: https://github.com/Arn-The-Wolf/Facial_Detection_MediaPipe</w:t>
+        </w:r>
+      </w:hyperlink>
+    </w:p>
+    <w:p>
+      <w:pPr>
+        <w:spacing w:after="40" w:before="60"/>
+      </w:pPr>
+      <w:r>
+        <w:rPr>
+          <w:rFonts w:ascii="Calibri" w:cs="Calibri" w:eastAsia="Calibri" w:hAnsi="Calibri"/>
+          <w:b/>
+          <w:bCs/>
+          <w:i w:val="false"/>
+          <w:iCs w:val="false"/>
+          <w:color w:val="333333"/>
+          <w:sz w:val="19"/>
+          <w:szCs w:val="19"/>
+        </w:rPr>
+        <w:t xml:space="preserve">Key results</w:t>
+      </w:r>
+    </w:p>
+    <w:p>
+      <w:pPr>
+        <w:pStyle w:val="ListParagraph"/>
+        <w:numPr>
+          <w:ilvl w:val="0"/>
+          <w:numId w:val="2"/>
+        </w:numPr>
+        <w:spacing w:after="60"/>
+      </w:pPr>
+      <w:r>
+        <w:rPr>
+          <w:rFonts w:ascii="Calibri" w:cs="Calibri" w:eastAsia="Calibri" w:hAnsi="Calibri"/>
+          <w:b w:val="false"/>
+          <w:bCs w:val="false"/>
+          <w:i w:val="false"/>
+          <w:iCs w:val="false"/>
+          <w:color w:val="333333"/>
+          <w:sz w:val="19"/>
+          <w:szCs w:val="19"/>
+        </w:rPr>
+        <w:t xml:space="preserve">MediaPipe face landmarks</w:t>
+      </w:r>
+    </w:p>
+    <w:p>
+      <w:pPr>
+        <w:pStyle w:val="ListParagraph"/>
+        <w:numPr>
+          <w:ilvl w:val="0"/>
+          <w:numId w:val="2"/>
+        </w:numPr>
+        <w:spacing w:after="60"/>
+      </w:pPr>
+      <w:r>
+        <w:rPr>
+          <w:rFonts w:ascii="Calibri" w:cs="Calibri" w:eastAsia="Calibri" w:hAnsi="Calibri"/>
+          <w:b w:val="false"/>
+          <w:bCs w:val="false"/>
+          <w:i w:val="false"/>
+          <w:iCs w:val="false"/>
+          <w:color w:val="333333"/>
+          <w:sz w:val="19"/>
+          <w:szCs w:val="19"/>
+        </w:rPr>
+        <w:t xml:space="preserve">Real-time detection overlay</w:t>
+      </w:r>
+    </w:p>
+    <w:p>
+      <w:pPr>
+        <w:spacing w:after="40" w:before="80"/>
+      </w:pPr>
+      <w:r>
+        <w:rPr>
+          <w:rFonts w:ascii="Calibri" w:cs="Calibri" w:eastAsia="Calibri" w:hAnsi="Calibri"/>
+          <w:b/>
+          <w:bCs/>
+          <w:i w:val="false"/>
+          <w:iCs w:val="false"/>
+          <w:color w:val="333333"/>
+          <w:sz w:val="19"/>
+          <w:szCs w:val="19"/>
+        </w:rPr>
+        <w:t xml:space="preserve">Challenges solved</w:t>
+      </w:r>
+    </w:p>
+    <w:p>
+      <w:pPr>
+        <w:pStyle w:val="ListParagraph"/>
+        <w:numPr>
+          <w:ilvl w:val="0"/>
+          <w:numId w:val="2"/>
+        </w:numPr>
+        <w:spacing w:after="60"/>
+      </w:pPr>
+      <w:r>
+        <w:rPr>
+          <w:rFonts w:ascii="Calibri" w:cs="Calibri" w:eastAsia="Calibri" w:hAnsi="Calibri"/>
+          <w:b w:val="false"/>
+          <w:bCs w:val="false"/>
+          <w:i w:val="false"/>
+          <w:iCs w:val="false"/>
+          <w:color w:val="333333"/>
+          <w:sz w:val="19"/>
+          <w:szCs w:val="19"/>
+        </w:rPr>
+        <w:t xml:space="preserve">Real-time landmark accuracy</w:t>
+      </w:r>
+    </w:p>
+    <w:p>
+      <w:pPr>
+        <w:pStyle w:val="ListParagraph"/>
+        <w:numPr>
+          <w:ilvl w:val="0"/>
+          <w:numId w:val="2"/>
+        </w:numPr>
+        <w:spacing w:after="60"/>
+      </w:pPr>
+      <w:r>
+        <w:rPr>
+          <w:rFonts w:ascii="Calibri" w:cs="Calibri" w:eastAsia="Calibri" w:hAnsi="Calibri"/>
+          <w:b w:val="false"/>
+          <w:bCs w:val="false"/>
+          <w:i w:val="false"/>
+          <w:iCs w:val="false"/>
+          <w:color w:val="333333"/>
+          <w:sz w:val="19"/>
+          <w:szCs w:val="19"/>
+        </w:rPr>
+        <w:t xml:space="preserve">Camera input handling</w:t>
+      </w:r>
+    </w:p>
+    <w:p>
+      <w:pPr>
+        <w:spacing w:after="40" w:before="180"/>
+      </w:pPr>
+      <w:r>
+        <w:rPr>
+          <w:rFonts w:ascii="Calibri" w:cs="Calibri" w:eastAsia="Calibri" w:hAnsi="Calibri"/>
+          <w:b/>
+          <w:bCs/>
+          <w:i w:val="false"/>
+          <w:iCs w:val="false"/>
+          <w:color w:val="2C3E50"/>
+          <w:sz w:val="26"/>
+          <w:szCs w:val="26"/>
+        </w:rPr>
+        <w:t xml:space="preserve">Face Detection Stepper Motor</w:t>
+      </w:r>
+      <w:r>
+        <w:rPr>
+          <w:rFonts w:ascii="Calibri" w:cs="Calibri" w:eastAsia="Calibri" w:hAnsi="Calibri"/>
+          <w:b w:val="false"/>
+          <w:bCs w:val="false"/>
+          <w:i w:val="false"/>
+          <w:iCs w:val="false"/>
+          <w:color w:val="666666"/>
+          <w:sz w:val="20"/>
+          <w:szCs w:val="20"/>
+        </w:rPr>
+        <w:t xml:space="preserve"> — CV-Driven Camera Pan</w:t>
+      </w:r>
+    </w:p>
+    <w:p>
+      <w:pPr>
+        <w:spacing w:after="120"/>
+      </w:pPr>
+      <w:r>
+        <w:rPr>
+          <w:rFonts w:ascii="Calibri" w:cs="Calibri" w:eastAsia="Calibri" w:hAnsi="Calibri"/>
+          <w:b w:val="false"/>
+          <w:bCs w:val="false"/>
+          <w:i w:val="false"/>
+          <w:iCs w:val="false"/>
+          <w:color w:val="333333"/>
+          <w:sz w:val="19"/>
+          <w:szCs w:val="19"/>
+        </w:rPr>
+        <w:t xml:space="preserve">Problem: Cameras need automated pan based on detected faces without manual joystick control.</w:t>
+      </w:r>
+    </w:p>
+    <w:p>
+      <w:pPr>
+        <w:spacing w:after="120"/>
+      </w:pPr>
+      <w:r>
+        <w:rPr>
+          <w:rFonts w:ascii="Calibri" w:cs="Calibri" w:eastAsia="Calibri" w:hAnsi="Calibri"/>
+          <w:b w:val="false"/>
+          <w:bCs w:val="false"/>
+          <w:i w:val="false"/>
+          <w:iCs w:val="false"/>
+          <w:color w:val="333333"/>
+          <w:sz w:val="19"/>
+          <w:szCs w:val="19"/>
+        </w:rPr>
+        <w:t xml:space="preserve">Built: Face detection pipeline driving stepper-motor actuation for camera orientation.</w:t>
+      </w:r>
+    </w:p>
+    <w:p>
+      <w:pPr>
+        <w:spacing w:after="120"/>
+      </w:pPr>
+      <w:r>
+        <w:rPr>
+          <w:rFonts w:ascii="Calibri" w:cs="Calibri" w:eastAsia="Calibri" w:hAnsi="Calibri"/>
+          <w:b w:val="false"/>
+          <w:bCs w:val="false"/>
+          <w:i w:val="false"/>
+          <w:iCs w:val="false"/>
+          <w:color w:val="333333"/>
+          <w:sz w:val="19"/>
+          <w:szCs w:val="19"/>
+        </w:rPr>
+        <w:t xml:space="preserve">Outcome: CV + hardware demo where detection drives motor pan.</w:t>
+      </w:r>
+    </w:p>
+    <w:p>
+      <w:pPr>
+        <w:spacing w:after="80"/>
+      </w:pPr>
+      <w:r>
+        <w:rPr>
+          <w:rFonts w:ascii="Calibri" w:cs="Calibri" w:eastAsia="Calibri" w:hAnsi="Calibri"/>
+          <w:b/>
+          <w:bCs/>
+          <w:i w:val="false"/>
+          <w:iCs w:val="false"/>
+          <w:color w:val="333333"/>
+          <w:sz w:val="19"/>
+          <w:szCs w:val="19"/>
+        </w:rPr>
+        <w:t xml:space="preserve">Tech: Python, OpenCV, Stepper Motor, Hardware, Computer Vision, IoT</w:t>
+      </w:r>
+    </w:p>
+    <w:p>
+      <w:pPr>
+        <w:spacing w:after="80"/>
+      </w:pPr>
+      <w:hyperlink w:history="1" r:id="rIdpqaxf9xmgkkmdzrsthstn">
+        <w:r>
+          <w:rPr>
+            <w:rFonts w:ascii="Calibri" w:cs="Calibri" w:eastAsia="Calibri" w:hAnsi="Calibri"/>
+            <w:b w:val="false"/>
+            <w:bCs w:val="false"/>
+            <w:i w:val="false"/>
+            <w:iCs w:val="false"/>
+            <w:color w:val="0563C1"/>
+            <w:sz w:val="19"/>
+            <w:szCs w:val="19"/>
+          </w:rPr>
+          <w:t xml:space="preserve">GitHub: https://github.com/Arn-The-Wolf/Face-Detection-Stepper-Motor</w:t>
+        </w:r>
+      </w:hyperlink>
+    </w:p>
+    <w:p>
+      <w:pPr>
+        <w:spacing w:after="40" w:before="60"/>
+      </w:pPr>
+      <w:r>
+        <w:rPr>
+          <w:rFonts w:ascii="Calibri" w:cs="Calibri" w:eastAsia="Calibri" w:hAnsi="Calibri"/>
+          <w:b/>
+          <w:bCs/>
+          <w:i w:val="false"/>
+          <w:iCs w:val="false"/>
+          <w:color w:val="333333"/>
+          <w:sz w:val="19"/>
+          <w:szCs w:val="19"/>
+        </w:rPr>
+        <w:t xml:space="preserve">Key results</w:t>
+      </w:r>
+    </w:p>
+    <w:p>
+      <w:pPr>
+        <w:pStyle w:val="ListParagraph"/>
+        <w:numPr>
+          <w:ilvl w:val="0"/>
+          <w:numId w:val="2"/>
+        </w:numPr>
+        <w:spacing w:after="60"/>
+      </w:pPr>
+      <w:r>
+        <w:rPr>
+          <w:rFonts w:ascii="Calibri" w:cs="Calibri" w:eastAsia="Calibri" w:hAnsi="Calibri"/>
+          <w:b w:val="false"/>
+          <w:bCs w:val="false"/>
+          <w:i w:val="false"/>
+          <w:iCs w:val="false"/>
+          <w:color w:val="333333"/>
+          <w:sz w:val="19"/>
+          <w:szCs w:val="19"/>
+        </w:rPr>
+        <w:t xml:space="preserve">Face-driven pan</w:t>
+      </w:r>
+    </w:p>
+    <w:p>
+      <w:pPr>
+        <w:pStyle w:val="ListParagraph"/>
+        <w:numPr>
+          <w:ilvl w:val="0"/>
+          <w:numId w:val="2"/>
+        </w:numPr>
+        <w:spacing w:after="60"/>
+      </w:pPr>
+      <w:r>
+        <w:rPr>
+          <w:rFonts w:ascii="Calibri" w:cs="Calibri" w:eastAsia="Calibri" w:hAnsi="Calibri"/>
+          <w:b w:val="false"/>
+          <w:bCs w:val="false"/>
+          <w:i w:val="false"/>
+          <w:iCs w:val="false"/>
+          <w:color w:val="333333"/>
+          <w:sz w:val="19"/>
+          <w:szCs w:val="19"/>
+        </w:rPr>
+        <w:t xml:space="preserve">Stepper motor integration</w:t>
+      </w:r>
+    </w:p>
+    <w:p>
+      <w:pPr>
+        <w:spacing w:after="40" w:before="80"/>
+      </w:pPr>
+      <w:r>
+        <w:rPr>
+          <w:rFonts w:ascii="Calibri" w:cs="Calibri" w:eastAsia="Calibri" w:hAnsi="Calibri"/>
+          <w:b/>
+          <w:bCs/>
+          <w:i w:val="false"/>
+          <w:iCs w:val="false"/>
+          <w:color w:val="333333"/>
+          <w:sz w:val="19"/>
+          <w:szCs w:val="19"/>
+        </w:rPr>
+        <w:t xml:space="preserve">Challenges solved</w:t>
+      </w:r>
+    </w:p>
+    <w:p>
+      <w:pPr>
+        <w:pStyle w:val="ListParagraph"/>
+        <w:numPr>
+          <w:ilvl w:val="0"/>
+          <w:numId w:val="2"/>
+        </w:numPr>
+        <w:spacing w:after="60"/>
+      </w:pPr>
+      <w:r>
+        <w:rPr>
+          <w:rFonts w:ascii="Calibri" w:cs="Calibri" w:eastAsia="Calibri" w:hAnsi="Calibri"/>
+          <w:b w:val="false"/>
+          <w:bCs w:val="false"/>
+          <w:i w:val="false"/>
+          <w:iCs w:val="false"/>
+          <w:color w:val="333333"/>
+          <w:sz w:val="19"/>
+          <w:szCs w:val="19"/>
+        </w:rPr>
+        <w:t xml:space="preserve">Motor timing</w:t>
+      </w:r>
+    </w:p>
+    <w:p>
+      <w:pPr>
+        <w:pStyle w:val="ListParagraph"/>
+        <w:numPr>
+          <w:ilvl w:val="0"/>
+          <w:numId w:val="2"/>
+        </w:numPr>
+        <w:spacing w:after="60"/>
+      </w:pPr>
+      <w:r>
+        <w:rPr>
+          <w:rFonts w:ascii="Calibri" w:cs="Calibri" w:eastAsia="Calibri" w:hAnsi="Calibri"/>
+          <w:b w:val="false"/>
+          <w:bCs w:val="false"/>
+          <w:i w:val="false"/>
+          <w:iCs w:val="false"/>
+          <w:color w:val="333333"/>
+          <w:sz w:val="19"/>
+          <w:szCs w:val="19"/>
+        </w:rPr>
+        <w:t xml:space="preserve">Detection-to-actuation latency</w:t>
+      </w:r>
+    </w:p>
+    <w:p>
+      <w:pPr>
+        <w:spacing w:after="40" w:before="180"/>
+      </w:pPr>
+      <w:r>
+        <w:rPr>
+          <w:rFonts w:ascii="Calibri" w:cs="Calibri" w:eastAsia="Calibri" w:hAnsi="Calibri"/>
+          <w:b/>
+          <w:bCs/>
+          <w:i w:val="false"/>
+          <w:iCs w:val="false"/>
+          <w:color w:val="2C3E50"/>
+          <w:sz w:val="26"/>
+          <w:szCs w:val="26"/>
+        </w:rPr>
+        <w:t xml:space="preserve">CV for Intelligent Robotics</w:t>
+      </w:r>
+      <w:r>
+        <w:rPr>
+          <w:rFonts w:ascii="Calibri" w:cs="Calibri" w:eastAsia="Calibri" w:hAnsi="Calibri"/>
+          <w:b w:val="false"/>
+          <w:bCs w:val="false"/>
+          <w:i w:val="false"/>
+          <w:iCs w:val="false"/>
+          <w:color w:val="666666"/>
+          <w:sz w:val="20"/>
+          <w:szCs w:val="20"/>
+        </w:rPr>
+        <w:t xml:space="preserve"> — Computer Vision Part 01</w:t>
+      </w:r>
+    </w:p>
+    <w:p>
+      <w:pPr>
+        <w:spacing w:after="120"/>
+      </w:pPr>
+      <w:r>
+        <w:rPr>
+          <w:rFonts w:ascii="Calibri" w:cs="Calibri" w:eastAsia="Calibri" w:hAnsi="Calibri"/>
+          <w:b w:val="false"/>
+          <w:bCs w:val="false"/>
+          <w:i w:val="false"/>
+          <w:iCs w:val="false"/>
+          <w:color w:val="333333"/>
+          <w:sz w:val="19"/>
+          <w:szCs w:val="19"/>
+        </w:rPr>
+        <w:t xml:space="preserve">Problem: Robotics prototypes need foundational computer vision pipelines before higher-level autonomy modules.</w:t>
+      </w:r>
+    </w:p>
+    <w:p>
+      <w:pPr>
+        <w:spacing w:after="120"/>
+      </w:pPr>
+      <w:r>
+        <w:rPr>
+          <w:rFonts w:ascii="Calibri" w:cs="Calibri" w:eastAsia="Calibri" w:hAnsi="Calibri"/>
+          <w:b w:val="false"/>
+          <w:bCs w:val="false"/>
+          <w:i w:val="false"/>
+          <w:iCs w:val="false"/>
+          <w:color w:val="333333"/>
+          <w:sz w:val="19"/>
+          <w:szCs w:val="19"/>
+        </w:rPr>
+        <w:t xml:space="preserve">Built: OpenCV/Python experiments covering core CV stages used in robotics perception stacks.</w:t>
+      </w:r>
+    </w:p>
+    <w:p>
+      <w:pPr>
+        <w:spacing w:after="120"/>
+      </w:pPr>
+      <w:r>
+        <w:rPr>
+          <w:rFonts w:ascii="Calibri" w:cs="Calibri" w:eastAsia="Calibri" w:hAnsi="Calibri"/>
+          <w:b w:val="false"/>
+          <w:bCs w:val="false"/>
+          <w:i w:val="false"/>
+          <w:iCs w:val="false"/>
+          <w:color w:val="333333"/>
+          <w:sz w:val="19"/>
+          <w:szCs w:val="19"/>
+        </w:rPr>
+        <w:t xml:space="preserve">Outcome: Foundational CV module for robotics perception experiments.</w:t>
+      </w:r>
+    </w:p>
+    <w:p>
+      <w:pPr>
+        <w:spacing w:after="80"/>
+      </w:pPr>
+      <w:r>
+        <w:rPr>
+          <w:rFonts w:ascii="Calibri" w:cs="Calibri" w:eastAsia="Calibri" w:hAnsi="Calibri"/>
+          <w:b/>
+          <w:bCs/>
+          <w:i w:val="false"/>
+          <w:iCs w:val="false"/>
+          <w:color w:val="333333"/>
+          <w:sz w:val="19"/>
+          <w:szCs w:val="19"/>
+        </w:rPr>
+        <w:t xml:space="preserve">Tech: Python, OpenCV, Computer Vision, Robotics, AI</w:t>
+      </w:r>
+    </w:p>
+    <w:p>
+      <w:pPr>
+        <w:spacing w:after="80"/>
+      </w:pPr>
+      <w:hyperlink w:history="1" r:id="rIduoo8j0hdor0gutxot6t-b">
+        <w:r>
+          <w:rPr>
+            <w:rFonts w:ascii="Calibri" w:cs="Calibri" w:eastAsia="Calibri" w:hAnsi="Calibri"/>
+            <w:b w:val="false"/>
+            <w:bCs w:val="false"/>
+            <w:i w:val="false"/>
+            <w:iCs w:val="false"/>
+            <w:color w:val="0563C1"/>
+            <w:sz w:val="19"/>
+            <w:szCs w:val="19"/>
+          </w:rPr>
+          <w:t xml:space="preserve">GitHub: https://github.com/Arn-The-Wolf/Computer-Vision-for-Intelligent-Robotics-Part-01</w:t>
+        </w:r>
+      </w:hyperlink>
+    </w:p>
+    <w:p>
+      <w:pPr>
+        <w:spacing w:after="40" w:before="60"/>
+      </w:pPr>
+      <w:r>
+        <w:rPr>
+          <w:rFonts w:ascii="Calibri" w:cs="Calibri" w:eastAsia="Calibri" w:hAnsi="Calibri"/>
+          <w:b/>
+          <w:bCs/>
+          <w:i w:val="false"/>
+          <w:iCs w:val="false"/>
+          <w:color w:val="333333"/>
+          <w:sz w:val="19"/>
+          <w:szCs w:val="19"/>
+        </w:rPr>
+        <w:t xml:space="preserve">Key results</w:t>
+      </w:r>
+    </w:p>
+    <w:p>
+      <w:pPr>
+        <w:pStyle w:val="ListParagraph"/>
+        <w:numPr>
+          <w:ilvl w:val="0"/>
+          <w:numId w:val="2"/>
+        </w:numPr>
+        <w:spacing w:after="60"/>
+      </w:pPr>
+      <w:r>
+        <w:rPr>
+          <w:rFonts w:ascii="Calibri" w:cs="Calibri" w:eastAsia="Calibri" w:hAnsi="Calibri"/>
+          <w:b w:val="false"/>
+          <w:bCs w:val="false"/>
+          <w:i w:val="false"/>
+          <w:iCs w:val="false"/>
+          <w:color w:val="333333"/>
+          <w:sz w:val="19"/>
+          <w:szCs w:val="19"/>
+        </w:rPr>
+        <w:t xml:space="preserve">CV foundations for robotics</w:t>
+      </w:r>
+    </w:p>
+    <w:p>
+      <w:pPr>
+        <w:pStyle w:val="ListParagraph"/>
+        <w:numPr>
+          <w:ilvl w:val="0"/>
+          <w:numId w:val="2"/>
+        </w:numPr>
+        <w:spacing w:after="60"/>
+      </w:pPr>
+      <w:r>
+        <w:rPr>
+          <w:rFonts w:ascii="Calibri" w:cs="Calibri" w:eastAsia="Calibri" w:hAnsi="Calibri"/>
+          <w:b w:val="false"/>
+          <w:bCs w:val="false"/>
+          <w:i w:val="false"/>
+          <w:iCs w:val="false"/>
+          <w:color w:val="333333"/>
+          <w:sz w:val="19"/>
+          <w:szCs w:val="19"/>
+        </w:rPr>
+        <w:t xml:space="preserve">Detection experiments</w:t>
+      </w:r>
+    </w:p>
+    <w:p>
+      <w:pPr>
+        <w:spacing w:after="40" w:before="80"/>
+      </w:pPr>
+      <w:r>
+        <w:rPr>
+          <w:rFonts w:ascii="Calibri" w:cs="Calibri" w:eastAsia="Calibri" w:hAnsi="Calibri"/>
+          <w:b/>
+          <w:bCs/>
+          <w:i w:val="false"/>
+          <w:iCs w:val="false"/>
+          <w:color w:val="333333"/>
+          <w:sz w:val="19"/>
+          <w:szCs w:val="19"/>
+        </w:rPr>
+        <w:t xml:space="preserve">Challenges solved</w:t>
+      </w:r>
+    </w:p>
+    <w:p>
+      <w:pPr>
+        <w:pStyle w:val="ListParagraph"/>
+        <w:numPr>
+          <w:ilvl w:val="0"/>
+          <w:numId w:val="2"/>
+        </w:numPr>
+        <w:spacing w:after="60"/>
+      </w:pPr>
+      <w:r>
+        <w:rPr>
+          <w:rFonts w:ascii="Calibri" w:cs="Calibri" w:eastAsia="Calibri" w:hAnsi="Calibri"/>
+          <w:b w:val="false"/>
+          <w:bCs w:val="false"/>
+          <w:i w:val="false"/>
+          <w:iCs w:val="false"/>
+          <w:color w:val="333333"/>
+          <w:sz w:val="19"/>
+          <w:szCs w:val="19"/>
+        </w:rPr>
+        <w:t xml:space="preserve">Perception pipeline design</w:t>
+      </w:r>
+    </w:p>
+    <w:p>
+      <w:pPr>
+        <w:pStyle w:val="ListParagraph"/>
+        <w:numPr>
+          <w:ilvl w:val="0"/>
+          <w:numId w:val="2"/>
+        </w:numPr>
+        <w:spacing w:after="60"/>
+      </w:pPr>
+      <w:r>
+        <w:rPr>
+          <w:rFonts w:ascii="Calibri" w:cs="Calibri" w:eastAsia="Calibri" w:hAnsi="Calibri"/>
+          <w:b w:val="false"/>
+          <w:bCs w:val="false"/>
+          <w:i w:val="false"/>
+          <w:iCs w:val="false"/>
+          <w:color w:val="333333"/>
+          <w:sz w:val="19"/>
+          <w:szCs w:val="19"/>
+        </w:rPr>
+        <w:t xml:space="preserve">Real-world noise</w:t>
+      </w:r>
+    </w:p>
+    <w:p>
+      <w:pPr>
+        <w:spacing w:after="40" w:before="180"/>
+      </w:pPr>
+      <w:r>
+        <w:rPr>
+          <w:rFonts w:ascii="Calibri" w:cs="Calibri" w:eastAsia="Calibri" w:hAnsi="Calibri"/>
+          <w:b/>
+          <w:bCs/>
+          <w:i w:val="false"/>
+          <w:iCs w:val="false"/>
+          <w:color w:val="2C3E50"/>
+          <w:sz w:val="26"/>
+          <w:szCs w:val="26"/>
+        </w:rPr>
+        <w:t xml:space="preserve">House Price AI</w:t>
+      </w:r>
+      <w:r>
+        <w:rPr>
+          <w:rFonts w:ascii="Calibri" w:cs="Calibri" w:eastAsia="Calibri" w:hAnsi="Calibri"/>
+          <w:b w:val="false"/>
+          <w:bCs w:val="false"/>
+          <w:i w:val="false"/>
+          <w:iCs w:val="false"/>
+          <w:color w:val="666666"/>
+          <w:sz w:val="20"/>
+          <w:szCs w:val="20"/>
+        </w:rPr>
+        <w:t xml:space="preserve"> — ML Property Valuation</w:t>
+      </w:r>
+    </w:p>
+    <w:p>
+      <w:pPr>
+        <w:spacing w:after="120"/>
+      </w:pPr>
+      <w:r>
+        <w:rPr>
+          <w:rFonts w:ascii="Calibri" w:cs="Calibri" w:eastAsia="Calibri" w:hAnsi="Calibri"/>
+          <w:b w:val="false"/>
+          <w:bCs w:val="false"/>
+          <w:i w:val="false"/>
+          <w:iCs w:val="false"/>
+          <w:color w:val="333333"/>
+          <w:sz w:val="19"/>
+          <w:szCs w:val="19"/>
+        </w:rPr>
+        <w:t xml:space="preserve">Problem: Estimating house prices manually is inconsistent — needed a trained model to predict prices from property features.</w:t>
+      </w:r>
+    </w:p>
+    <w:p>
+      <w:pPr>
+        <w:spacing w:after="120"/>
+      </w:pPr>
+      <w:r>
+        <w:rPr>
+          <w:rFonts w:ascii="Calibri" w:cs="Calibri" w:eastAsia="Calibri" w:hAnsi="Calibri"/>
+          <w:b w:val="false"/>
+          <w:bCs w:val="false"/>
+          <w:i w:val="false"/>
+          <w:iCs w:val="false"/>
+          <w:color w:val="333333"/>
+          <w:sz w:val="19"/>
+          <w:szCs w:val="19"/>
+        </w:rPr>
+        <w:t xml:space="preserve">Built: ML training pipeline: feature prep, model training/evaluation, and price prediction inference.</w:t>
+      </w:r>
+    </w:p>
+    <w:p>
+      <w:pPr>
+        <w:spacing w:after="120"/>
+      </w:pPr>
+      <w:r>
+        <w:rPr>
+          <w:rFonts w:ascii="Calibri" w:cs="Calibri" w:eastAsia="Calibri" w:hAnsi="Calibri"/>
+          <w:b w:val="false"/>
+          <w:bCs w:val="false"/>
+          <w:i w:val="false"/>
+          <w:iCs w:val="false"/>
+          <w:color w:val="333333"/>
+          <w:sz w:val="19"/>
+          <w:szCs w:val="19"/>
+        </w:rPr>
+        <w:t xml:space="preserve">Outcome: Trained house-price prediction model with evaluation metrics.</w:t>
+      </w:r>
+    </w:p>
+    <w:p>
+      <w:pPr>
+        <w:spacing w:after="80"/>
+      </w:pPr>
+      <w:r>
+        <w:rPr>
+          <w:rFonts w:ascii="Calibri" w:cs="Calibri" w:eastAsia="Calibri" w:hAnsi="Calibri"/>
+          <w:b/>
+          <w:bCs/>
+          <w:i w:val="false"/>
+          <w:iCs w:val="false"/>
+          <w:color w:val="333333"/>
+          <w:sz w:val="19"/>
+          <w:szCs w:val="19"/>
+        </w:rPr>
+        <w:t xml:space="preserve">Tech: Python, Machine Learning, Scikit-learn, AI, Data Science</w:t>
+      </w:r>
+    </w:p>
+    <w:p>
+      <w:pPr>
+        <w:spacing w:after="80"/>
+      </w:pPr>
+      <w:hyperlink w:history="1" r:id="rIdqtimw-fskvvhpjtank-ic">
+        <w:r>
+          <w:rPr>
+            <w:rFonts w:ascii="Calibri" w:cs="Calibri" w:eastAsia="Calibri" w:hAnsi="Calibri"/>
+            <w:b w:val="false"/>
+            <w:bCs w:val="false"/>
+            <w:i w:val="false"/>
+            <w:iCs w:val="false"/>
+            <w:color w:val="0563C1"/>
+            <w:sz w:val="19"/>
+            <w:szCs w:val="19"/>
+          </w:rPr>
+          <w:t xml:space="preserve">GitHub: https://github.com/Arn-The-Wolf/AI-TO-CHECK-THE-PRICE-OF-THE-HOUSE</w:t>
+        </w:r>
+      </w:hyperlink>
+    </w:p>
+    <w:p>
+      <w:pPr>
+        <w:spacing w:after="40" w:before="60"/>
+      </w:pPr>
+      <w:r>
+        <w:rPr>
+          <w:rFonts w:ascii="Calibri" w:cs="Calibri" w:eastAsia="Calibri" w:hAnsi="Calibri"/>
+          <w:b/>
+          <w:bCs/>
+          <w:i w:val="false"/>
+          <w:iCs w:val="false"/>
+          <w:color w:val="333333"/>
+          <w:sz w:val="19"/>
+          <w:szCs w:val="19"/>
+        </w:rPr>
+        <w:t xml:space="preserve">Key results</w:t>
+      </w:r>
+    </w:p>
+    <w:p>
+      <w:pPr>
+        <w:pStyle w:val="ListParagraph"/>
+        <w:numPr>
+          <w:ilvl w:val="0"/>
+          <w:numId w:val="2"/>
+        </w:numPr>
+        <w:spacing w:after="60"/>
+      </w:pPr>
+      <w:r>
+        <w:rPr>
+          <w:rFonts w:ascii="Calibri" w:cs="Calibri" w:eastAsia="Calibri" w:hAnsi="Calibri"/>
+          <w:b w:val="false"/>
+          <w:bCs w:val="false"/>
+          <w:i w:val="false"/>
+          <w:iCs w:val="false"/>
+          <w:color w:val="333333"/>
+          <w:sz w:val="19"/>
+          <w:szCs w:val="19"/>
+        </w:rPr>
+        <w:t xml:space="preserve">Price prediction model</w:t>
+      </w:r>
+    </w:p>
+    <w:p>
+      <w:pPr>
+        <w:pStyle w:val="ListParagraph"/>
+        <w:numPr>
+          <w:ilvl w:val="0"/>
+          <w:numId w:val="2"/>
+        </w:numPr>
+        <w:spacing w:after="60"/>
+      </w:pPr>
+      <w:r>
+        <w:rPr>
+          <w:rFonts w:ascii="Calibri" w:cs="Calibri" w:eastAsia="Calibri" w:hAnsi="Calibri"/>
+          <w:b w:val="false"/>
+          <w:bCs w:val="false"/>
+          <w:i w:val="false"/>
+          <w:iCs w:val="false"/>
+          <w:color w:val="333333"/>
+          <w:sz w:val="19"/>
+          <w:szCs w:val="19"/>
+        </w:rPr>
+        <w:t xml:space="preserve">Training &amp; eval pipeline</w:t>
+      </w:r>
+    </w:p>
+    <w:p>
+      <w:pPr>
+        <w:spacing w:after="40" w:before="80"/>
+      </w:pPr>
+      <w:r>
+        <w:rPr>
+          <w:rFonts w:ascii="Calibri" w:cs="Calibri" w:eastAsia="Calibri" w:hAnsi="Calibri"/>
+          <w:b/>
+          <w:bCs/>
+          <w:i w:val="false"/>
+          <w:iCs w:val="false"/>
+          <w:color w:val="333333"/>
+          <w:sz w:val="19"/>
+          <w:szCs w:val="19"/>
+        </w:rPr>
+        <w:t xml:space="preserve">Challenges solved</w:t>
+      </w:r>
+    </w:p>
+    <w:p>
+      <w:pPr>
+        <w:pStyle w:val="ListParagraph"/>
+        <w:numPr>
+          <w:ilvl w:val="0"/>
+          <w:numId w:val="2"/>
+        </w:numPr>
+        <w:spacing w:after="60"/>
+      </w:pPr>
+      <w:r>
+        <w:rPr>
+          <w:rFonts w:ascii="Calibri" w:cs="Calibri" w:eastAsia="Calibri" w:hAnsi="Calibri"/>
+          <w:b w:val="false"/>
+          <w:bCs w:val="false"/>
+          <w:i w:val="false"/>
+          <w:iCs w:val="false"/>
+          <w:color w:val="333333"/>
+          <w:sz w:val="19"/>
+          <w:szCs w:val="19"/>
+        </w:rPr>
+        <w:t xml:space="preserve">Feature engineering</w:t>
+      </w:r>
+    </w:p>
+    <w:p>
+      <w:pPr>
+        <w:pStyle w:val="ListParagraph"/>
+        <w:numPr>
+          <w:ilvl w:val="0"/>
+          <w:numId w:val="2"/>
+        </w:numPr>
+        <w:spacing w:after="60"/>
+      </w:pPr>
+      <w:r>
+        <w:rPr>
+          <w:rFonts w:ascii="Calibri" w:cs="Calibri" w:eastAsia="Calibri" w:hAnsi="Calibri"/>
+          <w:b w:val="false"/>
+          <w:bCs w:val="false"/>
+          <w:i w:val="false"/>
+          <w:iCs w:val="false"/>
+          <w:color w:val="333333"/>
+          <w:sz w:val="19"/>
+          <w:szCs w:val="19"/>
+        </w:rPr>
+        <w:t xml:space="preserve">Model accuracy</w:t>
+      </w:r>
+    </w:p>
+    <w:p>
+      <w:pPr>
+        <w:pStyle w:val="ListParagraph"/>
+        <w:numPr>
+          <w:ilvl w:val="0"/>
+          <w:numId w:val="2"/>
+        </w:numPr>
+        <w:spacing w:after="60"/>
+      </w:pPr>
+      <w:r>
+        <w:rPr>
+          <w:rFonts w:ascii="Calibri" w:cs="Calibri" w:eastAsia="Calibri" w:hAnsi="Calibri"/>
+          <w:b w:val="false"/>
+          <w:bCs w:val="false"/>
+          <w:i w:val="false"/>
+          <w:iCs w:val="false"/>
+          <w:color w:val="333333"/>
+          <w:sz w:val="19"/>
+          <w:szCs w:val="19"/>
+        </w:rPr>
+        <w:t xml:space="preserve">Overfitting control</w:t>
+      </w:r>
+    </w:p>
+    <w:p>
+      <w:pPr>
+        <w:spacing w:after="40" w:before="180"/>
+      </w:pPr>
+      <w:r>
+        <w:rPr>
+          <w:rFonts w:ascii="Calibri" w:cs="Calibri" w:eastAsia="Calibri" w:hAnsi="Calibri"/>
+          <w:b/>
+          <w:bCs/>
+          <w:i w:val="false"/>
+          <w:iCs w:val="false"/>
+          <w:color w:val="2C3E50"/>
+          <w:sz w:val="26"/>
+          <w:szCs w:val="26"/>
+        </w:rPr>
+        <w:t xml:space="preserve">CCTV Camera Monitor</w:t>
+      </w:r>
+      <w:r>
+        <w:rPr>
+          <w:rFonts w:ascii="Calibri" w:cs="Calibri" w:eastAsia="Calibri" w:hAnsi="Calibri"/>
+          <w:b w:val="false"/>
+          <w:bCs w:val="false"/>
+          <w:i w:val="false"/>
+          <w:iCs w:val="false"/>
+          <w:color w:val="666666"/>
+          <w:sz w:val="20"/>
+          <w:szCs w:val="20"/>
+        </w:rPr>
+        <w:t xml:space="preserve"> — Live Feed &amp; Recording</w:t>
+      </w:r>
+    </w:p>
+    <w:p>
+      <w:pPr>
+        <w:spacing w:after="120"/>
+      </w:pPr>
+      <w:r>
+        <w:rPr>
+          <w:rFonts w:ascii="Calibri" w:cs="Calibri" w:eastAsia="Calibri" w:hAnsi="Calibri"/>
+          <w:b w:val="false"/>
+          <w:bCs w:val="false"/>
+          <w:i w:val="false"/>
+          <w:iCs w:val="false"/>
+          <w:color w:val="333333"/>
+          <w:sz w:val="19"/>
+          <w:szCs w:val="19"/>
+        </w:rPr>
+        <w:t xml:space="preserve">Problem: Home/office setups need a simple way to view live camera feeds and record footage without enterprise NVR software.</w:t>
+      </w:r>
+    </w:p>
+    <w:p>
+      <w:pPr>
+        <w:spacing w:after="120"/>
+      </w:pPr>
+      <w:r>
+        <w:rPr>
+          <w:rFonts w:ascii="Calibri" w:cs="Calibri" w:eastAsia="Calibri" w:hAnsi="Calibri"/>
+          <w:b w:val="false"/>
+          <w:bCs w:val="false"/>
+          <w:i w:val="false"/>
+          <w:iCs w:val="false"/>
+          <w:color w:val="333333"/>
+          <w:sz w:val="19"/>
+          <w:szCs w:val="19"/>
+        </w:rPr>
+        <w:t xml:space="preserve">Built: Camera setup, live viewing, and recording workflows aimed at lightweight surveillance demos.</w:t>
+      </w:r>
+    </w:p>
+    <w:p>
+      <w:pPr>
+        <w:spacing w:after="120"/>
+      </w:pPr>
+      <w:r>
+        <w:rPr>
+          <w:rFonts w:ascii="Calibri" w:cs="Calibri" w:eastAsia="Calibri" w:hAnsi="Calibri"/>
+          <w:b w:val="false"/>
+          <w:bCs w:val="false"/>
+          <w:i w:val="false"/>
+          <w:iCs w:val="false"/>
+          <w:color w:val="333333"/>
+          <w:sz w:val="19"/>
+          <w:szCs w:val="19"/>
+        </w:rPr>
+        <w:t xml:space="preserve">Outcome: Working surveillance monitor prototype with live view and recording.</w:t>
+      </w:r>
+    </w:p>
+    <w:p>
+      <w:pPr>
+        <w:spacing w:after="80"/>
+      </w:pPr>
+      <w:r>
+        <w:rPr>
+          <w:rFonts w:ascii="Calibri" w:cs="Calibri" w:eastAsia="Calibri" w:hAnsi="Calibri"/>
+          <w:b/>
+          <w:bCs/>
+          <w:i w:val="false"/>
+          <w:iCs w:val="false"/>
+          <w:color w:val="333333"/>
+          <w:sz w:val="19"/>
+          <w:szCs w:val="19"/>
+        </w:rPr>
+        <w:t xml:space="preserve">Tech: Python, OpenCV, Flask, Surveillance, Computer Vision</w:t>
+      </w:r>
+    </w:p>
+    <w:p>
+      <w:pPr>
+        <w:spacing w:after="80"/>
+      </w:pPr>
+      <w:hyperlink w:history="1" r:id="rIdglhwr3_del06ykhkhojhl">
+        <w:r>
+          <w:rPr>
+            <w:rFonts w:ascii="Calibri" w:cs="Calibri" w:eastAsia="Calibri" w:hAnsi="Calibri"/>
+            <w:b w:val="false"/>
+            <w:bCs w:val="false"/>
+            <w:i w:val="false"/>
+            <w:iCs w:val="false"/>
+            <w:color w:val="0563C1"/>
+            <w:sz w:val="19"/>
+            <w:szCs w:val="19"/>
+          </w:rPr>
+          <w:t xml:space="preserve">GitHub: https://github.com/Arn-The-Wolf/cctv-camera</w:t>
+        </w:r>
+      </w:hyperlink>
+    </w:p>
+    <w:p>
+      <w:pPr>
+        <w:spacing w:after="40" w:before="60"/>
+      </w:pPr>
+      <w:r>
+        <w:rPr>
+          <w:rFonts w:ascii="Calibri" w:cs="Calibri" w:eastAsia="Calibri" w:hAnsi="Calibri"/>
+          <w:b/>
+          <w:bCs/>
+          <w:i w:val="false"/>
+          <w:iCs w:val="false"/>
+          <w:color w:val="333333"/>
+          <w:sz w:val="19"/>
+          <w:szCs w:val="19"/>
+        </w:rPr>
+        <w:t xml:space="preserve">Key results</w:t>
+      </w:r>
+    </w:p>
+    <w:p>
+      <w:pPr>
+        <w:pStyle w:val="ListParagraph"/>
+        <w:numPr>
+          <w:ilvl w:val="0"/>
+          <w:numId w:val="2"/>
+        </w:numPr>
+        <w:spacing w:after="60"/>
+      </w:pPr>
+      <w:r>
+        <w:rPr>
+          <w:rFonts w:ascii="Calibri" w:cs="Calibri" w:eastAsia="Calibri" w:hAnsi="Calibri"/>
+          <w:b w:val="false"/>
+          <w:bCs w:val="false"/>
+          <w:i w:val="false"/>
+          <w:iCs w:val="false"/>
+          <w:color w:val="333333"/>
+          <w:sz w:val="19"/>
+          <w:szCs w:val="19"/>
+        </w:rPr>
+        <w:t xml:space="preserve">Live camera feeds</w:t>
+      </w:r>
+    </w:p>
+    <w:p>
+      <w:pPr>
+        <w:pStyle w:val="ListParagraph"/>
+        <w:numPr>
+          <w:ilvl w:val="0"/>
+          <w:numId w:val="2"/>
+        </w:numPr>
+        <w:spacing w:after="60"/>
+      </w:pPr>
+      <w:r>
+        <w:rPr>
+          <w:rFonts w:ascii="Calibri" w:cs="Calibri" w:eastAsia="Calibri" w:hAnsi="Calibri"/>
+          <w:b w:val="false"/>
+          <w:bCs w:val="false"/>
+          <w:i w:val="false"/>
+          <w:iCs w:val="false"/>
+          <w:color w:val="333333"/>
+          <w:sz w:val="19"/>
+          <w:szCs w:val="19"/>
+        </w:rPr>
+        <w:t xml:space="preserve">Footage recording</w:t>
+      </w:r>
+    </w:p>
+    <w:p>
+      <w:pPr>
+        <w:spacing w:after="40" w:before="80"/>
+      </w:pPr>
+      <w:r>
+        <w:rPr>
+          <w:rFonts w:ascii="Calibri" w:cs="Calibri" w:eastAsia="Calibri" w:hAnsi="Calibri"/>
+          <w:b/>
+          <w:bCs/>
+          <w:i w:val="false"/>
+          <w:iCs w:val="false"/>
+          <w:color w:val="333333"/>
+          <w:sz w:val="19"/>
+          <w:szCs w:val="19"/>
+        </w:rPr>
+        <w:t xml:space="preserve">Challenges solved</w:t>
+      </w:r>
+    </w:p>
+    <w:p>
+      <w:pPr>
+        <w:pStyle w:val="ListParagraph"/>
+        <w:numPr>
+          <w:ilvl w:val="0"/>
+          <w:numId w:val="2"/>
+        </w:numPr>
+        <w:spacing w:after="60"/>
+      </w:pPr>
+      <w:r>
+        <w:rPr>
+          <w:rFonts w:ascii="Calibri" w:cs="Calibri" w:eastAsia="Calibri" w:hAnsi="Calibri"/>
+          <w:b w:val="false"/>
+          <w:bCs w:val="false"/>
+          <w:i w:val="false"/>
+          <w:iCs w:val="false"/>
+          <w:color w:val="333333"/>
+          <w:sz w:val="19"/>
+          <w:szCs w:val="19"/>
+        </w:rPr>
+        <w:t xml:space="preserve">Live stream latency</w:t>
+      </w:r>
+    </w:p>
+    <w:p>
+      <w:pPr>
+        <w:pStyle w:val="ListParagraph"/>
+        <w:numPr>
+          <w:ilvl w:val="0"/>
+          <w:numId w:val="2"/>
+        </w:numPr>
+        <w:spacing w:after="60"/>
+      </w:pPr>
+      <w:r>
+        <w:rPr>
+          <w:rFonts w:ascii="Calibri" w:cs="Calibri" w:eastAsia="Calibri" w:hAnsi="Calibri"/>
+          <w:b w:val="false"/>
+          <w:bCs w:val="false"/>
+          <w:i w:val="false"/>
+          <w:iCs w:val="false"/>
+          <w:color w:val="333333"/>
+          <w:sz w:val="19"/>
+          <w:szCs w:val="19"/>
+        </w:rPr>
+        <w:t xml:space="preserve">Recording storage</w:t>
+      </w:r>
+    </w:p>
+    <w:p>
+      <w:pPr>
+        <w:pStyle w:val="ListParagraph"/>
+        <w:numPr>
+          <w:ilvl w:val="0"/>
+          <w:numId w:val="2"/>
+        </w:numPr>
+        <w:spacing w:after="60"/>
+      </w:pPr>
+      <w:r>
+        <w:rPr>
+          <w:rFonts w:ascii="Calibri" w:cs="Calibri" w:eastAsia="Calibri" w:hAnsi="Calibri"/>
+          <w:b w:val="false"/>
+          <w:bCs w:val="false"/>
+          <w:i w:val="false"/>
+          <w:iCs w:val="false"/>
+          <w:color w:val="333333"/>
+          <w:sz w:val="19"/>
+          <w:szCs w:val="19"/>
+        </w:rPr>
+        <w:t xml:space="preserve">Multi-camera UX</w:t>
+      </w:r>
+    </w:p>
+    <w:p>
+      <w:pPr>
+        <w:spacing w:after="40" w:before="180"/>
+      </w:pPr>
+      <w:r>
+        <w:rPr>
+          <w:rFonts w:ascii="Calibri" w:cs="Calibri" w:eastAsia="Calibri" w:hAnsi="Calibri"/>
+          <w:b/>
+          <w:bCs/>
+          <w:i w:val="false"/>
+          <w:iCs w:val="false"/>
+          <w:color w:val="2C3E50"/>
+          <w:sz w:val="26"/>
+          <w:szCs w:val="26"/>
+        </w:rPr>
+        <w:t xml:space="preserve">Python Chatbot</w:t>
+      </w:r>
+      <w:r>
+        <w:rPr>
+          <w:rFonts w:ascii="Calibri" w:cs="Calibri" w:eastAsia="Calibri" w:hAnsi="Calibri"/>
+          <w:b w:val="false"/>
+          <w:bCs w:val="false"/>
+          <w:i w:val="false"/>
+          <w:iCs w:val="false"/>
+          <w:color w:val="666666"/>
+          <w:sz w:val="20"/>
+          <w:szCs w:val="20"/>
+        </w:rPr>
+        <w:t xml:space="preserve"> — Conversational AI Prototype</w:t>
+      </w:r>
+    </w:p>
+    <w:p>
+      <w:pPr>
+        <w:spacing w:after="120"/>
+      </w:pPr>
+      <w:r>
+        <w:rPr>
+          <w:rFonts w:ascii="Calibri" w:cs="Calibri" w:eastAsia="Calibri" w:hAnsi="Calibri"/>
+          <w:b w:val="false"/>
+          <w:bCs w:val="false"/>
+          <w:i w:val="false"/>
+          <w:iCs w:val="false"/>
+          <w:color w:val="333333"/>
+          <w:sz w:val="19"/>
+          <w:szCs w:val="19"/>
+        </w:rPr>
+        <w:t xml:space="preserve">Problem: Needed a lightweight chatbot prototype for conversational flows and response handling.</w:t>
+      </w:r>
+    </w:p>
+    <w:p>
+      <w:pPr>
+        <w:spacing w:after="120"/>
+      </w:pPr>
+      <w:r>
+        <w:rPr>
+          <w:rFonts w:ascii="Calibri" w:cs="Calibri" w:eastAsia="Calibri" w:hAnsi="Calibri"/>
+          <w:b w:val="false"/>
+          <w:bCs w:val="false"/>
+          <w:i w:val="false"/>
+          <w:iCs w:val="false"/>
+          <w:color w:val="333333"/>
+          <w:sz w:val="19"/>
+          <w:szCs w:val="19"/>
+        </w:rPr>
+        <w:t xml:space="preserve">Built: Python conversational agent with message handling and response generation workflows.</w:t>
+      </w:r>
+    </w:p>
+    <w:p>
+      <w:pPr>
+        <w:spacing w:after="120"/>
+      </w:pPr>
+      <w:r>
+        <w:rPr>
+          <w:rFonts w:ascii="Calibri" w:cs="Calibri" w:eastAsia="Calibri" w:hAnsi="Calibri"/>
+          <w:b w:val="false"/>
+          <w:bCs w:val="false"/>
+          <w:i w:val="false"/>
+          <w:iCs w:val="false"/>
+          <w:color w:val="333333"/>
+          <w:sz w:val="19"/>
+          <w:szCs w:val="19"/>
+        </w:rPr>
+        <w:t xml:space="preserve">Outcome: Working chatbot prototype with conversational turn handling.</w:t>
+      </w:r>
+    </w:p>
+    <w:p>
+      <w:pPr>
+        <w:spacing w:after="80"/>
+      </w:pPr>
+      <w:r>
+        <w:rPr>
+          <w:rFonts w:ascii="Calibri" w:cs="Calibri" w:eastAsia="Calibri" w:hAnsi="Calibri"/>
+          <w:b/>
+          <w:bCs/>
+          <w:i w:val="false"/>
+          <w:iCs w:val="false"/>
+          <w:color w:val="333333"/>
+          <w:sz w:val="19"/>
+          <w:szCs w:val="19"/>
+        </w:rPr>
+        <w:t xml:space="preserve">Tech: Python, NLP, Chatbot, AI</w:t>
+      </w:r>
+    </w:p>
+    <w:p>
+      <w:pPr>
+        <w:spacing w:after="80"/>
+      </w:pPr>
+      <w:hyperlink w:history="1" r:id="rIdzxehn0jt4_v8h5fmzp63k">
+        <w:r>
+          <w:rPr>
+            <w:rFonts w:ascii="Calibri" w:cs="Calibri" w:eastAsia="Calibri" w:hAnsi="Calibri"/>
+            <w:b w:val="false"/>
+            <w:bCs w:val="false"/>
+            <w:i w:val="false"/>
+            <w:iCs w:val="false"/>
+            <w:color w:val="0563C1"/>
+            <w:sz w:val="19"/>
+            <w:szCs w:val="19"/>
+          </w:rPr>
+          <w:t xml:space="preserve">GitHub: https://github.com/Arn-The-Wolf/chatbot</w:t>
+        </w:r>
+      </w:hyperlink>
+    </w:p>
+    <w:p>
+      <w:pPr>
+        <w:spacing w:after="40" w:before="60"/>
+      </w:pPr>
+      <w:r>
+        <w:rPr>
+          <w:rFonts w:ascii="Calibri" w:cs="Calibri" w:eastAsia="Calibri" w:hAnsi="Calibri"/>
+          <w:b/>
+          <w:bCs/>
+          <w:i w:val="false"/>
+          <w:iCs w:val="false"/>
+          <w:color w:val="333333"/>
+          <w:sz w:val="19"/>
+          <w:szCs w:val="19"/>
+        </w:rPr>
+        <w:t xml:space="preserve">Key results</w:t>
+      </w:r>
+    </w:p>
+    <w:p>
+      <w:pPr>
+        <w:pStyle w:val="ListParagraph"/>
+        <w:numPr>
+          <w:ilvl w:val="0"/>
+          <w:numId w:val="2"/>
+        </w:numPr>
+        <w:spacing w:after="60"/>
+      </w:pPr>
+      <w:r>
+        <w:rPr>
+          <w:rFonts w:ascii="Calibri" w:cs="Calibri" w:eastAsia="Calibri" w:hAnsi="Calibri"/>
+          <w:b w:val="false"/>
+          <w:bCs w:val="false"/>
+          <w:i w:val="false"/>
+          <w:iCs w:val="false"/>
+          <w:color w:val="333333"/>
+          <w:sz w:val="19"/>
+          <w:szCs w:val="19"/>
+        </w:rPr>
+        <w:t xml:space="preserve">Chatbot prototype</w:t>
+      </w:r>
+    </w:p>
+    <w:p>
+      <w:pPr>
+        <w:pStyle w:val="ListParagraph"/>
+        <w:numPr>
+          <w:ilvl w:val="0"/>
+          <w:numId w:val="2"/>
+        </w:numPr>
+        <w:spacing w:after="60"/>
+      </w:pPr>
+      <w:r>
+        <w:rPr>
+          <w:rFonts w:ascii="Calibri" w:cs="Calibri" w:eastAsia="Calibri" w:hAnsi="Calibri"/>
+          <w:b w:val="false"/>
+          <w:bCs w:val="false"/>
+          <w:i w:val="false"/>
+          <w:iCs w:val="false"/>
+          <w:color w:val="333333"/>
+          <w:sz w:val="19"/>
+          <w:szCs w:val="19"/>
+        </w:rPr>
+        <w:t xml:space="preserve">Conversational turn flow</w:t>
+      </w:r>
+    </w:p>
+    <w:p>
+      <w:pPr>
+        <w:spacing w:after="40" w:before="80"/>
+      </w:pPr>
+      <w:r>
+        <w:rPr>
+          <w:rFonts w:ascii="Calibri" w:cs="Calibri" w:eastAsia="Calibri" w:hAnsi="Calibri"/>
+          <w:b/>
+          <w:bCs/>
+          <w:i w:val="false"/>
+          <w:iCs w:val="false"/>
+          <w:color w:val="333333"/>
+          <w:sz w:val="19"/>
+          <w:szCs w:val="19"/>
+        </w:rPr>
+        <w:t xml:space="preserve">Challenges solved</w:t>
+      </w:r>
+    </w:p>
+    <w:p>
+      <w:pPr>
+        <w:pStyle w:val="ListParagraph"/>
+        <w:numPr>
+          <w:ilvl w:val="0"/>
+          <w:numId w:val="2"/>
+        </w:numPr>
+        <w:spacing w:after="60"/>
+      </w:pPr>
+      <w:r>
+        <w:rPr>
+          <w:rFonts w:ascii="Calibri" w:cs="Calibri" w:eastAsia="Calibri" w:hAnsi="Calibri"/>
+          <w:b w:val="false"/>
+          <w:bCs w:val="false"/>
+          <w:i w:val="false"/>
+          <w:iCs w:val="false"/>
+          <w:color w:val="333333"/>
+          <w:sz w:val="19"/>
+          <w:szCs w:val="19"/>
+        </w:rPr>
+        <w:t xml:space="preserve">Response relevance</w:t>
+      </w:r>
+    </w:p>
+    <w:p>
+      <w:pPr>
+        <w:pStyle w:val="ListParagraph"/>
+        <w:numPr>
+          <w:ilvl w:val="0"/>
+          <w:numId w:val="2"/>
+        </w:numPr>
+        <w:spacing w:after="60"/>
+      </w:pPr>
+      <w:r>
+        <w:rPr>
+          <w:rFonts w:ascii="Calibri" w:cs="Calibri" w:eastAsia="Calibri" w:hAnsi="Calibri"/>
+          <w:b w:val="false"/>
+          <w:bCs w:val="false"/>
+          <w:i w:val="false"/>
+          <w:iCs w:val="false"/>
+          <w:color w:val="333333"/>
+          <w:sz w:val="19"/>
+          <w:szCs w:val="19"/>
+        </w:rPr>
+        <w:t xml:space="preserve">Conversation state</w:t>
+      </w:r>
+    </w:p>
+    <w:p>
       <w:r>
         <w:br w:type="page"/>
       </w:r>
@@ -10203,7 +12920,7 @@
       <w:pPr>
         <w:spacing w:after="80"/>
       </w:pPr>
-      <w:hyperlink w:history="1" r:id="rIdvrk32-fdcxdo-tt8tanu4">
+      <w:hyperlink w:history="1" r:id="rId1eop4u7jirpiyrrbwrvg6">
         <w:r>
           <w:rPr>
             <w:rFonts w:ascii="Calibri" w:cs="Calibri" w:eastAsia="Calibri" w:hAnsi="Calibri"/>
@@ -10391,6 +13108,1002 @@
           <w:szCs w:val="19"/>
         </w:rPr>
         <w:t xml:space="preserve">Sensor calibration</w:t>
+      </w:r>
+    </w:p>
+    <w:p>
+      <w:pPr>
+        <w:spacing w:after="40" w:before="80"/>
+      </w:pPr>
+      <w:r>
+        <w:rPr>
+          <w:rFonts w:ascii="Calibri" w:cs="Calibri" w:eastAsia="Calibri" w:hAnsi="Calibri"/>
+          <w:b/>
+          <w:bCs/>
+          <w:i w:val="false"/>
+          <w:iCs w:val="false"/>
+          <w:color w:val="333333"/>
+          <w:sz w:val="19"/>
+          <w:szCs w:val="19"/>
+        </w:rPr>
+        <w:t xml:space="preserve">Impact metrics</w:t>
+      </w:r>
+    </w:p>
+    <w:p>
+      <w:pPr>
+        <w:pStyle w:val="ListParagraph"/>
+        <w:numPr>
+          <w:ilvl w:val="0"/>
+          <w:numId w:val="2"/>
+        </w:numPr>
+        <w:spacing w:after="60"/>
+      </w:pPr>
+      <w:r>
+        <w:rPr>
+          <w:rFonts w:ascii="Calibri" w:cs="Calibri" w:eastAsia="Calibri" w:hAnsi="Calibri"/>
+          <w:b w:val="false"/>
+          <w:bCs w:val="false"/>
+          <w:i w:val="false"/>
+          <w:iCs w:val="false"/>
+          <w:color w:val="333333"/>
+          <w:sz w:val="19"/>
+          <w:szCs w:val="19"/>
+        </w:rPr>
+        <w:t xml:space="preserve">Data Pipeline: Manual → MQTT live stream (Real-time)</w:t>
+      </w:r>
+    </w:p>
+    <w:p>
+      <w:pPr>
+        <w:pStyle w:val="ListParagraph"/>
+        <w:numPr>
+          <w:ilvl w:val="0"/>
+          <w:numId w:val="2"/>
+        </w:numPr>
+        <w:spacing w:after="60"/>
+      </w:pPr>
+      <w:r>
+        <w:rPr>
+          <w:rFonts w:ascii="Calibri" w:cs="Calibri" w:eastAsia="Calibri" w:hAnsi="Calibri"/>
+          <w:b w:val="false"/>
+          <w:bCs w:val="false"/>
+          <w:i w:val="false"/>
+          <w:iCs w:val="false"/>
+          <w:color w:val="333333"/>
+          <w:sz w:val="19"/>
+          <w:szCs w:val="19"/>
+        </w:rPr>
+        <w:t xml:space="preserve">Backend: None → Flask + MQTT (Complete)</w:t>
+      </w:r>
+    </w:p>
+    <w:p>
+      <w:pPr>
+        <w:pStyle w:val="ListParagraph"/>
+        <w:numPr>
+          <w:ilvl w:val="0"/>
+          <w:numId w:val="2"/>
+        </w:numPr>
+        <w:spacing w:after="60"/>
+      </w:pPr>
+      <w:r>
+        <w:rPr>
+          <w:rFonts w:ascii="Calibri" w:cs="Calibri" w:eastAsia="Calibri" w:hAnsi="Calibri"/>
+          <w:b w:val="false"/>
+          <w:bCs w:val="false"/>
+          <w:i w:val="false"/>
+          <w:iCs w:val="false"/>
+          <w:color w:val="333333"/>
+          <w:sz w:val="19"/>
+          <w:szCs w:val="19"/>
+        </w:rPr>
+        <w:t xml:space="preserve">Deployment: Local → Dockerized (Portable)</w:t>
+      </w:r>
+    </w:p>
+    <w:p>
+      <w:pPr>
+        <w:spacing w:after="40" w:before="180"/>
+      </w:pPr>
+      <w:r>
+        <w:rPr>
+          <w:rFonts w:ascii="Calibri" w:cs="Calibri" w:eastAsia="Calibri" w:hAnsi="Calibri"/>
+          <w:b/>
+          <w:bCs/>
+          <w:i w:val="false"/>
+          <w:iCs w:val="false"/>
+          <w:color w:val="2C3E50"/>
+          <w:sz w:val="26"/>
+          <w:szCs w:val="26"/>
+        </w:rPr>
+        <w:t xml:space="preserve">IoT Light Scheduler</w:t>
+      </w:r>
+      <w:r>
+        <w:rPr>
+          <w:rFonts w:ascii="Calibri" w:cs="Calibri" w:eastAsia="Calibri" w:hAnsi="Calibri"/>
+          <w:b w:val="false"/>
+          <w:bCs w:val="false"/>
+          <w:i w:val="false"/>
+          <w:iCs w:val="false"/>
+          <w:color w:val="666666"/>
+          <w:sz w:val="20"/>
+          <w:szCs w:val="20"/>
+        </w:rPr>
+        <w:t xml:space="preserve"> — WebSocket + MQTT Smart Home</w:t>
+      </w:r>
+    </w:p>
+    <w:p>
+      <w:pPr>
+        <w:spacing w:after="120"/>
+      </w:pPr>
+      <w:r>
+        <w:rPr>
+          <w:rFonts w:ascii="Calibri" w:cs="Calibri" w:eastAsia="Calibri" w:hAnsi="Calibri"/>
+          <w:b w:val="false"/>
+          <w:bCs w:val="false"/>
+          <w:i w:val="false"/>
+          <w:iCs w:val="false"/>
+          <w:color w:val="333333"/>
+          <w:sz w:val="19"/>
+          <w:szCs w:val="19"/>
+        </w:rPr>
+        <w:t xml:space="preserve">Problem: Smart-home demos need a graphical scheduler that bridges web UI, WebSocket, MQTT, and Arduino hardware.</w:t>
+      </w:r>
+    </w:p>
+    <w:p>
+      <w:pPr>
+        <w:spacing w:after="120"/>
+      </w:pPr>
+      <w:r>
+        <w:rPr>
+          <w:rFonts w:ascii="Calibri" w:cs="Calibri" w:eastAsia="Calibri" w:hAnsi="Calibri"/>
+          <w:b w:val="false"/>
+          <w:bCs w:val="false"/>
+          <w:i w:val="false"/>
+          <w:iCs w:val="false"/>
+          <w:color w:val="333333"/>
+          <w:sz w:val="19"/>
+          <w:szCs w:val="19"/>
+        </w:rPr>
+        <w:t xml:space="preserve">Built: Python web dashboard with WebSocket live updates, MQTT device control, and Arduino-linked light scheduling.</w:t>
+      </w:r>
+    </w:p>
+    <w:p>
+      <w:pPr>
+        <w:spacing w:after="120"/>
+      </w:pPr>
+      <w:r>
+        <w:rPr>
+          <w:rFonts w:ascii="Calibri" w:cs="Calibri" w:eastAsia="Calibri" w:hAnsi="Calibri"/>
+          <w:b w:val="false"/>
+          <w:bCs w:val="false"/>
+          <w:i w:val="false"/>
+          <w:iCs w:val="false"/>
+          <w:color w:val="333333"/>
+          <w:sz w:val="19"/>
+          <w:szCs w:val="19"/>
+        </w:rPr>
+        <w:t xml:space="preserve">Outcome: End-to-end light scheduling demo from web UI to hardware.</w:t>
+      </w:r>
+    </w:p>
+    <w:p>
+      <w:pPr>
+        <w:spacing w:after="80"/>
+      </w:pPr>
+      <w:r>
+        <w:rPr>
+          <w:rFonts w:ascii="Calibri" w:cs="Calibri" w:eastAsia="Calibri" w:hAnsi="Calibri"/>
+          <w:b/>
+          <w:bCs/>
+          <w:i w:val="false"/>
+          <w:iCs w:val="false"/>
+          <w:color w:val="333333"/>
+          <w:sz w:val="19"/>
+          <w:szCs w:val="19"/>
+        </w:rPr>
+        <w:t xml:space="preserve">Tech: Python, MQTT, WebSocket, Arduino, IoT, Flask</w:t>
+      </w:r>
+    </w:p>
+    <w:p>
+      <w:pPr>
+        <w:spacing w:after="80"/>
+      </w:pPr>
+      <w:hyperlink w:history="1" r:id="rIdon4aoqkozvtunu_u7skj-">
+        <w:r>
+          <w:rPr>
+            <w:rFonts w:ascii="Calibri" w:cs="Calibri" w:eastAsia="Calibri" w:hAnsi="Calibri"/>
+            <w:b w:val="false"/>
+            <w:bCs w:val="false"/>
+            <w:i w:val="false"/>
+            <w:iCs w:val="false"/>
+            <w:color w:val="0563C1"/>
+            <w:sz w:val="19"/>
+            <w:szCs w:val="19"/>
+          </w:rPr>
+          <w:t xml:space="preserve">GitHub: https://github.com/Arn-The-Wolf/Web-based-Light-Scheduler</w:t>
+        </w:r>
+      </w:hyperlink>
+    </w:p>
+    <w:p>
+      <w:pPr>
+        <w:spacing w:after="40" w:before="60"/>
+      </w:pPr>
+      <w:r>
+        <w:rPr>
+          <w:rFonts w:ascii="Calibri" w:cs="Calibri" w:eastAsia="Calibri" w:hAnsi="Calibri"/>
+          <w:b/>
+          <w:bCs/>
+          <w:i w:val="false"/>
+          <w:iCs w:val="false"/>
+          <w:color w:val="333333"/>
+          <w:sz w:val="19"/>
+          <w:szCs w:val="19"/>
+        </w:rPr>
+        <w:t xml:space="preserve">Key results</w:t>
+      </w:r>
+    </w:p>
+    <w:p>
+      <w:pPr>
+        <w:pStyle w:val="ListParagraph"/>
+        <w:numPr>
+          <w:ilvl w:val="0"/>
+          <w:numId w:val="2"/>
+        </w:numPr>
+        <w:spacing w:after="60"/>
+      </w:pPr>
+      <w:r>
+        <w:rPr>
+          <w:rFonts w:ascii="Calibri" w:cs="Calibri" w:eastAsia="Calibri" w:hAnsi="Calibri"/>
+          <w:b w:val="false"/>
+          <w:bCs w:val="false"/>
+          <w:i w:val="false"/>
+          <w:iCs w:val="false"/>
+          <w:color w:val="333333"/>
+          <w:sz w:val="19"/>
+          <w:szCs w:val="19"/>
+        </w:rPr>
+        <w:t xml:space="preserve">Graphical light scheduler</w:t>
+      </w:r>
+    </w:p>
+    <w:p>
+      <w:pPr>
+        <w:pStyle w:val="ListParagraph"/>
+        <w:numPr>
+          <w:ilvl w:val="0"/>
+          <w:numId w:val="2"/>
+        </w:numPr>
+        <w:spacing w:after="60"/>
+      </w:pPr>
+      <w:r>
+        <w:rPr>
+          <w:rFonts w:ascii="Calibri" w:cs="Calibri" w:eastAsia="Calibri" w:hAnsi="Calibri"/>
+          <w:b w:val="false"/>
+          <w:bCs w:val="false"/>
+          <w:i w:val="false"/>
+          <w:iCs w:val="false"/>
+          <w:color w:val="333333"/>
+          <w:sz w:val="19"/>
+          <w:szCs w:val="19"/>
+        </w:rPr>
+        <w:t xml:space="preserve">MQTT device control</w:t>
+      </w:r>
+    </w:p>
+    <w:p>
+      <w:pPr>
+        <w:pStyle w:val="ListParagraph"/>
+        <w:numPr>
+          <w:ilvl w:val="0"/>
+          <w:numId w:val="2"/>
+        </w:numPr>
+        <w:spacing w:after="60"/>
+      </w:pPr>
+      <w:r>
+        <w:rPr>
+          <w:rFonts w:ascii="Calibri" w:cs="Calibri" w:eastAsia="Calibri" w:hAnsi="Calibri"/>
+          <w:b w:val="false"/>
+          <w:bCs w:val="false"/>
+          <w:i w:val="false"/>
+          <w:iCs w:val="false"/>
+          <w:color w:val="333333"/>
+          <w:sz w:val="19"/>
+          <w:szCs w:val="19"/>
+        </w:rPr>
+        <w:t xml:space="preserve">Smart-home demo</w:t>
+      </w:r>
+    </w:p>
+    <w:p>
+      <w:pPr>
+        <w:spacing w:after="40" w:before="80"/>
+      </w:pPr>
+      <w:r>
+        <w:rPr>
+          <w:rFonts w:ascii="Calibri" w:cs="Calibri" w:eastAsia="Calibri" w:hAnsi="Calibri"/>
+          <w:b/>
+          <w:bCs/>
+          <w:i w:val="false"/>
+          <w:iCs w:val="false"/>
+          <w:color w:val="333333"/>
+          <w:sz w:val="19"/>
+          <w:szCs w:val="19"/>
+        </w:rPr>
+        <w:t xml:space="preserve">Challenges solved</w:t>
+      </w:r>
+    </w:p>
+    <w:p>
+      <w:pPr>
+        <w:pStyle w:val="ListParagraph"/>
+        <w:numPr>
+          <w:ilvl w:val="0"/>
+          <w:numId w:val="2"/>
+        </w:numPr>
+        <w:spacing w:after="60"/>
+      </w:pPr>
+      <w:r>
+        <w:rPr>
+          <w:rFonts w:ascii="Calibri" w:cs="Calibri" w:eastAsia="Calibri" w:hAnsi="Calibri"/>
+          <w:b w:val="false"/>
+          <w:bCs w:val="false"/>
+          <w:i w:val="false"/>
+          <w:iCs w:val="false"/>
+          <w:color w:val="333333"/>
+          <w:sz w:val="19"/>
+          <w:szCs w:val="19"/>
+        </w:rPr>
+        <w:t xml:space="preserve">WebSocket + MQTT sync</w:t>
+      </w:r>
+    </w:p>
+    <w:p>
+      <w:pPr>
+        <w:pStyle w:val="ListParagraph"/>
+        <w:numPr>
+          <w:ilvl w:val="0"/>
+          <w:numId w:val="2"/>
+        </w:numPr>
+        <w:spacing w:after="60"/>
+      </w:pPr>
+      <w:r>
+        <w:rPr>
+          <w:rFonts w:ascii="Calibri" w:cs="Calibri" w:eastAsia="Calibri" w:hAnsi="Calibri"/>
+          <w:b w:val="false"/>
+          <w:bCs w:val="false"/>
+          <w:i w:val="false"/>
+          <w:iCs w:val="false"/>
+          <w:color w:val="333333"/>
+          <w:sz w:val="19"/>
+          <w:szCs w:val="19"/>
+        </w:rPr>
+        <w:t xml:space="preserve">Schedule reliability</w:t>
+      </w:r>
+    </w:p>
+    <w:p>
+      <w:pPr>
+        <w:pStyle w:val="ListParagraph"/>
+        <w:numPr>
+          <w:ilvl w:val="0"/>
+          <w:numId w:val="2"/>
+        </w:numPr>
+        <w:spacing w:after="60"/>
+      </w:pPr>
+      <w:r>
+        <w:rPr>
+          <w:rFonts w:ascii="Calibri" w:cs="Calibri" w:eastAsia="Calibri" w:hAnsi="Calibri"/>
+          <w:b w:val="false"/>
+          <w:bCs w:val="false"/>
+          <w:i w:val="false"/>
+          <w:iCs w:val="false"/>
+          <w:color w:val="333333"/>
+          <w:sz w:val="19"/>
+          <w:szCs w:val="19"/>
+        </w:rPr>
+        <w:t xml:space="preserve">Arduino integration</w:t>
+      </w:r>
+    </w:p>
+    <w:p>
+      <w:pPr>
+        <w:spacing w:after="40" w:before="80"/>
+      </w:pPr>
+      <w:r>
+        <w:rPr>
+          <w:rFonts w:ascii="Calibri" w:cs="Calibri" w:eastAsia="Calibri" w:hAnsi="Calibri"/>
+          <w:b/>
+          <w:bCs/>
+          <w:i w:val="false"/>
+          <w:iCs w:val="false"/>
+          <w:color w:val="333333"/>
+          <w:sz w:val="19"/>
+          <w:szCs w:val="19"/>
+        </w:rPr>
+        <w:t xml:space="preserve">Impact metrics</w:t>
+      </w:r>
+    </w:p>
+    <w:p>
+      <w:pPr>
+        <w:pStyle w:val="ListParagraph"/>
+        <w:numPr>
+          <w:ilvl w:val="0"/>
+          <w:numId w:val="2"/>
+        </w:numPr>
+        <w:spacing w:after="60"/>
+      </w:pPr>
+      <w:r>
+        <w:rPr>
+          <w:rFonts w:ascii="Calibri" w:cs="Calibri" w:eastAsia="Calibri" w:hAnsi="Calibri"/>
+          <w:b w:val="false"/>
+          <w:bCs w:val="false"/>
+          <w:i w:val="false"/>
+          <w:iCs w:val="false"/>
+          <w:color w:val="333333"/>
+          <w:sz w:val="19"/>
+          <w:szCs w:val="19"/>
+        </w:rPr>
+        <w:t xml:space="preserve">Data Pipeline: Manual → MQTT live stream (Real-time)</w:t>
+      </w:r>
+    </w:p>
+    <w:p>
+      <w:pPr>
+        <w:pStyle w:val="ListParagraph"/>
+        <w:numPr>
+          <w:ilvl w:val="0"/>
+          <w:numId w:val="2"/>
+        </w:numPr>
+        <w:spacing w:after="60"/>
+      </w:pPr>
+      <w:r>
+        <w:rPr>
+          <w:rFonts w:ascii="Calibri" w:cs="Calibri" w:eastAsia="Calibri" w:hAnsi="Calibri"/>
+          <w:b w:val="false"/>
+          <w:bCs w:val="false"/>
+          <w:i w:val="false"/>
+          <w:iCs w:val="false"/>
+          <w:color w:val="333333"/>
+          <w:sz w:val="19"/>
+          <w:szCs w:val="19"/>
+        </w:rPr>
+        <w:t xml:space="preserve">Backend: None → Flask + MQTT (Complete)</w:t>
+      </w:r>
+    </w:p>
+    <w:p>
+      <w:pPr>
+        <w:pStyle w:val="ListParagraph"/>
+        <w:numPr>
+          <w:ilvl w:val="0"/>
+          <w:numId w:val="2"/>
+        </w:numPr>
+        <w:spacing w:after="60"/>
+      </w:pPr>
+      <w:r>
+        <w:rPr>
+          <w:rFonts w:ascii="Calibri" w:cs="Calibri" w:eastAsia="Calibri" w:hAnsi="Calibri"/>
+          <w:b w:val="false"/>
+          <w:bCs w:val="false"/>
+          <w:i w:val="false"/>
+          <w:iCs w:val="false"/>
+          <w:color w:val="333333"/>
+          <w:sz w:val="19"/>
+          <w:szCs w:val="19"/>
+        </w:rPr>
+        <w:t xml:space="preserve">Deployment: Local → Dockerized (Portable)</w:t>
+      </w:r>
+    </w:p>
+    <w:p>
+      <w:pPr>
+        <w:spacing w:after="40" w:before="180"/>
+      </w:pPr>
+      <w:r>
+        <w:rPr>
+          <w:rFonts w:ascii="Calibri" w:cs="Calibri" w:eastAsia="Calibri" w:hAnsi="Calibri"/>
+          <w:b/>
+          <w:bCs/>
+          <w:i w:val="false"/>
+          <w:iCs w:val="false"/>
+          <w:color w:val="2C3E50"/>
+          <w:sz w:val="26"/>
+          <w:szCs w:val="26"/>
+        </w:rPr>
+        <w:t xml:space="preserve">Automatic Gate Demo Kit</w:t>
+      </w:r>
+      <w:r>
+        <w:rPr>
+          <w:rFonts w:ascii="Calibri" w:cs="Calibri" w:eastAsia="Calibri" w:hAnsi="Calibri"/>
+          <w:b w:val="false"/>
+          <w:bCs w:val="false"/>
+          <w:i w:val="false"/>
+          <w:iCs w:val="false"/>
+          <w:color w:val="666666"/>
+          <w:sz w:val="20"/>
+          <w:szCs w:val="20"/>
+        </w:rPr>
+        <w:t xml:space="preserve"> — Arduino Sensor-Driven Gate</w:t>
+      </w:r>
+    </w:p>
+    <w:p>
+      <w:pPr>
+        <w:spacing w:after="120"/>
+      </w:pPr>
+      <w:r>
+        <w:rPr>
+          <w:rFonts w:ascii="Calibri" w:cs="Calibri" w:eastAsia="Calibri" w:hAnsi="Calibri"/>
+          <w:b w:val="false"/>
+          <w:bCs w:val="false"/>
+          <w:i w:val="false"/>
+          <w:iCs w:val="false"/>
+          <w:color w:val="333333"/>
+          <w:sz w:val="19"/>
+          <w:szCs w:val="19"/>
+        </w:rPr>
+        <w:t xml:space="preserve">Problem: Embedded demos need clear sensor → decision → actuator flows for access control prototypes.</w:t>
+      </w:r>
+    </w:p>
+    <w:p>
+      <w:pPr>
+        <w:spacing w:after="120"/>
+      </w:pPr>
+      <w:r>
+        <w:rPr>
+          <w:rFonts w:ascii="Calibri" w:cs="Calibri" w:eastAsia="Calibri" w:hAnsi="Calibri"/>
+          <w:b w:val="false"/>
+          <w:bCs w:val="false"/>
+          <w:i w:val="false"/>
+          <w:iCs w:val="false"/>
+          <w:color w:val="333333"/>
+          <w:sz w:val="19"/>
+          <w:szCs w:val="19"/>
+        </w:rPr>
+        <w:t xml:space="preserve">Built: C++ Arduino firmware with sensor reads, decision logic, servo gate motion, LED status, and buzzer alerts.</w:t>
+      </w:r>
+    </w:p>
+    <w:p>
+      <w:pPr>
+        <w:spacing w:after="120"/>
+      </w:pPr>
+      <w:r>
+        <w:rPr>
+          <w:rFonts w:ascii="Calibri" w:cs="Calibri" w:eastAsia="Calibri" w:hAnsi="Calibri"/>
+          <w:b w:val="false"/>
+          <w:bCs w:val="false"/>
+          <w:i w:val="false"/>
+          <w:iCs w:val="false"/>
+          <w:color w:val="333333"/>
+          <w:sz w:val="19"/>
+          <w:szCs w:val="19"/>
+        </w:rPr>
+        <w:t xml:space="preserve">Outcome: Working Arduino gate automation with sensor-driven actuation.</w:t>
+      </w:r>
+    </w:p>
+    <w:p>
+      <w:pPr>
+        <w:spacing w:after="80"/>
+      </w:pPr>
+      <w:r>
+        <w:rPr>
+          <w:rFonts w:ascii="Calibri" w:cs="Calibri" w:eastAsia="Calibri" w:hAnsi="Calibri"/>
+          <w:b/>
+          <w:bCs/>
+          <w:i w:val="false"/>
+          <w:iCs w:val="false"/>
+          <w:color w:val="333333"/>
+          <w:sz w:val="19"/>
+          <w:szCs w:val="19"/>
+        </w:rPr>
+        <w:t xml:space="preserve">Tech: C++, Arduino, Servo, Sensors, Embedded, IoT</w:t>
+      </w:r>
+    </w:p>
+    <w:p>
+      <w:pPr>
+        <w:spacing w:after="80"/>
+      </w:pPr>
+      <w:hyperlink w:history="1" r:id="rIdtrlbgdb7nez75emk8fuq4">
+        <w:r>
+          <w:rPr>
+            <w:rFonts w:ascii="Calibri" w:cs="Calibri" w:eastAsia="Calibri" w:hAnsi="Calibri"/>
+            <w:b w:val="false"/>
+            <w:bCs w:val="false"/>
+            <w:i w:val="false"/>
+            <w:iCs w:val="false"/>
+            <w:color w:val="0563C1"/>
+            <w:sz w:val="19"/>
+            <w:szCs w:val="19"/>
+          </w:rPr>
+          <w:t xml:space="preserve">GitHub: https://github.com/Arn-The-Wolf/-Automatic-Gate-Demo-Kit</w:t>
+        </w:r>
+      </w:hyperlink>
+    </w:p>
+    <w:p>
+      <w:pPr>
+        <w:spacing w:after="40" w:before="60"/>
+      </w:pPr>
+      <w:r>
+        <w:rPr>
+          <w:rFonts w:ascii="Calibri" w:cs="Calibri" w:eastAsia="Calibri" w:hAnsi="Calibri"/>
+          <w:b/>
+          <w:bCs/>
+          <w:i w:val="false"/>
+          <w:iCs w:val="false"/>
+          <w:color w:val="333333"/>
+          <w:sz w:val="19"/>
+          <w:szCs w:val="19"/>
+        </w:rPr>
+        <w:t xml:space="preserve">Key results</w:t>
+      </w:r>
+    </w:p>
+    <w:p>
+      <w:pPr>
+        <w:pStyle w:val="ListParagraph"/>
+        <w:numPr>
+          <w:ilvl w:val="0"/>
+          <w:numId w:val="2"/>
+        </w:numPr>
+        <w:spacing w:after="60"/>
+      </w:pPr>
+      <w:r>
+        <w:rPr>
+          <w:rFonts w:ascii="Calibri" w:cs="Calibri" w:eastAsia="Calibri" w:hAnsi="Calibri"/>
+          <w:b w:val="false"/>
+          <w:bCs w:val="false"/>
+          <w:i w:val="false"/>
+          <w:iCs w:val="false"/>
+          <w:color w:val="333333"/>
+          <w:sz w:val="19"/>
+          <w:szCs w:val="19"/>
+        </w:rPr>
+        <w:t xml:space="preserve">Sensor-driven gate</w:t>
+      </w:r>
+    </w:p>
+    <w:p>
+      <w:pPr>
+        <w:pStyle w:val="ListParagraph"/>
+        <w:numPr>
+          <w:ilvl w:val="0"/>
+          <w:numId w:val="2"/>
+        </w:numPr>
+        <w:spacing w:after="60"/>
+      </w:pPr>
+      <w:r>
+        <w:rPr>
+          <w:rFonts w:ascii="Calibri" w:cs="Calibri" w:eastAsia="Calibri" w:hAnsi="Calibri"/>
+          <w:b w:val="false"/>
+          <w:bCs w:val="false"/>
+          <w:i w:val="false"/>
+          <w:iCs w:val="false"/>
+          <w:color w:val="333333"/>
+          <w:sz w:val="19"/>
+          <w:szCs w:val="19"/>
+        </w:rPr>
+        <w:t xml:space="preserve">LED + buzzer feedback</w:t>
+      </w:r>
+    </w:p>
+    <w:p>
+      <w:pPr>
+        <w:spacing w:after="40" w:before="80"/>
+      </w:pPr>
+      <w:r>
+        <w:rPr>
+          <w:rFonts w:ascii="Calibri" w:cs="Calibri" w:eastAsia="Calibri" w:hAnsi="Calibri"/>
+          <w:b/>
+          <w:bCs/>
+          <w:i w:val="false"/>
+          <w:iCs w:val="false"/>
+          <w:color w:val="333333"/>
+          <w:sz w:val="19"/>
+          <w:szCs w:val="19"/>
+        </w:rPr>
+        <w:t xml:space="preserve">Challenges solved</w:t>
+      </w:r>
+    </w:p>
+    <w:p>
+      <w:pPr>
+        <w:pStyle w:val="ListParagraph"/>
+        <w:numPr>
+          <w:ilvl w:val="0"/>
+          <w:numId w:val="2"/>
+        </w:numPr>
+        <w:spacing w:after="60"/>
+      </w:pPr>
+      <w:r>
+        <w:rPr>
+          <w:rFonts w:ascii="Calibri" w:cs="Calibri" w:eastAsia="Calibri" w:hAnsi="Calibri"/>
+          <w:b w:val="false"/>
+          <w:bCs w:val="false"/>
+          <w:i w:val="false"/>
+          <w:iCs w:val="false"/>
+          <w:color w:val="333333"/>
+          <w:sz w:val="19"/>
+          <w:szCs w:val="19"/>
+        </w:rPr>
+        <w:t xml:space="preserve">Sensor noise</w:t>
+      </w:r>
+    </w:p>
+    <w:p>
+      <w:pPr>
+        <w:pStyle w:val="ListParagraph"/>
+        <w:numPr>
+          <w:ilvl w:val="0"/>
+          <w:numId w:val="2"/>
+        </w:numPr>
+        <w:spacing w:after="60"/>
+      </w:pPr>
+      <w:r>
+        <w:rPr>
+          <w:rFonts w:ascii="Calibri" w:cs="Calibri" w:eastAsia="Calibri" w:hAnsi="Calibri"/>
+          <w:b w:val="false"/>
+          <w:bCs w:val="false"/>
+          <w:i w:val="false"/>
+          <w:iCs w:val="false"/>
+          <w:color w:val="333333"/>
+          <w:sz w:val="19"/>
+          <w:szCs w:val="19"/>
+        </w:rPr>
+        <w:t xml:space="preserve">Servo timing</w:t>
+      </w:r>
+    </w:p>
+    <w:p>
+      <w:pPr>
+        <w:pStyle w:val="ListParagraph"/>
+        <w:numPr>
+          <w:ilvl w:val="0"/>
+          <w:numId w:val="2"/>
+        </w:numPr>
+        <w:spacing w:after="60"/>
+      </w:pPr>
+      <w:r>
+        <w:rPr>
+          <w:rFonts w:ascii="Calibri" w:cs="Calibri" w:eastAsia="Calibri" w:hAnsi="Calibri"/>
+          <w:b w:val="false"/>
+          <w:bCs w:val="false"/>
+          <w:i w:val="false"/>
+          <w:iCs w:val="false"/>
+          <w:color w:val="333333"/>
+          <w:sz w:val="19"/>
+          <w:szCs w:val="19"/>
+        </w:rPr>
+        <w:t xml:space="preserve">Clear demo UX</w:t>
+      </w:r>
+    </w:p>
+    <w:p>
+      <w:pPr>
+        <w:spacing w:after="40" w:before="180"/>
+      </w:pPr>
+      <w:r>
+        <w:rPr>
+          <w:rFonts w:ascii="Calibri" w:cs="Calibri" w:eastAsia="Calibri" w:hAnsi="Calibri"/>
+          <w:b/>
+          <w:bCs/>
+          <w:i w:val="false"/>
+          <w:iCs w:val="false"/>
+          <w:color w:val="2C3E50"/>
+          <w:sz w:val="26"/>
+          <w:szCs w:val="26"/>
+        </w:rPr>
+        <w:t xml:space="preserve">MQTT Light Control</w:t>
+      </w:r>
+      <w:r>
+        <w:rPr>
+          <w:rFonts w:ascii="Calibri" w:cs="Calibri" w:eastAsia="Calibri" w:hAnsi="Calibri"/>
+          <w:b w:val="false"/>
+          <w:bCs w:val="false"/>
+          <w:i w:val="false"/>
+          <w:iCs w:val="false"/>
+          <w:color w:val="666666"/>
+          <w:sz w:val="20"/>
+          <w:szCs w:val="20"/>
+        </w:rPr>
+        <w:t xml:space="preserve"> — IoT Light Switch Simulator</w:t>
+      </w:r>
+    </w:p>
+    <w:p>
+      <w:pPr>
+        <w:spacing w:after="120"/>
+      </w:pPr>
+      <w:r>
+        <w:rPr>
+          <w:rFonts w:ascii="Calibri" w:cs="Calibri" w:eastAsia="Calibri" w:hAnsi="Calibri"/>
+          <w:b w:val="false"/>
+          <w:bCs w:val="false"/>
+          <w:i w:val="false"/>
+          <w:iCs w:val="false"/>
+          <w:color w:val="333333"/>
+          <w:sz w:val="19"/>
+          <w:szCs w:val="19"/>
+        </w:rPr>
+        <w:t xml:space="preserve">Problem: Needed a simple web UI to control a simulated IoT light over MQTT for teaching pub/sub concepts.</w:t>
+      </w:r>
+    </w:p>
+    <w:p>
+      <w:pPr>
+        <w:spacing w:after="120"/>
+      </w:pPr>
+      <w:r>
+        <w:rPr>
+          <w:rFonts w:ascii="Calibri" w:cs="Calibri" w:eastAsia="Calibri" w:hAnsi="Calibri"/>
+          <w:b w:val="false"/>
+          <w:bCs w:val="false"/>
+          <w:i w:val="false"/>
+          <w:iCs w:val="false"/>
+          <w:color w:val="333333"/>
+          <w:sz w:val="19"/>
+          <w:szCs w:val="19"/>
+        </w:rPr>
+        <w:t xml:space="preserve">Built: HTML/web client with Python MQTT bridge for on/off light control simulation.</w:t>
+      </w:r>
+    </w:p>
+    <w:p>
+      <w:pPr>
+        <w:spacing w:after="120"/>
+      </w:pPr>
+      <w:r>
+        <w:rPr>
+          <w:rFonts w:ascii="Calibri" w:cs="Calibri" w:eastAsia="Calibri" w:hAnsi="Calibri"/>
+          <w:b w:val="false"/>
+          <w:bCs w:val="false"/>
+          <w:i w:val="false"/>
+          <w:iCs w:val="false"/>
+          <w:color w:val="333333"/>
+          <w:sz w:val="19"/>
+          <w:szCs w:val="19"/>
+        </w:rPr>
+        <w:t xml:space="preserve">Outcome: Working browser-to-MQTT light control simulator.</w:t>
+      </w:r>
+    </w:p>
+    <w:p>
+      <w:pPr>
+        <w:spacing w:after="80"/>
+      </w:pPr>
+      <w:r>
+        <w:rPr>
+          <w:rFonts w:ascii="Calibri" w:cs="Calibri" w:eastAsia="Calibri" w:hAnsi="Calibri"/>
+          <w:b/>
+          <w:bCs/>
+          <w:i w:val="false"/>
+          <w:iCs w:val="false"/>
+          <w:color w:val="333333"/>
+          <w:sz w:val="19"/>
+          <w:szCs w:val="19"/>
+        </w:rPr>
+        <w:t xml:space="preserve">Tech: HTML, Python, MQTT, IoT</w:t>
+      </w:r>
+    </w:p>
+    <w:p>
+      <w:pPr>
+        <w:spacing w:after="80"/>
+      </w:pPr>
+      <w:hyperlink w:history="1" r:id="rIdadnhmktax4pcc1robaleg">
+        <w:r>
+          <w:rPr>
+            <w:rFonts w:ascii="Calibri" w:cs="Calibri" w:eastAsia="Calibri" w:hAnsi="Calibri"/>
+            <w:b w:val="false"/>
+            <w:bCs w:val="false"/>
+            <w:i w:val="false"/>
+            <w:iCs w:val="false"/>
+            <w:color w:val="0563C1"/>
+            <w:sz w:val="19"/>
+            <w:szCs w:val="19"/>
+          </w:rPr>
+          <w:t xml:space="preserve">GitHub: https://github.com/Arn-The-Wolf/MQTT-Light-Control</w:t>
+        </w:r>
+      </w:hyperlink>
+    </w:p>
+    <w:p>
+      <w:pPr>
+        <w:spacing w:after="40" w:before="60"/>
+      </w:pPr>
+      <w:r>
+        <w:rPr>
+          <w:rFonts w:ascii="Calibri" w:cs="Calibri" w:eastAsia="Calibri" w:hAnsi="Calibri"/>
+          <w:b/>
+          <w:bCs/>
+          <w:i w:val="false"/>
+          <w:iCs w:val="false"/>
+          <w:color w:val="333333"/>
+          <w:sz w:val="19"/>
+          <w:szCs w:val="19"/>
+        </w:rPr>
+        <w:t xml:space="preserve">Key results</w:t>
+      </w:r>
+    </w:p>
+    <w:p>
+      <w:pPr>
+        <w:pStyle w:val="ListParagraph"/>
+        <w:numPr>
+          <w:ilvl w:val="0"/>
+          <w:numId w:val="2"/>
+        </w:numPr>
+        <w:spacing w:after="60"/>
+      </w:pPr>
+      <w:r>
+        <w:rPr>
+          <w:rFonts w:ascii="Calibri" w:cs="Calibri" w:eastAsia="Calibri" w:hAnsi="Calibri"/>
+          <w:b w:val="false"/>
+          <w:bCs w:val="false"/>
+          <w:i w:val="false"/>
+          <w:iCs w:val="false"/>
+          <w:color w:val="333333"/>
+          <w:sz w:val="19"/>
+          <w:szCs w:val="19"/>
+        </w:rPr>
+        <w:t xml:space="preserve">MQTT light toggle</w:t>
+      </w:r>
+    </w:p>
+    <w:p>
+      <w:pPr>
+        <w:pStyle w:val="ListParagraph"/>
+        <w:numPr>
+          <w:ilvl w:val="0"/>
+          <w:numId w:val="2"/>
+        </w:numPr>
+        <w:spacing w:after="60"/>
+      </w:pPr>
+      <w:r>
+        <w:rPr>
+          <w:rFonts w:ascii="Calibri" w:cs="Calibri" w:eastAsia="Calibri" w:hAnsi="Calibri"/>
+          <w:b w:val="false"/>
+          <w:bCs w:val="false"/>
+          <w:i w:val="false"/>
+          <w:iCs w:val="false"/>
+          <w:color w:val="333333"/>
+          <w:sz w:val="19"/>
+          <w:szCs w:val="19"/>
+        </w:rPr>
+        <w:t xml:space="preserve">Web control UI</w:t>
+      </w:r>
+    </w:p>
+    <w:p>
+      <w:pPr>
+        <w:spacing w:after="40" w:before="80"/>
+      </w:pPr>
+      <w:r>
+        <w:rPr>
+          <w:rFonts w:ascii="Calibri" w:cs="Calibri" w:eastAsia="Calibri" w:hAnsi="Calibri"/>
+          <w:b/>
+          <w:bCs/>
+          <w:i w:val="false"/>
+          <w:iCs w:val="false"/>
+          <w:color w:val="333333"/>
+          <w:sz w:val="19"/>
+          <w:szCs w:val="19"/>
+        </w:rPr>
+        <w:t xml:space="preserve">Challenges solved</w:t>
+      </w:r>
+    </w:p>
+    <w:p>
+      <w:pPr>
+        <w:pStyle w:val="ListParagraph"/>
+        <w:numPr>
+          <w:ilvl w:val="0"/>
+          <w:numId w:val="2"/>
+        </w:numPr>
+        <w:spacing w:after="60"/>
+      </w:pPr>
+      <w:r>
+        <w:rPr>
+          <w:rFonts w:ascii="Calibri" w:cs="Calibri" w:eastAsia="Calibri" w:hAnsi="Calibri"/>
+          <w:b w:val="false"/>
+          <w:bCs w:val="false"/>
+          <w:i w:val="false"/>
+          <w:iCs w:val="false"/>
+          <w:color w:val="333333"/>
+          <w:sz w:val="19"/>
+          <w:szCs w:val="19"/>
+        </w:rPr>
+        <w:t xml:space="preserve">Broker connectivity</w:t>
+      </w:r>
+    </w:p>
+    <w:p>
+      <w:pPr>
+        <w:pStyle w:val="ListParagraph"/>
+        <w:numPr>
+          <w:ilvl w:val="0"/>
+          <w:numId w:val="2"/>
+        </w:numPr>
+        <w:spacing w:after="60"/>
+      </w:pPr>
+      <w:r>
+        <w:rPr>
+          <w:rFonts w:ascii="Calibri" w:cs="Calibri" w:eastAsia="Calibri" w:hAnsi="Calibri"/>
+          <w:b w:val="false"/>
+          <w:bCs w:val="false"/>
+          <w:i w:val="false"/>
+          <w:iCs w:val="false"/>
+          <w:color w:val="333333"/>
+          <w:sz w:val="19"/>
+          <w:szCs w:val="19"/>
+        </w:rPr>
+        <w:t xml:space="preserve">UI/state sync</w:t>
       </w:r>
     </w:p>
     <w:p>

</xml_diff>